<commit_message>
Se arregla el Informe General de la GUIA III de la NOM035
</commit_message>
<xml_diff>
--- a/storage/app/plantillas/informe_guiaIII_template.docx
+++ b/storage/app/plantillas/informe_guiaIII_template.docx
@@ -175,12 +175,7 @@
         </w:rPr>
         <w:t xml:space="preserve">INFORME DE IDENTIFICACIÓN Y ANÁLISIS DE LOS FACTORES DE RIESGO PSICOSOCIAL </w:t>
       </w:r>
-    </w:p>
-    <w:p>
-      <w:pPr>
-        <w:pStyle w:val="Ttulo"/>
-        <w:framePr w:hSpace="0" w:wrap="auto" w:vAnchor="margin" w:hAnchor="text" w:yAlign="inline"/>
-        <w:jc w:val="center"/>
+      <w:r>
         <w:rPr>
           <w:rFonts w:ascii="Bahnschrift" w:hAnsi="Bahnschrift"/>
           <w:b w:val="0"/>
@@ -199,6 +194,54 @@
             <w14:round/>
           </w14:textOutline>
         </w:rPr>
+        <w:t>Y EVALUACIÓN DEL ENTORNO ORGANIZACIONAL</w:t>
+      </w:r>
+      <w:r>
+        <w:rPr>
+          <w:rFonts w:ascii="Bahnschrift" w:hAnsi="Bahnschrift"/>
+          <w:b w:val="0"/>
+          <w:bCs/>
+          <w:sz w:val="36"/>
+          <w:szCs w:val="36"/>
+          <w:lang w:bidi="es-ES"/>
+          <w14:shadow w14:blurRad="38100" w14:dist="19050" w14:dir="2700000" w14:sx="100000" w14:sy="100000" w14:kx="0" w14:ky="0" w14:algn="tl">
+            <w14:schemeClr w14:val="dk1">
+              <w14:alpha w14:val="60000"/>
+            </w14:schemeClr>
+          </w14:shadow>
+          <w14:textOutline w14:w="0" w14:cap="flat" w14:cmpd="sng" w14:algn="ctr">
+            <w14:noFill/>
+            <w14:prstDash w14:val="solid"/>
+            <w14:round/>
+          </w14:textOutline>
+        </w:rPr>
+        <w:br/>
+        <w:t>EN EL TRABAJO</w:t>
+      </w:r>
+    </w:p>
+    <w:p>
+      <w:pPr>
+        <w:pStyle w:val="Ttulo"/>
+        <w:framePr w:hSpace="0" w:wrap="auto" w:vAnchor="margin" w:hAnchor="text" w:yAlign="inline"/>
+        <w:jc w:val="center"/>
+        <w:rPr>
+          <w:rFonts w:ascii="Bahnschrift" w:hAnsi="Bahnschrift"/>
+          <w:b w:val="0"/>
+          <w:bCs/>
+          <w:sz w:val="36"/>
+          <w:szCs w:val="36"/>
+          <w:lang w:bidi="es-ES"/>
+          <w14:shadow w14:blurRad="38100" w14:dist="19050" w14:dir="2700000" w14:sx="100000" w14:sy="100000" w14:kx="0" w14:ky="0" w14:algn="tl">
+            <w14:schemeClr w14:val="dk1">
+              <w14:alpha w14:val="60000"/>
+            </w14:schemeClr>
+          </w14:shadow>
+          <w14:textOutline w14:w="0" w14:cap="flat" w14:cmpd="sng" w14:algn="ctr">
+            <w14:noFill/>
+            <w14:prstDash w14:val="solid"/>
+            <w14:round/>
+          </w14:textOutline>
+        </w:rPr>
       </w:pPr>
     </w:p>
     <w:p>
@@ -380,7 +423,49 @@
             <w14:round/>
           </w14:textOutline>
         </w:rPr>
-        <w:t xml:space="preserve">Guía </w:t>
+        <w:t>Guía</w:t>
+      </w:r>
+      <w:r>
+        <w:rPr>
+          <w:rFonts w:ascii="Bahnschrift" w:hAnsi="Bahnschrift"/>
+          <w:b w:val="0"/>
+          <w:color w:val="404040" w:themeColor="text1" w:themeTint="BF"/>
+          <w:sz w:val="36"/>
+          <w:szCs w:val="36"/>
+          <w:lang w:bidi="es-ES"/>
+          <w14:shadow w14:blurRad="38100" w14:dist="19050" w14:dir="2700000" w14:sx="100000" w14:sy="100000" w14:kx="0" w14:ky="0" w14:algn="tl">
+            <w14:schemeClr w14:val="dk1">
+              <w14:alpha w14:val="60000"/>
+            </w14:schemeClr>
+          </w14:shadow>
+          <w14:textOutline w14:w="0" w14:cap="flat" w14:cmpd="sng" w14:algn="ctr">
+            <w14:noFill/>
+            <w14:prstDash w14:val="solid"/>
+            <w14:round/>
+          </w14:textOutline>
+        </w:rPr>
+        <w:t xml:space="preserve"> de Referencia</w:t>
+      </w:r>
+      <w:r>
+        <w:rPr>
+          <w:rFonts w:ascii="Bahnschrift" w:hAnsi="Bahnschrift"/>
+          <w:b w:val="0"/>
+          <w:color w:val="404040" w:themeColor="text1" w:themeTint="BF"/>
+          <w:sz w:val="36"/>
+          <w:szCs w:val="36"/>
+          <w:lang w:bidi="es-ES"/>
+          <w14:shadow w14:blurRad="38100" w14:dist="19050" w14:dir="2700000" w14:sx="100000" w14:sy="100000" w14:kx="0" w14:ky="0" w14:algn="tl">
+            <w14:schemeClr w14:val="dk1">
+              <w14:alpha w14:val="60000"/>
+            </w14:schemeClr>
+          </w14:shadow>
+          <w14:textOutline w14:w="0" w14:cap="flat" w14:cmpd="sng" w14:algn="ctr">
+            <w14:noFill/>
+            <w14:prstDash w14:val="solid"/>
+            <w14:round/>
+          </w14:textOutline>
+        </w:rPr>
+        <w:t xml:space="preserve"> </w:t>
       </w:r>
       <w:r>
         <w:rPr>
@@ -2159,7 +2244,7 @@
           <w:sz w:val="24"/>
           <w:szCs w:val="24"/>
         </w:rPr>
-        <w:t>2</w:t>
+        <w:t>3</w:t>
       </w:r>
       <w:r>
         <w:rPr>
@@ -2579,6 +2664,295 @@
     </w:p>
     <w:p>
       <w:pPr>
+        <w:pStyle w:val="Ttulo"/>
+        <w:framePr w:hSpace="0" w:wrap="auto" w:vAnchor="margin" w:hAnchor="text" w:yAlign="inline"/>
+        <w:spacing w:before="120" w:after="120"/>
+        <w:rPr>
+          <w:rFonts w:asciiTheme="minorHAnsi" w:eastAsiaTheme="minorHAnsi" w:hAnsiTheme="minorHAnsi" w:cstheme="minorHAnsi"/>
+          <w:b w:val="0"/>
+          <w:color w:val="auto"/>
+          <w:kern w:val="0"/>
+          <w:sz w:val="24"/>
+          <w:szCs w:val="24"/>
+          <w:lang w:val="es-MX"/>
+        </w:rPr>
+      </w:pPr>
+      <w:r>
+        <w:rPr>
+          <w:rFonts w:asciiTheme="minorHAnsi" w:eastAsiaTheme="minorHAnsi" w:hAnsiTheme="minorHAnsi" w:cstheme="minorHAnsi"/>
+          <w:b w:val="0"/>
+          <w:color w:val="auto"/>
+          <w:kern w:val="0"/>
+          <w:sz w:val="24"/>
+          <w:szCs w:val="24"/>
+          <w:lang w:val="es-MX"/>
+        </w:rPr>
+        <w:lastRenderedPageBreak/>
+        <w:t xml:space="preserve">La </w:t>
+      </w:r>
+      <w:r>
+        <w:rPr>
+          <w:rFonts w:asciiTheme="minorHAnsi" w:eastAsiaTheme="minorHAnsi" w:hAnsiTheme="minorHAnsi" w:cstheme="minorHAnsi"/>
+          <w:b w:val="0"/>
+          <w:color w:val="auto"/>
+          <w:kern w:val="0"/>
+          <w:sz w:val="24"/>
+          <w:szCs w:val="24"/>
+          <w:lang w:val="es-MX"/>
+        </w:rPr>
+        <w:t>evaluación del entorno organizacional favorable</w:t>
+      </w:r>
+      <w:r>
+        <w:rPr>
+          <w:rFonts w:asciiTheme="minorHAnsi" w:eastAsiaTheme="minorHAnsi" w:hAnsiTheme="minorHAnsi" w:cstheme="minorHAnsi"/>
+          <w:b w:val="0"/>
+          <w:color w:val="auto"/>
+          <w:kern w:val="0"/>
+          <w:sz w:val="24"/>
+          <w:szCs w:val="24"/>
+          <w:lang w:val="es-MX"/>
+        </w:rPr>
+        <w:t xml:space="preserve"> contempló lo siguiente de acuerdo con el </w:t>
+      </w:r>
+      <w:r>
+        <w:rPr>
+          <w:rFonts w:asciiTheme="minorHAnsi" w:eastAsiaTheme="minorHAnsi" w:hAnsiTheme="minorHAnsi" w:cstheme="minorHAnsi"/>
+          <w:b w:val="0"/>
+          <w:color w:val="auto"/>
+          <w:kern w:val="0"/>
+          <w:sz w:val="24"/>
+          <w:szCs w:val="24"/>
+          <w:lang w:val="es-MX"/>
+        </w:rPr>
+        <w:t>numeral 7.3:</w:t>
+      </w:r>
+    </w:p>
+    <w:p>
+      <w:pPr>
+        <w:pStyle w:val="Ttulo"/>
+        <w:framePr w:hSpace="0" w:wrap="auto" w:vAnchor="margin" w:hAnchor="text" w:yAlign="inline"/>
+        <w:spacing w:before="120" w:after="120"/>
+        <w:rPr>
+          <w:rFonts w:asciiTheme="minorHAnsi" w:eastAsiaTheme="minorHAnsi" w:hAnsiTheme="minorHAnsi" w:cstheme="minorHAnsi"/>
+          <w:b w:val="0"/>
+          <w:color w:val="auto"/>
+          <w:kern w:val="0"/>
+          <w:sz w:val="24"/>
+          <w:szCs w:val="24"/>
+          <w:lang w:val="es-MX"/>
+        </w:rPr>
+      </w:pPr>
+    </w:p>
+    <w:p>
+      <w:pPr>
+        <w:pStyle w:val="Ttulo"/>
+        <w:framePr w:hSpace="0" w:wrap="auto" w:vAnchor="margin" w:hAnchor="text" w:yAlign="inline"/>
+        <w:numPr>
+          <w:ilvl w:val="0"/>
+          <w:numId w:val="4"/>
+        </w:numPr>
+        <w:spacing w:before="120" w:after="120"/>
+        <w:rPr>
+          <w:rFonts w:asciiTheme="minorHAnsi" w:eastAsiaTheme="minorHAnsi" w:hAnsiTheme="minorHAnsi" w:cstheme="minorHAnsi"/>
+          <w:b w:val="0"/>
+          <w:color w:val="auto"/>
+          <w:kern w:val="0"/>
+          <w:sz w:val="24"/>
+          <w:szCs w:val="24"/>
+          <w:lang w:val="es-MX"/>
+        </w:rPr>
+      </w:pPr>
+      <w:r>
+        <w:rPr>
+          <w:rFonts w:asciiTheme="minorHAnsi" w:eastAsiaTheme="minorHAnsi" w:hAnsiTheme="minorHAnsi" w:cstheme="minorHAnsi"/>
+          <w:b w:val="0"/>
+          <w:color w:val="auto"/>
+          <w:kern w:val="0"/>
+          <w:sz w:val="24"/>
+          <w:szCs w:val="24"/>
+          <w:lang w:val="es-MX"/>
+        </w:rPr>
+        <w:t>El sentido de pertenencia de los trabajadores a la empresa;</w:t>
+      </w:r>
+    </w:p>
+    <w:p>
+      <w:pPr>
+        <w:pStyle w:val="Ttulo"/>
+        <w:framePr w:hSpace="0" w:wrap="auto" w:vAnchor="margin" w:hAnchor="text" w:yAlign="inline"/>
+        <w:numPr>
+          <w:ilvl w:val="0"/>
+          <w:numId w:val="4"/>
+        </w:numPr>
+        <w:spacing w:before="120" w:after="120"/>
+        <w:rPr>
+          <w:rFonts w:asciiTheme="minorHAnsi" w:eastAsiaTheme="minorHAnsi" w:hAnsiTheme="minorHAnsi" w:cstheme="minorHAnsi"/>
+          <w:b w:val="0"/>
+          <w:color w:val="auto"/>
+          <w:kern w:val="0"/>
+          <w:sz w:val="24"/>
+          <w:szCs w:val="24"/>
+          <w:lang w:val="es-MX"/>
+        </w:rPr>
+      </w:pPr>
+      <w:r>
+        <w:rPr>
+          <w:rFonts w:asciiTheme="minorHAnsi" w:eastAsiaTheme="minorHAnsi" w:hAnsiTheme="minorHAnsi" w:cstheme="minorHAnsi"/>
+          <w:b w:val="0"/>
+          <w:color w:val="auto"/>
+          <w:kern w:val="0"/>
+          <w:sz w:val="24"/>
+          <w:szCs w:val="24"/>
+          <w:lang w:val="es-MX"/>
+        </w:rPr>
+        <w:t>La formación para la adecuada realización de las tareas encomendadas;</w:t>
+      </w:r>
+    </w:p>
+    <w:p>
+      <w:pPr>
+        <w:pStyle w:val="Ttulo"/>
+        <w:framePr w:hSpace="0" w:wrap="auto" w:vAnchor="margin" w:hAnchor="text" w:yAlign="inline"/>
+        <w:numPr>
+          <w:ilvl w:val="0"/>
+          <w:numId w:val="4"/>
+        </w:numPr>
+        <w:spacing w:before="120" w:after="120"/>
+        <w:rPr>
+          <w:rFonts w:asciiTheme="minorHAnsi" w:eastAsiaTheme="minorHAnsi" w:hAnsiTheme="minorHAnsi" w:cstheme="minorHAnsi"/>
+          <w:b w:val="0"/>
+          <w:color w:val="auto"/>
+          <w:kern w:val="0"/>
+          <w:sz w:val="24"/>
+          <w:szCs w:val="24"/>
+          <w:lang w:val="es-MX"/>
+        </w:rPr>
+      </w:pPr>
+      <w:r>
+        <w:rPr>
+          <w:rFonts w:asciiTheme="minorHAnsi" w:eastAsiaTheme="minorHAnsi" w:hAnsiTheme="minorHAnsi" w:cstheme="minorHAnsi"/>
+          <w:b w:val="0"/>
+          <w:color w:val="auto"/>
+          <w:kern w:val="0"/>
+          <w:sz w:val="24"/>
+          <w:szCs w:val="24"/>
+          <w:lang w:val="es-MX"/>
+        </w:rPr>
+        <w:t>La definición precisa de responsabilidades para los trabajadores</w:t>
+      </w:r>
+    </w:p>
+    <w:p>
+      <w:pPr>
+        <w:pStyle w:val="Ttulo"/>
+        <w:framePr w:hSpace="0" w:wrap="auto" w:vAnchor="margin" w:hAnchor="text" w:yAlign="inline"/>
+        <w:numPr>
+          <w:ilvl w:val="0"/>
+          <w:numId w:val="4"/>
+        </w:numPr>
+        <w:spacing w:before="120" w:after="120"/>
+        <w:rPr>
+          <w:rFonts w:asciiTheme="minorHAnsi" w:eastAsiaTheme="minorHAnsi" w:hAnsiTheme="minorHAnsi" w:cstheme="minorHAnsi"/>
+          <w:b w:val="0"/>
+          <w:color w:val="auto"/>
+          <w:kern w:val="0"/>
+          <w:sz w:val="24"/>
+          <w:szCs w:val="24"/>
+          <w:lang w:val="es-MX"/>
+        </w:rPr>
+      </w:pPr>
+      <w:r>
+        <w:rPr>
+          <w:rFonts w:asciiTheme="minorHAnsi" w:eastAsiaTheme="minorHAnsi" w:hAnsiTheme="minorHAnsi" w:cstheme="minorHAnsi"/>
+          <w:b w:val="0"/>
+          <w:color w:val="auto"/>
+          <w:kern w:val="0"/>
+          <w:sz w:val="24"/>
+          <w:szCs w:val="24"/>
+          <w:lang w:val="es-MX"/>
+        </w:rPr>
+        <w:t>La participación proactiva y comunicación entre el patrón, sus representantes y los trabajadores;</w:t>
+      </w:r>
+    </w:p>
+    <w:p>
+      <w:pPr>
+        <w:pStyle w:val="Ttulo"/>
+        <w:framePr w:hSpace="0" w:wrap="auto" w:vAnchor="margin" w:hAnchor="text" w:yAlign="inline"/>
+        <w:numPr>
+          <w:ilvl w:val="0"/>
+          <w:numId w:val="4"/>
+        </w:numPr>
+        <w:spacing w:before="120" w:after="120"/>
+        <w:rPr>
+          <w:rFonts w:asciiTheme="minorHAnsi" w:eastAsiaTheme="minorHAnsi" w:hAnsiTheme="minorHAnsi" w:cstheme="minorHAnsi"/>
+          <w:b w:val="0"/>
+          <w:color w:val="auto"/>
+          <w:kern w:val="0"/>
+          <w:sz w:val="24"/>
+          <w:szCs w:val="24"/>
+          <w:lang w:val="es-MX"/>
+        </w:rPr>
+      </w:pPr>
+      <w:r>
+        <w:rPr>
+          <w:rFonts w:asciiTheme="minorHAnsi" w:eastAsiaTheme="minorHAnsi" w:hAnsiTheme="minorHAnsi" w:cstheme="minorHAnsi"/>
+          <w:b w:val="0"/>
+          <w:color w:val="auto"/>
+          <w:kern w:val="0"/>
+          <w:sz w:val="24"/>
+          <w:szCs w:val="24"/>
+          <w:lang w:val="es-MX"/>
+        </w:rPr>
+        <w:t>La distribución adecuada de cargas de trabajo con jornadas laborales regulares, y</w:t>
+      </w:r>
+    </w:p>
+    <w:p>
+      <w:pPr>
+        <w:pStyle w:val="Ttulo"/>
+        <w:framePr w:hSpace="0" w:wrap="auto" w:vAnchor="margin" w:hAnchor="text" w:yAlign="inline"/>
+        <w:numPr>
+          <w:ilvl w:val="0"/>
+          <w:numId w:val="4"/>
+        </w:numPr>
+        <w:spacing w:before="120" w:after="120"/>
+        <w:rPr>
+          <w:rFonts w:asciiTheme="minorHAnsi" w:eastAsiaTheme="minorHAnsi" w:hAnsiTheme="minorHAnsi" w:cstheme="minorHAnsi"/>
+          <w:b w:val="0"/>
+          <w:color w:val="auto"/>
+          <w:kern w:val="0"/>
+          <w:sz w:val="24"/>
+          <w:szCs w:val="24"/>
+          <w:lang w:val="es-MX"/>
+        </w:rPr>
+      </w:pPr>
+      <w:r>
+        <w:rPr>
+          <w:rFonts w:asciiTheme="minorHAnsi" w:eastAsiaTheme="minorHAnsi" w:hAnsiTheme="minorHAnsi" w:cstheme="minorHAnsi"/>
+          <w:b w:val="0"/>
+          <w:color w:val="auto"/>
+          <w:kern w:val="0"/>
+          <w:sz w:val="24"/>
+          <w:szCs w:val="24"/>
+          <w:lang w:val="es-MX"/>
+        </w:rPr>
+        <w:t>La evaluación y el reconocimiento del desempeño.</w:t>
+      </w:r>
+    </w:p>
+    <w:p>
+      <w:pPr>
+        <w:pStyle w:val="Ttulo"/>
+        <w:framePr w:hSpace="0" w:wrap="auto" w:vAnchor="margin" w:hAnchor="text" w:yAlign="inline"/>
+        <w:spacing w:before="120" w:after="120"/>
+        <w:rPr>
+          <w:rFonts w:asciiTheme="minorHAnsi" w:eastAsiaTheme="minorHAnsi" w:hAnsiTheme="minorHAnsi" w:cstheme="minorHAnsi"/>
+          <w:b w:val="0"/>
+          <w:color w:val="auto"/>
+          <w:kern w:val="0"/>
+          <w:sz w:val="24"/>
+          <w:szCs w:val="24"/>
+          <w:lang w:val="es-MX"/>
+        </w:rPr>
+      </w:pPr>
+    </w:p>
+    <w:p>
+      <w:pPr>
         <w:pStyle w:val="Prrafodelista"/>
         <w:numPr>
           <w:ilvl w:val="1"/>
@@ -2617,7 +2991,6 @@
             <w14:round/>
           </w14:textOutline>
         </w:rPr>
-        <w:lastRenderedPageBreak/>
         <w:t>Forma</w:t>
       </w:r>
       <w:r>
@@ -3619,6 +3992,7 @@
           <w:szCs w:val="24"/>
           <w:lang w:val="es-MX"/>
         </w:rPr>
+        <w:lastRenderedPageBreak/>
         <w:t xml:space="preserve">Se comprobó que la cantidad de cuestionarios </w:t>
       </w:r>
       <w:r>
@@ -3734,142 +4108,277 @@
     </w:p>
     <w:p>
       <w:pPr>
-        <w:jc w:val="both"/>
-        <w:rPr>
-          <w:rFonts w:cstheme="minorHAnsi"/>
-          <w:sz w:val="24"/>
-          <w:szCs w:val="24"/>
-        </w:rPr>
-      </w:pPr>
-      <w:r>
-        <w:rPr>
-          <w:rFonts w:cstheme="minorHAnsi"/>
-          <w:sz w:val="24"/>
-          <w:szCs w:val="24"/>
-        </w:rPr>
-        <w:t>De acuerdo con el</w:t>
-      </w:r>
-      <w:r>
-        <w:rPr>
-          <w:rFonts w:cstheme="minorHAnsi"/>
-          <w:sz w:val="24"/>
-          <w:szCs w:val="24"/>
-        </w:rPr>
-        <w:t xml:space="preserve"> ${</w:t>
+        <w:pStyle w:val="Ttulo"/>
+        <w:framePr w:hSpace="0" w:wrap="auto" w:vAnchor="margin" w:hAnchor="text" w:yAlign="inline"/>
+        <w:spacing w:before="120" w:after="120"/>
+        <w:jc w:val="both"/>
+        <w:rPr>
+          <w:rFonts w:asciiTheme="minorHAnsi" w:eastAsiaTheme="minorHAnsi" w:hAnsiTheme="minorHAnsi" w:cstheme="minorHAnsi"/>
+          <w:b w:val="0"/>
+          <w:color w:val="auto"/>
+          <w:kern w:val="0"/>
+          <w:sz w:val="24"/>
+          <w:szCs w:val="24"/>
+          <w:lang w:val="es-MX"/>
+        </w:rPr>
+      </w:pPr>
+      <w:r>
+        <w:rPr>
+          <w:rFonts w:asciiTheme="minorHAnsi" w:eastAsiaTheme="minorHAnsi" w:hAnsiTheme="minorHAnsi" w:cstheme="minorHAnsi"/>
+          <w:b w:val="0"/>
+          <w:color w:val="auto"/>
+          <w:kern w:val="0"/>
+          <w:sz w:val="24"/>
+          <w:szCs w:val="24"/>
+          <w:lang w:val="es-MX"/>
+        </w:rPr>
+        <w:t>Para determinar la muestra representativa, el centro de trabajo contaba con una plantilla de personal activo el ${periodo}, el total de la plantilla fue de ${</w:t>
       </w:r>
       <w:proofErr w:type="spellStart"/>
       <w:r>
         <w:rPr>
-          <w:rFonts w:cstheme="minorHAnsi"/>
-          <w:sz w:val="24"/>
-          <w:szCs w:val="24"/>
-        </w:rPr>
-        <w:t>guia_numeral</w:t>
+          <w:rFonts w:asciiTheme="minorHAnsi" w:eastAsiaTheme="minorHAnsi" w:hAnsiTheme="minorHAnsi" w:cstheme="minorHAnsi"/>
+          <w:b w:val="0"/>
+          <w:color w:val="auto"/>
+          <w:kern w:val="0"/>
+          <w:sz w:val="24"/>
+          <w:szCs w:val="24"/>
+          <w:lang w:val="es-MX"/>
+        </w:rPr>
+        <w:t>total_colab</w:t>
       </w:r>
       <w:proofErr w:type="spellEnd"/>
       <w:r>
         <w:rPr>
-          <w:rFonts w:cstheme="minorHAnsi"/>
-          <w:sz w:val="24"/>
-          <w:szCs w:val="24"/>
-        </w:rPr>
-        <w:t xml:space="preserve">} </w:t>
-      </w:r>
-      <w:r>
-        <w:rPr>
-          <w:rFonts w:cstheme="minorHAnsi"/>
-          <w:sz w:val="24"/>
-          <w:szCs w:val="24"/>
-        </w:rPr>
-        <w:t>de la NOM-035-STPS-2018, a partir de la suma de cada puntaje y de cada uno de los ítems que integran los cuestionarios individuales, se determinó y analizo la calificación final, por categoría y por dominio de cada uno de sus colaboradores y del centro de trabajo, el nivel de riesgo de estos, así como las acciones que se deberán adoptar para el control de los factores de riesgo psicosocial, según corresponda, con base en las tablas siguientes:</w:t>
-      </w:r>
-    </w:p>
-    <w:p>
-      <w:pPr>
-        <w:pStyle w:val="Prrafodelista"/>
+          <w:rFonts w:asciiTheme="minorHAnsi" w:eastAsiaTheme="minorHAnsi" w:hAnsiTheme="minorHAnsi" w:cstheme="minorHAnsi"/>
+          <w:b w:val="0"/>
+          <w:color w:val="auto"/>
+          <w:kern w:val="0"/>
+          <w:sz w:val="24"/>
+          <w:szCs w:val="24"/>
+          <w:lang w:val="es-MX"/>
+        </w:rPr>
+        <w:t>}</w:t>
+      </w:r>
+      <w:r>
+        <w:rPr>
+          <w:rFonts w:asciiTheme="minorHAnsi" w:eastAsiaTheme="minorHAnsi" w:hAnsiTheme="minorHAnsi" w:cstheme="minorHAnsi"/>
+          <w:bCs/>
+          <w:color w:val="FF0000"/>
+          <w:kern w:val="0"/>
+          <w:sz w:val="24"/>
+          <w:szCs w:val="24"/>
+          <w:lang w:val="es-MX"/>
+        </w:rPr>
+        <w:t xml:space="preserve"> </w:t>
+      </w:r>
+      <w:r>
+        <w:rPr>
+          <w:rFonts w:asciiTheme="minorHAnsi" w:eastAsiaTheme="minorHAnsi" w:hAnsiTheme="minorHAnsi" w:cstheme="minorHAnsi"/>
+          <w:b w:val="0"/>
+          <w:color w:val="auto"/>
+          <w:kern w:val="0"/>
+          <w:sz w:val="24"/>
+          <w:szCs w:val="24"/>
+          <w:lang w:val="es-MX"/>
+        </w:rPr>
+        <w:t xml:space="preserve">colaboradores, contabilizando a personal de mandos medios, supervisores, administrativo y operativo. </w:t>
+      </w:r>
+    </w:p>
+    <w:p>
+      <w:pPr>
+        <w:pStyle w:val="Ttulo"/>
+        <w:framePr w:hSpace="0" w:wrap="auto" w:vAnchor="margin" w:hAnchor="text" w:yAlign="inline"/>
+        <w:spacing w:before="120" w:after="120"/>
+        <w:rPr>
+          <w:rFonts w:asciiTheme="minorHAnsi" w:eastAsiaTheme="minorHAnsi" w:hAnsiTheme="minorHAnsi" w:cstheme="minorHAnsi"/>
+          <w:b w:val="0"/>
+          <w:color w:val="auto"/>
+          <w:kern w:val="0"/>
+          <w:sz w:val="24"/>
+          <w:szCs w:val="24"/>
+          <w:lang w:val="es-MX"/>
+        </w:rPr>
+      </w:pPr>
+    </w:p>
+    <w:p>
+      <w:pPr>
+        <w:pStyle w:val="Ttulo"/>
+        <w:framePr w:hSpace="0" w:wrap="auto" w:vAnchor="margin" w:hAnchor="text" w:yAlign="inline"/>
+        <w:spacing w:before="120" w:after="120"/>
+        <w:rPr>
+          <w:rFonts w:asciiTheme="minorHAnsi" w:eastAsiaTheme="minorHAnsi" w:hAnsiTheme="minorHAnsi" w:cstheme="minorHAnsi"/>
+          <w:b w:val="0"/>
+          <w:color w:val="auto"/>
+          <w:kern w:val="0"/>
+          <w:sz w:val="24"/>
+          <w:szCs w:val="24"/>
+          <w:lang w:val="es-MX"/>
+        </w:rPr>
+      </w:pPr>
+      <w:r>
+        <w:rPr>
+          <w:rFonts w:asciiTheme="minorHAnsi" w:eastAsiaTheme="minorHAnsi" w:hAnsiTheme="minorHAnsi" w:cstheme="minorHAnsi"/>
+          <w:b w:val="0"/>
+          <w:color w:val="auto"/>
+          <w:kern w:val="0"/>
+          <w:sz w:val="24"/>
+          <w:szCs w:val="24"/>
+          <w:lang w:val="es-MX"/>
+        </w:rPr>
+        <w:t xml:space="preserve">La muestra se determinó conforme a la ecuación mencionada en el apartado 1 de la </w:t>
+      </w:r>
+      <w:r>
+        <w:rPr>
+          <w:rFonts w:asciiTheme="minorHAnsi" w:eastAsiaTheme="minorHAnsi" w:hAnsiTheme="minorHAnsi" w:cstheme="minorHAnsi"/>
+          <w:b w:val="0"/>
+          <w:color w:val="auto"/>
+          <w:kern w:val="0"/>
+          <w:sz w:val="24"/>
+          <w:szCs w:val="24"/>
+          <w:lang w:val="es-MX"/>
+        </w:rPr>
+        <w:t>G</w:t>
+      </w:r>
+      <w:r>
+        <w:rPr>
+          <w:rFonts w:asciiTheme="minorHAnsi" w:eastAsiaTheme="minorHAnsi" w:hAnsiTheme="minorHAnsi" w:cstheme="minorHAnsi"/>
+          <w:b w:val="0"/>
+          <w:color w:val="auto"/>
+          <w:kern w:val="0"/>
+          <w:sz w:val="24"/>
+          <w:szCs w:val="24"/>
+          <w:lang w:val="es-MX"/>
+        </w:rPr>
+        <w:t xml:space="preserve">uía de </w:t>
+      </w:r>
+      <w:r>
+        <w:rPr>
+          <w:rFonts w:asciiTheme="minorHAnsi" w:eastAsiaTheme="minorHAnsi" w:hAnsiTheme="minorHAnsi" w:cstheme="minorHAnsi"/>
+          <w:b w:val="0"/>
+          <w:color w:val="auto"/>
+          <w:kern w:val="0"/>
+          <w:sz w:val="24"/>
+          <w:szCs w:val="24"/>
+          <w:lang w:val="es-MX"/>
+        </w:rPr>
+        <w:t>R</w:t>
+      </w:r>
+      <w:r>
+        <w:rPr>
+          <w:rFonts w:asciiTheme="minorHAnsi" w:eastAsiaTheme="minorHAnsi" w:hAnsiTheme="minorHAnsi" w:cstheme="minorHAnsi"/>
+          <w:b w:val="0"/>
+          <w:color w:val="auto"/>
+          <w:kern w:val="0"/>
+          <w:sz w:val="24"/>
+          <w:szCs w:val="24"/>
+          <w:lang w:val="es-MX"/>
+        </w:rPr>
+        <w:t xml:space="preserve">eferencia </w:t>
+      </w:r>
+      <w:r>
+        <w:rPr>
+          <w:rFonts w:asciiTheme="minorHAnsi" w:eastAsiaTheme="minorHAnsi" w:hAnsiTheme="minorHAnsi" w:cstheme="minorHAnsi"/>
+          <w:b w:val="0"/>
+          <w:color w:val="auto"/>
+          <w:kern w:val="0"/>
+          <w:sz w:val="24"/>
+          <w:szCs w:val="24"/>
+          <w:lang w:val="es-MX"/>
+        </w:rPr>
+        <w:t>III</w:t>
+      </w:r>
+      <w:r>
+        <w:rPr>
+          <w:rFonts w:asciiTheme="minorHAnsi" w:eastAsiaTheme="minorHAnsi" w:hAnsiTheme="minorHAnsi" w:cstheme="minorHAnsi"/>
+          <w:b w:val="0"/>
+          <w:color w:val="auto"/>
+          <w:kern w:val="0"/>
+          <w:sz w:val="24"/>
+          <w:szCs w:val="24"/>
+          <w:lang w:val="es-MX"/>
+        </w:rPr>
+        <w:t xml:space="preserve"> de la NOM-035-STPS-2018.</w:t>
+      </w:r>
+    </w:p>
+    <w:p>
+      <w:pPr>
+        <w:pStyle w:val="Ttulo"/>
+        <w:framePr w:hSpace="0" w:wrap="auto" w:vAnchor="margin" w:hAnchor="text" w:yAlign="inline"/>
+        <w:spacing w:before="120" w:after="120"/>
+        <w:rPr>
+          <w:rFonts w:asciiTheme="minorHAnsi" w:eastAsiaTheme="minorHAnsi" w:hAnsiTheme="minorHAnsi" w:cstheme="minorHAnsi"/>
+          <w:b w:val="0"/>
+          <w:color w:val="auto"/>
+          <w:kern w:val="0"/>
+          <w:sz w:val="24"/>
+          <w:szCs w:val="24"/>
+          <w:lang w:val="es-MX"/>
+        </w:rPr>
+      </w:pPr>
+    </w:p>
+    <w:p>
+      <w:pPr>
+        <w:pStyle w:val="Ttulo"/>
+        <w:framePr w:hSpace="0" w:wrap="auto" w:vAnchor="margin" w:hAnchor="text" w:yAlign="inline"/>
+        <w:spacing w:before="120" w:after="120"/>
+        <w:rPr>
+          <w:rFonts w:asciiTheme="minorHAnsi" w:eastAsiaTheme="minorHAnsi" w:hAnsiTheme="minorHAnsi" w:cstheme="minorHAnsi"/>
+          <w:b w:val="0"/>
+          <w:color w:val="auto"/>
+          <w:kern w:val="0"/>
+          <w:sz w:val="24"/>
+          <w:szCs w:val="24"/>
+          <w:lang w:val="es-MX"/>
+        </w:rPr>
+      </w:pPr>
+      <w:r>
+        <w:rPr>
+          <w:rFonts w:asciiTheme="minorHAnsi" w:eastAsiaTheme="minorHAnsi" w:hAnsiTheme="minorHAnsi" w:cstheme="minorHAnsi"/>
+          <w:b w:val="0"/>
+          <w:color w:val="auto"/>
+          <w:kern w:val="0"/>
+          <w:sz w:val="24"/>
+          <w:szCs w:val="24"/>
+          <w:lang w:val="es-MX"/>
+        </w:rPr>
+        <w:t>El cuestionario deberá aplicarse a todos los trabajadores del centro de trabajo, o bien, se podrá aplicar a una muestra representativa de éstos. El tamaño de la muestra se deberá determinar conforme a la Ecuación 1 siguiente:</w:t>
+      </w:r>
+    </w:p>
+    <w:p>
+      <w:pPr>
+        <w:pStyle w:val="Ttulo"/>
+        <w:framePr w:hSpace="0" w:wrap="auto" w:vAnchor="margin" w:hAnchor="text" w:yAlign="inline"/>
+        <w:spacing w:before="120" w:after="120"/>
+        <w:rPr>
+          <w:rFonts w:asciiTheme="minorHAnsi" w:eastAsiaTheme="minorHAnsi" w:hAnsiTheme="minorHAnsi" w:cstheme="minorHAnsi"/>
+          <w:b w:val="0"/>
+          <w:color w:val="auto"/>
+          <w:kern w:val="0"/>
+          <w:sz w:val="24"/>
+          <w:szCs w:val="24"/>
+          <w:lang w:val="es-MX"/>
+        </w:rPr>
+      </w:pPr>
+    </w:p>
+    <w:p>
+      <w:pPr>
+        <w:pStyle w:val="Ttulo"/>
+        <w:framePr w:hSpace="0" w:wrap="auto" w:vAnchor="margin" w:hAnchor="text" w:yAlign="inline"/>
         <w:numPr>
           <w:ilvl w:val="0"/>
-          <w:numId w:val="18"/>
+          <w:numId w:val="22"/>
         </w:numPr>
-        <w:ind w:left="426"/>
-        <w:jc w:val="both"/>
-        <w:rPr>
-          <w:rFonts w:cstheme="minorHAnsi"/>
-        </w:rPr>
-      </w:pPr>
-      <w:r>
-        <w:rPr>
-          <w:rFonts w:cstheme="minorHAnsi"/>
-          <w:sz w:val="24"/>
-          <w:szCs w:val="24"/>
-        </w:rPr>
-        <w:lastRenderedPageBreak/>
-        <w:t>Para obtener la calificación se consideró la agrupación de los ítems por categoría, dominio y dimensión, de acuerdo con lo siguiente:</w:t>
-      </w:r>
-    </w:p>
-    <w:p>
-      <w:pPr>
-        <w:pStyle w:val="Default"/>
-        <w:numPr>
-          <w:ilvl w:val="2"/>
-          <w:numId w:val="1"/>
-        </w:numPr>
-        <w:ind w:left="567" w:hanging="283"/>
-        <w:jc w:val="both"/>
-        <w:rPr>
-          <w:rFonts w:asciiTheme="minorHAnsi" w:hAnsiTheme="minorHAnsi" w:cstheme="minorHAnsi"/>
-          <w:color w:val="auto"/>
-        </w:rPr>
-      </w:pPr>
-      <w:r>
-        <w:rPr>
-          <w:rFonts w:asciiTheme="minorHAnsi" w:hAnsiTheme="minorHAnsi" w:cstheme="minorHAnsi"/>
-          <w:color w:val="auto"/>
-        </w:rPr>
-        <w:t xml:space="preserve">Las respuestas a los ítems del cuestionario para la identificación de los factores de riesgo psicosocial </w:t>
-      </w:r>
-      <w:r>
-        <w:rPr>
-          <w:rFonts w:asciiTheme="minorHAnsi" w:hAnsiTheme="minorHAnsi" w:cstheme="minorHAnsi"/>
-          <w:color w:val="auto"/>
-        </w:rPr>
-        <w:t xml:space="preserve">y evaluación del entorno organizacional </w:t>
-      </w:r>
-      <w:r>
-        <w:rPr>
-          <w:rFonts w:asciiTheme="minorHAnsi" w:hAnsiTheme="minorHAnsi" w:cstheme="minorHAnsi"/>
-          <w:color w:val="auto"/>
-        </w:rPr>
-        <w:t xml:space="preserve">se calificaron, de acuerdo con la puntación de la tabla siguiente: </w:t>
-      </w:r>
-    </w:p>
-    <w:p>
-      <w:pPr>
-        <w:pStyle w:val="Default"/>
-        <w:jc w:val="both"/>
-        <w:rPr>
-          <w:rFonts w:asciiTheme="minorHAnsi" w:hAnsiTheme="minorHAnsi" w:cstheme="minorHAnsi"/>
-          <w:color w:val="auto"/>
-        </w:rPr>
-      </w:pPr>
-    </w:p>
-    <w:p>
-      <w:pPr>
-        <w:pStyle w:val="Default"/>
+        <w:spacing w:before="120" w:after="120"/>
         <w:jc w:val="center"/>
         <w:rPr>
-          <w:rFonts w:asciiTheme="minorHAnsi" w:hAnsiTheme="minorHAnsi" w:cstheme="minorHAnsi"/>
-          <w:color w:val="auto"/>
-        </w:rPr>
-      </w:pPr>
-    </w:p>
-    <w:p>
-      <w:pPr>
-        <w:pStyle w:val="Default"/>
-        <w:jc w:val="center"/>
-        <w:rPr>
-          <w:rFonts w:asciiTheme="minorHAnsi" w:hAnsiTheme="minorHAnsi" w:cstheme="minorHAnsi"/>
-          <w:color w:val="auto"/>
+          <w:rFonts w:asciiTheme="minorHAnsi" w:eastAsiaTheme="minorHAnsi" w:hAnsiTheme="minorHAnsi" w:cstheme="minorHAnsi"/>
+          <w:b w:val="0"/>
+          <w:color w:val="auto"/>
+          <w:kern w:val="0"/>
+          <w:sz w:val="24"/>
+          <w:szCs w:val="24"/>
+          <w:lang w:val="es-MX"/>
         </w:rPr>
       </w:pPr>
       <w:r>
@@ -3877,10 +4386,16 @@
           <w:noProof/>
         </w:rPr>
         <w:drawing>
-          <wp:inline distT="0" distB="0" distL="0" distR="0" wp14:anchorId="58C47336" wp14:editId="36F1CD74">
-            <wp:extent cx="5612130" cy="1030605"/>
-            <wp:effectExtent l="0" t="0" r="7620" b="0"/>
-            <wp:docPr id="329909410" name="Imagen 2"/>
+          <wp:inline distT="0" distB="0" distL="0" distR="0" wp14:anchorId="4E5ADA6C" wp14:editId="0E7A3CF3">
+            <wp:extent cx="2161905" cy="561905"/>
+            <wp:effectExtent l="0" t="0" r="0" b="0"/>
+            <wp:docPr id="2" name="Imagen 1" descr="Imagen que contiene Texto&#10;&#10;Descripción generada automáticamente">
+              <a:extLst xmlns:a="http://schemas.openxmlformats.org/drawingml/2006/main">
+                <a:ext uri="{FF2B5EF4-FFF2-40B4-BE49-F238E27FC236}">
+                  <a16:creationId xmlns:a16="http://schemas.microsoft.com/office/drawing/2014/main" id="{99B533D1-CF23-44BD-822B-24D8C01A9494}"/>
+                </a:ext>
+              </a:extLst>
+            </wp:docPr>
             <wp:cNvGraphicFramePr>
               <a:graphicFrameLocks xmlns:a="http://schemas.openxmlformats.org/drawingml/2006/main" noChangeAspect="1"/>
             </wp:cNvGraphicFramePr>
@@ -3888,36 +4403,31 @@
               <a:graphicData uri="http://schemas.openxmlformats.org/drawingml/2006/picture">
                 <pic:pic xmlns:pic="http://schemas.openxmlformats.org/drawingml/2006/picture">
                   <pic:nvPicPr>
-                    <pic:cNvPr id="0" name="Picture 2"/>
+                    <pic:cNvPr id="2" name="Imagen 1" descr="Imagen que contiene Texto&#10;&#10;Descripción generada automáticamente">
+                      <a:extLst>
+                        <a:ext uri="{FF2B5EF4-FFF2-40B4-BE49-F238E27FC236}">
+                          <a16:creationId xmlns:a16="http://schemas.microsoft.com/office/drawing/2014/main" id="{99B533D1-CF23-44BD-822B-24D8C01A9494}"/>
+                        </a:ext>
+                      </a:extLst>
+                    </pic:cNvPr>
                     <pic:cNvPicPr>
-                      <a:picLocks noChangeAspect="1" noChangeArrowheads="1"/>
+                      <a:picLocks noChangeAspect="1"/>
                     </pic:cNvPicPr>
                   </pic:nvPicPr>
                   <pic:blipFill>
-                    <a:blip r:embed="rId8">
-                      <a:extLst>
-                        <a:ext uri="{28A0092B-C50C-407E-A947-70E740481C1C}">
-                          <a14:useLocalDpi xmlns:a14="http://schemas.microsoft.com/office/drawing/2010/main" val="0"/>
-                        </a:ext>
-                      </a:extLst>
-                    </a:blip>
-                    <a:srcRect/>
+                    <a:blip r:embed="rId8"/>
                     <a:stretch>
                       <a:fillRect/>
                     </a:stretch>
                   </pic:blipFill>
-                  <pic:spPr bwMode="auto">
+                  <pic:spPr>
                     <a:xfrm>
                       <a:off x="0" y="0"/>
-                      <a:ext cx="5612130" cy="1030605"/>
+                      <a:ext cx="2161905" cy="561905"/>
                     </a:xfrm>
                     <a:prstGeom prst="rect">
                       <a:avLst/>
                     </a:prstGeom>
-                    <a:noFill/>
-                    <a:ln>
-                      <a:noFill/>
-                    </a:ln>
                   </pic:spPr>
                 </pic:pic>
               </a:graphicData>
@@ -3928,30 +4438,552 @@
     </w:p>
     <w:p>
       <w:pPr>
-        <w:pStyle w:val="Default"/>
+        <w:pStyle w:val="Ttulo"/>
+        <w:framePr w:hSpace="0" w:wrap="auto" w:vAnchor="margin" w:hAnchor="text" w:yAlign="inline"/>
+        <w:spacing w:before="120" w:after="120"/>
         <w:jc w:val="center"/>
         <w:rPr>
-          <w:rFonts w:asciiTheme="minorHAnsi" w:hAnsiTheme="minorHAnsi" w:cstheme="minorHAnsi"/>
-          <w:color w:val="auto"/>
-        </w:rPr>
-      </w:pPr>
-    </w:p>
-    <w:p>
-      <w:pPr>
-        <w:pStyle w:val="Default"/>
-        <w:jc w:val="both"/>
-        <w:rPr>
-          <w:rFonts w:asciiTheme="minorHAnsi" w:hAnsiTheme="minorHAnsi" w:cstheme="minorHAnsi"/>
-          <w:color w:val="auto"/>
-        </w:rPr>
-      </w:pPr>
+          <w:rFonts w:asciiTheme="minorHAnsi" w:eastAsiaTheme="minorHAnsi" w:hAnsiTheme="minorHAnsi" w:cstheme="minorHAnsi"/>
+          <w:b w:val="0"/>
+          <w:color w:val="auto"/>
+          <w:kern w:val="0"/>
+          <w:sz w:val="24"/>
+          <w:szCs w:val="24"/>
+          <w:lang w:val="es-MX"/>
+        </w:rPr>
+      </w:pPr>
+    </w:p>
+    <w:p>
+      <w:pPr>
+        <w:pStyle w:val="Ttulo"/>
+        <w:framePr w:hSpace="0" w:wrap="auto" w:vAnchor="margin" w:hAnchor="text" w:yAlign="inline"/>
+        <w:spacing w:before="120" w:after="120"/>
+        <w:jc w:val="center"/>
+        <w:rPr>
+          <w:rFonts w:asciiTheme="minorHAnsi" w:eastAsiaTheme="minorHAnsi" w:hAnsiTheme="minorHAnsi" w:cstheme="minorHAnsi"/>
+          <w:b w:val="0"/>
+          <w:color w:val="auto"/>
+          <w:kern w:val="0"/>
+          <w:sz w:val="24"/>
+          <w:szCs w:val="24"/>
+          <w:lang w:val="es-MX"/>
+        </w:rPr>
+      </w:pPr>
+    </w:p>
+    <w:p>
+      <w:pPr>
+        <w:pStyle w:val="Ttulo"/>
+        <w:framePr w:hSpace="0" w:wrap="auto" w:vAnchor="margin" w:hAnchor="text" w:yAlign="inline"/>
+        <w:spacing w:before="120" w:after="120"/>
+        <w:rPr>
+          <w:rFonts w:asciiTheme="minorHAnsi" w:eastAsiaTheme="minorHAnsi" w:hAnsiTheme="minorHAnsi" w:cstheme="minorHAnsi"/>
+          <w:b w:val="0"/>
+          <w:color w:val="auto"/>
+          <w:kern w:val="0"/>
+          <w:sz w:val="24"/>
+          <w:szCs w:val="24"/>
+          <w:lang w:val="es-MX"/>
+        </w:rPr>
+      </w:pPr>
+      <w:r>
+        <w:rPr>
+          <w:rFonts w:asciiTheme="minorHAnsi" w:eastAsiaTheme="minorHAnsi" w:hAnsiTheme="minorHAnsi" w:cstheme="minorHAnsi"/>
+          <w:b w:val="0"/>
+          <w:color w:val="auto"/>
+          <w:kern w:val="0"/>
+          <w:sz w:val="24"/>
+          <w:szCs w:val="24"/>
+          <w:lang w:val="es-MX"/>
+        </w:rPr>
+        <w:t>En donde:</w:t>
+      </w:r>
+    </w:p>
+    <w:p>
+      <w:pPr>
+        <w:pStyle w:val="Ttulo"/>
+        <w:framePr w:hSpace="0" w:wrap="auto" w:vAnchor="margin" w:hAnchor="text" w:yAlign="inline"/>
+        <w:spacing w:before="120" w:after="120"/>
+        <w:rPr>
+          <w:rFonts w:asciiTheme="minorHAnsi" w:eastAsiaTheme="minorHAnsi" w:hAnsiTheme="minorHAnsi" w:cstheme="minorHAnsi"/>
+          <w:b w:val="0"/>
+          <w:color w:val="auto"/>
+          <w:kern w:val="0"/>
+          <w:sz w:val="24"/>
+          <w:szCs w:val="24"/>
+          <w:lang w:val="es-MX"/>
+        </w:rPr>
+      </w:pPr>
+      <w:r>
+        <w:rPr>
+          <w:rFonts w:asciiTheme="minorHAnsi" w:eastAsiaTheme="minorHAnsi" w:hAnsiTheme="minorHAnsi" w:cstheme="minorHAnsi"/>
+          <w:b w:val="0"/>
+          <w:color w:val="auto"/>
+          <w:kern w:val="0"/>
+          <w:sz w:val="24"/>
+          <w:szCs w:val="24"/>
+          <w:lang w:val="es-MX"/>
+        </w:rPr>
+        <w:t>N es el número total de trabajadores del centro de trabajo.</w:t>
+      </w:r>
+    </w:p>
+    <w:p>
+      <w:pPr>
+        <w:pStyle w:val="Ttulo"/>
+        <w:framePr w:hSpace="0" w:wrap="auto" w:vAnchor="margin" w:hAnchor="text" w:yAlign="inline"/>
+        <w:spacing w:before="120" w:after="120"/>
+        <w:rPr>
+          <w:rFonts w:asciiTheme="minorHAnsi" w:eastAsiaTheme="minorHAnsi" w:hAnsiTheme="minorHAnsi" w:cstheme="minorHAnsi"/>
+          <w:b w:val="0"/>
+          <w:color w:val="auto"/>
+          <w:kern w:val="0"/>
+          <w:sz w:val="24"/>
+          <w:szCs w:val="24"/>
+          <w:lang w:val="es-MX"/>
+        </w:rPr>
+      </w:pPr>
+      <w:r>
+        <w:rPr>
+          <w:rFonts w:asciiTheme="minorHAnsi" w:eastAsiaTheme="minorHAnsi" w:hAnsiTheme="minorHAnsi" w:cstheme="minorHAnsi"/>
+          <w:b w:val="0"/>
+          <w:color w:val="auto"/>
+          <w:kern w:val="0"/>
+          <w:sz w:val="24"/>
+          <w:szCs w:val="24"/>
+          <w:lang w:val="es-MX"/>
+        </w:rPr>
+        <w:t>N es el número de trabajadores a los que se les deberán aplicar los cuestionarios.</w:t>
+      </w:r>
+    </w:p>
+    <w:p>
+      <w:pPr>
+        <w:pStyle w:val="Ttulo"/>
+        <w:framePr w:hSpace="0" w:wrap="auto" w:vAnchor="margin" w:hAnchor="text" w:yAlign="inline"/>
+        <w:spacing w:before="120" w:after="120"/>
+        <w:rPr>
+          <w:rFonts w:asciiTheme="minorHAnsi" w:eastAsiaTheme="minorHAnsi" w:hAnsiTheme="minorHAnsi" w:cstheme="minorHAnsi"/>
+          <w:b w:val="0"/>
+          <w:color w:val="auto"/>
+          <w:kern w:val="0"/>
+          <w:sz w:val="24"/>
+          <w:szCs w:val="24"/>
+          <w:lang w:val="es-MX"/>
+        </w:rPr>
+      </w:pPr>
+      <w:r>
+        <w:rPr>
+          <w:rFonts w:asciiTheme="minorHAnsi" w:eastAsiaTheme="minorHAnsi" w:hAnsiTheme="minorHAnsi" w:cstheme="minorHAnsi"/>
+          <w:b w:val="0"/>
+          <w:color w:val="auto"/>
+          <w:kern w:val="0"/>
+          <w:sz w:val="24"/>
+          <w:szCs w:val="24"/>
+          <w:lang w:val="es-MX"/>
+        </w:rPr>
+        <w:t>0.9604 y 0.0025 permanecen constantes.</w:t>
+      </w:r>
+    </w:p>
+    <w:p>
+      <w:pPr>
+        <w:pStyle w:val="Ttulo"/>
+        <w:framePr w:hSpace="0" w:wrap="auto" w:vAnchor="margin" w:hAnchor="text" w:yAlign="inline"/>
+        <w:spacing w:before="120" w:after="120"/>
+        <w:jc w:val="both"/>
+        <w:rPr>
+          <w:rFonts w:asciiTheme="minorHAnsi" w:eastAsiaTheme="minorHAnsi" w:hAnsiTheme="minorHAnsi" w:cstheme="minorHAnsi"/>
+          <w:b w:val="0"/>
+          <w:color w:val="auto"/>
+          <w:kern w:val="0"/>
+          <w:sz w:val="24"/>
+          <w:szCs w:val="24"/>
+          <w:lang w:val="es-MX"/>
+        </w:rPr>
+      </w:pPr>
+    </w:p>
+    <w:p>
+      <w:pPr>
+        <w:pStyle w:val="Ttulo"/>
+        <w:framePr w:hSpace="0" w:wrap="auto" w:vAnchor="margin" w:hAnchor="text" w:yAlign="inline"/>
+        <w:spacing w:before="120" w:after="120"/>
+        <w:jc w:val="both"/>
+        <w:rPr>
+          <w:rFonts w:asciiTheme="minorHAnsi" w:eastAsiaTheme="minorHAnsi" w:hAnsiTheme="minorHAnsi" w:cstheme="minorHAnsi"/>
+          <w:b w:val="0"/>
+          <w:color w:val="auto"/>
+          <w:kern w:val="0"/>
+          <w:sz w:val="24"/>
+          <w:szCs w:val="24"/>
+          <w:lang w:val="es-MX"/>
+        </w:rPr>
+      </w:pPr>
+      <w:r>
+        <w:rPr>
+          <w:rFonts w:asciiTheme="minorHAnsi" w:eastAsiaTheme="minorHAnsi" w:hAnsiTheme="minorHAnsi" w:cstheme="minorHAnsi"/>
+          <w:b w:val="0"/>
+          <w:color w:val="auto"/>
+          <w:kern w:val="0"/>
+          <w:sz w:val="24"/>
+          <w:szCs w:val="24"/>
+          <w:lang w:val="es-MX"/>
+        </w:rPr>
+        <w:t>La selección de los trabajadores se realizó de forma aleatoria, de manera que todos pudieran ser considerados para la aplicación de los cuestionarios, sin importar, su turno, tipo de puesto, área de trabajo, departamento, etc.</w:t>
+      </w:r>
+    </w:p>
+    <w:p>
+      <w:pPr>
+        <w:pStyle w:val="Ttulo"/>
+        <w:framePr w:hSpace="0" w:wrap="auto" w:vAnchor="margin" w:hAnchor="text" w:yAlign="inline"/>
+        <w:spacing w:before="120" w:after="120"/>
+        <w:jc w:val="both"/>
+        <w:rPr>
+          <w:rFonts w:asciiTheme="minorHAnsi" w:eastAsiaTheme="minorHAnsi" w:hAnsiTheme="minorHAnsi" w:cstheme="minorHAnsi"/>
+          <w:b w:val="0"/>
+          <w:color w:val="auto"/>
+          <w:kern w:val="0"/>
+          <w:sz w:val="24"/>
+          <w:szCs w:val="24"/>
+          <w:lang w:val="es-MX"/>
+        </w:rPr>
+      </w:pPr>
+    </w:p>
+    <w:p>
+      <w:pPr>
+        <w:pStyle w:val="Ttulo"/>
+        <w:framePr w:hSpace="0" w:wrap="auto" w:vAnchor="margin" w:hAnchor="text" w:yAlign="inline"/>
+        <w:spacing w:before="120" w:after="120"/>
+        <w:jc w:val="both"/>
+        <w:rPr>
+          <w:rFonts w:asciiTheme="minorHAnsi" w:eastAsiaTheme="minorHAnsi" w:hAnsiTheme="minorHAnsi" w:cstheme="minorHAnsi"/>
+          <w:b w:val="0"/>
+          <w:color w:val="auto"/>
+          <w:kern w:val="0"/>
+          <w:sz w:val="24"/>
+          <w:szCs w:val="24"/>
+          <w:lang w:val="es-MX"/>
+        </w:rPr>
+      </w:pPr>
+      <w:r>
+        <w:rPr>
+          <w:rFonts w:asciiTheme="minorHAnsi" w:eastAsiaTheme="minorHAnsi" w:hAnsiTheme="minorHAnsi" w:cstheme="minorHAnsi"/>
+          <w:b w:val="0"/>
+          <w:color w:val="auto"/>
+          <w:kern w:val="0"/>
+          <w:sz w:val="24"/>
+          <w:szCs w:val="24"/>
+          <w:lang w:val="es-MX"/>
+        </w:rPr>
+        <w:t>La muestra se distribuyó entre hombres y mujeres conforme al porcentaje de cada género en el centro de trabajo quedando de la siguiente forma:</w:t>
+      </w:r>
+    </w:p>
+    <w:p>
+      <w:pPr>
+        <w:pStyle w:val="Ttulo"/>
+        <w:framePr w:hSpace="0" w:wrap="auto" w:vAnchor="margin" w:hAnchor="text" w:yAlign="inline"/>
+        <w:spacing w:before="120" w:after="120"/>
+        <w:jc w:val="center"/>
+        <w:rPr>
+          <w:rFonts w:asciiTheme="minorHAnsi" w:eastAsiaTheme="minorHAnsi" w:hAnsiTheme="minorHAnsi" w:cstheme="minorHAnsi"/>
+          <w:bCs/>
+          <w:color w:val="auto"/>
+          <w:kern w:val="0"/>
+          <w:sz w:val="24"/>
+          <w:szCs w:val="24"/>
+          <w:lang w:val="es-MX"/>
+        </w:rPr>
+      </w:pPr>
+      <w:r>
+        <w:rPr>
+          <w:rFonts w:asciiTheme="minorHAnsi" w:eastAsiaTheme="minorHAnsi" w:hAnsiTheme="minorHAnsi" w:cstheme="minorHAnsi"/>
+          <w:bCs/>
+          <w:color w:val="auto"/>
+          <w:kern w:val="0"/>
+          <w:sz w:val="24"/>
+          <w:szCs w:val="24"/>
+          <w:lang w:val="es-MX"/>
+        </w:rPr>
+        <w:t xml:space="preserve">Muestra </w:t>
+      </w:r>
+      <w:r>
+        <w:rPr>
+          <w:rFonts w:asciiTheme="minorHAnsi" w:eastAsiaTheme="minorHAnsi" w:hAnsiTheme="minorHAnsi" w:cstheme="minorHAnsi"/>
+          <w:b w:val="0"/>
+          <w:color w:val="FF0000"/>
+          <w:kern w:val="0"/>
+          <w:sz w:val="24"/>
+          <w:szCs w:val="24"/>
+          <w:lang w:val="es-MX"/>
+        </w:rPr>
+        <w:t>${</w:t>
+      </w:r>
+      <w:proofErr w:type="spellStart"/>
+      <w:r>
+        <w:rPr>
+          <w:rFonts w:asciiTheme="minorHAnsi" w:eastAsiaTheme="minorHAnsi" w:hAnsiTheme="minorHAnsi" w:cstheme="minorHAnsi"/>
+          <w:b w:val="0"/>
+          <w:color w:val="FF0000"/>
+          <w:kern w:val="0"/>
+          <w:sz w:val="24"/>
+          <w:szCs w:val="24"/>
+          <w:lang w:val="es-MX"/>
+        </w:rPr>
+        <w:t>total_colab</w:t>
+      </w:r>
+      <w:proofErr w:type="spellEnd"/>
+      <w:r>
+        <w:rPr>
+          <w:rFonts w:asciiTheme="minorHAnsi" w:eastAsiaTheme="minorHAnsi" w:hAnsiTheme="minorHAnsi" w:cstheme="minorHAnsi"/>
+          <w:b w:val="0"/>
+          <w:color w:val="FF0000"/>
+          <w:kern w:val="0"/>
+          <w:sz w:val="24"/>
+          <w:szCs w:val="24"/>
+          <w:lang w:val="es-MX"/>
+        </w:rPr>
+        <w:t>}</w:t>
+      </w:r>
+      <w:r>
+        <w:rPr>
+          <w:rFonts w:asciiTheme="minorHAnsi" w:eastAsiaTheme="minorHAnsi" w:hAnsiTheme="minorHAnsi" w:cstheme="minorHAnsi"/>
+          <w:bCs/>
+          <w:color w:val="auto"/>
+          <w:kern w:val="0"/>
+          <w:sz w:val="24"/>
+          <w:szCs w:val="24"/>
+          <w:lang w:val="es-MX"/>
+        </w:rPr>
+        <w:t xml:space="preserve"> colaboradores</w:t>
+      </w:r>
+    </w:p>
+    <w:p>
+      <w:pPr>
+        <w:jc w:val="center"/>
+        <w:rPr>
+          <w:rFonts w:cstheme="minorHAnsi"/>
+          <w:sz w:val="24"/>
+          <w:szCs w:val="24"/>
+        </w:rPr>
+      </w:pPr>
+      <w:proofErr w:type="gramStart"/>
+      <w:r>
+        <w:rPr>
+          <w:rFonts w:cstheme="minorHAnsi"/>
+          <w:sz w:val="24"/>
+          <w:szCs w:val="24"/>
+        </w:rPr>
+        <w:t>Total</w:t>
+      </w:r>
+      <w:proofErr w:type="gramEnd"/>
+      <w:r>
+        <w:rPr>
+          <w:rFonts w:cstheme="minorHAnsi"/>
+          <w:sz w:val="24"/>
+          <w:szCs w:val="24"/>
+        </w:rPr>
+        <w:t xml:space="preserve"> hombres </w:t>
+      </w:r>
+      <w:r>
+        <w:rPr>
+          <w:rFonts w:cstheme="minorHAnsi"/>
+          <w:color w:val="FF0000"/>
+          <w:sz w:val="24"/>
+          <w:szCs w:val="24"/>
+        </w:rPr>
+        <w:t>${hombres}</w:t>
+      </w:r>
+      <w:r>
+        <w:rPr>
+          <w:rFonts w:cstheme="minorHAnsi"/>
+          <w:color w:val="FF0000"/>
+          <w:sz w:val="24"/>
+          <w:szCs w:val="24"/>
+        </w:rPr>
+        <w:tab/>
+      </w:r>
+      <w:r>
+        <w:rPr>
+          <w:rFonts w:cstheme="minorHAnsi"/>
+          <w:sz w:val="24"/>
+          <w:szCs w:val="24"/>
+        </w:rPr>
+        <w:t xml:space="preserve">Total mujeres </w:t>
+      </w:r>
+      <w:r>
+        <w:rPr>
+          <w:rFonts w:cstheme="minorHAnsi"/>
+          <w:color w:val="FF0000"/>
+          <w:sz w:val="24"/>
+          <w:szCs w:val="24"/>
+        </w:rPr>
+        <w:t>${mujeres}</w:t>
+      </w:r>
+    </w:p>
+    <w:p>
+      <w:pPr>
+        <w:pStyle w:val="Prrafodelista"/>
+        <w:ind w:left="1440"/>
+        <w:jc w:val="both"/>
+        <w:rPr>
+          <w:rFonts w:ascii="Bahnschrift" w:hAnsi="Bahnschrift"/>
+          <w:b/>
+          <w:sz w:val="28"/>
+          <w:szCs w:val="28"/>
+          <w14:shadow w14:blurRad="38100" w14:dist="19050" w14:dir="2700000" w14:sx="100000" w14:sy="100000" w14:kx="0" w14:ky="0" w14:algn="tl">
+            <w14:schemeClr w14:val="dk1">
+              <w14:alpha w14:val="60000"/>
+            </w14:schemeClr>
+          </w14:shadow>
+          <w14:textOutline w14:w="0" w14:cap="flat" w14:cmpd="sng" w14:algn="ctr">
+            <w14:noFill/>
+            <w14:prstDash w14:val="solid"/>
+            <w14:round/>
+          </w14:textOutline>
+        </w:rPr>
+      </w:pPr>
+    </w:p>
+    <w:p>
+      <w:pPr>
+        <w:pStyle w:val="Prrafodelista"/>
+        <w:numPr>
+          <w:ilvl w:val="1"/>
+          <w:numId w:val="22"/>
+        </w:numPr>
+        <w:jc w:val="both"/>
+        <w:rPr>
+          <w:rFonts w:ascii="Bahnschrift" w:hAnsi="Bahnschrift"/>
+          <w:bCs/>
+          <w:sz w:val="24"/>
+          <w:szCs w:val="24"/>
+          <w14:shadow w14:blurRad="38100" w14:dist="19050" w14:dir="2700000" w14:sx="100000" w14:sy="100000" w14:kx="0" w14:ky="0" w14:algn="tl">
+            <w14:schemeClr w14:val="dk1">
+              <w14:alpha w14:val="60000"/>
+            </w14:schemeClr>
+          </w14:shadow>
+          <w14:textOutline w14:w="0" w14:cap="flat" w14:cmpd="sng" w14:algn="ctr">
+            <w14:noFill/>
+            <w14:prstDash w14:val="solid"/>
+            <w14:round/>
+          </w14:textOutline>
+        </w:rPr>
+      </w:pPr>
+      <w:r>
+        <w:rPr>
+          <w:rFonts w:ascii="Bahnschrift" w:hAnsi="Bahnschrift"/>
+          <w:bCs/>
+          <w:sz w:val="24"/>
+          <w:szCs w:val="24"/>
+          <w14:shadow w14:blurRad="38100" w14:dist="19050" w14:dir="2700000" w14:sx="100000" w14:sy="100000" w14:kx="0" w14:ky="0" w14:algn="tl">
+            <w14:schemeClr w14:val="dk1">
+              <w14:alpha w14:val="60000"/>
+            </w14:schemeClr>
+          </w14:shadow>
+          <w14:textOutline w14:w="0" w14:cap="flat" w14:cmpd="sng" w14:algn="ctr">
+            <w14:noFill/>
+            <w14:prstDash w14:val="solid"/>
+            <w14:round/>
+          </w14:textOutline>
+        </w:rPr>
+        <w:t>Medio</w:t>
+      </w:r>
+      <w:r>
+        <w:rPr>
+          <w:rFonts w:ascii="Bahnschrift" w:hAnsi="Bahnschrift"/>
+          <w:bCs/>
+          <w:sz w:val="24"/>
+          <w:szCs w:val="24"/>
+          <w14:shadow w14:blurRad="38100" w14:dist="19050" w14:dir="2700000" w14:sx="100000" w14:sy="100000" w14:kx="0" w14:ky="0" w14:algn="tl">
+            <w14:schemeClr w14:val="dk1">
+              <w14:alpha w14:val="60000"/>
+            </w14:schemeClr>
+          </w14:shadow>
+          <w14:textOutline w14:w="0" w14:cap="flat" w14:cmpd="sng" w14:algn="ctr">
+            <w14:noFill/>
+            <w14:prstDash w14:val="solid"/>
+            <w14:round/>
+          </w14:textOutline>
+        </w:rPr>
+        <w:t xml:space="preserve"> de Calificación</w:t>
+      </w:r>
+    </w:p>
+    <w:p>
+      <w:pPr>
+        <w:jc w:val="both"/>
+        <w:rPr>
+          <w:rFonts w:cstheme="minorHAnsi"/>
+          <w:sz w:val="24"/>
+          <w:szCs w:val="24"/>
+        </w:rPr>
+      </w:pPr>
+      <w:r>
+        <w:rPr>
+          <w:rFonts w:cstheme="minorHAnsi"/>
+          <w:sz w:val="24"/>
+          <w:szCs w:val="24"/>
+        </w:rPr>
+        <w:t>De acuerdo con el</w:t>
+      </w:r>
+      <w:r>
+        <w:rPr>
+          <w:rFonts w:cstheme="minorHAnsi"/>
+          <w:sz w:val="24"/>
+          <w:szCs w:val="24"/>
+        </w:rPr>
+        <w:t xml:space="preserve"> ${</w:t>
+      </w:r>
+      <w:proofErr w:type="spellStart"/>
+      <w:r>
+        <w:rPr>
+          <w:rFonts w:cstheme="minorHAnsi"/>
+          <w:sz w:val="24"/>
+          <w:szCs w:val="24"/>
+        </w:rPr>
+        <w:t>guia_numeral</w:t>
+      </w:r>
+      <w:proofErr w:type="spellEnd"/>
+      <w:r>
+        <w:rPr>
+          <w:rFonts w:cstheme="minorHAnsi"/>
+          <w:sz w:val="24"/>
+          <w:szCs w:val="24"/>
+        </w:rPr>
+        <w:t xml:space="preserve">} </w:t>
+      </w:r>
+      <w:r>
+        <w:rPr>
+          <w:rFonts w:cstheme="minorHAnsi"/>
+          <w:sz w:val="24"/>
+          <w:szCs w:val="24"/>
+        </w:rPr>
+        <w:t>de la NOM-035-STPS-2018, a partir de la suma de cada puntaje y de cada uno de los ítems que integran los cuestionarios individuales, se determinó y analizo la calificación final, por categoría y por dominio de cada uno de sus colaboradores y del centro de trabajo, el nivel de riesgo de estos, así como las acciones que se deberán adoptar para el control de los factores de riesgo psicosocial, según corresponda, con base en las tablas siguientes:</w:t>
+      </w:r>
+    </w:p>
+    <w:p>
+      <w:pPr>
+        <w:pStyle w:val="Prrafodelista"/>
+        <w:numPr>
+          <w:ilvl w:val="0"/>
+          <w:numId w:val="18"/>
+        </w:numPr>
+        <w:ind w:left="426"/>
+        <w:jc w:val="both"/>
+        <w:rPr>
+          <w:rFonts w:cstheme="minorHAnsi"/>
+        </w:rPr>
+      </w:pPr>
+      <w:r>
+        <w:rPr>
+          <w:rFonts w:cstheme="minorHAnsi"/>
+          <w:sz w:val="24"/>
+          <w:szCs w:val="24"/>
+        </w:rPr>
+        <w:lastRenderedPageBreak/>
+        <w:t>Para obtener la calificación se consideró la agrupación de los ítems por categoría, dominio y dimensión, de acuerdo con lo siguiente:</w:t>
+      </w:r>
     </w:p>
     <w:p>
       <w:pPr>
         <w:pStyle w:val="Default"/>
         <w:numPr>
           <w:ilvl w:val="2"/>
-          <w:numId w:val="1"/>
+          <w:numId w:val="22"/>
         </w:numPr>
         <w:ind w:left="567" w:hanging="283"/>
         <w:jc w:val="both"/>
@@ -3965,414 +4997,61 @@
           <w:rFonts w:asciiTheme="minorHAnsi" w:hAnsiTheme="minorHAnsi" w:cstheme="minorHAnsi"/>
           <w:color w:val="auto"/>
         </w:rPr>
-        <w:t>Para obtener la calificaci</w:t>
-      </w:r>
-      <w:r>
-        <w:rPr>
-          <w:rFonts w:asciiTheme="minorHAnsi" w:hAnsiTheme="minorHAnsi" w:cstheme="minorHAnsi" w:hint="cs"/>
-          <w:color w:val="auto"/>
-        </w:rPr>
-        <w:t>ó</w:t>
+        <w:t xml:space="preserve">Las respuestas a los ítems del cuestionario para la identificación de los factores de riesgo psicosocial </w:t>
       </w:r>
       <w:r>
         <w:rPr>
           <w:rFonts w:asciiTheme="minorHAnsi" w:hAnsiTheme="minorHAnsi" w:cstheme="minorHAnsi"/>
           <w:color w:val="auto"/>
         </w:rPr>
-        <w:t>n se consider</w:t>
+        <w:t xml:space="preserve">y evaluación del entorno organizacional </w:t>
       </w:r>
       <w:r>
         <w:rPr>
           <w:rFonts w:asciiTheme="minorHAnsi" w:hAnsiTheme="minorHAnsi" w:cstheme="minorHAnsi"/>
           <w:color w:val="auto"/>
         </w:rPr>
-        <w:t xml:space="preserve">ó </w:t>
-      </w:r>
-      <w:r>
+        <w:t xml:space="preserve">se calificaron, de acuerdo con la puntación de la tabla siguiente: </w:t>
+      </w:r>
+    </w:p>
+    <w:p>
+      <w:pPr>
+        <w:pStyle w:val="Default"/>
+        <w:jc w:val="both"/>
         <w:rPr>
           <w:rFonts w:asciiTheme="minorHAnsi" w:hAnsiTheme="minorHAnsi" w:cstheme="minorHAnsi"/>
           <w:color w:val="auto"/>
         </w:rPr>
-        <w:t xml:space="preserve">la Tabla </w:t>
-      </w:r>
-      <w:r>
+      </w:pPr>
+    </w:p>
+    <w:p>
+      <w:pPr>
+        <w:pStyle w:val="Default"/>
+        <w:jc w:val="center"/>
         <w:rPr>
           <w:rFonts w:asciiTheme="minorHAnsi" w:hAnsiTheme="minorHAnsi" w:cstheme="minorHAnsi"/>
           <w:color w:val="auto"/>
         </w:rPr>
-        <w:t>3</w:t>
-      </w:r>
-      <w:r>
+      </w:pPr>
+    </w:p>
+    <w:p>
+      <w:pPr>
+        <w:pStyle w:val="Default"/>
+        <w:jc w:val="center"/>
         <w:rPr>
           <w:rFonts w:asciiTheme="minorHAnsi" w:hAnsiTheme="minorHAnsi" w:cstheme="minorHAnsi"/>
           <w:color w:val="auto"/>
         </w:rPr>
-        <w:t xml:space="preserve"> que agrupa los </w:t>
-      </w:r>
-      <w:r>
-        <w:rPr>
-          <w:rFonts w:asciiTheme="minorHAnsi" w:hAnsiTheme="minorHAnsi" w:cstheme="minorHAnsi" w:hint="cs"/>
-          <w:color w:val="auto"/>
-        </w:rPr>
-        <w:t>í</w:t>
-      </w:r>
-      <w:r>
-        <w:rPr>
-          <w:rFonts w:asciiTheme="minorHAnsi" w:hAnsiTheme="minorHAnsi" w:cstheme="minorHAnsi"/>
-          <w:color w:val="auto"/>
-        </w:rPr>
-        <w:t>tems por categor</w:t>
-      </w:r>
-      <w:r>
-        <w:rPr>
-          <w:rFonts w:asciiTheme="minorHAnsi" w:hAnsiTheme="minorHAnsi" w:cstheme="minorHAnsi" w:hint="cs"/>
-          <w:color w:val="auto"/>
-        </w:rPr>
-        <w:t>í</w:t>
-      </w:r>
-      <w:r>
-        <w:rPr>
-          <w:rFonts w:asciiTheme="minorHAnsi" w:hAnsiTheme="minorHAnsi" w:cstheme="minorHAnsi"/>
-          <w:color w:val="auto"/>
-        </w:rPr>
-        <w:t>a, dominio y dimensi</w:t>
-      </w:r>
-      <w:r>
-        <w:rPr>
-          <w:rFonts w:asciiTheme="minorHAnsi" w:hAnsiTheme="minorHAnsi" w:cstheme="minorHAnsi" w:hint="cs"/>
-          <w:color w:val="auto"/>
-        </w:rPr>
-        <w:t>ó</w:t>
-      </w:r>
-      <w:r>
-        <w:rPr>
-          <w:rFonts w:asciiTheme="minorHAnsi" w:hAnsiTheme="minorHAnsi" w:cstheme="minorHAnsi"/>
-          <w:color w:val="auto"/>
-        </w:rPr>
-        <w:t>n,</w:t>
-      </w:r>
-      <w:r>
-        <w:rPr>
-          <w:rFonts w:asciiTheme="minorHAnsi" w:hAnsiTheme="minorHAnsi" w:cstheme="minorHAnsi"/>
-          <w:color w:val="auto"/>
-        </w:rPr>
-        <w:t xml:space="preserve"> </w:t>
-      </w:r>
-      <w:r>
-        <w:rPr>
-          <w:rFonts w:asciiTheme="minorHAnsi" w:hAnsiTheme="minorHAnsi" w:cstheme="minorHAnsi"/>
-          <w:color w:val="auto"/>
-        </w:rPr>
-        <w:t>y proceder de la manera siguiente:</w:t>
-      </w:r>
-    </w:p>
-    <w:p>
-      <w:pPr>
-        <w:pStyle w:val="Default"/>
-        <w:numPr>
-          <w:ilvl w:val="1"/>
-          <w:numId w:val="11"/>
-        </w:numPr>
-        <w:jc w:val="both"/>
-        <w:rPr>
-          <w:rFonts w:asciiTheme="minorHAnsi" w:hAnsiTheme="minorHAnsi" w:cstheme="minorHAnsi"/>
-          <w:color w:val="auto"/>
-          <w:sz w:val="22"/>
-          <w:szCs w:val="22"/>
-        </w:rPr>
-      </w:pPr>
-      <w:r>
-        <w:rPr>
-          <w:rFonts w:asciiTheme="minorHAnsi" w:hAnsiTheme="minorHAnsi" w:cstheme="minorHAnsi"/>
-          <w:color w:val="auto"/>
-          <w:sz w:val="22"/>
-          <w:szCs w:val="22"/>
-        </w:rPr>
-        <w:t>Calificaci</w:t>
-      </w:r>
-      <w:r>
-        <w:rPr>
-          <w:rFonts w:asciiTheme="minorHAnsi" w:hAnsiTheme="minorHAnsi" w:cstheme="minorHAnsi" w:hint="cs"/>
-          <w:color w:val="auto"/>
-          <w:sz w:val="22"/>
-          <w:szCs w:val="22"/>
-        </w:rPr>
-        <w:t>ó</w:t>
-      </w:r>
-      <w:r>
-        <w:rPr>
-          <w:rFonts w:asciiTheme="minorHAnsi" w:hAnsiTheme="minorHAnsi" w:cstheme="minorHAnsi"/>
-          <w:color w:val="auto"/>
-          <w:sz w:val="22"/>
-          <w:szCs w:val="22"/>
-        </w:rPr>
-        <w:t>n del dominio (</w:t>
-      </w:r>
-      <w:proofErr w:type="spellStart"/>
-      <w:r>
-        <w:rPr>
-          <w:rFonts w:asciiTheme="minorHAnsi" w:hAnsiTheme="minorHAnsi" w:cstheme="minorHAnsi"/>
-          <w:color w:val="auto"/>
-          <w:sz w:val="22"/>
-          <w:szCs w:val="22"/>
-        </w:rPr>
-        <w:t>Cdom</w:t>
-      </w:r>
-      <w:proofErr w:type="spellEnd"/>
-      <w:r>
-        <w:rPr>
-          <w:rFonts w:asciiTheme="minorHAnsi" w:hAnsiTheme="minorHAnsi" w:cstheme="minorHAnsi"/>
-          <w:color w:val="auto"/>
-          <w:sz w:val="22"/>
-          <w:szCs w:val="22"/>
-        </w:rPr>
-        <w:t xml:space="preserve">). Se obtiene sumando el puntaje de cada uno de los </w:t>
-      </w:r>
-      <w:r>
-        <w:rPr>
-          <w:rFonts w:asciiTheme="minorHAnsi" w:hAnsiTheme="minorHAnsi" w:cstheme="minorHAnsi" w:hint="cs"/>
-          <w:color w:val="auto"/>
-          <w:sz w:val="22"/>
-          <w:szCs w:val="22"/>
-        </w:rPr>
-        <w:t>í</w:t>
-      </w:r>
-      <w:r>
-        <w:rPr>
-          <w:rFonts w:asciiTheme="minorHAnsi" w:hAnsiTheme="minorHAnsi" w:cstheme="minorHAnsi"/>
-          <w:color w:val="auto"/>
-          <w:sz w:val="22"/>
-          <w:szCs w:val="22"/>
-        </w:rPr>
-        <w:t>tems que integran el dominio;</w:t>
-      </w:r>
-    </w:p>
-    <w:p>
-      <w:pPr>
-        <w:pStyle w:val="Default"/>
-        <w:numPr>
-          <w:ilvl w:val="1"/>
-          <w:numId w:val="11"/>
-        </w:numPr>
-        <w:jc w:val="both"/>
-        <w:rPr>
-          <w:rFonts w:asciiTheme="minorHAnsi" w:hAnsiTheme="minorHAnsi" w:cstheme="minorHAnsi"/>
-          <w:color w:val="auto"/>
-          <w:sz w:val="22"/>
-          <w:szCs w:val="22"/>
-        </w:rPr>
-      </w:pPr>
-      <w:r>
-        <w:rPr>
-          <w:rFonts w:asciiTheme="minorHAnsi" w:hAnsiTheme="minorHAnsi" w:cstheme="minorHAnsi"/>
-          <w:color w:val="auto"/>
-          <w:sz w:val="22"/>
-          <w:szCs w:val="22"/>
-        </w:rPr>
-        <w:t>Calificaci</w:t>
-      </w:r>
-      <w:r>
-        <w:rPr>
-          <w:rFonts w:asciiTheme="minorHAnsi" w:hAnsiTheme="minorHAnsi" w:cstheme="minorHAnsi" w:hint="cs"/>
-          <w:color w:val="auto"/>
-          <w:sz w:val="22"/>
-          <w:szCs w:val="22"/>
-        </w:rPr>
-        <w:t>ó</w:t>
-      </w:r>
-      <w:r>
-        <w:rPr>
-          <w:rFonts w:asciiTheme="minorHAnsi" w:hAnsiTheme="minorHAnsi" w:cstheme="minorHAnsi"/>
-          <w:color w:val="auto"/>
-          <w:sz w:val="22"/>
-          <w:szCs w:val="22"/>
-        </w:rPr>
-        <w:t>n de la categor</w:t>
-      </w:r>
-      <w:r>
-        <w:rPr>
-          <w:rFonts w:asciiTheme="minorHAnsi" w:hAnsiTheme="minorHAnsi" w:cstheme="minorHAnsi" w:hint="cs"/>
-          <w:color w:val="auto"/>
-          <w:sz w:val="22"/>
-          <w:szCs w:val="22"/>
-        </w:rPr>
-        <w:t>í</w:t>
-      </w:r>
-      <w:r>
-        <w:rPr>
-          <w:rFonts w:asciiTheme="minorHAnsi" w:hAnsiTheme="minorHAnsi" w:cstheme="minorHAnsi"/>
-          <w:color w:val="auto"/>
-          <w:sz w:val="22"/>
-          <w:szCs w:val="22"/>
-        </w:rPr>
-        <w:t>a (</w:t>
-      </w:r>
-      <w:proofErr w:type="spellStart"/>
-      <w:r>
-        <w:rPr>
-          <w:rFonts w:asciiTheme="minorHAnsi" w:hAnsiTheme="minorHAnsi" w:cstheme="minorHAnsi"/>
-          <w:color w:val="auto"/>
-          <w:sz w:val="22"/>
-          <w:szCs w:val="22"/>
-        </w:rPr>
-        <w:t>Ccat</w:t>
-      </w:r>
-      <w:proofErr w:type="spellEnd"/>
-      <w:r>
-        <w:rPr>
-          <w:rFonts w:asciiTheme="minorHAnsi" w:hAnsiTheme="minorHAnsi" w:cstheme="minorHAnsi"/>
-          <w:color w:val="auto"/>
-          <w:sz w:val="22"/>
-          <w:szCs w:val="22"/>
-        </w:rPr>
-        <w:t xml:space="preserve">). Se obtiene sumando el puntaje de cada uno de los </w:t>
-      </w:r>
-      <w:r>
-        <w:rPr>
-          <w:rFonts w:asciiTheme="minorHAnsi" w:hAnsiTheme="minorHAnsi" w:cstheme="minorHAnsi" w:hint="cs"/>
-          <w:color w:val="auto"/>
-          <w:sz w:val="22"/>
-          <w:szCs w:val="22"/>
-        </w:rPr>
-        <w:t>í</w:t>
-      </w:r>
-      <w:r>
-        <w:rPr>
-          <w:rFonts w:asciiTheme="minorHAnsi" w:hAnsiTheme="minorHAnsi" w:cstheme="minorHAnsi"/>
-          <w:color w:val="auto"/>
-          <w:sz w:val="22"/>
-          <w:szCs w:val="22"/>
-        </w:rPr>
-        <w:t>tems que integran la categor</w:t>
-      </w:r>
-      <w:r>
-        <w:rPr>
-          <w:rFonts w:asciiTheme="minorHAnsi" w:hAnsiTheme="minorHAnsi" w:cstheme="minorHAnsi" w:hint="cs"/>
-          <w:color w:val="auto"/>
-          <w:sz w:val="22"/>
-          <w:szCs w:val="22"/>
-        </w:rPr>
-        <w:t>í</w:t>
-      </w:r>
-      <w:r>
-        <w:rPr>
-          <w:rFonts w:asciiTheme="minorHAnsi" w:hAnsiTheme="minorHAnsi" w:cstheme="minorHAnsi"/>
-          <w:color w:val="auto"/>
-          <w:sz w:val="22"/>
-          <w:szCs w:val="22"/>
-        </w:rPr>
-        <w:t>a, y</w:t>
-      </w:r>
-    </w:p>
-    <w:p>
-      <w:pPr>
-        <w:pStyle w:val="Default"/>
-        <w:numPr>
-          <w:ilvl w:val="1"/>
-          <w:numId w:val="11"/>
-        </w:numPr>
-        <w:jc w:val="both"/>
-        <w:rPr>
-          <w:rFonts w:asciiTheme="minorHAnsi" w:hAnsiTheme="minorHAnsi" w:cstheme="minorHAnsi"/>
-          <w:color w:val="auto"/>
-          <w:sz w:val="22"/>
-          <w:szCs w:val="22"/>
-        </w:rPr>
-      </w:pPr>
-      <w:r>
-        <w:rPr>
-          <w:rFonts w:asciiTheme="minorHAnsi" w:hAnsiTheme="minorHAnsi" w:cstheme="minorHAnsi"/>
-          <w:color w:val="auto"/>
-          <w:sz w:val="22"/>
-          <w:szCs w:val="22"/>
-        </w:rPr>
-        <w:t>Calificaci</w:t>
-      </w:r>
-      <w:r>
-        <w:rPr>
-          <w:rFonts w:asciiTheme="minorHAnsi" w:hAnsiTheme="minorHAnsi" w:cstheme="minorHAnsi" w:hint="cs"/>
-          <w:color w:val="auto"/>
-          <w:sz w:val="22"/>
-          <w:szCs w:val="22"/>
-        </w:rPr>
-        <w:t>ó</w:t>
-      </w:r>
-      <w:r>
-        <w:rPr>
-          <w:rFonts w:asciiTheme="minorHAnsi" w:hAnsiTheme="minorHAnsi" w:cstheme="minorHAnsi"/>
-          <w:color w:val="auto"/>
-          <w:sz w:val="22"/>
-          <w:szCs w:val="22"/>
-        </w:rPr>
-        <w:t>n final del cuestionario (</w:t>
-      </w:r>
-      <w:proofErr w:type="spellStart"/>
-      <w:r>
-        <w:rPr>
-          <w:rFonts w:asciiTheme="minorHAnsi" w:hAnsiTheme="minorHAnsi" w:cstheme="minorHAnsi"/>
-          <w:color w:val="auto"/>
-          <w:sz w:val="22"/>
-          <w:szCs w:val="22"/>
-        </w:rPr>
-        <w:t>Cfinal</w:t>
-      </w:r>
-      <w:proofErr w:type="spellEnd"/>
-      <w:r>
-        <w:rPr>
-          <w:rFonts w:asciiTheme="minorHAnsi" w:hAnsiTheme="minorHAnsi" w:cstheme="minorHAnsi"/>
-          <w:color w:val="auto"/>
-          <w:sz w:val="22"/>
-          <w:szCs w:val="22"/>
-        </w:rPr>
-        <w:t xml:space="preserve">). Se obtiene sumando el puntaje de todos y cada uno de los </w:t>
-      </w:r>
-      <w:r>
-        <w:rPr>
-          <w:rFonts w:asciiTheme="minorHAnsi" w:hAnsiTheme="minorHAnsi" w:cstheme="minorHAnsi" w:hint="cs"/>
-          <w:color w:val="auto"/>
-          <w:sz w:val="22"/>
-          <w:szCs w:val="22"/>
-        </w:rPr>
-        <w:t>í</w:t>
-      </w:r>
-      <w:r>
-        <w:rPr>
-          <w:rFonts w:asciiTheme="minorHAnsi" w:hAnsiTheme="minorHAnsi" w:cstheme="minorHAnsi"/>
-          <w:color w:val="auto"/>
-          <w:sz w:val="22"/>
-          <w:szCs w:val="22"/>
-        </w:rPr>
-        <w:t>tems que integran el cuestionario;</w:t>
-      </w:r>
-    </w:p>
-    <w:p>
-      <w:pPr>
-        <w:pStyle w:val="Default"/>
-        <w:jc w:val="both"/>
-        <w:rPr>
-          <w:rFonts w:asciiTheme="minorHAnsi" w:hAnsiTheme="minorHAnsi" w:cstheme="minorHAnsi"/>
-          <w:color w:val="auto"/>
-        </w:rPr>
-      </w:pPr>
-    </w:p>
-    <w:p>
-      <w:pPr>
-        <w:pStyle w:val="Default"/>
-        <w:jc w:val="both"/>
-        <w:rPr>
-          <w:rFonts w:asciiTheme="minorHAnsi" w:hAnsiTheme="minorHAnsi" w:cstheme="minorHAnsi"/>
-          <w:color w:val="auto"/>
-        </w:rPr>
       </w:pPr>
       <w:r>
         <w:rPr>
           <w:noProof/>
         </w:rPr>
         <w:drawing>
-          <wp:inline distT="0" distB="0" distL="0" distR="0" wp14:anchorId="1A7AA744" wp14:editId="40BB8A56">
-            <wp:extent cx="5612130" cy="2731770"/>
-            <wp:effectExtent l="0" t="0" r="7620" b="0"/>
-            <wp:docPr id="2034023652" name="Imagen 3"/>
+          <wp:inline distT="0" distB="0" distL="0" distR="0" wp14:anchorId="6A034AB0" wp14:editId="01908607">
+            <wp:extent cx="5612130" cy="1423670"/>
+            <wp:effectExtent l="0" t="0" r="7620" b="5080"/>
+            <wp:docPr id="70313279" name="Imagen 3"/>
             <wp:cNvGraphicFramePr>
               <a:graphicFrameLocks xmlns:a="http://schemas.openxmlformats.org/drawingml/2006/main" noChangeAspect="1"/>
             </wp:cNvGraphicFramePr>
@@ -4401,7 +5080,7 @@
                   <pic:spPr bwMode="auto">
                     <a:xfrm>
                       <a:off x="0" y="0"/>
-                      <a:ext cx="5612130" cy="2731770"/>
+                      <a:ext cx="5612130" cy="1423670"/>
                     </a:xfrm>
                     <a:prstGeom prst="rect">
                       <a:avLst/>
@@ -4421,7 +5100,7 @@
     <w:p>
       <w:pPr>
         <w:pStyle w:val="Default"/>
-        <w:jc w:val="both"/>
+        <w:jc w:val="center"/>
         <w:rPr>
           <w:rFonts w:asciiTheme="minorHAnsi" w:hAnsiTheme="minorHAnsi" w:cstheme="minorHAnsi"/>
           <w:color w:val="auto"/>
@@ -4443,7 +5122,7 @@
         <w:pStyle w:val="Default"/>
         <w:numPr>
           <w:ilvl w:val="2"/>
-          <w:numId w:val="1"/>
+          <w:numId w:val="22"/>
         </w:numPr>
         <w:ind w:left="567" w:hanging="283"/>
         <w:jc w:val="both"/>
@@ -4457,14 +5136,384 @@
           <w:rFonts w:asciiTheme="minorHAnsi" w:hAnsiTheme="minorHAnsi" w:cstheme="minorHAnsi"/>
           <w:color w:val="auto"/>
         </w:rPr>
-        <w:t>Los resultados de los cuestionarios se evaluaron conforme a los siguientes rangos</w:t>
+        <w:t>Para obtener la calificaci</w:t>
+      </w:r>
+      <w:r>
+        <w:rPr>
+          <w:rFonts w:asciiTheme="minorHAnsi" w:hAnsiTheme="minorHAnsi" w:cstheme="minorHAnsi" w:hint="cs"/>
+          <w:color w:val="auto"/>
+        </w:rPr>
+        <w:t>ó</w:t>
       </w:r>
       <w:r>
         <w:rPr>
           <w:rFonts w:asciiTheme="minorHAnsi" w:hAnsiTheme="minorHAnsi" w:cstheme="minorHAnsi"/>
           <w:color w:val="auto"/>
         </w:rPr>
-        <w:t>:</w:t>
+        <w:t>n se consider</w:t>
+      </w:r>
+      <w:r>
+        <w:rPr>
+          <w:rFonts w:asciiTheme="minorHAnsi" w:hAnsiTheme="minorHAnsi" w:cstheme="minorHAnsi"/>
+          <w:color w:val="auto"/>
+        </w:rPr>
+        <w:t xml:space="preserve">ó </w:t>
+      </w:r>
+      <w:r>
+        <w:rPr>
+          <w:rFonts w:asciiTheme="minorHAnsi" w:hAnsiTheme="minorHAnsi" w:cstheme="minorHAnsi"/>
+          <w:color w:val="auto"/>
+        </w:rPr>
+        <w:t xml:space="preserve">la Tabla </w:t>
+      </w:r>
+      <w:r>
+        <w:rPr>
+          <w:rFonts w:asciiTheme="minorHAnsi" w:hAnsiTheme="minorHAnsi" w:cstheme="minorHAnsi"/>
+          <w:color w:val="auto"/>
+        </w:rPr>
+        <w:t>3</w:t>
+      </w:r>
+      <w:r>
+        <w:rPr>
+          <w:rFonts w:asciiTheme="minorHAnsi" w:hAnsiTheme="minorHAnsi" w:cstheme="minorHAnsi"/>
+          <w:color w:val="auto"/>
+        </w:rPr>
+        <w:t xml:space="preserve"> que agrupa los </w:t>
+      </w:r>
+      <w:r>
+        <w:rPr>
+          <w:rFonts w:asciiTheme="minorHAnsi" w:hAnsiTheme="minorHAnsi" w:cstheme="minorHAnsi" w:hint="cs"/>
+          <w:color w:val="auto"/>
+        </w:rPr>
+        <w:t>í</w:t>
+      </w:r>
+      <w:r>
+        <w:rPr>
+          <w:rFonts w:asciiTheme="minorHAnsi" w:hAnsiTheme="minorHAnsi" w:cstheme="minorHAnsi"/>
+          <w:color w:val="auto"/>
+        </w:rPr>
+        <w:t>tems por categor</w:t>
+      </w:r>
+      <w:r>
+        <w:rPr>
+          <w:rFonts w:asciiTheme="minorHAnsi" w:hAnsiTheme="minorHAnsi" w:cstheme="minorHAnsi" w:hint="cs"/>
+          <w:color w:val="auto"/>
+        </w:rPr>
+        <w:t>í</w:t>
+      </w:r>
+      <w:r>
+        <w:rPr>
+          <w:rFonts w:asciiTheme="minorHAnsi" w:hAnsiTheme="minorHAnsi" w:cstheme="minorHAnsi"/>
+          <w:color w:val="auto"/>
+        </w:rPr>
+        <w:t>a, dominio y dimensi</w:t>
+      </w:r>
+      <w:r>
+        <w:rPr>
+          <w:rFonts w:asciiTheme="minorHAnsi" w:hAnsiTheme="minorHAnsi" w:cstheme="minorHAnsi" w:hint="cs"/>
+          <w:color w:val="auto"/>
+        </w:rPr>
+        <w:t>ó</w:t>
+      </w:r>
+      <w:r>
+        <w:rPr>
+          <w:rFonts w:asciiTheme="minorHAnsi" w:hAnsiTheme="minorHAnsi" w:cstheme="minorHAnsi"/>
+          <w:color w:val="auto"/>
+        </w:rPr>
+        <w:t>n,</w:t>
+      </w:r>
+      <w:r>
+        <w:rPr>
+          <w:rFonts w:asciiTheme="minorHAnsi" w:hAnsiTheme="minorHAnsi" w:cstheme="minorHAnsi"/>
+          <w:color w:val="auto"/>
+        </w:rPr>
+        <w:t xml:space="preserve"> </w:t>
+      </w:r>
+      <w:r>
+        <w:rPr>
+          <w:rFonts w:asciiTheme="minorHAnsi" w:hAnsiTheme="minorHAnsi" w:cstheme="minorHAnsi"/>
+          <w:color w:val="auto"/>
+        </w:rPr>
+        <w:t>y proceder de la manera siguiente:</w:t>
+      </w:r>
+    </w:p>
+    <w:p>
+      <w:pPr>
+        <w:pStyle w:val="Default"/>
+        <w:numPr>
+          <w:ilvl w:val="1"/>
+          <w:numId w:val="11"/>
+        </w:numPr>
+        <w:jc w:val="both"/>
+        <w:rPr>
+          <w:rFonts w:asciiTheme="minorHAnsi" w:hAnsiTheme="minorHAnsi" w:cstheme="minorHAnsi"/>
+          <w:color w:val="auto"/>
+          <w:sz w:val="22"/>
+          <w:szCs w:val="22"/>
+        </w:rPr>
+      </w:pPr>
+      <w:r>
+        <w:rPr>
+          <w:rFonts w:asciiTheme="minorHAnsi" w:hAnsiTheme="minorHAnsi" w:cstheme="minorHAnsi"/>
+          <w:color w:val="auto"/>
+          <w:sz w:val="22"/>
+          <w:szCs w:val="22"/>
+        </w:rPr>
+        <w:t>Calificaci</w:t>
+      </w:r>
+      <w:r>
+        <w:rPr>
+          <w:rFonts w:asciiTheme="minorHAnsi" w:hAnsiTheme="minorHAnsi" w:cstheme="minorHAnsi" w:hint="cs"/>
+          <w:color w:val="auto"/>
+          <w:sz w:val="22"/>
+          <w:szCs w:val="22"/>
+        </w:rPr>
+        <w:t>ó</w:t>
+      </w:r>
+      <w:r>
+        <w:rPr>
+          <w:rFonts w:asciiTheme="minorHAnsi" w:hAnsiTheme="minorHAnsi" w:cstheme="minorHAnsi"/>
+          <w:color w:val="auto"/>
+          <w:sz w:val="22"/>
+          <w:szCs w:val="22"/>
+        </w:rPr>
+        <w:t>n del dominio (</w:t>
+      </w:r>
+      <w:proofErr w:type="spellStart"/>
+      <w:r>
+        <w:rPr>
+          <w:rFonts w:asciiTheme="minorHAnsi" w:hAnsiTheme="minorHAnsi" w:cstheme="minorHAnsi"/>
+          <w:color w:val="auto"/>
+          <w:sz w:val="22"/>
+          <w:szCs w:val="22"/>
+        </w:rPr>
+        <w:t>Cdom</w:t>
+      </w:r>
+      <w:proofErr w:type="spellEnd"/>
+      <w:r>
+        <w:rPr>
+          <w:rFonts w:asciiTheme="minorHAnsi" w:hAnsiTheme="minorHAnsi" w:cstheme="minorHAnsi"/>
+          <w:color w:val="auto"/>
+          <w:sz w:val="22"/>
+          <w:szCs w:val="22"/>
+        </w:rPr>
+        <w:t xml:space="preserve">). Se obtiene sumando el puntaje de cada uno de los </w:t>
+      </w:r>
+      <w:r>
+        <w:rPr>
+          <w:rFonts w:asciiTheme="minorHAnsi" w:hAnsiTheme="minorHAnsi" w:cstheme="minorHAnsi" w:hint="cs"/>
+          <w:color w:val="auto"/>
+          <w:sz w:val="22"/>
+          <w:szCs w:val="22"/>
+        </w:rPr>
+        <w:t>í</w:t>
+      </w:r>
+      <w:r>
+        <w:rPr>
+          <w:rFonts w:asciiTheme="minorHAnsi" w:hAnsiTheme="minorHAnsi" w:cstheme="minorHAnsi"/>
+          <w:color w:val="auto"/>
+          <w:sz w:val="22"/>
+          <w:szCs w:val="22"/>
+        </w:rPr>
+        <w:t>tems que integran el dominio;</w:t>
+      </w:r>
+    </w:p>
+    <w:p>
+      <w:pPr>
+        <w:pStyle w:val="Default"/>
+        <w:numPr>
+          <w:ilvl w:val="1"/>
+          <w:numId w:val="11"/>
+        </w:numPr>
+        <w:jc w:val="both"/>
+        <w:rPr>
+          <w:rFonts w:asciiTheme="minorHAnsi" w:hAnsiTheme="minorHAnsi" w:cstheme="minorHAnsi"/>
+          <w:color w:val="auto"/>
+          <w:sz w:val="22"/>
+          <w:szCs w:val="22"/>
+        </w:rPr>
+      </w:pPr>
+      <w:r>
+        <w:rPr>
+          <w:rFonts w:asciiTheme="minorHAnsi" w:hAnsiTheme="minorHAnsi" w:cstheme="minorHAnsi"/>
+          <w:color w:val="auto"/>
+          <w:sz w:val="22"/>
+          <w:szCs w:val="22"/>
+        </w:rPr>
+        <w:t>Calificaci</w:t>
+      </w:r>
+      <w:r>
+        <w:rPr>
+          <w:rFonts w:asciiTheme="minorHAnsi" w:hAnsiTheme="minorHAnsi" w:cstheme="minorHAnsi" w:hint="cs"/>
+          <w:color w:val="auto"/>
+          <w:sz w:val="22"/>
+          <w:szCs w:val="22"/>
+        </w:rPr>
+        <w:t>ó</w:t>
+      </w:r>
+      <w:r>
+        <w:rPr>
+          <w:rFonts w:asciiTheme="minorHAnsi" w:hAnsiTheme="minorHAnsi" w:cstheme="minorHAnsi"/>
+          <w:color w:val="auto"/>
+          <w:sz w:val="22"/>
+          <w:szCs w:val="22"/>
+        </w:rPr>
+        <w:t>n de la categor</w:t>
+      </w:r>
+      <w:r>
+        <w:rPr>
+          <w:rFonts w:asciiTheme="minorHAnsi" w:hAnsiTheme="minorHAnsi" w:cstheme="minorHAnsi" w:hint="cs"/>
+          <w:color w:val="auto"/>
+          <w:sz w:val="22"/>
+          <w:szCs w:val="22"/>
+        </w:rPr>
+        <w:t>í</w:t>
+      </w:r>
+      <w:r>
+        <w:rPr>
+          <w:rFonts w:asciiTheme="minorHAnsi" w:hAnsiTheme="minorHAnsi" w:cstheme="minorHAnsi"/>
+          <w:color w:val="auto"/>
+          <w:sz w:val="22"/>
+          <w:szCs w:val="22"/>
+        </w:rPr>
+        <w:t>a (</w:t>
+      </w:r>
+      <w:proofErr w:type="spellStart"/>
+      <w:r>
+        <w:rPr>
+          <w:rFonts w:asciiTheme="minorHAnsi" w:hAnsiTheme="minorHAnsi" w:cstheme="minorHAnsi"/>
+          <w:color w:val="auto"/>
+          <w:sz w:val="22"/>
+          <w:szCs w:val="22"/>
+        </w:rPr>
+        <w:t>Ccat</w:t>
+      </w:r>
+      <w:proofErr w:type="spellEnd"/>
+      <w:r>
+        <w:rPr>
+          <w:rFonts w:asciiTheme="minorHAnsi" w:hAnsiTheme="minorHAnsi" w:cstheme="minorHAnsi"/>
+          <w:color w:val="auto"/>
+          <w:sz w:val="22"/>
+          <w:szCs w:val="22"/>
+        </w:rPr>
+        <w:t xml:space="preserve">). Se obtiene sumando el puntaje de cada uno de los </w:t>
+      </w:r>
+      <w:r>
+        <w:rPr>
+          <w:rFonts w:asciiTheme="minorHAnsi" w:hAnsiTheme="minorHAnsi" w:cstheme="minorHAnsi" w:hint="cs"/>
+          <w:color w:val="auto"/>
+          <w:sz w:val="22"/>
+          <w:szCs w:val="22"/>
+        </w:rPr>
+        <w:t>í</w:t>
+      </w:r>
+      <w:r>
+        <w:rPr>
+          <w:rFonts w:asciiTheme="minorHAnsi" w:hAnsiTheme="minorHAnsi" w:cstheme="minorHAnsi"/>
+          <w:color w:val="auto"/>
+          <w:sz w:val="22"/>
+          <w:szCs w:val="22"/>
+        </w:rPr>
+        <w:t>tems que integran la categor</w:t>
+      </w:r>
+      <w:r>
+        <w:rPr>
+          <w:rFonts w:asciiTheme="minorHAnsi" w:hAnsiTheme="minorHAnsi" w:cstheme="minorHAnsi" w:hint="cs"/>
+          <w:color w:val="auto"/>
+          <w:sz w:val="22"/>
+          <w:szCs w:val="22"/>
+        </w:rPr>
+        <w:t>í</w:t>
+      </w:r>
+      <w:r>
+        <w:rPr>
+          <w:rFonts w:asciiTheme="minorHAnsi" w:hAnsiTheme="minorHAnsi" w:cstheme="minorHAnsi"/>
+          <w:color w:val="auto"/>
+          <w:sz w:val="22"/>
+          <w:szCs w:val="22"/>
+        </w:rPr>
+        <w:t>a, y</w:t>
+      </w:r>
+    </w:p>
+    <w:p>
+      <w:pPr>
+        <w:pStyle w:val="Default"/>
+        <w:numPr>
+          <w:ilvl w:val="1"/>
+          <w:numId w:val="11"/>
+        </w:numPr>
+        <w:jc w:val="both"/>
+        <w:rPr>
+          <w:rFonts w:asciiTheme="minorHAnsi" w:hAnsiTheme="minorHAnsi" w:cstheme="minorHAnsi"/>
+          <w:color w:val="auto"/>
+          <w:sz w:val="22"/>
+          <w:szCs w:val="22"/>
+        </w:rPr>
+      </w:pPr>
+      <w:r>
+        <w:rPr>
+          <w:rFonts w:asciiTheme="minorHAnsi" w:hAnsiTheme="minorHAnsi" w:cstheme="minorHAnsi"/>
+          <w:color w:val="auto"/>
+          <w:sz w:val="22"/>
+          <w:szCs w:val="22"/>
+        </w:rPr>
+        <w:t>Calificaci</w:t>
+      </w:r>
+      <w:r>
+        <w:rPr>
+          <w:rFonts w:asciiTheme="minorHAnsi" w:hAnsiTheme="minorHAnsi" w:cstheme="minorHAnsi" w:hint="cs"/>
+          <w:color w:val="auto"/>
+          <w:sz w:val="22"/>
+          <w:szCs w:val="22"/>
+        </w:rPr>
+        <w:t>ó</w:t>
+      </w:r>
+      <w:r>
+        <w:rPr>
+          <w:rFonts w:asciiTheme="minorHAnsi" w:hAnsiTheme="minorHAnsi" w:cstheme="minorHAnsi"/>
+          <w:color w:val="auto"/>
+          <w:sz w:val="22"/>
+          <w:szCs w:val="22"/>
+        </w:rPr>
+        <w:t>n final del cuestionario (</w:t>
+      </w:r>
+      <w:proofErr w:type="spellStart"/>
+      <w:r>
+        <w:rPr>
+          <w:rFonts w:asciiTheme="minorHAnsi" w:hAnsiTheme="minorHAnsi" w:cstheme="minorHAnsi"/>
+          <w:color w:val="auto"/>
+          <w:sz w:val="22"/>
+          <w:szCs w:val="22"/>
+        </w:rPr>
+        <w:t>Cfinal</w:t>
+      </w:r>
+      <w:proofErr w:type="spellEnd"/>
+      <w:r>
+        <w:rPr>
+          <w:rFonts w:asciiTheme="minorHAnsi" w:hAnsiTheme="minorHAnsi" w:cstheme="minorHAnsi"/>
+          <w:color w:val="auto"/>
+          <w:sz w:val="22"/>
+          <w:szCs w:val="22"/>
+        </w:rPr>
+        <w:t xml:space="preserve">). Se obtiene sumando el puntaje de todos y cada uno de los </w:t>
+      </w:r>
+      <w:r>
+        <w:rPr>
+          <w:rFonts w:asciiTheme="minorHAnsi" w:hAnsiTheme="minorHAnsi" w:cstheme="minorHAnsi" w:hint="cs"/>
+          <w:color w:val="auto"/>
+          <w:sz w:val="22"/>
+          <w:szCs w:val="22"/>
+        </w:rPr>
+        <w:t>í</w:t>
+      </w:r>
+      <w:r>
+        <w:rPr>
+          <w:rFonts w:asciiTheme="minorHAnsi" w:hAnsiTheme="minorHAnsi" w:cstheme="minorHAnsi"/>
+          <w:color w:val="auto"/>
+          <w:sz w:val="22"/>
+          <w:szCs w:val="22"/>
+        </w:rPr>
+        <w:t>tems que integran el cuestionario;</w:t>
       </w:r>
     </w:p>
     <w:p>
@@ -4492,10 +5541,10 @@
         </w:rPr>
         <w:lastRenderedPageBreak/>
         <w:drawing>
-          <wp:inline distT="0" distB="0" distL="0" distR="0" wp14:anchorId="47D51FCF" wp14:editId="02BE635E">
-            <wp:extent cx="5612130" cy="828040"/>
-            <wp:effectExtent l="0" t="0" r="7620" b="0"/>
-            <wp:docPr id="759936012" name="Imagen 4"/>
+          <wp:inline distT="0" distB="0" distL="0" distR="0" wp14:anchorId="59ABECE7" wp14:editId="4AEC1E62">
+            <wp:extent cx="5612130" cy="8052435"/>
+            <wp:effectExtent l="0" t="0" r="7620" b="5715"/>
+            <wp:docPr id="1879073821" name="Imagen 4"/>
             <wp:cNvGraphicFramePr>
               <a:graphicFrameLocks xmlns:a="http://schemas.openxmlformats.org/drawingml/2006/main" noChangeAspect="1"/>
             </wp:cNvGraphicFramePr>
@@ -4524,7 +5573,7 @@
                   <pic:spPr bwMode="auto">
                     <a:xfrm>
                       <a:off x="0" y="0"/>
-                      <a:ext cx="5612130" cy="828040"/>
+                      <a:ext cx="5612130" cy="8052435"/>
                     </a:xfrm>
                     <a:prstGeom prst="rect">
                       <a:avLst/>
@@ -4556,18 +5605,68 @@
         <w:pStyle w:val="Default"/>
         <w:jc w:val="both"/>
         <w:rPr>
+          <w:rFonts w:asciiTheme="minorHAnsi" w:hAnsiTheme="minorHAnsi" w:cstheme="minorHAnsi"/>
+          <w:color w:val="auto"/>
+        </w:rPr>
+      </w:pPr>
+    </w:p>
+    <w:p>
+      <w:pPr>
+        <w:pStyle w:val="Default"/>
+        <w:numPr>
+          <w:ilvl w:val="2"/>
+          <w:numId w:val="22"/>
+        </w:numPr>
+        <w:ind w:left="567" w:hanging="283"/>
+        <w:jc w:val="both"/>
+        <w:rPr>
+          <w:rFonts w:asciiTheme="minorHAnsi" w:hAnsiTheme="minorHAnsi" w:cstheme="minorHAnsi"/>
+          <w:color w:val="auto"/>
+        </w:rPr>
+      </w:pPr>
+      <w:r>
+        <w:rPr>
+          <w:rFonts w:asciiTheme="minorHAnsi" w:hAnsiTheme="minorHAnsi" w:cstheme="minorHAnsi"/>
+          <w:color w:val="auto"/>
+        </w:rPr>
+        <w:t>Los resultados de los cuestionarios se evaluaron conforme a los siguientes rangos</w:t>
+      </w:r>
+      <w:r>
+        <w:rPr>
+          <w:rFonts w:asciiTheme="minorHAnsi" w:hAnsiTheme="minorHAnsi" w:cstheme="minorHAnsi"/>
+          <w:color w:val="auto"/>
+        </w:rPr>
+        <w:t>:</w:t>
+      </w:r>
+    </w:p>
+    <w:p>
+      <w:pPr>
+        <w:pStyle w:val="Default"/>
+        <w:jc w:val="both"/>
+        <w:rPr>
+          <w:rFonts w:asciiTheme="minorHAnsi" w:hAnsiTheme="minorHAnsi" w:cstheme="minorHAnsi"/>
+          <w:color w:val="auto"/>
+        </w:rPr>
+      </w:pPr>
+    </w:p>
+    <w:p>
+      <w:pPr>
+        <w:pStyle w:val="Default"/>
+        <w:jc w:val="both"/>
+        <w:rPr>
+          <w:rFonts w:asciiTheme="minorHAnsi" w:hAnsiTheme="minorHAnsi" w:cstheme="minorHAnsi"/>
+          <w:color w:val="auto"/>
+        </w:rPr>
+      </w:pPr>
+      <w:r>
+        <w:rPr>
           <w:noProof/>
         </w:rPr>
-      </w:pPr>
-      <w:r>
-        <w:rPr>
-          <w:noProof/>
-        </w:rPr>
         <w:drawing>
-          <wp:inline distT="0" distB="0" distL="0" distR="0" wp14:anchorId="03300185" wp14:editId="5A40511E">
-            <wp:extent cx="5612130" cy="1325880"/>
-            <wp:effectExtent l="0" t="0" r="7620" b="7620"/>
-            <wp:docPr id="227853165" name="Imagen 7"/>
+          <wp:inline distT="0" distB="0" distL="0" distR="0" wp14:anchorId="5CCFD657" wp14:editId="500FAB97">
+            <wp:extent cx="5612130" cy="713105"/>
+            <wp:effectExtent l="0" t="0" r="7620" b="0"/>
+            <wp:docPr id="1642736607" name="Imagen 5"/>
             <wp:cNvGraphicFramePr>
               <a:graphicFrameLocks xmlns:a="http://schemas.openxmlformats.org/drawingml/2006/main" noChangeAspect="1"/>
             </wp:cNvGraphicFramePr>
@@ -4575,7 +5674,7 @@
               <a:graphicData uri="http://schemas.openxmlformats.org/drawingml/2006/picture">
                 <pic:pic xmlns:pic="http://schemas.openxmlformats.org/drawingml/2006/picture">
                   <pic:nvPicPr>
-                    <pic:cNvPr id="0" name="Picture 7"/>
+                    <pic:cNvPr id="0" name="Picture 5"/>
                     <pic:cNvPicPr>
                       <a:picLocks noChangeAspect="1" noChangeArrowheads="1"/>
                     </pic:cNvPicPr>
@@ -4596,7 +5695,7 @@
                   <pic:spPr bwMode="auto">
                     <a:xfrm>
                       <a:off x="0" y="0"/>
-                      <a:ext cx="5612130" cy="1325880"/>
+                      <a:ext cx="5612130" cy="713105"/>
                     </a:xfrm>
                     <a:prstGeom prst="rect">
                       <a:avLst/>
@@ -4618,17 +5717,18 @@
         <w:pStyle w:val="Default"/>
         <w:jc w:val="both"/>
         <w:rPr>
+          <w:rFonts w:asciiTheme="minorHAnsi" w:hAnsiTheme="minorHAnsi" w:cstheme="minorHAnsi"/>
+          <w:color w:val="auto"/>
+        </w:rPr>
+      </w:pPr>
+    </w:p>
+    <w:p>
+      <w:pPr>
+        <w:pStyle w:val="Default"/>
+        <w:jc w:val="both"/>
+        <w:rPr>
           <w:noProof/>
-        </w:rPr>
-      </w:pPr>
-    </w:p>
-    <w:p>
-      <w:pPr>
-        <w:pStyle w:val="Default"/>
-        <w:jc w:val="both"/>
-        <w:rPr>
-          <w:rFonts w:asciiTheme="minorHAnsi" w:hAnsiTheme="minorHAnsi" w:cstheme="minorHAnsi"/>
-          <w:color w:val="auto"/>
+          <w:u w:val="single"/>
         </w:rPr>
       </w:pPr>
       <w:r>
@@ -4636,10 +5736,10 @@
           <w:noProof/>
         </w:rPr>
         <w:drawing>
-          <wp:inline distT="0" distB="0" distL="0" distR="0" wp14:anchorId="3BB8B841" wp14:editId="16F0864B">
-            <wp:extent cx="5612130" cy="1541145"/>
-            <wp:effectExtent l="0" t="0" r="7620" b="1905"/>
-            <wp:docPr id="1057132000" name="Imagen 6"/>
+          <wp:inline distT="0" distB="0" distL="0" distR="0" wp14:anchorId="2B814FEA" wp14:editId="78239DCC">
+            <wp:extent cx="5612130" cy="1329690"/>
+            <wp:effectExtent l="0" t="0" r="7620" b="3810"/>
+            <wp:docPr id="853940661" name="Imagen 6"/>
             <wp:cNvGraphicFramePr>
               <a:graphicFrameLocks xmlns:a="http://schemas.openxmlformats.org/drawingml/2006/main" noChangeAspect="1"/>
             </wp:cNvGraphicFramePr>
@@ -4668,7 +5768,7 @@
                   <pic:spPr bwMode="auto">
                     <a:xfrm>
                       <a:off x="0" y="0"/>
-                      <a:ext cx="5612130" cy="1541145"/>
+                      <a:ext cx="5612130" cy="1329690"/>
                     </a:xfrm>
                     <a:prstGeom prst="rect">
                       <a:avLst/>
@@ -4687,174 +5787,31 @@
     </w:p>
     <w:p>
       <w:pPr>
-        <w:pStyle w:val="Ttulo"/>
-        <w:framePr w:hSpace="0" w:wrap="auto" w:vAnchor="margin" w:hAnchor="text" w:yAlign="inline"/>
-        <w:spacing w:before="120" w:after="120"/>
-        <w:jc w:val="both"/>
-        <w:rPr>
-          <w:rFonts w:asciiTheme="minorHAnsi" w:eastAsiaTheme="minorHAnsi" w:hAnsiTheme="minorHAnsi" w:cstheme="minorHAnsi"/>
-          <w:b w:val="0"/>
-          <w:color w:val="auto"/>
-          <w:kern w:val="0"/>
-          <w:sz w:val="20"/>
-          <w:szCs w:val="20"/>
-          <w:lang w:val="es-MX"/>
-        </w:rPr>
-      </w:pPr>
-    </w:p>
-    <w:p>
-      <w:pPr>
-        <w:autoSpaceDE w:val="0"/>
-        <w:autoSpaceDN w:val="0"/>
-        <w:adjustRightInd w:val="0"/>
-        <w:spacing w:after="0" w:line="240" w:lineRule="auto"/>
-        <w:jc w:val="both"/>
-        <w:rPr>
-          <w:rFonts w:cstheme="minorHAnsi"/>
-          <w:sz w:val="24"/>
-          <w:szCs w:val="24"/>
-        </w:rPr>
-      </w:pPr>
-      <w:r>
-        <w:rPr>
-          <w:rFonts w:cstheme="minorHAnsi"/>
-        </w:rPr>
-        <w:t>A partir del resultado de la calificaci</w:t>
-      </w:r>
-      <w:r>
-        <w:rPr>
-          <w:rFonts w:cstheme="minorHAnsi" w:hint="cs"/>
-        </w:rPr>
-        <w:t>ó</w:t>
-      </w:r>
-      <w:r>
-        <w:rPr>
-          <w:rFonts w:cstheme="minorHAnsi"/>
-        </w:rPr>
-        <w:t xml:space="preserve">n de cada cuestionario se </w:t>
-      </w:r>
-      <w:r>
-        <w:rPr>
-          <w:rFonts w:cstheme="minorHAnsi"/>
-        </w:rPr>
-        <w:t>determinó</w:t>
-      </w:r>
-      <w:r>
-        <w:rPr>
-          <w:rFonts w:cstheme="minorHAnsi"/>
-        </w:rPr>
-        <w:t xml:space="preserve"> y analiz</w:t>
-      </w:r>
-      <w:r>
-        <w:rPr>
-          <w:rFonts w:cstheme="minorHAnsi"/>
-        </w:rPr>
-        <w:t>ó</w:t>
-      </w:r>
-      <w:r>
-        <w:rPr>
-          <w:rFonts w:cstheme="minorHAnsi"/>
-        </w:rPr>
-        <w:t xml:space="preserve"> el nivel de riesgo, as</w:t>
-      </w:r>
-      <w:r>
-        <w:rPr>
-          <w:rFonts w:cstheme="minorHAnsi" w:hint="cs"/>
-        </w:rPr>
-        <w:t>í</w:t>
-      </w:r>
-      <w:r>
-        <w:rPr>
-          <w:rFonts w:cstheme="minorHAnsi"/>
-        </w:rPr>
-        <w:t xml:space="preserve"> como las acciones que se deber</w:t>
-      </w:r>
-      <w:r>
-        <w:rPr>
-          <w:rFonts w:cstheme="minorHAnsi" w:hint="cs"/>
-        </w:rPr>
-        <w:t>á</w:t>
-      </w:r>
-      <w:r>
-        <w:rPr>
-          <w:rFonts w:cstheme="minorHAnsi"/>
-        </w:rPr>
-        <w:t>n adoptar para el control de los factores de riesgo psicosocial, a trav</w:t>
-      </w:r>
-      <w:r>
-        <w:rPr>
-          <w:rFonts w:cstheme="minorHAnsi" w:hint="cs"/>
-        </w:rPr>
-        <w:t>é</w:t>
-      </w:r>
-      <w:r>
-        <w:rPr>
-          <w:rFonts w:cstheme="minorHAnsi"/>
-        </w:rPr>
-        <w:t>s de un Programa de</w:t>
-      </w:r>
-      <w:r>
-        <w:rPr>
-          <w:rFonts w:cstheme="minorHAnsi"/>
-        </w:rPr>
-        <w:t xml:space="preserve"> </w:t>
-      </w:r>
-      <w:r>
-        <w:rPr>
-          <w:rFonts w:cstheme="minorHAnsi"/>
-        </w:rPr>
-        <w:t>intervenci</w:t>
-      </w:r>
-      <w:r>
-        <w:rPr>
-          <w:rFonts w:cstheme="minorHAnsi" w:hint="cs"/>
-        </w:rPr>
-        <w:t>ó</w:t>
-      </w:r>
-      <w:r>
-        <w:rPr>
-          <w:rFonts w:cstheme="minorHAnsi"/>
-        </w:rPr>
-        <w:t xml:space="preserve">n para los niveles medio, alto y muy alto, con base en la Tabla </w:t>
-      </w:r>
-      <w:r>
-        <w:rPr>
-          <w:rFonts w:cstheme="minorHAnsi"/>
-        </w:rPr>
-        <w:t>4</w:t>
-      </w:r>
-      <w:r>
-        <w:rPr>
-          <w:rFonts w:cstheme="minorHAnsi"/>
-        </w:rPr>
-        <w:t xml:space="preserve"> siguiente:</w:t>
-      </w:r>
-    </w:p>
-    <w:p>
-      <w:pPr>
-        <w:pStyle w:val="Ttulo"/>
-        <w:framePr w:hSpace="0" w:wrap="auto" w:vAnchor="margin" w:hAnchor="text" w:yAlign="inline"/>
-        <w:spacing w:before="120" w:after="120"/>
-        <w:jc w:val="center"/>
-        <w:rPr>
-          <w:rFonts w:asciiTheme="minorHAnsi" w:eastAsiaTheme="minorHAnsi" w:hAnsiTheme="minorHAnsi" w:cstheme="minorHAnsi"/>
-          <w:b w:val="0"/>
-          <w:color w:val="auto"/>
-          <w:kern w:val="0"/>
-          <w:sz w:val="24"/>
-          <w:szCs w:val="24"/>
-          <w:lang w:val="es-MX"/>
-        </w:rPr>
-      </w:pPr>
-      <w:r>
+        <w:pStyle w:val="Default"/>
+        <w:jc w:val="both"/>
         <w:rPr>
           <w:noProof/>
         </w:rPr>
+      </w:pPr>
+    </w:p>
+    <w:p>
+      <w:pPr>
+        <w:pStyle w:val="Default"/>
+        <w:jc w:val="both"/>
+        <w:rPr>
+          <w:rFonts w:asciiTheme="minorHAnsi" w:hAnsiTheme="minorHAnsi" w:cstheme="minorHAnsi"/>
+          <w:color w:val="auto"/>
+        </w:rPr>
+      </w:pPr>
+      <w:r>
+        <w:rPr>
+          <w:noProof/>
+        </w:rPr>
         <w:drawing>
-          <wp:inline distT="0" distB="0" distL="0" distR="0" wp14:anchorId="3F04CE08" wp14:editId="5F0BF77C">
-            <wp:extent cx="5429250" cy="2640294"/>
-            <wp:effectExtent l="0" t="0" r="0" b="8255"/>
-            <wp:docPr id="671884264" name="Imagen 10"/>
+          <wp:inline distT="0" distB="0" distL="0" distR="0" wp14:anchorId="7D19CCC1" wp14:editId="7BF7BEBA">
+            <wp:extent cx="5612130" cy="2866390"/>
+            <wp:effectExtent l="0" t="0" r="7620" b="0"/>
+            <wp:docPr id="2023724497" name="Imagen 7"/>
             <wp:cNvGraphicFramePr>
               <a:graphicFrameLocks xmlns:a="http://schemas.openxmlformats.org/drawingml/2006/main" noChangeAspect="1"/>
             </wp:cNvGraphicFramePr>
@@ -4862,7 +5819,7 @@
               <a:graphicData uri="http://schemas.openxmlformats.org/drawingml/2006/picture">
                 <pic:pic xmlns:pic="http://schemas.openxmlformats.org/drawingml/2006/picture">
                   <pic:nvPicPr>
-                    <pic:cNvPr id="0" name="Picture 10"/>
+                    <pic:cNvPr id="0" name="Picture 7"/>
                     <pic:cNvPicPr>
                       <a:picLocks noChangeAspect="1" noChangeArrowheads="1"/>
                     </pic:cNvPicPr>
@@ -4883,7 +5840,7 @@
                   <pic:spPr bwMode="auto">
                     <a:xfrm>
                       <a:off x="0" y="0"/>
-                      <a:ext cx="5437566" cy="2644338"/>
+                      <a:ext cx="5612130" cy="2866390"/>
                     </a:xfrm>
                     <a:prstGeom prst="rect">
                       <a:avLst/>
@@ -4902,6 +5859,222 @@
     </w:p>
     <w:p>
       <w:pPr>
+        <w:pStyle w:val="Ttulo"/>
+        <w:framePr w:hSpace="0" w:wrap="auto" w:vAnchor="margin" w:hAnchor="text" w:yAlign="inline"/>
+        <w:spacing w:before="120" w:after="120"/>
+        <w:jc w:val="both"/>
+        <w:rPr>
+          <w:rFonts w:asciiTheme="minorHAnsi" w:eastAsiaTheme="minorHAnsi" w:hAnsiTheme="minorHAnsi" w:cstheme="minorHAnsi"/>
+          <w:b w:val="0"/>
+          <w:color w:val="auto"/>
+          <w:kern w:val="0"/>
+          <w:sz w:val="20"/>
+          <w:szCs w:val="20"/>
+          <w:lang w:val="es-MX"/>
+        </w:rPr>
+      </w:pPr>
+    </w:p>
+    <w:p>
+      <w:pPr>
+        <w:autoSpaceDE w:val="0"/>
+        <w:autoSpaceDN w:val="0"/>
+        <w:adjustRightInd w:val="0"/>
+        <w:spacing w:after="0" w:line="240" w:lineRule="auto"/>
+        <w:jc w:val="both"/>
+        <w:rPr>
+          <w:rFonts w:cstheme="minorHAnsi"/>
+          <w:sz w:val="24"/>
+          <w:szCs w:val="24"/>
+        </w:rPr>
+      </w:pPr>
+      <w:r>
+        <w:rPr>
+          <w:rFonts w:cstheme="minorHAnsi"/>
+        </w:rPr>
+        <w:t>A partir del resultado de la calificaci</w:t>
+      </w:r>
+      <w:r>
+        <w:rPr>
+          <w:rFonts w:cstheme="minorHAnsi" w:hint="cs"/>
+        </w:rPr>
+        <w:t>ó</w:t>
+      </w:r>
+      <w:r>
+        <w:rPr>
+          <w:rFonts w:cstheme="minorHAnsi"/>
+        </w:rPr>
+        <w:t xml:space="preserve">n de cada cuestionario se </w:t>
+      </w:r>
+      <w:r>
+        <w:rPr>
+          <w:rFonts w:cstheme="minorHAnsi"/>
+        </w:rPr>
+        <w:t>determinó</w:t>
+      </w:r>
+      <w:r>
+        <w:rPr>
+          <w:rFonts w:cstheme="minorHAnsi"/>
+        </w:rPr>
+        <w:t xml:space="preserve"> y analiz</w:t>
+      </w:r>
+      <w:r>
+        <w:rPr>
+          <w:rFonts w:cstheme="minorHAnsi"/>
+        </w:rPr>
+        <w:t>ó</w:t>
+      </w:r>
+      <w:r>
+        <w:rPr>
+          <w:rFonts w:cstheme="minorHAnsi"/>
+        </w:rPr>
+        <w:t xml:space="preserve"> el nivel de riesgo, as</w:t>
+      </w:r>
+      <w:r>
+        <w:rPr>
+          <w:rFonts w:cstheme="minorHAnsi" w:hint="cs"/>
+        </w:rPr>
+        <w:t>í</w:t>
+      </w:r>
+      <w:r>
+        <w:rPr>
+          <w:rFonts w:cstheme="minorHAnsi"/>
+        </w:rPr>
+        <w:t xml:space="preserve"> como las acciones que se deber</w:t>
+      </w:r>
+      <w:r>
+        <w:rPr>
+          <w:rFonts w:cstheme="minorHAnsi" w:hint="cs"/>
+        </w:rPr>
+        <w:t>á</w:t>
+      </w:r>
+      <w:r>
+        <w:rPr>
+          <w:rFonts w:cstheme="minorHAnsi"/>
+        </w:rPr>
+        <w:t>n adoptar para el control de los factores de riesgo psicosocial, a trav</w:t>
+      </w:r>
+      <w:r>
+        <w:rPr>
+          <w:rFonts w:cstheme="minorHAnsi" w:hint="cs"/>
+        </w:rPr>
+        <w:t>é</w:t>
+      </w:r>
+      <w:r>
+        <w:rPr>
+          <w:rFonts w:cstheme="minorHAnsi"/>
+        </w:rPr>
+        <w:t>s de un Programa de</w:t>
+      </w:r>
+      <w:r>
+        <w:rPr>
+          <w:rFonts w:cstheme="minorHAnsi"/>
+        </w:rPr>
+        <w:t xml:space="preserve"> </w:t>
+      </w:r>
+      <w:r>
+        <w:rPr>
+          <w:rFonts w:cstheme="minorHAnsi"/>
+        </w:rPr>
+        <w:t>intervenci</w:t>
+      </w:r>
+      <w:r>
+        <w:rPr>
+          <w:rFonts w:cstheme="minorHAnsi" w:hint="cs"/>
+        </w:rPr>
+        <w:t>ó</w:t>
+      </w:r>
+      <w:r>
+        <w:rPr>
+          <w:rFonts w:cstheme="minorHAnsi"/>
+        </w:rPr>
+        <w:t xml:space="preserve">n para los niveles medio, alto y muy alto, con base en la Tabla </w:t>
+      </w:r>
+      <w:r>
+        <w:rPr>
+          <w:rFonts w:cstheme="minorHAnsi"/>
+        </w:rPr>
+        <w:t>4</w:t>
+      </w:r>
+      <w:r>
+        <w:rPr>
+          <w:rFonts w:cstheme="minorHAnsi"/>
+        </w:rPr>
+        <w:t xml:space="preserve"> siguiente:</w:t>
+      </w:r>
+    </w:p>
+    <w:p>
+      <w:pPr>
+        <w:pStyle w:val="Ttulo"/>
+        <w:framePr w:hSpace="0" w:wrap="auto" w:vAnchor="margin" w:hAnchor="text" w:yAlign="inline"/>
+        <w:spacing w:before="120" w:after="120"/>
+        <w:jc w:val="center"/>
+        <w:rPr>
+          <w:rFonts w:asciiTheme="minorHAnsi" w:eastAsiaTheme="minorHAnsi" w:hAnsiTheme="minorHAnsi" w:cstheme="minorHAnsi"/>
+          <w:b w:val="0"/>
+          <w:color w:val="auto"/>
+          <w:kern w:val="0"/>
+          <w:sz w:val="24"/>
+          <w:szCs w:val="24"/>
+          <w:lang w:val="es-MX"/>
+        </w:rPr>
+      </w:pPr>
+      <w:r>
+        <w:rPr>
+          <w:noProof/>
+        </w:rPr>
+        <w:lastRenderedPageBreak/>
+        <w:drawing>
+          <wp:inline distT="0" distB="0" distL="0" distR="0" wp14:anchorId="0B40E361" wp14:editId="6D1C0173">
+            <wp:extent cx="5612130" cy="2729230"/>
+            <wp:effectExtent l="0" t="0" r="7620" b="0"/>
+            <wp:docPr id="671884264" name="Imagen 10"/>
+            <wp:cNvGraphicFramePr>
+              <a:graphicFrameLocks xmlns:a="http://schemas.openxmlformats.org/drawingml/2006/main" noChangeAspect="1"/>
+            </wp:cNvGraphicFramePr>
+            <a:graphic xmlns:a="http://schemas.openxmlformats.org/drawingml/2006/main">
+              <a:graphicData uri="http://schemas.openxmlformats.org/drawingml/2006/picture">
+                <pic:pic xmlns:pic="http://schemas.openxmlformats.org/drawingml/2006/picture">
+                  <pic:nvPicPr>
+                    <pic:cNvPr id="0" name="Picture 10"/>
+                    <pic:cNvPicPr>
+                      <a:picLocks noChangeAspect="1" noChangeArrowheads="1"/>
+                    </pic:cNvPicPr>
+                  </pic:nvPicPr>
+                  <pic:blipFill>
+                    <a:blip r:embed="rId14">
+                      <a:extLst>
+                        <a:ext uri="{28A0092B-C50C-407E-A947-70E740481C1C}">
+                          <a14:useLocalDpi xmlns:a14="http://schemas.microsoft.com/office/drawing/2010/main" val="0"/>
+                        </a:ext>
+                      </a:extLst>
+                    </a:blip>
+                    <a:srcRect/>
+                    <a:stretch>
+                      <a:fillRect/>
+                    </a:stretch>
+                  </pic:blipFill>
+                  <pic:spPr bwMode="auto">
+                    <a:xfrm>
+                      <a:off x="0" y="0"/>
+                      <a:ext cx="5612130" cy="2729230"/>
+                    </a:xfrm>
+                    <a:prstGeom prst="rect">
+                      <a:avLst/>
+                    </a:prstGeom>
+                    <a:noFill/>
+                    <a:ln>
+                      <a:noFill/>
+                    </a:ln>
+                  </pic:spPr>
+                </pic:pic>
+              </a:graphicData>
+            </a:graphic>
+          </wp:inline>
+        </w:drawing>
+      </w:r>
+    </w:p>
+    <w:p>
+      <w:pPr>
         <w:autoSpaceDE w:val="0"/>
         <w:autoSpaceDN w:val="0"/>
         <w:adjustRightInd w:val="0"/>
@@ -5043,16 +6216,7 @@
           <w:sz w:val="18"/>
           <w:szCs w:val="18"/>
         </w:rPr>
-        <w:t xml:space="preserve">evaluar </w:t>
-      </w:r>
-      <w:r>
-        <w:rPr>
-          <w:rFonts w:cstheme="minorHAnsi"/>
-          <w:sz w:val="18"/>
-          <w:szCs w:val="18"/>
-        </w:rPr>
-        <w:lastRenderedPageBreak/>
-        <w:t>el entorno organizacional y el efecto a la salud de los trabajadores para establecer las medidas de control y</w:t>
+        <w:t>evaluar el entorno organizacional y el efecto a la salud de los trabajadores para establecer las medidas de control y</w:t>
       </w:r>
       <w:r>
         <w:rPr>
@@ -5598,7 +6762,7 @@
                     </pic:cNvPicPr>
                   </pic:nvPicPr>
                   <pic:blipFill>
-                    <a:blip r:embed="rId14">
+                    <a:blip r:embed="rId15">
                       <a:extLst>
                         <a:ext uri="{28A0092B-C50C-407E-A947-70E740481C1C}">
                           <a14:useLocalDpi xmlns:a14="http://schemas.microsoft.com/office/drawing/2010/main" val="0"/>
@@ -6537,22 +7701,6 @@
         <w:pStyle w:val="Ttulo"/>
         <w:framePr w:hSpace="0" w:wrap="auto" w:vAnchor="margin" w:hAnchor="text" w:yAlign="inline"/>
         <w:spacing w:before="120" w:after="120"/>
-        <w:rPr>
-          <w:rFonts w:asciiTheme="minorHAnsi" w:eastAsiaTheme="minorHAnsi" w:hAnsiTheme="minorHAnsi" w:cstheme="minorHAnsi"/>
-          <w:b w:val="0"/>
-          <w:color w:val="auto"/>
-          <w:kern w:val="0"/>
-          <w:sz w:val="24"/>
-          <w:szCs w:val="24"/>
-          <w:lang w:val="es-MX"/>
-        </w:rPr>
-      </w:pPr>
-    </w:p>
-    <w:p>
-      <w:pPr>
-        <w:pStyle w:val="Ttulo"/>
-        <w:framePr w:hSpace="0" w:wrap="auto" w:vAnchor="margin" w:hAnchor="text" w:yAlign="inline"/>
-        <w:spacing w:before="120" w:after="120"/>
         <w:jc w:val="both"/>
         <w:rPr>
           <w:rFonts w:asciiTheme="minorHAnsi" w:eastAsiaTheme="minorHAnsi" w:hAnsiTheme="minorHAnsi" w:cstheme="minorHAnsi"/>
@@ -6745,16 +7893,16 @@
         <mc:AlternateContent>
           <mc:Choice Requires="wps">
             <w:drawing>
-              <wp:anchor distT="0" distB="0" distL="114300" distR="114300" simplePos="0" relativeHeight="251657215" behindDoc="1" locked="0" layoutInCell="1" allowOverlap="1" wp14:anchorId="42CE2C72" wp14:editId="7BE701E9">
+              <wp:anchor distT="0" distB="0" distL="114300" distR="114300" simplePos="0" relativeHeight="251657215" behindDoc="1" locked="0" layoutInCell="1" allowOverlap="1" wp14:anchorId="42CE2C72" wp14:editId="4E2DA9E5">
                 <wp:simplePos x="0" y="0"/>
                 <wp:positionH relativeFrom="column">
-                  <wp:posOffset>-114935</wp:posOffset>
+                  <wp:posOffset>-137160</wp:posOffset>
                 </wp:positionH>
                 <wp:positionV relativeFrom="paragraph">
-                  <wp:posOffset>223520</wp:posOffset>
+                  <wp:posOffset>213359</wp:posOffset>
                 </wp:positionV>
-                <wp:extent cx="5895340" cy="1402080"/>
-                <wp:effectExtent l="0" t="0" r="10160" b="26670"/>
+                <wp:extent cx="5895340" cy="1685925"/>
+                <wp:effectExtent l="0" t="0" r="10160" b="28575"/>
                 <wp:wrapNone/>
                 <wp:docPr id="64" name="Rectángulo: esquinas redondeadas 64"/>
                 <wp:cNvGraphicFramePr/>
@@ -6765,7 +7913,7 @@
                       <wps:spPr>
                         <a:xfrm>
                           <a:off x="0" y="0"/>
-                          <a:ext cx="5895340" cy="1402080"/>
+                          <a:ext cx="5895340" cy="1685925"/>
                         </a:xfrm>
                         <a:prstGeom prst="roundRect">
                           <a:avLst>
@@ -6819,7 +7967,7 @@
           </mc:Choice>
           <mc:Fallback>
             <w:pict>
-              <v:roundrect w14:anchorId="25913494" id="Rectángulo: esquinas redondeadas 64" o:spid="_x0000_s1026" style="position:absolute;margin-left:-9.05pt;margin-top:17.6pt;width:464.2pt;height:110.4pt;z-index:-251659265;visibility:visible;mso-wrap-style:square;mso-width-percent:0;mso-height-percent:0;mso-wrap-distance-left:9pt;mso-wrap-distance-top:0;mso-wrap-distance-right:9pt;mso-wrap-distance-bottom:0;mso-position-horizontal:absolute;mso-position-horizontal-relative:text;mso-position-vertical:absolute;mso-position-vertical-relative:text;mso-width-percent:0;mso-height-percent:0;mso-width-relative:margin;mso-height-relative:margin;v-text-anchor:middle" arcsize="6453f" o:gfxdata="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" fillcolor="yellow" strokecolor="#ffc000" strokeweight="1pt">
+              <v:roundrect w14:anchorId="58A5D110" id="Rectángulo: esquinas redondeadas 64" o:spid="_x0000_s1026" style="position:absolute;margin-left:-10.8pt;margin-top:16.8pt;width:464.2pt;height:132.75pt;z-index:-251659265;visibility:visible;mso-wrap-style:square;mso-width-percent:0;mso-height-percent:0;mso-wrap-distance-left:9pt;mso-wrap-distance-top:0;mso-wrap-distance-right:9pt;mso-wrap-distance-bottom:0;mso-position-horizontal:absolute;mso-position-horizontal-relative:text;mso-position-vertical:absolute;mso-position-vertical-relative:text;mso-width-percent:0;mso-height-percent:0;mso-width-relative:margin;mso-height-relative:margin;v-text-anchor:middle" arcsize="6453f" o:gfxdata="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" fillcolor="yellow" strokecolor="#ffc000" strokeweight="1pt">
                 <v:fill opacity="9766f"/>
                 <v:stroke joinstyle="miter"/>
               </v:roundrect>
@@ -6914,17 +8062,25 @@
         </w:rPr>
         <w:t>}</w:t>
       </w:r>
-      <w:r>
-        <w:rPr>
-          <w:rFonts w:cstheme="minorHAnsi"/>
+    </w:p>
+    <w:p>
+      <w:pPr>
+        <w:pStyle w:val="Ttulo"/>
+        <w:framePr w:hSpace="0" w:wrap="auto" w:vAnchor="margin" w:hAnchor="text" w:yAlign="inline"/>
+        <w:spacing w:before="120" w:after="120"/>
+        <w:jc w:val="both"/>
+        <w:rPr>
+          <w:rFonts w:asciiTheme="minorHAnsi" w:eastAsiaTheme="minorHAnsi" w:hAnsiTheme="minorHAnsi" w:cstheme="minorHAnsi"/>
           <w:bCs/>
           <w:i/>
           <w:iCs/>
-          <w:sz w:val="24"/>
-          <w:szCs w:val="24"/>
-        </w:rPr>
-        <w:br w:type="page"/>
-      </w:r>
+          <w:color w:val="auto"/>
+          <w:kern w:val="0"/>
+          <w:sz w:val="24"/>
+          <w:szCs w:val="24"/>
+          <w:lang w:val="es-MX"/>
+        </w:rPr>
+      </w:pPr>
     </w:p>
     <w:p>
       <w:pPr>
@@ -6944,7 +8100,13 @@
           <w:lang w:val="es-MX"/>
         </w:rPr>
       </w:pPr>
-      <w:r>
+    </w:p>
+    <w:p>
+      <w:pPr>
+        <w:pStyle w:val="Ttulo"/>
+        <w:framePr w:hSpace="0" w:wrap="auto" w:vAnchor="margin" w:hAnchor="text" w:yAlign="inline"/>
+        <w:spacing w:before="120" w:after="120"/>
+        <w:jc w:val="both"/>
         <w:rPr>
           <w:rFonts w:asciiTheme="minorHAnsi" w:eastAsiaTheme="minorHAnsi" w:hAnsiTheme="minorHAnsi" w:cstheme="minorHAnsi"/>
           <w:bCs/>
@@ -6956,7 +8118,171 @@
           <w:szCs w:val="24"/>
           <w:lang w:val="es-MX"/>
         </w:rPr>
-        <w:lastRenderedPageBreak/>
+      </w:pPr>
+    </w:p>
+    <w:p>
+      <w:pPr>
+        <w:pStyle w:val="Ttulo"/>
+        <w:framePr w:hSpace="0" w:wrap="auto" w:vAnchor="margin" w:hAnchor="text" w:yAlign="inline"/>
+        <w:spacing w:before="120" w:after="120"/>
+        <w:jc w:val="both"/>
+        <w:rPr>
+          <w:rFonts w:asciiTheme="minorHAnsi" w:eastAsiaTheme="minorHAnsi" w:hAnsiTheme="minorHAnsi" w:cstheme="minorHAnsi"/>
+          <w:bCs/>
+          <w:i/>
+          <w:iCs/>
+          <w:color w:val="auto"/>
+          <w:kern w:val="0"/>
+          <w:sz w:val="24"/>
+          <w:szCs w:val="24"/>
+          <w:lang w:val="es-MX"/>
+        </w:rPr>
+      </w:pPr>
+    </w:p>
+    <w:p>
+      <w:pPr>
+        <w:pStyle w:val="Ttulo"/>
+        <w:framePr w:hSpace="0" w:wrap="auto" w:vAnchor="margin" w:hAnchor="text" w:yAlign="inline"/>
+        <w:spacing w:before="120" w:after="120"/>
+        <w:jc w:val="both"/>
+        <w:rPr>
+          <w:rFonts w:asciiTheme="minorHAnsi" w:eastAsiaTheme="minorHAnsi" w:hAnsiTheme="minorHAnsi" w:cstheme="minorHAnsi"/>
+          <w:bCs/>
+          <w:i/>
+          <w:iCs/>
+          <w:color w:val="auto"/>
+          <w:kern w:val="0"/>
+          <w:sz w:val="24"/>
+          <w:szCs w:val="24"/>
+          <w:lang w:val="es-MX"/>
+        </w:rPr>
+      </w:pPr>
+    </w:p>
+    <w:p>
+      <w:pPr>
+        <w:pStyle w:val="Ttulo"/>
+        <w:framePr w:hSpace="0" w:wrap="auto" w:vAnchor="margin" w:hAnchor="text" w:yAlign="inline"/>
+        <w:spacing w:before="120" w:after="120"/>
+        <w:jc w:val="both"/>
+        <w:rPr>
+          <w:rFonts w:asciiTheme="minorHAnsi" w:eastAsiaTheme="minorHAnsi" w:hAnsiTheme="minorHAnsi" w:cstheme="minorHAnsi"/>
+          <w:bCs/>
+          <w:i/>
+          <w:iCs/>
+          <w:color w:val="auto"/>
+          <w:kern w:val="0"/>
+          <w:sz w:val="24"/>
+          <w:szCs w:val="24"/>
+          <w:lang w:val="es-MX"/>
+        </w:rPr>
+      </w:pPr>
+    </w:p>
+    <w:p>
+      <w:pPr>
+        <w:pStyle w:val="Ttulo"/>
+        <w:framePr w:hSpace="0" w:wrap="auto" w:vAnchor="margin" w:hAnchor="text" w:yAlign="inline"/>
+        <w:spacing w:before="120" w:after="120"/>
+        <w:jc w:val="both"/>
+        <w:rPr>
+          <w:rFonts w:asciiTheme="minorHAnsi" w:eastAsiaTheme="minorHAnsi" w:hAnsiTheme="minorHAnsi" w:cstheme="minorHAnsi"/>
+          <w:bCs/>
+          <w:i/>
+          <w:iCs/>
+          <w:color w:val="auto"/>
+          <w:kern w:val="0"/>
+          <w:sz w:val="24"/>
+          <w:szCs w:val="24"/>
+          <w:lang w:val="es-MX"/>
+        </w:rPr>
+      </w:pPr>
+    </w:p>
+    <w:p>
+      <w:pPr>
+        <w:pStyle w:val="Ttulo"/>
+        <w:framePr w:hSpace="0" w:wrap="auto" w:vAnchor="margin" w:hAnchor="text" w:yAlign="inline"/>
+        <w:spacing w:before="120" w:after="120"/>
+        <w:jc w:val="both"/>
+        <w:rPr>
+          <w:rFonts w:asciiTheme="minorHAnsi" w:eastAsiaTheme="minorHAnsi" w:hAnsiTheme="minorHAnsi" w:cstheme="minorHAnsi"/>
+          <w:bCs/>
+          <w:i/>
+          <w:iCs/>
+          <w:color w:val="auto"/>
+          <w:kern w:val="0"/>
+          <w:sz w:val="24"/>
+          <w:szCs w:val="24"/>
+          <w:lang w:val="es-MX"/>
+        </w:rPr>
+      </w:pPr>
+    </w:p>
+    <w:p>
+      <w:pPr>
+        <w:pStyle w:val="Ttulo"/>
+        <w:framePr w:hSpace="0" w:wrap="auto" w:vAnchor="margin" w:hAnchor="text" w:yAlign="inline"/>
+        <w:spacing w:before="120" w:after="120"/>
+        <w:jc w:val="both"/>
+        <w:rPr>
+          <w:rFonts w:asciiTheme="minorHAnsi" w:eastAsiaTheme="minorHAnsi" w:hAnsiTheme="minorHAnsi" w:cstheme="minorHAnsi"/>
+          <w:bCs/>
+          <w:i/>
+          <w:iCs/>
+          <w:color w:val="auto"/>
+          <w:kern w:val="0"/>
+          <w:sz w:val="24"/>
+          <w:szCs w:val="24"/>
+          <w:lang w:val="es-MX"/>
+        </w:rPr>
+      </w:pPr>
+    </w:p>
+    <w:p>
+      <w:pPr>
+        <w:pStyle w:val="Ttulo"/>
+        <w:framePr w:hSpace="0" w:wrap="auto" w:vAnchor="margin" w:hAnchor="text" w:yAlign="inline"/>
+        <w:spacing w:before="120" w:after="120"/>
+        <w:jc w:val="both"/>
+        <w:rPr>
+          <w:rFonts w:asciiTheme="minorHAnsi" w:eastAsiaTheme="minorHAnsi" w:hAnsiTheme="minorHAnsi" w:cstheme="minorHAnsi"/>
+          <w:bCs/>
+          <w:i/>
+          <w:iCs/>
+          <w:color w:val="auto"/>
+          <w:kern w:val="0"/>
+          <w:sz w:val="24"/>
+          <w:szCs w:val="24"/>
+          <w:lang w:val="es-MX"/>
+        </w:rPr>
+      </w:pPr>
+    </w:p>
+    <w:p>
+      <w:pPr>
+        <w:pStyle w:val="Ttulo"/>
+        <w:framePr w:hSpace="0" w:wrap="auto" w:vAnchor="margin" w:hAnchor="text" w:yAlign="inline"/>
+        <w:spacing w:before="120" w:after="120"/>
+        <w:jc w:val="both"/>
+        <w:rPr>
+          <w:rFonts w:asciiTheme="minorHAnsi" w:eastAsiaTheme="minorHAnsi" w:hAnsiTheme="minorHAnsi" w:cstheme="minorHAnsi"/>
+          <w:bCs/>
+          <w:i/>
+          <w:iCs/>
+          <w:color w:val="auto"/>
+          <w:kern w:val="0"/>
+          <w:sz w:val="24"/>
+          <w:szCs w:val="24"/>
+          <w:lang w:val="es-MX"/>
+        </w:rPr>
+      </w:pPr>
+      <w:r>
+        <w:rPr>
+          <w:rFonts w:asciiTheme="minorHAnsi" w:eastAsiaTheme="minorHAnsi" w:hAnsiTheme="minorHAnsi" w:cstheme="minorHAnsi"/>
+          <w:bCs/>
+          <w:i/>
+          <w:iCs/>
+          <w:color w:val="auto"/>
+          <w:kern w:val="0"/>
+          <w:sz w:val="24"/>
+          <w:szCs w:val="24"/>
+          <w:lang w:val="es-MX"/>
+        </w:rPr>
         <w:t>Calificación final</w:t>
       </w:r>
       <w:r>
@@ -7589,6 +8915,74 @@
         <w:pStyle w:val="Ttulo"/>
         <w:framePr w:hSpace="0" w:wrap="auto" w:vAnchor="margin" w:hAnchor="text" w:yAlign="inline"/>
         <w:spacing w:before="120" w:after="120"/>
+        <w:jc w:val="both"/>
+        <w:rPr>
+          <w:rFonts w:asciiTheme="minorHAnsi" w:eastAsiaTheme="minorHAnsi" w:hAnsiTheme="minorHAnsi" w:cstheme="minorHAnsi"/>
+          <w:b w:val="0"/>
+          <w:color w:val="auto"/>
+          <w:kern w:val="0"/>
+          <w:sz w:val="24"/>
+          <w:szCs w:val="24"/>
+          <w:lang w:val="es-MX"/>
+        </w:rPr>
+      </w:pPr>
+    </w:p>
+    <w:p>
+      <w:pPr>
+        <w:pStyle w:val="Ttulo"/>
+        <w:framePr w:hSpace="0" w:wrap="auto" w:vAnchor="margin" w:hAnchor="text" w:yAlign="inline"/>
+        <w:spacing w:before="120" w:after="120"/>
+        <w:jc w:val="both"/>
+        <w:rPr>
+          <w:rFonts w:asciiTheme="minorHAnsi" w:eastAsiaTheme="minorHAnsi" w:hAnsiTheme="minorHAnsi" w:cstheme="minorHAnsi"/>
+          <w:b w:val="0"/>
+          <w:color w:val="auto"/>
+          <w:kern w:val="0"/>
+          <w:sz w:val="24"/>
+          <w:szCs w:val="24"/>
+          <w:lang w:val="es-MX"/>
+        </w:rPr>
+      </w:pPr>
+    </w:p>
+    <w:p>
+      <w:pPr>
+        <w:pStyle w:val="Ttulo"/>
+        <w:framePr w:hSpace="0" w:wrap="auto" w:vAnchor="margin" w:hAnchor="text" w:yAlign="inline"/>
+        <w:spacing w:before="120" w:after="120"/>
+        <w:jc w:val="both"/>
+        <w:rPr>
+          <w:rFonts w:asciiTheme="minorHAnsi" w:eastAsiaTheme="minorHAnsi" w:hAnsiTheme="minorHAnsi" w:cstheme="minorHAnsi"/>
+          <w:b w:val="0"/>
+          <w:color w:val="auto"/>
+          <w:kern w:val="0"/>
+          <w:sz w:val="24"/>
+          <w:szCs w:val="24"/>
+          <w:lang w:val="es-MX"/>
+        </w:rPr>
+      </w:pPr>
+    </w:p>
+    <w:p>
+      <w:pPr>
+        <w:pStyle w:val="Ttulo"/>
+        <w:framePr w:hSpace="0" w:wrap="auto" w:vAnchor="margin" w:hAnchor="text" w:yAlign="inline"/>
+        <w:spacing w:before="120" w:after="120"/>
+        <w:jc w:val="both"/>
+        <w:rPr>
+          <w:rFonts w:asciiTheme="minorHAnsi" w:eastAsiaTheme="minorHAnsi" w:hAnsiTheme="minorHAnsi" w:cstheme="minorHAnsi"/>
+          <w:b w:val="0"/>
+          <w:color w:val="auto"/>
+          <w:kern w:val="0"/>
+          <w:sz w:val="24"/>
+          <w:szCs w:val="24"/>
+          <w:lang w:val="es-MX"/>
+        </w:rPr>
+      </w:pPr>
+    </w:p>
+    <w:p>
+      <w:pPr>
+        <w:pStyle w:val="Ttulo"/>
+        <w:framePr w:hSpace="0" w:wrap="auto" w:vAnchor="margin" w:hAnchor="text" w:yAlign="inline"/>
+        <w:spacing w:before="120" w:after="120"/>
         <w:jc w:val="center"/>
         <w:rPr>
           <w:rFonts w:asciiTheme="minorHAnsi" w:eastAsiaTheme="minorHAnsi" w:hAnsiTheme="minorHAnsi" w:cstheme="minorHAnsi"/>
@@ -7726,7 +9120,13 @@
           <w:lang w:val="es-MX"/>
         </w:rPr>
       </w:pPr>
-      <w:r>
+    </w:p>
+    <w:p>
+      <w:pPr>
+        <w:pStyle w:val="Ttulo"/>
+        <w:framePr w:hSpace="0" w:wrap="auto" w:vAnchor="margin" w:hAnchor="text" w:yAlign="inline"/>
+        <w:spacing w:before="120" w:after="120"/>
+        <w:jc w:val="both"/>
         <w:rPr>
           <w:rFonts w:asciiTheme="minorHAnsi" w:eastAsiaTheme="minorHAnsi" w:hAnsiTheme="minorHAnsi" w:cstheme="minorHAnsi"/>
           <w:bCs/>
@@ -7738,9 +9138,14 @@
           <w:szCs w:val="24"/>
           <w:lang w:val="es-MX"/>
         </w:rPr>
-        <w:t>Calificación</w:t>
-      </w:r>
-      <w:r>
+      </w:pPr>
+    </w:p>
+    <w:p>
+      <w:pPr>
+        <w:pStyle w:val="Ttulo"/>
+        <w:framePr w:hSpace="0" w:wrap="auto" w:vAnchor="margin" w:hAnchor="text" w:yAlign="inline"/>
+        <w:spacing w:before="120" w:after="120"/>
+        <w:jc w:val="both"/>
         <w:rPr>
           <w:rFonts w:asciiTheme="minorHAnsi" w:eastAsiaTheme="minorHAnsi" w:hAnsiTheme="minorHAnsi" w:cstheme="minorHAnsi"/>
           <w:bCs/>
@@ -7752,8 +9157,7 @@
           <w:szCs w:val="24"/>
           <w:lang w:val="es-MX"/>
         </w:rPr>
-        <w:t xml:space="preserve"> final</w:t>
-      </w:r>
+      </w:pPr>
       <w:r>
         <w:rPr>
           <w:rFonts w:asciiTheme="minorHAnsi" w:eastAsiaTheme="minorHAnsi" w:hAnsiTheme="minorHAnsi" w:cstheme="minorHAnsi"/>
@@ -7766,7 +9170,7 @@
           <w:szCs w:val="24"/>
           <w:lang w:val="es-MX"/>
         </w:rPr>
-        <w:t xml:space="preserve"> </w:t>
+        <w:br w:type="column"/>
       </w:r>
       <w:r>
         <w:rPr>
@@ -7780,8 +9184,85 @@
           <w:szCs w:val="24"/>
           <w:lang w:val="es-MX"/>
         </w:rPr>
+        <w:lastRenderedPageBreak/>
+        <w:t>Calificación</w:t>
+      </w:r>
+      <w:r>
+        <w:rPr>
+          <w:rFonts w:asciiTheme="minorHAnsi" w:eastAsiaTheme="minorHAnsi" w:hAnsiTheme="minorHAnsi" w:cstheme="minorHAnsi"/>
+          <w:bCs/>
+          <w:i/>
+          <w:iCs/>
+          <w:color w:val="auto"/>
+          <w:kern w:val="0"/>
+          <w:sz w:val="24"/>
+          <w:szCs w:val="24"/>
+          <w:lang w:val="es-MX"/>
+        </w:rPr>
+        <w:t xml:space="preserve"> final</w:t>
+      </w:r>
+      <w:r>
+        <w:rPr>
+          <w:rFonts w:asciiTheme="minorHAnsi" w:eastAsiaTheme="minorHAnsi" w:hAnsiTheme="minorHAnsi" w:cstheme="minorHAnsi"/>
+          <w:bCs/>
+          <w:i/>
+          <w:iCs/>
+          <w:color w:val="auto"/>
+          <w:kern w:val="0"/>
+          <w:sz w:val="24"/>
+          <w:szCs w:val="24"/>
+          <w:lang w:val="es-MX"/>
+        </w:rPr>
+        <w:t xml:space="preserve"> </w:t>
+      </w:r>
+      <w:r>
+        <w:rPr>
+          <w:rFonts w:asciiTheme="minorHAnsi" w:eastAsiaTheme="minorHAnsi" w:hAnsiTheme="minorHAnsi" w:cstheme="minorHAnsi"/>
+          <w:bCs/>
+          <w:i/>
+          <w:iCs/>
+          <w:color w:val="auto"/>
+          <w:kern w:val="0"/>
+          <w:sz w:val="24"/>
+          <w:szCs w:val="24"/>
+          <w:lang w:val="es-MX"/>
+        </w:rPr>
         <w:t>por categoría</w:t>
       </w:r>
+    </w:p>
+    <w:p>
+      <w:pPr>
+        <w:pStyle w:val="Ttulo"/>
+        <w:framePr w:hSpace="0" w:wrap="auto" w:vAnchor="margin" w:hAnchor="text" w:yAlign="inline"/>
+        <w:spacing w:before="120" w:after="120"/>
+        <w:jc w:val="both"/>
+        <w:rPr>
+          <w:rFonts w:asciiTheme="minorHAnsi" w:eastAsiaTheme="minorHAnsi" w:hAnsiTheme="minorHAnsi" w:cstheme="minorHAnsi"/>
+          <w:b w:val="0"/>
+          <w:color w:val="auto"/>
+          <w:kern w:val="0"/>
+          <w:sz w:val="24"/>
+          <w:szCs w:val="24"/>
+          <w:lang w:val="es-MX"/>
+        </w:rPr>
+      </w:pPr>
+    </w:p>
+    <w:p>
+      <w:pPr>
+        <w:pStyle w:val="Ttulo"/>
+        <w:framePr w:hSpace="0" w:wrap="auto" w:vAnchor="margin" w:hAnchor="text" w:yAlign="inline"/>
+        <w:spacing w:before="120" w:after="120"/>
+        <w:jc w:val="both"/>
+        <w:rPr>
+          <w:rFonts w:asciiTheme="minorHAnsi" w:eastAsiaTheme="minorHAnsi" w:hAnsiTheme="minorHAnsi" w:cstheme="minorHAnsi"/>
+          <w:b w:val="0"/>
+          <w:color w:val="auto"/>
+          <w:kern w:val="0"/>
+          <w:sz w:val="24"/>
+          <w:szCs w:val="24"/>
+          <w:lang w:val="es-MX"/>
+        </w:rPr>
+      </w:pPr>
     </w:p>
     <w:p>
       <w:pPr>
@@ -7813,15 +9294,15 @@
         <mc:AlternateContent>
           <mc:Choice Requires="wps">
             <w:drawing>
-              <wp:anchor distT="45720" distB="45720" distL="114300" distR="114300" simplePos="0" relativeHeight="251662338" behindDoc="0" locked="0" layoutInCell="1" allowOverlap="1" wp14:anchorId="64B46952" wp14:editId="5AA44A33">
+              <wp:anchor distT="45720" distB="45720" distL="114300" distR="114300" simplePos="0" relativeHeight="251662338" behindDoc="0" locked="0" layoutInCell="1" allowOverlap="1" wp14:anchorId="64B46952" wp14:editId="5EECF3FD">
                 <wp:simplePos x="0" y="0"/>
                 <wp:positionH relativeFrom="column">
-                  <wp:posOffset>2813685</wp:posOffset>
+                  <wp:posOffset>415290</wp:posOffset>
                 </wp:positionH>
                 <wp:positionV relativeFrom="paragraph">
-                  <wp:posOffset>38735</wp:posOffset>
+                  <wp:posOffset>8890</wp:posOffset>
                 </wp:positionV>
-                <wp:extent cx="3368040" cy="1531620"/>
+                <wp:extent cx="5124450" cy="2457450"/>
                 <wp:effectExtent l="0" t="0" r="0" b="0"/>
                 <wp:wrapNone/>
                 <wp:docPr id="217" name="Cuadro de texto 2"/>
@@ -7837,7 +9318,7 @@
                       <wps:spPr bwMode="auto">
                         <a:xfrm>
                           <a:off x="0" y="0"/>
-                          <a:ext cx="3368040" cy="1531620"/>
+                          <a:ext cx="5124450" cy="2457450"/>
                         </a:xfrm>
                         <a:prstGeom prst="rect">
                           <a:avLst/>
@@ -7856,11 +9337,9 @@
                             <w:r>
                               <w:t>${</w:t>
                             </w:r>
-                            <w:proofErr w:type="spellStart"/>
                             <w:r>
                               <w:t>grafica_categorias</w:t>
                             </w:r>
-                            <w:proofErr w:type="spellEnd"/>
                             <w:r>
                               <w:t>}</w:t>
                             </w:r>
@@ -7889,18 +9368,16 @@
                 <v:stroke joinstyle="miter"/>
                 <v:path gradientshapeok="t" o:connecttype="rect"/>
               </v:shapetype>
-              <v:shape id="Cuadro de texto 2" o:spid="_x0000_s1026" type="#_x0000_t202" style="position:absolute;left:0;text-align:left;margin-left:221.55pt;margin-top:3.05pt;width:265.2pt;height:120.6pt;z-index:251662338;visibility:visible;mso-wrap-style:square;mso-width-percent:0;mso-height-percent:0;mso-wrap-distance-left:9pt;mso-wrap-distance-top:3.6pt;mso-wrap-distance-right:9pt;mso-wrap-distance-bottom:3.6pt;mso-position-horizontal:absolute;mso-position-horizontal-relative:text;mso-position-vertical:absolute;mso-position-vertical-relative:text;mso-width-percent:0;mso-height-percent:0;mso-width-relative:margin;mso-height-relative:margin;v-text-anchor:top" o:gfxdata="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" filled="f" stroked="f">
+              <v:shape id="Cuadro de texto 2" o:spid="_x0000_s1026" type="#_x0000_t202" style="position:absolute;left:0;text-align:left;margin-left:32.7pt;margin-top:.7pt;width:403.5pt;height:193.5pt;z-index:251662338;visibility:visible;mso-wrap-style:square;mso-width-percent:0;mso-height-percent:0;mso-wrap-distance-left:9pt;mso-wrap-distance-top:3.6pt;mso-wrap-distance-right:9pt;mso-wrap-distance-bottom:3.6pt;mso-position-horizontal:absolute;mso-position-horizontal-relative:text;mso-position-vertical:absolute;mso-position-vertical-relative:text;mso-width-percent:0;mso-height-percent:0;mso-width-relative:margin;mso-height-relative:margin;v-text-anchor:top" o:gfxdata="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" filled="f" stroked="f">
                 <v:textbox>
                   <w:txbxContent>
                     <w:p>
                       <w:r>
                         <w:t>${</w:t>
                       </w:r>
-                      <w:proofErr w:type="spellStart"/>
                       <w:r>
                         <w:t>grafica_categorias</w:t>
                       </w:r>
-                      <w:proofErr w:type="spellEnd"/>
                       <w:r>
                         <w:t>}</w:t>
                       </w:r>
@@ -7913,6 +9390,244 @@
           </mc:Fallback>
         </mc:AlternateContent>
       </w:r>
+    </w:p>
+    <w:p>
+      <w:pPr>
+        <w:pStyle w:val="Ttulo"/>
+        <w:framePr w:hSpace="0" w:wrap="auto" w:vAnchor="margin" w:hAnchor="text" w:yAlign="inline"/>
+        <w:spacing w:before="120" w:after="120"/>
+        <w:jc w:val="both"/>
+        <w:rPr>
+          <w:rFonts w:asciiTheme="minorHAnsi" w:eastAsiaTheme="minorHAnsi" w:hAnsiTheme="minorHAnsi" w:cstheme="minorHAnsi"/>
+          <w:b w:val="0"/>
+          <w:color w:val="auto"/>
+          <w:kern w:val="0"/>
+          <w:sz w:val="24"/>
+          <w:szCs w:val="24"/>
+          <w:lang w:val="es-MX"/>
+        </w:rPr>
+      </w:pPr>
+    </w:p>
+    <w:p>
+      <w:pPr>
+        <w:pStyle w:val="Ttulo"/>
+        <w:framePr w:hSpace="0" w:wrap="auto" w:vAnchor="margin" w:hAnchor="text" w:yAlign="inline"/>
+        <w:spacing w:before="120" w:after="120"/>
+        <w:jc w:val="both"/>
+        <w:rPr>
+          <w:rFonts w:asciiTheme="minorHAnsi" w:eastAsiaTheme="minorHAnsi" w:hAnsiTheme="minorHAnsi" w:cstheme="minorHAnsi"/>
+          <w:b w:val="0"/>
+          <w:color w:val="auto"/>
+          <w:kern w:val="0"/>
+          <w:sz w:val="24"/>
+          <w:szCs w:val="24"/>
+          <w:lang w:val="es-MX"/>
+        </w:rPr>
+      </w:pPr>
+    </w:p>
+    <w:p>
+      <w:pPr>
+        <w:pStyle w:val="Ttulo"/>
+        <w:framePr w:hSpace="0" w:wrap="auto" w:vAnchor="margin" w:hAnchor="text" w:yAlign="inline"/>
+        <w:spacing w:before="120" w:after="120"/>
+        <w:jc w:val="both"/>
+        <w:rPr>
+          <w:rFonts w:asciiTheme="minorHAnsi" w:eastAsiaTheme="minorHAnsi" w:hAnsiTheme="minorHAnsi" w:cstheme="minorHAnsi"/>
+          <w:b w:val="0"/>
+          <w:color w:val="auto"/>
+          <w:kern w:val="0"/>
+          <w:sz w:val="24"/>
+          <w:szCs w:val="24"/>
+          <w:lang w:val="es-MX"/>
+        </w:rPr>
+      </w:pPr>
+    </w:p>
+    <w:p>
+      <w:pPr>
+        <w:pStyle w:val="Ttulo"/>
+        <w:framePr w:hSpace="0" w:wrap="auto" w:vAnchor="margin" w:hAnchor="text" w:yAlign="inline"/>
+        <w:spacing w:before="120" w:after="120"/>
+        <w:jc w:val="both"/>
+        <w:rPr>
+          <w:rFonts w:asciiTheme="minorHAnsi" w:eastAsiaTheme="minorHAnsi" w:hAnsiTheme="minorHAnsi" w:cstheme="minorHAnsi"/>
+          <w:b w:val="0"/>
+          <w:color w:val="auto"/>
+          <w:kern w:val="0"/>
+          <w:sz w:val="24"/>
+          <w:szCs w:val="24"/>
+          <w:lang w:val="es-MX"/>
+        </w:rPr>
+      </w:pPr>
+    </w:p>
+    <w:p>
+      <w:pPr>
+        <w:pStyle w:val="Ttulo"/>
+        <w:framePr w:hSpace="0" w:wrap="auto" w:vAnchor="margin" w:hAnchor="text" w:yAlign="inline"/>
+        <w:spacing w:before="120" w:after="120"/>
+        <w:jc w:val="both"/>
+        <w:rPr>
+          <w:rFonts w:asciiTheme="minorHAnsi" w:eastAsiaTheme="minorHAnsi" w:hAnsiTheme="minorHAnsi" w:cstheme="minorHAnsi"/>
+          <w:b w:val="0"/>
+          <w:color w:val="auto"/>
+          <w:kern w:val="0"/>
+          <w:sz w:val="24"/>
+          <w:szCs w:val="24"/>
+          <w:lang w:val="es-MX"/>
+        </w:rPr>
+      </w:pPr>
+    </w:p>
+    <w:p>
+      <w:pPr>
+        <w:pStyle w:val="Ttulo"/>
+        <w:framePr w:hSpace="0" w:wrap="auto" w:vAnchor="margin" w:hAnchor="text" w:yAlign="inline"/>
+        <w:spacing w:before="120" w:after="120"/>
+        <w:jc w:val="both"/>
+        <w:rPr>
+          <w:rFonts w:asciiTheme="minorHAnsi" w:eastAsiaTheme="minorHAnsi" w:hAnsiTheme="minorHAnsi" w:cstheme="minorHAnsi"/>
+          <w:b w:val="0"/>
+          <w:color w:val="auto"/>
+          <w:kern w:val="0"/>
+          <w:sz w:val="24"/>
+          <w:szCs w:val="24"/>
+          <w:lang w:val="es-MX"/>
+        </w:rPr>
+      </w:pPr>
+    </w:p>
+    <w:p>
+      <w:pPr>
+        <w:pStyle w:val="Ttulo"/>
+        <w:framePr w:hSpace="0" w:wrap="auto" w:vAnchor="margin" w:hAnchor="text" w:yAlign="inline"/>
+        <w:spacing w:before="120" w:after="120"/>
+        <w:jc w:val="both"/>
+        <w:rPr>
+          <w:rFonts w:asciiTheme="minorHAnsi" w:eastAsiaTheme="minorHAnsi" w:hAnsiTheme="minorHAnsi" w:cstheme="minorHAnsi"/>
+          <w:b w:val="0"/>
+          <w:color w:val="auto"/>
+          <w:kern w:val="0"/>
+          <w:sz w:val="24"/>
+          <w:szCs w:val="24"/>
+          <w:lang w:val="es-MX"/>
+        </w:rPr>
+      </w:pPr>
+    </w:p>
+    <w:p>
+      <w:pPr>
+        <w:pStyle w:val="Ttulo"/>
+        <w:framePr w:hSpace="0" w:wrap="auto" w:vAnchor="margin" w:hAnchor="text" w:yAlign="inline"/>
+        <w:spacing w:before="120" w:after="120"/>
+        <w:jc w:val="both"/>
+        <w:rPr>
+          <w:rFonts w:asciiTheme="minorHAnsi" w:eastAsiaTheme="minorHAnsi" w:hAnsiTheme="minorHAnsi" w:cstheme="minorHAnsi"/>
+          <w:b w:val="0"/>
+          <w:color w:val="auto"/>
+          <w:kern w:val="0"/>
+          <w:sz w:val="24"/>
+          <w:szCs w:val="24"/>
+          <w:lang w:val="es-MX"/>
+        </w:rPr>
+      </w:pPr>
+    </w:p>
+    <w:p>
+      <w:pPr>
+        <w:pStyle w:val="Ttulo"/>
+        <w:framePr w:hSpace="0" w:wrap="auto" w:vAnchor="margin" w:hAnchor="text" w:yAlign="inline"/>
+        <w:spacing w:before="120" w:after="120"/>
+        <w:jc w:val="both"/>
+        <w:rPr>
+          <w:rFonts w:asciiTheme="minorHAnsi" w:eastAsiaTheme="minorHAnsi" w:hAnsiTheme="minorHAnsi" w:cstheme="minorHAnsi"/>
+          <w:b w:val="0"/>
+          <w:color w:val="auto"/>
+          <w:kern w:val="0"/>
+          <w:sz w:val="24"/>
+          <w:szCs w:val="24"/>
+          <w:lang w:val="es-MX"/>
+        </w:rPr>
+      </w:pPr>
+    </w:p>
+    <w:p>
+      <w:pPr>
+        <w:pStyle w:val="Ttulo"/>
+        <w:framePr w:hSpace="0" w:wrap="auto" w:vAnchor="margin" w:hAnchor="text" w:yAlign="inline"/>
+        <w:spacing w:before="120" w:after="120"/>
+        <w:jc w:val="both"/>
+        <w:rPr>
+          <w:rFonts w:asciiTheme="minorHAnsi" w:eastAsiaTheme="minorHAnsi" w:hAnsiTheme="minorHAnsi" w:cstheme="minorHAnsi"/>
+          <w:b w:val="0"/>
+          <w:color w:val="auto"/>
+          <w:kern w:val="0"/>
+          <w:sz w:val="24"/>
+          <w:szCs w:val="24"/>
+          <w:lang w:val="es-MX"/>
+        </w:rPr>
+      </w:pPr>
+    </w:p>
+    <w:p>
+      <w:pPr>
+        <w:pStyle w:val="Ttulo"/>
+        <w:framePr w:hSpace="0" w:wrap="auto" w:vAnchor="margin" w:hAnchor="text" w:yAlign="inline"/>
+        <w:spacing w:before="120" w:after="120"/>
+        <w:jc w:val="both"/>
+        <w:rPr>
+          <w:rFonts w:asciiTheme="minorHAnsi" w:eastAsiaTheme="minorHAnsi" w:hAnsiTheme="minorHAnsi" w:cstheme="minorHAnsi"/>
+          <w:b w:val="0"/>
+          <w:color w:val="auto"/>
+          <w:kern w:val="0"/>
+          <w:sz w:val="24"/>
+          <w:szCs w:val="24"/>
+          <w:lang w:val="es-MX"/>
+        </w:rPr>
+      </w:pPr>
+    </w:p>
+    <w:p>
+      <w:pPr>
+        <w:pStyle w:val="Ttulo"/>
+        <w:framePr w:hSpace="0" w:wrap="auto" w:vAnchor="margin" w:hAnchor="text" w:yAlign="inline"/>
+        <w:spacing w:before="120" w:after="120"/>
+        <w:jc w:val="both"/>
+        <w:rPr>
+          <w:rFonts w:asciiTheme="minorHAnsi" w:eastAsiaTheme="minorHAnsi" w:hAnsiTheme="minorHAnsi" w:cstheme="minorHAnsi"/>
+          <w:b w:val="0"/>
+          <w:color w:val="auto"/>
+          <w:kern w:val="0"/>
+          <w:sz w:val="24"/>
+          <w:szCs w:val="24"/>
+          <w:lang w:val="es-MX"/>
+        </w:rPr>
+      </w:pPr>
+    </w:p>
+    <w:p>
+      <w:pPr>
+        <w:pStyle w:val="Ttulo"/>
+        <w:framePr w:hSpace="0" w:wrap="auto" w:vAnchor="margin" w:hAnchor="text" w:yAlign="inline"/>
+        <w:spacing w:before="120" w:after="120"/>
+        <w:jc w:val="both"/>
+        <w:rPr>
+          <w:rFonts w:asciiTheme="minorHAnsi" w:eastAsiaTheme="minorHAnsi" w:hAnsiTheme="minorHAnsi" w:cstheme="minorHAnsi"/>
+          <w:b w:val="0"/>
+          <w:color w:val="auto"/>
+          <w:kern w:val="0"/>
+          <w:sz w:val="24"/>
+          <w:szCs w:val="24"/>
+          <w:lang w:val="es-MX"/>
+        </w:rPr>
+      </w:pPr>
+    </w:p>
+    <w:p>
+      <w:pPr>
+        <w:pStyle w:val="Ttulo"/>
+        <w:framePr w:hSpace="0" w:wrap="auto" w:vAnchor="margin" w:hAnchor="text" w:yAlign="inline"/>
+        <w:spacing w:before="120" w:after="120"/>
+        <w:jc w:val="both"/>
+        <w:rPr>
+          <w:rFonts w:asciiTheme="minorHAnsi" w:eastAsiaTheme="minorHAnsi" w:hAnsiTheme="minorHAnsi" w:cstheme="minorHAnsi"/>
+          <w:b w:val="0"/>
+          <w:color w:val="auto"/>
+          <w:kern w:val="0"/>
+          <w:sz w:val="24"/>
+          <w:szCs w:val="24"/>
+          <w:lang w:val="es-MX"/>
+        </w:rPr>
+      </w:pPr>
     </w:p>
     <w:tbl>
       <w:tblPr>
@@ -8248,17 +9963,6 @@
         <w:rPr>
           <w:rFonts w:asciiTheme="minorHAnsi" w:eastAsiaTheme="minorHAnsi" w:hAnsiTheme="minorHAnsi" w:cstheme="minorHAnsi"/>
           <w:b w:val="0"/>
-          <w:color w:val="auto"/>
-          <w:kern w:val="0"/>
-          <w:sz w:val="24"/>
-          <w:szCs w:val="24"/>
-          <w:lang w:val="es-MX"/>
-        </w:rPr>
-      </w:pPr>
-      <w:r>
-        <w:rPr>
-          <w:rFonts w:asciiTheme="minorHAnsi" w:eastAsiaTheme="minorHAnsi" w:hAnsiTheme="minorHAnsi" w:cstheme="minorHAnsi"/>
-          <w:b w:val="0"/>
           <w:noProof/>
           <w:color w:val="auto"/>
           <w:kern w:val="0"/>
@@ -8266,42 +9970,20 @@
           <w:szCs w:val="24"/>
           <w:lang w:val="es-MX"/>
         </w:rPr>
+      </w:pPr>
+      <w:r>
+        <w:rPr>
+          <w:rFonts w:asciiTheme="minorHAnsi" w:eastAsiaTheme="minorHAnsi" w:hAnsiTheme="minorHAnsi" w:cstheme="minorHAnsi"/>
+          <w:b w:val="0"/>
+          <w:noProof/>
+          <w:color w:val="auto"/>
+          <w:kern w:val="0"/>
+          <w:sz w:val="24"/>
+          <w:szCs w:val="24"/>
+          <w:lang w:val="es-MX"/>
+        </w:rPr>
         <w:t xml:space="preserve">  </w:t>
       </w:r>
-    </w:p>
-    <w:p>
-      <w:pPr>
-        <w:pStyle w:val="Ttulo"/>
-        <w:framePr w:hSpace="0" w:wrap="auto" w:vAnchor="margin" w:hAnchor="text" w:yAlign="inline"/>
-        <w:spacing w:before="120" w:after="120"/>
-        <w:jc w:val="both"/>
-        <w:rPr>
-          <w:rFonts w:asciiTheme="minorHAnsi" w:eastAsiaTheme="minorHAnsi" w:hAnsiTheme="minorHAnsi" w:cstheme="minorHAnsi"/>
-          <w:b w:val="0"/>
-          <w:color w:val="auto"/>
-          <w:kern w:val="0"/>
-          <w:sz w:val="24"/>
-          <w:szCs w:val="24"/>
-          <w:lang w:val="es-MX"/>
-        </w:rPr>
-      </w:pPr>
-    </w:p>
-    <w:p>
-      <w:pPr>
-        <w:pStyle w:val="Ttulo"/>
-        <w:framePr w:hSpace="0" w:wrap="auto" w:vAnchor="margin" w:hAnchor="text" w:yAlign="inline"/>
-        <w:spacing w:before="120" w:after="120"/>
-        <w:jc w:val="both"/>
-        <w:rPr>
-          <w:rFonts w:asciiTheme="minorHAnsi" w:eastAsiaTheme="minorHAnsi" w:hAnsiTheme="minorHAnsi" w:cstheme="minorHAnsi"/>
-          <w:b w:val="0"/>
-          <w:color w:val="auto"/>
-          <w:kern w:val="0"/>
-          <w:sz w:val="24"/>
-          <w:szCs w:val="24"/>
-          <w:lang w:val="es-MX"/>
-        </w:rPr>
-      </w:pPr>
     </w:p>
     <w:p>
       <w:pPr>
@@ -9663,35 +11345,6 @@
         <w:jc w:val="both"/>
         <w:rPr>
           <w:rFonts w:asciiTheme="minorHAnsi" w:eastAsiaTheme="minorHAnsi" w:hAnsiTheme="minorHAnsi" w:cstheme="minorHAnsi"/>
-          <w:b w:val="0"/>
-          <w:color w:val="auto"/>
-          <w:kern w:val="0"/>
-          <w:sz w:val="24"/>
-          <w:szCs w:val="24"/>
-          <w:lang w:val="es-MX"/>
-        </w:rPr>
-      </w:pPr>
-      <w:r>
-        <w:rPr>
-          <w:rFonts w:asciiTheme="minorHAnsi" w:eastAsiaTheme="minorHAnsi" w:hAnsiTheme="minorHAnsi" w:cstheme="minorHAnsi"/>
-          <w:b w:val="0"/>
-          <w:color w:val="auto"/>
-          <w:kern w:val="0"/>
-          <w:sz w:val="24"/>
-          <w:szCs w:val="24"/>
-          <w:lang w:val="es-MX"/>
-        </w:rPr>
-        <w:br/>
-      </w:r>
-    </w:p>
-    <w:p>
-      <w:pPr>
-        <w:pStyle w:val="Ttulo"/>
-        <w:framePr w:hSpace="0" w:wrap="auto" w:vAnchor="margin" w:hAnchor="text" w:yAlign="inline"/>
-        <w:spacing w:before="120" w:after="120"/>
-        <w:jc w:val="both"/>
-        <w:rPr>
-          <w:rFonts w:asciiTheme="minorHAnsi" w:eastAsiaTheme="minorHAnsi" w:hAnsiTheme="minorHAnsi" w:cstheme="minorHAnsi"/>
           <w:bCs/>
           <w:i/>
           <w:iCs/>
@@ -9702,18 +11355,222 @@
           <w:lang w:val="es-MX"/>
         </w:rPr>
       </w:pPr>
-      <w:r>
-        <w:rPr>
-          <w:rFonts w:asciiTheme="minorHAnsi" w:eastAsiaTheme="minorHAnsi" w:hAnsiTheme="minorHAnsi" w:cstheme="minorHAnsi"/>
-          <w:b w:val="0"/>
-          <w:color w:val="auto"/>
-          <w:kern w:val="0"/>
-          <w:sz w:val="24"/>
-          <w:szCs w:val="24"/>
-          <w:lang w:val="es-MX"/>
-        </w:rPr>
-        <w:br w:type="column"/>
-      </w:r>
+    </w:p>
+    <w:p>
+      <w:pPr>
+        <w:pStyle w:val="Ttulo"/>
+        <w:framePr w:hSpace="0" w:wrap="auto" w:vAnchor="margin" w:hAnchor="text" w:yAlign="inline"/>
+        <w:spacing w:before="120" w:after="120"/>
+        <w:jc w:val="both"/>
+        <w:rPr>
+          <w:rFonts w:asciiTheme="minorHAnsi" w:eastAsiaTheme="minorHAnsi" w:hAnsiTheme="minorHAnsi" w:cstheme="minorHAnsi"/>
+          <w:bCs/>
+          <w:i/>
+          <w:iCs/>
+          <w:color w:val="auto"/>
+          <w:kern w:val="0"/>
+          <w:sz w:val="24"/>
+          <w:szCs w:val="24"/>
+          <w:lang w:val="es-MX"/>
+        </w:rPr>
+      </w:pPr>
+    </w:p>
+    <w:p>
+      <w:pPr>
+        <w:pStyle w:val="Ttulo"/>
+        <w:framePr w:hSpace="0" w:wrap="auto" w:vAnchor="margin" w:hAnchor="text" w:yAlign="inline"/>
+        <w:spacing w:before="120" w:after="120"/>
+        <w:jc w:val="both"/>
+        <w:rPr>
+          <w:rFonts w:asciiTheme="minorHAnsi" w:eastAsiaTheme="minorHAnsi" w:hAnsiTheme="minorHAnsi" w:cstheme="minorHAnsi"/>
+          <w:bCs/>
+          <w:i/>
+          <w:iCs/>
+          <w:color w:val="auto"/>
+          <w:kern w:val="0"/>
+          <w:sz w:val="24"/>
+          <w:szCs w:val="24"/>
+          <w:lang w:val="es-MX"/>
+        </w:rPr>
+      </w:pPr>
+    </w:p>
+    <w:p>
+      <w:pPr>
+        <w:pStyle w:val="Ttulo"/>
+        <w:framePr w:hSpace="0" w:wrap="auto" w:vAnchor="margin" w:hAnchor="text" w:yAlign="inline"/>
+        <w:spacing w:before="120" w:after="120"/>
+        <w:jc w:val="both"/>
+        <w:rPr>
+          <w:rFonts w:asciiTheme="minorHAnsi" w:eastAsiaTheme="minorHAnsi" w:hAnsiTheme="minorHAnsi" w:cstheme="minorHAnsi"/>
+          <w:bCs/>
+          <w:i/>
+          <w:iCs/>
+          <w:color w:val="auto"/>
+          <w:kern w:val="0"/>
+          <w:sz w:val="24"/>
+          <w:szCs w:val="24"/>
+          <w:lang w:val="es-MX"/>
+        </w:rPr>
+      </w:pPr>
+    </w:p>
+    <w:p>
+      <w:pPr>
+        <w:pStyle w:val="Ttulo"/>
+        <w:framePr w:hSpace="0" w:wrap="auto" w:vAnchor="margin" w:hAnchor="text" w:yAlign="inline"/>
+        <w:spacing w:before="120" w:after="120"/>
+        <w:jc w:val="both"/>
+        <w:rPr>
+          <w:rFonts w:asciiTheme="minorHAnsi" w:eastAsiaTheme="minorHAnsi" w:hAnsiTheme="minorHAnsi" w:cstheme="minorHAnsi"/>
+          <w:bCs/>
+          <w:i/>
+          <w:iCs/>
+          <w:color w:val="auto"/>
+          <w:kern w:val="0"/>
+          <w:sz w:val="24"/>
+          <w:szCs w:val="24"/>
+          <w:lang w:val="es-MX"/>
+        </w:rPr>
+      </w:pPr>
+    </w:p>
+    <w:p>
+      <w:pPr>
+        <w:pStyle w:val="Ttulo"/>
+        <w:framePr w:hSpace="0" w:wrap="auto" w:vAnchor="margin" w:hAnchor="text" w:yAlign="inline"/>
+        <w:spacing w:before="120" w:after="120"/>
+        <w:jc w:val="both"/>
+        <w:rPr>
+          <w:rFonts w:asciiTheme="minorHAnsi" w:eastAsiaTheme="minorHAnsi" w:hAnsiTheme="minorHAnsi" w:cstheme="minorHAnsi"/>
+          <w:bCs/>
+          <w:i/>
+          <w:iCs/>
+          <w:color w:val="auto"/>
+          <w:kern w:val="0"/>
+          <w:sz w:val="24"/>
+          <w:szCs w:val="24"/>
+          <w:lang w:val="es-MX"/>
+        </w:rPr>
+      </w:pPr>
+      <w:r>
+        <w:rPr>
+          <w:rFonts w:asciiTheme="minorHAnsi" w:eastAsiaTheme="minorHAnsi" w:hAnsiTheme="minorHAnsi" w:cstheme="minorHAnsi"/>
+          <w:b w:val="0"/>
+          <w:color w:val="auto"/>
+          <w:kern w:val="0"/>
+          <w:sz w:val="24"/>
+          <w:szCs w:val="24"/>
+          <w:lang w:val="es-MX"/>
+        </w:rPr>
+        <w:lastRenderedPageBreak/>
+        <w:br/>
+      </w:r>
+      <w:r>
+        <w:rPr>
+          <w:rFonts w:asciiTheme="minorHAnsi" w:eastAsiaTheme="minorHAnsi" w:hAnsiTheme="minorHAnsi" w:cstheme="minorHAnsi"/>
+          <w:bCs/>
+          <w:i/>
+          <w:iCs/>
+          <w:color w:val="auto"/>
+          <w:kern w:val="0"/>
+          <w:sz w:val="24"/>
+          <w:szCs w:val="24"/>
+          <w:lang w:val="es-MX"/>
+        </w:rPr>
+        <w:t>Calificación</w:t>
+      </w:r>
+      <w:r>
+        <w:rPr>
+          <w:rFonts w:asciiTheme="minorHAnsi" w:eastAsiaTheme="minorHAnsi" w:hAnsiTheme="minorHAnsi" w:cstheme="minorHAnsi"/>
+          <w:bCs/>
+          <w:i/>
+          <w:iCs/>
+          <w:color w:val="auto"/>
+          <w:kern w:val="0"/>
+          <w:sz w:val="24"/>
+          <w:szCs w:val="24"/>
+          <w:lang w:val="es-MX"/>
+        </w:rPr>
+        <w:t xml:space="preserve"> total</w:t>
+      </w:r>
+      <w:r>
+        <w:rPr>
+          <w:rFonts w:asciiTheme="minorHAnsi" w:eastAsiaTheme="minorHAnsi" w:hAnsiTheme="minorHAnsi" w:cstheme="minorHAnsi"/>
+          <w:bCs/>
+          <w:i/>
+          <w:iCs/>
+          <w:color w:val="auto"/>
+          <w:kern w:val="0"/>
+          <w:sz w:val="24"/>
+          <w:szCs w:val="24"/>
+          <w:lang w:val="es-MX"/>
+        </w:rPr>
+        <w:t xml:space="preserve"> </w:t>
+      </w:r>
+      <w:r>
+        <w:rPr>
+          <w:rFonts w:asciiTheme="minorHAnsi" w:eastAsiaTheme="minorHAnsi" w:hAnsiTheme="minorHAnsi" w:cstheme="minorHAnsi"/>
+          <w:bCs/>
+          <w:i/>
+          <w:iCs/>
+          <w:color w:val="auto"/>
+          <w:kern w:val="0"/>
+          <w:sz w:val="24"/>
+          <w:szCs w:val="24"/>
+          <w:lang w:val="es-MX"/>
+        </w:rPr>
+        <w:t xml:space="preserve">por </w:t>
+      </w:r>
+      <w:r>
+        <w:rPr>
+          <w:rFonts w:asciiTheme="minorHAnsi" w:eastAsiaTheme="minorHAnsi" w:hAnsiTheme="minorHAnsi" w:cstheme="minorHAnsi"/>
+          <w:bCs/>
+          <w:i/>
+          <w:iCs/>
+          <w:color w:val="auto"/>
+          <w:kern w:val="0"/>
+          <w:sz w:val="24"/>
+          <w:szCs w:val="24"/>
+          <w:lang w:val="es-MX"/>
+        </w:rPr>
+        <w:t>dominio</w:t>
+      </w:r>
+    </w:p>
+    <w:p>
+      <w:pPr>
+        <w:pStyle w:val="Ttulo"/>
+        <w:framePr w:hSpace="0" w:wrap="auto" w:vAnchor="margin" w:hAnchor="text" w:yAlign="inline"/>
+        <w:spacing w:before="120" w:after="120"/>
+        <w:jc w:val="both"/>
+        <w:rPr>
+          <w:rFonts w:asciiTheme="minorHAnsi" w:eastAsiaTheme="minorHAnsi" w:hAnsiTheme="minorHAnsi" w:cstheme="minorHAnsi"/>
+          <w:bCs/>
+          <w:i/>
+          <w:iCs/>
+          <w:color w:val="auto"/>
+          <w:kern w:val="0"/>
+          <w:sz w:val="24"/>
+          <w:szCs w:val="24"/>
+          <w:lang w:val="es-MX"/>
+        </w:rPr>
+      </w:pPr>
+    </w:p>
+    <w:p>
+      <w:pPr>
+        <w:pStyle w:val="Ttulo"/>
+        <w:framePr w:hSpace="0" w:wrap="auto" w:vAnchor="margin" w:hAnchor="text" w:yAlign="inline"/>
+        <w:spacing w:before="120" w:after="120"/>
+        <w:jc w:val="both"/>
+        <w:rPr>
+          <w:rFonts w:asciiTheme="minorHAnsi" w:eastAsiaTheme="minorHAnsi" w:hAnsiTheme="minorHAnsi" w:cstheme="minorHAnsi"/>
+          <w:bCs/>
+          <w:i/>
+          <w:iCs/>
+          <w:color w:val="auto"/>
+          <w:kern w:val="0"/>
+          <w:sz w:val="24"/>
+          <w:szCs w:val="24"/>
+          <w:lang w:val="es-MX"/>
+        </w:rPr>
+      </w:pPr>
       <w:r>
         <w:rPr>
           <w:rFonts w:asciiTheme="minorHAnsi" w:eastAsiaTheme="minorHAnsi" w:hAnsiTheme="minorHAnsi" w:cstheme="minorHAnsi"/>
@@ -9725,19 +11582,18 @@
           <w:szCs w:val="24"/>
           <w:lang w:val="es-MX"/>
         </w:rPr>
-        <w:lastRenderedPageBreak/>
         <mc:AlternateContent>
           <mc:Choice Requires="wps">
             <w:drawing>
-              <wp:anchor distT="45720" distB="45720" distL="114300" distR="114300" simplePos="0" relativeHeight="251664386" behindDoc="0" locked="0" layoutInCell="1" allowOverlap="1" wp14:anchorId="64F40AD7" wp14:editId="18972FCA">
+              <wp:anchor distT="45720" distB="45720" distL="114300" distR="114300" simplePos="0" relativeHeight="251664386" behindDoc="0" locked="0" layoutInCell="1" allowOverlap="1" wp14:anchorId="64F40AD7" wp14:editId="252DF8C8">
                 <wp:simplePos x="0" y="0"/>
                 <wp:positionH relativeFrom="column">
-                  <wp:posOffset>2722245</wp:posOffset>
+                  <wp:posOffset>862965</wp:posOffset>
                 </wp:positionH>
                 <wp:positionV relativeFrom="paragraph">
-                  <wp:posOffset>182245</wp:posOffset>
+                  <wp:posOffset>8890</wp:posOffset>
                 </wp:positionV>
-                <wp:extent cx="3265170" cy="1531620"/>
+                <wp:extent cx="4533900" cy="2590800"/>
                 <wp:effectExtent l="0" t="0" r="0" b="0"/>
                 <wp:wrapNone/>
                 <wp:docPr id="188192207" name="Cuadro de texto 2"/>
@@ -9753,7 +11609,7 @@
                       <wps:spPr bwMode="auto">
                         <a:xfrm>
                           <a:off x="0" y="0"/>
-                          <a:ext cx="3265170" cy="1531620"/>
+                          <a:ext cx="4533900" cy="2590800"/>
                         </a:xfrm>
                         <a:prstGeom prst="rect">
                           <a:avLst/>
@@ -9772,11 +11628,9 @@
                             <w:r>
                               <w:t>${</w:t>
                             </w:r>
-                            <w:proofErr w:type="spellStart"/>
                             <w:r>
                               <w:t>grafica_dominios</w:t>
                             </w:r>
-                            <w:proofErr w:type="spellEnd"/>
                             <w:r>
                               <w:t>}</w:t>
                             </w:r>
@@ -9801,18 +11655,16 @@
           </mc:Choice>
           <mc:Fallback>
             <w:pict>
-              <v:shape w14:anchorId="64F40AD7" id="_x0000_s1027" type="#_x0000_t202" style="position:absolute;left:0;text-align:left;margin-left:214.35pt;margin-top:14.35pt;width:257.1pt;height:120.6pt;z-index:251664386;visibility:visible;mso-wrap-style:square;mso-width-percent:0;mso-height-percent:0;mso-wrap-distance-left:9pt;mso-wrap-distance-top:3.6pt;mso-wrap-distance-right:9pt;mso-wrap-distance-bottom:3.6pt;mso-position-horizontal:absolute;mso-position-horizontal-relative:text;mso-position-vertical:absolute;mso-position-vertical-relative:text;mso-width-percent:0;mso-height-percent:0;mso-width-relative:margin;mso-height-relative:margin;v-text-anchor:top" o:gfxdata="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" filled="f" stroked="f">
+              <v:shape w14:anchorId="64F40AD7" id="_x0000_s1027" type="#_x0000_t202" style="position:absolute;left:0;text-align:left;margin-left:67.95pt;margin-top:.7pt;width:357pt;height:204pt;z-index:251664386;visibility:visible;mso-wrap-style:square;mso-width-percent:0;mso-height-percent:0;mso-wrap-distance-left:9pt;mso-wrap-distance-top:3.6pt;mso-wrap-distance-right:9pt;mso-wrap-distance-bottom:3.6pt;mso-position-horizontal:absolute;mso-position-horizontal-relative:text;mso-position-vertical:absolute;mso-position-vertical-relative:text;mso-width-percent:0;mso-height-percent:0;mso-width-relative:margin;mso-height-relative:margin;v-text-anchor:top" o:gfxdata="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" filled="f" stroked="f">
                 <v:textbox>
                   <w:txbxContent>
                     <w:p>
                       <w:r>
                         <w:t>${</w:t>
                       </w:r>
-                      <w:proofErr w:type="spellStart"/>
                       <w:r>
                         <w:t>grafica_dominios</w:t>
                       </w:r>
-                      <w:proofErr w:type="spellEnd"/>
                       <w:r>
                         <w:t>}</w:t>
                       </w:r>
@@ -9825,7 +11677,13 @@
           </mc:Fallback>
         </mc:AlternateContent>
       </w:r>
-      <w:r>
+    </w:p>
+    <w:p>
+      <w:pPr>
+        <w:pStyle w:val="Ttulo"/>
+        <w:framePr w:hSpace="0" w:wrap="auto" w:vAnchor="margin" w:hAnchor="text" w:yAlign="inline"/>
+        <w:spacing w:before="120" w:after="120"/>
+        <w:jc w:val="both"/>
         <w:rPr>
           <w:rFonts w:asciiTheme="minorHAnsi" w:eastAsiaTheme="minorHAnsi" w:hAnsiTheme="minorHAnsi" w:cstheme="minorHAnsi"/>
           <w:bCs/>
@@ -9837,9 +11695,14 @@
           <w:szCs w:val="24"/>
           <w:lang w:val="es-MX"/>
         </w:rPr>
-        <w:t>Calificación</w:t>
-      </w:r>
-      <w:r>
+      </w:pPr>
+    </w:p>
+    <w:p>
+      <w:pPr>
+        <w:pStyle w:val="Ttulo"/>
+        <w:framePr w:hSpace="0" w:wrap="auto" w:vAnchor="margin" w:hAnchor="text" w:yAlign="inline"/>
+        <w:spacing w:before="120" w:after="120"/>
+        <w:jc w:val="both"/>
         <w:rPr>
           <w:rFonts w:asciiTheme="minorHAnsi" w:eastAsiaTheme="minorHAnsi" w:hAnsiTheme="minorHAnsi" w:cstheme="minorHAnsi"/>
           <w:bCs/>
@@ -9851,9 +11714,14 @@
           <w:szCs w:val="24"/>
           <w:lang w:val="es-MX"/>
         </w:rPr>
-        <w:t xml:space="preserve"> total</w:t>
-      </w:r>
-      <w:r>
+      </w:pPr>
+    </w:p>
+    <w:p>
+      <w:pPr>
+        <w:pStyle w:val="Ttulo"/>
+        <w:framePr w:hSpace="0" w:wrap="auto" w:vAnchor="margin" w:hAnchor="text" w:yAlign="inline"/>
+        <w:spacing w:before="120" w:after="120"/>
+        <w:jc w:val="both"/>
         <w:rPr>
           <w:rFonts w:asciiTheme="minorHAnsi" w:eastAsiaTheme="minorHAnsi" w:hAnsiTheme="minorHAnsi" w:cstheme="minorHAnsi"/>
           <w:bCs/>
@@ -9865,9 +11733,14 @@
           <w:szCs w:val="24"/>
           <w:lang w:val="es-MX"/>
         </w:rPr>
-        <w:t xml:space="preserve"> </w:t>
-      </w:r>
-      <w:r>
+      </w:pPr>
+    </w:p>
+    <w:p>
+      <w:pPr>
+        <w:pStyle w:val="Ttulo"/>
+        <w:framePr w:hSpace="0" w:wrap="auto" w:vAnchor="margin" w:hAnchor="text" w:yAlign="inline"/>
+        <w:spacing w:before="120" w:after="120"/>
+        <w:jc w:val="both"/>
         <w:rPr>
           <w:rFonts w:asciiTheme="minorHAnsi" w:eastAsiaTheme="minorHAnsi" w:hAnsiTheme="minorHAnsi" w:cstheme="minorHAnsi"/>
           <w:bCs/>
@@ -9879,9 +11752,14 @@
           <w:szCs w:val="24"/>
           <w:lang w:val="es-MX"/>
         </w:rPr>
-        <w:t xml:space="preserve">por </w:t>
-      </w:r>
-      <w:r>
+      </w:pPr>
+    </w:p>
+    <w:p>
+      <w:pPr>
+        <w:pStyle w:val="Ttulo"/>
+        <w:framePr w:hSpace="0" w:wrap="auto" w:vAnchor="margin" w:hAnchor="text" w:yAlign="inline"/>
+        <w:spacing w:before="120" w:after="120"/>
+        <w:jc w:val="both"/>
         <w:rPr>
           <w:rFonts w:asciiTheme="minorHAnsi" w:eastAsiaTheme="minorHAnsi" w:hAnsiTheme="minorHAnsi" w:cstheme="minorHAnsi"/>
           <w:bCs/>
@@ -9893,8 +11771,159 @@
           <w:szCs w:val="24"/>
           <w:lang w:val="es-MX"/>
         </w:rPr>
-        <w:t>dominio</w:t>
-      </w:r>
+      </w:pPr>
+    </w:p>
+    <w:p>
+      <w:pPr>
+        <w:pStyle w:val="Ttulo"/>
+        <w:framePr w:hSpace="0" w:wrap="auto" w:vAnchor="margin" w:hAnchor="text" w:yAlign="inline"/>
+        <w:spacing w:before="120" w:after="120"/>
+        <w:jc w:val="both"/>
+        <w:rPr>
+          <w:rFonts w:asciiTheme="minorHAnsi" w:eastAsiaTheme="minorHAnsi" w:hAnsiTheme="minorHAnsi" w:cstheme="minorHAnsi"/>
+          <w:bCs/>
+          <w:i/>
+          <w:iCs/>
+          <w:color w:val="auto"/>
+          <w:kern w:val="0"/>
+          <w:sz w:val="24"/>
+          <w:szCs w:val="24"/>
+          <w:lang w:val="es-MX"/>
+        </w:rPr>
+      </w:pPr>
+    </w:p>
+    <w:p>
+      <w:pPr>
+        <w:pStyle w:val="Ttulo"/>
+        <w:framePr w:hSpace="0" w:wrap="auto" w:vAnchor="margin" w:hAnchor="text" w:yAlign="inline"/>
+        <w:spacing w:before="120" w:after="120"/>
+        <w:jc w:val="both"/>
+        <w:rPr>
+          <w:rFonts w:asciiTheme="minorHAnsi" w:eastAsiaTheme="minorHAnsi" w:hAnsiTheme="minorHAnsi" w:cstheme="minorHAnsi"/>
+          <w:bCs/>
+          <w:i/>
+          <w:iCs/>
+          <w:color w:val="auto"/>
+          <w:kern w:val="0"/>
+          <w:sz w:val="24"/>
+          <w:szCs w:val="24"/>
+          <w:lang w:val="es-MX"/>
+        </w:rPr>
+      </w:pPr>
+    </w:p>
+    <w:p>
+      <w:pPr>
+        <w:pStyle w:val="Ttulo"/>
+        <w:framePr w:hSpace="0" w:wrap="auto" w:vAnchor="margin" w:hAnchor="text" w:yAlign="inline"/>
+        <w:spacing w:before="120" w:after="120"/>
+        <w:jc w:val="both"/>
+        <w:rPr>
+          <w:rFonts w:asciiTheme="minorHAnsi" w:eastAsiaTheme="minorHAnsi" w:hAnsiTheme="minorHAnsi" w:cstheme="minorHAnsi"/>
+          <w:bCs/>
+          <w:i/>
+          <w:iCs/>
+          <w:color w:val="auto"/>
+          <w:kern w:val="0"/>
+          <w:sz w:val="24"/>
+          <w:szCs w:val="24"/>
+          <w:lang w:val="es-MX"/>
+        </w:rPr>
+      </w:pPr>
+    </w:p>
+    <w:p>
+      <w:pPr>
+        <w:pStyle w:val="Ttulo"/>
+        <w:framePr w:hSpace="0" w:wrap="auto" w:vAnchor="margin" w:hAnchor="text" w:yAlign="inline"/>
+        <w:spacing w:before="120" w:after="120"/>
+        <w:jc w:val="both"/>
+        <w:rPr>
+          <w:rFonts w:asciiTheme="minorHAnsi" w:eastAsiaTheme="minorHAnsi" w:hAnsiTheme="minorHAnsi" w:cstheme="minorHAnsi"/>
+          <w:bCs/>
+          <w:i/>
+          <w:iCs/>
+          <w:color w:val="auto"/>
+          <w:kern w:val="0"/>
+          <w:sz w:val="24"/>
+          <w:szCs w:val="24"/>
+          <w:lang w:val="es-MX"/>
+        </w:rPr>
+      </w:pPr>
+    </w:p>
+    <w:p>
+      <w:pPr>
+        <w:pStyle w:val="Ttulo"/>
+        <w:framePr w:hSpace="0" w:wrap="auto" w:vAnchor="margin" w:hAnchor="text" w:yAlign="inline"/>
+        <w:spacing w:before="120" w:after="120"/>
+        <w:jc w:val="both"/>
+        <w:rPr>
+          <w:rFonts w:asciiTheme="minorHAnsi" w:eastAsiaTheme="minorHAnsi" w:hAnsiTheme="minorHAnsi" w:cstheme="minorHAnsi"/>
+          <w:bCs/>
+          <w:i/>
+          <w:iCs/>
+          <w:color w:val="auto"/>
+          <w:kern w:val="0"/>
+          <w:sz w:val="24"/>
+          <w:szCs w:val="24"/>
+          <w:lang w:val="es-MX"/>
+        </w:rPr>
+      </w:pPr>
+    </w:p>
+    <w:p>
+      <w:pPr>
+        <w:pStyle w:val="Ttulo"/>
+        <w:framePr w:hSpace="0" w:wrap="auto" w:vAnchor="margin" w:hAnchor="text" w:yAlign="inline"/>
+        <w:spacing w:before="120" w:after="120"/>
+        <w:jc w:val="both"/>
+        <w:rPr>
+          <w:rFonts w:asciiTheme="minorHAnsi" w:eastAsiaTheme="minorHAnsi" w:hAnsiTheme="minorHAnsi" w:cstheme="minorHAnsi"/>
+          <w:bCs/>
+          <w:i/>
+          <w:iCs/>
+          <w:color w:val="auto"/>
+          <w:kern w:val="0"/>
+          <w:sz w:val="24"/>
+          <w:szCs w:val="24"/>
+          <w:lang w:val="es-MX"/>
+        </w:rPr>
+      </w:pPr>
+    </w:p>
+    <w:p>
+      <w:pPr>
+        <w:pStyle w:val="Ttulo"/>
+        <w:framePr w:hSpace="0" w:wrap="auto" w:vAnchor="margin" w:hAnchor="text" w:yAlign="inline"/>
+        <w:spacing w:before="120" w:after="120"/>
+        <w:jc w:val="both"/>
+        <w:rPr>
+          <w:rFonts w:asciiTheme="minorHAnsi" w:eastAsiaTheme="minorHAnsi" w:hAnsiTheme="minorHAnsi" w:cstheme="minorHAnsi"/>
+          <w:bCs/>
+          <w:i/>
+          <w:iCs/>
+          <w:color w:val="auto"/>
+          <w:kern w:val="0"/>
+          <w:sz w:val="24"/>
+          <w:szCs w:val="24"/>
+          <w:lang w:val="es-MX"/>
+        </w:rPr>
+      </w:pPr>
+    </w:p>
+    <w:p>
+      <w:pPr>
+        <w:pStyle w:val="Ttulo"/>
+        <w:framePr w:hSpace="0" w:wrap="auto" w:vAnchor="margin" w:hAnchor="text" w:yAlign="inline"/>
+        <w:spacing w:before="120" w:after="120"/>
+        <w:jc w:val="both"/>
+        <w:rPr>
+          <w:rFonts w:asciiTheme="minorHAnsi" w:eastAsiaTheme="minorHAnsi" w:hAnsiTheme="minorHAnsi" w:cstheme="minorHAnsi"/>
+          <w:bCs/>
+          <w:i/>
+          <w:iCs/>
+          <w:color w:val="auto"/>
+          <w:kern w:val="0"/>
+          <w:sz w:val="24"/>
+          <w:szCs w:val="24"/>
+          <w:lang w:val="es-MX"/>
+        </w:rPr>
+      </w:pPr>
     </w:p>
     <w:p>
       <w:pPr>
@@ -10238,69 +12267,6 @@
           <w:lang w:val="es-MX"/>
         </w:rPr>
       </w:pPr>
-    </w:p>
-    <w:p>
-      <w:pPr>
-        <w:pStyle w:val="Ttulo"/>
-        <w:framePr w:hSpace="0" w:wrap="auto" w:vAnchor="margin" w:hAnchor="text" w:yAlign="inline"/>
-        <w:spacing w:before="120" w:after="120"/>
-        <w:jc w:val="both"/>
-        <w:rPr>
-          <w:rFonts w:asciiTheme="minorHAnsi" w:eastAsiaTheme="minorHAnsi" w:hAnsiTheme="minorHAnsi" w:cstheme="minorHAnsi"/>
-          <w:b w:val="0"/>
-          <w:color w:val="auto"/>
-          <w:kern w:val="0"/>
-          <w:sz w:val="24"/>
-          <w:szCs w:val="24"/>
-          <w:lang w:val="es-MX"/>
-        </w:rPr>
-      </w:pPr>
-    </w:p>
-    <w:p>
-      <w:pPr>
-        <w:pStyle w:val="Ttulo"/>
-        <w:framePr w:hSpace="0" w:wrap="auto" w:vAnchor="margin" w:hAnchor="text" w:yAlign="inline"/>
-        <w:spacing w:before="120" w:after="120"/>
-        <w:jc w:val="both"/>
-        <w:rPr>
-          <w:rFonts w:asciiTheme="minorHAnsi" w:eastAsiaTheme="minorHAnsi" w:hAnsiTheme="minorHAnsi" w:cstheme="minorHAnsi"/>
-          <w:b w:val="0"/>
-          <w:color w:val="auto"/>
-          <w:kern w:val="0"/>
-          <w:sz w:val="24"/>
-          <w:szCs w:val="24"/>
-          <w:lang w:val="es-MX"/>
-        </w:rPr>
-      </w:pPr>
-    </w:p>
-    <w:p>
-      <w:pPr>
-        <w:pStyle w:val="Ttulo"/>
-        <w:framePr w:hSpace="0" w:wrap="auto" w:vAnchor="margin" w:hAnchor="text" w:yAlign="inline"/>
-        <w:spacing w:before="120" w:after="120"/>
-        <w:jc w:val="both"/>
-        <w:rPr>
-          <w:rFonts w:asciiTheme="minorHAnsi" w:eastAsiaTheme="minorHAnsi" w:hAnsiTheme="minorHAnsi" w:cstheme="minorHAnsi"/>
-          <w:b w:val="0"/>
-          <w:color w:val="auto"/>
-          <w:kern w:val="0"/>
-          <w:sz w:val="24"/>
-          <w:szCs w:val="24"/>
-          <w:lang w:val="es-MX"/>
-        </w:rPr>
-      </w:pPr>
-      <w:r>
-        <w:rPr>
-          <w:rFonts w:asciiTheme="minorHAnsi" w:eastAsiaTheme="minorHAnsi" w:hAnsiTheme="minorHAnsi" w:cstheme="minorHAnsi"/>
-          <w:b w:val="0"/>
-          <w:color w:val="auto"/>
-          <w:kern w:val="0"/>
-          <w:sz w:val="24"/>
-          <w:szCs w:val="24"/>
-          <w:lang w:val="es-MX"/>
-        </w:rPr>
-        <w:t xml:space="preserve">   </w:t>
-      </w:r>
     </w:p>
     <w:p>
       <w:pPr>
@@ -11924,7 +13890,6 @@
           <w:sz w:val="24"/>
           <w:szCs w:val="24"/>
         </w:rPr>
-        <w:lastRenderedPageBreak/>
         <w:t xml:space="preserve">Primer nivel: Las acciones se centran en el plano organizacional </w:t>
       </w:r>
       <w:r>
@@ -12166,13 +14131,26 @@
           <w:szCs w:val="24"/>
         </w:rPr>
       </w:pPr>
-      <w:r>
+    </w:p>
+    <w:p>
+      <w:pPr>
+        <w:spacing w:line="240" w:lineRule="auto"/>
+        <w:jc w:val="both"/>
         <w:rPr>
           <w:rFonts w:eastAsiaTheme="minorEastAsia" w:cstheme="minorHAnsi"/>
           <w:kern w:val="24"/>
           <w:sz w:val="24"/>
           <w:szCs w:val="24"/>
         </w:rPr>
+      </w:pPr>
+      <w:r>
+        <w:rPr>
+          <w:rFonts w:eastAsiaTheme="minorEastAsia" w:cstheme="minorHAnsi"/>
+          <w:kern w:val="24"/>
+          <w:sz w:val="24"/>
+          <w:szCs w:val="24"/>
+        </w:rPr>
+        <w:lastRenderedPageBreak/>
         <w:t>Primer Nivel - organizacional</w:t>
       </w:r>
     </w:p>
@@ -12209,7 +14187,7 @@
                     </pic:cNvPicPr>
                   </pic:nvPicPr>
                   <pic:blipFill>
-                    <a:blip r:embed="rId15">
+                    <a:blip r:embed="rId16">
                       <a:extLst>
                         <a:ext uri="{28A0092B-C50C-407E-A947-70E740481C1C}">
                           <a14:useLocalDpi xmlns:a14="http://schemas.microsoft.com/office/drawing/2010/main" val="0"/>
@@ -12259,7 +14237,6 @@
           <w:sz w:val="24"/>
           <w:szCs w:val="24"/>
         </w:rPr>
-        <w:lastRenderedPageBreak/>
         <w:t xml:space="preserve">Segundo </w:t>
       </w:r>
       <w:r>
@@ -12323,7 +14300,7 @@
                     </pic:cNvPicPr>
                   </pic:nvPicPr>
                   <pic:blipFill>
-                    <a:blip r:embed="rId16">
+                    <a:blip r:embed="rId17">
                       <a:extLst>
                         <a:ext uri="{28A0092B-C50C-407E-A947-70E740481C1C}">
                           <a14:useLocalDpi xmlns:a14="http://schemas.microsoft.com/office/drawing/2010/main" val="0"/>
@@ -12439,7 +14416,7 @@
                     </pic:cNvPicPr>
                   </pic:nvPicPr>
                   <pic:blipFill>
-                    <a:blip r:embed="rId17">
+                    <a:blip r:embed="rId18">
                       <a:extLst>
                         <a:ext uri="{28A0092B-C50C-407E-A947-70E740481C1C}">
                           <a14:useLocalDpi xmlns:a14="http://schemas.microsoft.com/office/drawing/2010/main" val="0"/>
@@ -12614,7 +14591,7 @@
                     <pic:cNvPicPr/>
                   </pic:nvPicPr>
                   <pic:blipFill>
-                    <a:blip r:embed="rId18" cstate="print">
+                    <a:blip r:embed="rId19" cstate="print">
                       <a:extLst>
                         <a:ext uri="{28A0092B-C50C-407E-A947-70E740481C1C}">
                           <a14:useLocalDpi xmlns:a14="http://schemas.microsoft.com/office/drawing/2010/main" val="0"/>
@@ -12936,8 +14913,8 @@
       </w:r>
     </w:p>
     <w:sectPr>
-      <w:headerReference w:type="default" r:id="rId19"/>
-      <w:headerReference w:type="first" r:id="rId20"/>
+      <w:headerReference w:type="default" r:id="rId20"/>
+      <w:headerReference w:type="first" r:id="rId21"/>
       <w:pgSz w:w="12240" w:h="15840"/>
       <w:pgMar w:top="1417" w:right="1701" w:bottom="1417" w:left="1701" w:header="708" w:footer="708" w:gutter="0"/>
       <w:cols w:space="708"/>
@@ -13361,7 +15338,7 @@
   <w:abstractNum w:abstractNumId="0" w15:restartNumberingAfterBreak="0">
     <w:nsid w:val="00805026"/>
     <w:multiLevelType w:val="hybridMultilevel"/>
-    <w:tmpl w:val="B75E0814"/>
+    <w:tmpl w:val="F422639C"/>
     <w:lvl w:ilvl="0" w:tplc="080A0013">
       <w:start w:val="1"/>
       <w:numFmt w:val="upperRoman"/>
@@ -13371,7 +15348,7 @@
         <w:ind w:left="720" w:hanging="360"/>
       </w:pPr>
     </w:lvl>
-    <w:lvl w:ilvl="1" w:tplc="080A0019">
+    <w:lvl w:ilvl="1" w:tplc="DA3CCBB0">
       <w:start w:val="1"/>
       <w:numFmt w:val="lowerLetter"/>
       <w:lvlText w:val="%2."/>
@@ -13379,6 +15356,12 @@
       <w:pPr>
         <w:ind w:left="1440" w:hanging="360"/>
       </w:pPr>
+      <w:rPr>
+        <w:b/>
+        <w:bCs/>
+        <w:sz w:val="24"/>
+        <w:szCs w:val="24"/>
+      </w:rPr>
     </w:lvl>
     <w:lvl w:ilvl="2" w:tplc="588EC9DC">
       <w:start w:val="1"/>
@@ -14706,6 +16689,102 @@
     </w:lvl>
   </w:abstractNum>
   <w:abstractNum w:abstractNumId="14" w15:restartNumberingAfterBreak="0">
+    <w:nsid w:val="53982C3F"/>
+    <w:multiLevelType w:val="hybridMultilevel"/>
+    <w:tmpl w:val="31E0EA54"/>
+    <w:lvl w:ilvl="0" w:tplc="FFFFFFFF">
+      <w:start w:val="1"/>
+      <w:numFmt w:val="upperRoman"/>
+      <w:lvlText w:val="%1."/>
+      <w:lvlJc w:val="right"/>
+      <w:pPr>
+        <w:ind w:left="720" w:hanging="360"/>
+      </w:pPr>
+    </w:lvl>
+    <w:lvl w:ilvl="1" w:tplc="0A247940">
+      <w:start w:val="4"/>
+      <w:numFmt w:val="lowerLetter"/>
+      <w:lvlText w:val="%2."/>
+      <w:lvlJc w:val="left"/>
+      <w:pPr>
+        <w:ind w:left="1440" w:hanging="360"/>
+      </w:pPr>
+      <w:rPr>
+        <w:rFonts w:hint="default"/>
+        <w:b/>
+        <w:bCs/>
+        <w:sz w:val="24"/>
+        <w:szCs w:val="24"/>
+      </w:rPr>
+    </w:lvl>
+    <w:lvl w:ilvl="2" w:tplc="FFFFFFFF">
+      <w:start w:val="1"/>
+      <w:numFmt w:val="lowerLetter"/>
+      <w:lvlText w:val="%3)"/>
+      <w:lvlJc w:val="left"/>
+      <w:pPr>
+        <w:ind w:left="2340" w:hanging="360"/>
+      </w:pPr>
+      <w:rPr>
+        <w:rFonts w:hint="default"/>
+      </w:rPr>
+    </w:lvl>
+    <w:lvl w:ilvl="3" w:tplc="FFFFFFFF" w:tentative="1">
+      <w:start w:val="1"/>
+      <w:numFmt w:val="decimal"/>
+      <w:lvlText w:val="%4."/>
+      <w:lvlJc w:val="left"/>
+      <w:pPr>
+        <w:ind w:left="2880" w:hanging="360"/>
+      </w:pPr>
+    </w:lvl>
+    <w:lvl w:ilvl="4" w:tplc="FFFFFFFF" w:tentative="1">
+      <w:start w:val="1"/>
+      <w:numFmt w:val="lowerLetter"/>
+      <w:lvlText w:val="%5."/>
+      <w:lvlJc w:val="left"/>
+      <w:pPr>
+        <w:ind w:left="3600" w:hanging="360"/>
+      </w:pPr>
+    </w:lvl>
+    <w:lvl w:ilvl="5" w:tplc="FFFFFFFF" w:tentative="1">
+      <w:start w:val="1"/>
+      <w:numFmt w:val="lowerRoman"/>
+      <w:lvlText w:val="%6."/>
+      <w:lvlJc w:val="right"/>
+      <w:pPr>
+        <w:ind w:left="4320" w:hanging="180"/>
+      </w:pPr>
+    </w:lvl>
+    <w:lvl w:ilvl="6" w:tplc="FFFFFFFF" w:tentative="1">
+      <w:start w:val="1"/>
+      <w:numFmt w:val="decimal"/>
+      <w:lvlText w:val="%7."/>
+      <w:lvlJc w:val="left"/>
+      <w:pPr>
+        <w:ind w:left="5040" w:hanging="360"/>
+      </w:pPr>
+    </w:lvl>
+    <w:lvl w:ilvl="7" w:tplc="FFFFFFFF" w:tentative="1">
+      <w:start w:val="1"/>
+      <w:numFmt w:val="lowerLetter"/>
+      <w:lvlText w:val="%8."/>
+      <w:lvlJc w:val="left"/>
+      <w:pPr>
+        <w:ind w:left="5760" w:hanging="360"/>
+      </w:pPr>
+    </w:lvl>
+    <w:lvl w:ilvl="8" w:tplc="FFFFFFFF" w:tentative="1">
+      <w:start w:val="1"/>
+      <w:numFmt w:val="lowerRoman"/>
+      <w:lvlText w:val="%9."/>
+      <w:lvlJc w:val="right"/>
+      <w:pPr>
+        <w:ind w:left="6480" w:hanging="180"/>
+      </w:pPr>
+    </w:lvl>
+  </w:abstractNum>
+  <w:abstractNum w:abstractNumId="15" w15:restartNumberingAfterBreak="0">
     <w:nsid w:val="569E2990"/>
     <w:multiLevelType w:val="hybridMultilevel"/>
     <w:tmpl w:val="693EE41C"/>
@@ -14791,7 +16870,7 @@
       </w:pPr>
     </w:lvl>
   </w:abstractNum>
-  <w:abstractNum w:abstractNumId="15" w15:restartNumberingAfterBreak="0">
+  <w:abstractNum w:abstractNumId="16" w15:restartNumberingAfterBreak="0">
     <w:nsid w:val="61CB6C1F"/>
     <w:multiLevelType w:val="hybridMultilevel"/>
     <w:tmpl w:val="828822E6"/>
@@ -14880,7 +16959,7 @@
       </w:pPr>
     </w:lvl>
   </w:abstractNum>
-  <w:abstractNum w:abstractNumId="16" w15:restartNumberingAfterBreak="0">
+  <w:abstractNum w:abstractNumId="17" w15:restartNumberingAfterBreak="0">
     <w:nsid w:val="66E6516B"/>
     <w:multiLevelType w:val="hybridMultilevel"/>
     <w:tmpl w:val="9686043C"/>
@@ -14969,7 +17048,7 @@
       </w:pPr>
     </w:lvl>
   </w:abstractNum>
-  <w:abstractNum w:abstractNumId="17" w15:restartNumberingAfterBreak="0">
+  <w:abstractNum w:abstractNumId="18" w15:restartNumberingAfterBreak="0">
     <w:nsid w:val="67C71615"/>
     <w:multiLevelType w:val="hybridMultilevel"/>
     <w:tmpl w:val="395CD2B8"/>
@@ -14979,7 +17058,7 @@
       <w:lvlText w:val="%1."/>
       <w:lvlJc w:val="left"/>
       <w:pPr>
-        <w:ind w:left="1440" w:hanging="720"/>
+        <w:ind w:left="9509" w:hanging="720"/>
       </w:pPr>
       <w:rPr>
         <w:rFonts w:hint="default"/>
@@ -15058,7 +17137,7 @@
       </w:pPr>
     </w:lvl>
   </w:abstractNum>
-  <w:abstractNum w:abstractNumId="18" w15:restartNumberingAfterBreak="0">
+  <w:abstractNum w:abstractNumId="19" w15:restartNumberingAfterBreak="0">
     <w:nsid w:val="6EB3091A"/>
     <w:multiLevelType w:val="hybridMultilevel"/>
     <w:tmpl w:val="D646B956"/>
@@ -15144,7 +17223,7 @@
       </w:pPr>
     </w:lvl>
   </w:abstractNum>
-  <w:abstractNum w:abstractNumId="19" w15:restartNumberingAfterBreak="0">
+  <w:abstractNum w:abstractNumId="20" w15:restartNumberingAfterBreak="0">
     <w:nsid w:val="77037559"/>
     <w:multiLevelType w:val="hybridMultilevel"/>
     <w:tmpl w:val="3C88B40A"/>
@@ -15230,7 +17309,7 @@
       </w:pPr>
     </w:lvl>
   </w:abstractNum>
-  <w:abstractNum w:abstractNumId="20" w15:restartNumberingAfterBreak="0">
+  <w:abstractNum w:abstractNumId="21" w15:restartNumberingAfterBreak="0">
     <w:nsid w:val="7F524E37"/>
     <w:multiLevelType w:val="hybridMultilevel"/>
     <w:tmpl w:val="B4141B96"/>
@@ -15326,7 +17405,7 @@
     <w:abstractNumId w:val="0"/>
   </w:num>
   <w:num w:numId="2" w16cid:durableId="1238856045">
-    <w:abstractNumId w:val="17"/>
+    <w:abstractNumId w:val="18"/>
   </w:num>
   <w:num w:numId="3" w16cid:durableId="524708600">
     <w:abstractNumId w:val="5"/>
@@ -15338,31 +17417,31 @@
     <w:abstractNumId w:val="6"/>
   </w:num>
   <w:num w:numId="6" w16cid:durableId="2072999112">
-    <w:abstractNumId w:val="19"/>
+    <w:abstractNumId w:val="20"/>
   </w:num>
   <w:num w:numId="7" w16cid:durableId="1795178190">
     <w:abstractNumId w:val="1"/>
   </w:num>
   <w:num w:numId="8" w16cid:durableId="799809132">
-    <w:abstractNumId w:val="14"/>
+    <w:abstractNumId w:val="15"/>
   </w:num>
   <w:num w:numId="9" w16cid:durableId="1674798662">
     <w:abstractNumId w:val="2"/>
   </w:num>
   <w:num w:numId="10" w16cid:durableId="1210533651">
-    <w:abstractNumId w:val="18"/>
+    <w:abstractNumId w:val="19"/>
   </w:num>
   <w:num w:numId="11" w16cid:durableId="1702784100">
-    <w:abstractNumId w:val="20"/>
+    <w:abstractNumId w:val="21"/>
   </w:num>
   <w:num w:numId="12" w16cid:durableId="2006282229">
-    <w:abstractNumId w:val="15"/>
+    <w:abstractNumId w:val="16"/>
   </w:num>
   <w:num w:numId="13" w16cid:durableId="1340081209">
     <w:abstractNumId w:val="9"/>
   </w:num>
   <w:num w:numId="14" w16cid:durableId="927151979">
-    <w:abstractNumId w:val="16"/>
+    <w:abstractNumId w:val="17"/>
   </w:num>
   <w:num w:numId="15" w16cid:durableId="1376347035">
     <w:abstractNumId w:val="3"/>
@@ -15384,6 +17463,9 @@
   </w:num>
   <w:num w:numId="21" w16cid:durableId="384914802">
     <w:abstractNumId w:val="11"/>
+  </w:num>
+  <w:num w:numId="22" w16cid:durableId="566839997">
+    <w:abstractNumId w:val="14"/>
   </w:num>
 </w:numbering>
 </file>

</xml_diff>

<commit_message>
Reparando bloque sede en Guía 3
</commit_message>
<xml_diff>
--- a/storage/app/plantillas/informe_guiaIII_template.docx
+++ b/storage/app/plantillas/informe_guiaIII_template.docx
@@ -510,6 +510,7 @@
         </w:rPr>
         <w:t>${</w:t>
       </w:r>
+      <w:proofErr w:type="spellStart"/>
       <w:r>
         <w:rPr>
           <w:rFonts w:ascii="Bahnschrift" w:hAnsi="Bahnschrift"/>
@@ -550,7 +551,29 @@
             <w14:round/>
           </w14:textOutline>
         </w:rPr>
-        <w:t>guia}</w:t>
+        <w:t>guia</w:t>
+      </w:r>
+      <w:proofErr w:type="spellEnd"/>
+      <w:r>
+        <w:rPr>
+          <w:rFonts w:ascii="Bahnschrift" w:hAnsi="Bahnschrift"/>
+          <w:b w:val="0"/>
+          <w:color w:val="404040" w:themeColor="text1" w:themeTint="BF"/>
+          <w:sz w:val="36"/>
+          <w:szCs w:val="36"/>
+          <w:lang w:bidi="es-ES"/>
+          <w14:shadow w14:blurRad="38100" w14:dist="19050" w14:dir="2700000" w14:sx="100000" w14:sy="100000" w14:kx="0" w14:ky="0" w14:algn="tl">
+            <w14:schemeClr w14:val="dk1">
+              <w14:alpha w14:val="60000"/>
+            </w14:schemeClr>
+          </w14:shadow>
+          <w14:textOutline w14:w="0" w14:cap="flat" w14:cmpd="sng" w14:algn="ctr">
+            <w14:noFill/>
+            <w14:prstDash w14:val="solid"/>
+            <w14:round/>
+          </w14:textOutline>
+        </w:rPr>
+        <w:t>}</w:t>
       </w:r>
     </w:p>
     <w:p>
@@ -1679,7 +1702,15 @@
     </w:p>
     <w:p>
       <w:r>
-        <w:t>${bloque_sedes}</w:t>
+        <w:t>${</w:t>
+      </w:r>
+      <w:proofErr w:type="spellStart"/>
+      <w:r>
+        <w:t>bloque_sedes</w:t>
+      </w:r>
+      <w:proofErr w:type="spellEnd"/>
+      <w:r>
+        <w:t>}</w:t>
       </w:r>
     </w:p>
     <w:p>
@@ -1711,14 +1742,10 @@
           <w:szCs w:val="24"/>
           <w:lang w:val="es-MX"/>
         </w:rPr>
-        <w:t>Nombre: ${company_name}</w:t>
-      </w:r>
-    </w:p>
-    <w:p>
-      <w:pPr>
-        <w:pStyle w:val="Ttulo"/>
-        <w:framePr w:hSpace="0" w:wrap="auto" w:vAnchor="margin" w:hAnchor="text" w:yAlign="inline"/>
-        <w:spacing w:before="120" w:after="120"/>
+        <w:t>Nombre: ${</w:t>
+      </w:r>
+      <w:proofErr w:type="spellStart"/>
+      <w:r>
         <w:rPr>
           <w:rFonts w:asciiTheme="minorHAnsi" w:eastAsiaTheme="minorHAnsi" w:hAnsiTheme="minorHAnsi" w:cstheme="minorHAnsi"/>
           <w:b w:val="0"/>
@@ -1730,7 +1757,9 @@
           <w:szCs w:val="24"/>
           <w:lang w:val="es-MX"/>
         </w:rPr>
-      </w:pPr>
+        <w:t>company_name</w:t>
+      </w:r>
+      <w:proofErr w:type="spellEnd"/>
       <w:r>
         <w:rPr>
           <w:rFonts w:asciiTheme="minorHAnsi" w:eastAsiaTheme="minorHAnsi" w:hAnsiTheme="minorHAnsi" w:cstheme="minorHAnsi"/>
@@ -1743,7 +1772,7 @@
           <w:szCs w:val="24"/>
           <w:lang w:val="es-MX"/>
         </w:rPr>
-        <w:t>Domicilio: ${direccion}</w:t>
+        <w:t>}</w:t>
       </w:r>
     </w:p>
     <w:p>
@@ -1775,14 +1804,10 @@
           <w:szCs w:val="24"/>
           <w:lang w:val="es-MX"/>
         </w:rPr>
-        <w:t>Actividad principal: ${actividad}</w:t>
-      </w:r>
-    </w:p>
-    <w:p>
-      <w:pPr>
-        <w:pStyle w:val="Ttulo"/>
-        <w:framePr w:hSpace="0" w:wrap="auto" w:vAnchor="margin" w:hAnchor="text" w:yAlign="inline"/>
-        <w:spacing w:before="120" w:after="120"/>
+        <w:t>Domicilio: ${</w:t>
+      </w:r>
+      <w:proofErr w:type="spellStart"/>
+      <w:r>
         <w:rPr>
           <w:rFonts w:asciiTheme="minorHAnsi" w:eastAsiaTheme="minorHAnsi" w:hAnsiTheme="minorHAnsi" w:cstheme="minorHAnsi"/>
           <w:b w:val="0"/>
@@ -1790,15 +1815,122 @@
           <w:iCs/>
           <w:color w:val="auto"/>
           <w:kern w:val="0"/>
-          <w:sz w:val="16"/>
-          <w:szCs w:val="16"/>
-          <w:lang w:val="es-MX"/>
-        </w:rPr>
-      </w:pPr>
-    </w:p>
-    <w:p>
-      <w:r>
-        <w:t>${/bloque_sedes}</w:t>
+          <w:sz w:val="24"/>
+          <w:szCs w:val="24"/>
+          <w:lang w:val="es-MX"/>
+        </w:rPr>
+        <w:t>direccion</w:t>
+      </w:r>
+      <w:proofErr w:type="spellEnd"/>
+      <w:r>
+        <w:rPr>
+          <w:rFonts w:asciiTheme="minorHAnsi" w:eastAsiaTheme="minorHAnsi" w:hAnsiTheme="minorHAnsi" w:cstheme="minorHAnsi"/>
+          <w:b w:val="0"/>
+          <w:i/>
+          <w:iCs/>
+          <w:color w:val="auto"/>
+          <w:kern w:val="0"/>
+          <w:sz w:val="24"/>
+          <w:szCs w:val="24"/>
+          <w:lang w:val="es-MX"/>
+        </w:rPr>
+        <w:t>}</w:t>
+      </w:r>
+    </w:p>
+    <w:p>
+      <w:pPr>
+        <w:pStyle w:val="Ttulo"/>
+        <w:framePr w:hSpace="0" w:wrap="auto" w:vAnchor="margin" w:hAnchor="text" w:yAlign="inline"/>
+        <w:spacing w:before="120" w:after="120"/>
+        <w:rPr>
+          <w:rFonts w:asciiTheme="minorHAnsi" w:eastAsiaTheme="minorHAnsi" w:hAnsiTheme="minorHAnsi" w:cstheme="minorHAnsi"/>
+          <w:b w:val="0"/>
+          <w:color w:val="auto"/>
+          <w:kern w:val="0"/>
+          <w:sz w:val="22"/>
+          <w:szCs w:val="22"/>
+          <w:lang w:val="es-MX"/>
+        </w:rPr>
+      </w:pPr>
+      <w:r>
+        <w:rPr>
+          <w:rFonts w:asciiTheme="minorHAnsi" w:eastAsiaTheme="minorHAnsi" w:hAnsiTheme="minorHAnsi" w:cstheme="minorHAnsi"/>
+          <w:b w:val="0"/>
+          <w:i/>
+          <w:iCs/>
+          <w:color w:val="auto"/>
+          <w:kern w:val="0"/>
+          <w:sz w:val="24"/>
+          <w:szCs w:val="24"/>
+          <w:lang w:val="es-MX"/>
+        </w:rPr>
+        <w:t>Actividad principal: ${actividad}</w:t>
+      </w:r>
+      <w:r>
+        <w:rPr>
+          <w:rFonts w:asciiTheme="minorHAnsi" w:eastAsiaTheme="minorHAnsi" w:hAnsiTheme="minorHAnsi" w:cstheme="minorHAnsi"/>
+          <w:b w:val="0"/>
+          <w:i/>
+          <w:iCs/>
+          <w:color w:val="auto"/>
+          <w:kern w:val="0"/>
+          <w:sz w:val="24"/>
+          <w:szCs w:val="24"/>
+          <w:lang w:val="es-MX"/>
+        </w:rPr>
+        <w:br/>
+      </w:r>
+      <w:r>
+        <w:rPr>
+          <w:rFonts w:asciiTheme="minorHAnsi" w:eastAsiaTheme="minorHAnsi" w:hAnsiTheme="minorHAnsi" w:cstheme="minorHAnsi"/>
+          <w:b w:val="0"/>
+          <w:i/>
+          <w:iCs/>
+          <w:color w:val="auto"/>
+          <w:kern w:val="0"/>
+          <w:sz w:val="24"/>
+          <w:szCs w:val="24"/>
+          <w:lang w:val="es-MX"/>
+        </w:rPr>
+        <w:br/>
+      </w:r>
+      <w:r>
+        <w:rPr>
+          <w:rFonts w:asciiTheme="minorHAnsi" w:eastAsiaTheme="minorHAnsi" w:hAnsiTheme="minorHAnsi" w:cstheme="minorHAnsi"/>
+          <w:b w:val="0"/>
+          <w:color w:val="auto"/>
+          <w:kern w:val="0"/>
+          <w:sz w:val="22"/>
+          <w:szCs w:val="22"/>
+          <w:lang w:val="es-MX"/>
+        </w:rPr>
+        <w:t>${/</w:t>
+      </w:r>
+      <w:proofErr w:type="spellStart"/>
+      <w:r>
+        <w:rPr>
+          <w:rFonts w:asciiTheme="minorHAnsi" w:eastAsiaTheme="minorHAnsi" w:hAnsiTheme="minorHAnsi" w:cstheme="minorHAnsi"/>
+          <w:b w:val="0"/>
+          <w:color w:val="auto"/>
+          <w:kern w:val="0"/>
+          <w:sz w:val="22"/>
+          <w:szCs w:val="22"/>
+          <w:lang w:val="es-MX"/>
+        </w:rPr>
+        <w:t>bloque_sedes</w:t>
+      </w:r>
+      <w:proofErr w:type="spellEnd"/>
+      <w:r>
+        <w:rPr>
+          <w:rFonts w:asciiTheme="minorHAnsi" w:eastAsiaTheme="minorHAnsi" w:hAnsiTheme="minorHAnsi" w:cstheme="minorHAnsi"/>
+          <w:b w:val="0"/>
+          <w:color w:val="auto"/>
+          <w:kern w:val="0"/>
+          <w:sz w:val="22"/>
+          <w:szCs w:val="22"/>
+          <w:lang w:val="es-MX"/>
+        </w:rPr>
+        <w:t>}</w:t>
       </w:r>
     </w:p>
     <w:p>
@@ -1889,7 +2021,31 @@
           <w:szCs w:val="24"/>
           <w:lang w:val="es-MX"/>
         </w:rPr>
-        <w:t>Establecer los elementos y acciones para identificar, analizar, prevenir y atender los factores de riesgo psicosocial y la prevención de la violencia laboral</w:t>
+        <w:t xml:space="preserve">Establecer los elementos y </w:t>
+      </w:r>
+      <w:r>
+        <w:rPr>
+          <w:rFonts w:asciiTheme="minorHAnsi" w:eastAsiaTheme="minorHAnsi" w:hAnsiTheme="minorHAnsi" w:cstheme="minorHAnsi"/>
+          <w:b w:val="0"/>
+          <w:color w:val="auto"/>
+          <w:kern w:val="0"/>
+          <w:sz w:val="24"/>
+          <w:szCs w:val="24"/>
+          <w:lang w:val="es-MX"/>
+        </w:rPr>
+        <w:t>acciones</w:t>
+      </w:r>
+      <w:r>
+        <w:rPr>
+          <w:rFonts w:asciiTheme="minorHAnsi" w:eastAsiaTheme="minorHAnsi" w:hAnsiTheme="minorHAnsi" w:cstheme="minorHAnsi"/>
+          <w:b w:val="0"/>
+          <w:color w:val="auto"/>
+          <w:kern w:val="0"/>
+          <w:sz w:val="24"/>
+          <w:szCs w:val="24"/>
+          <w:lang w:val="es-MX"/>
+        </w:rPr>
+        <w:t xml:space="preserve"> para identificar, analizar, prevenir y atender los factores de riesgo psicosocial y la prevención de la violencia laboral</w:t>
       </w:r>
       <w:r>
         <w:rPr>
@@ -2221,19 +2377,35 @@
         <w:t xml:space="preserve"> </w:t>
       </w:r>
       <w:r>
-        <w:t xml:space="preserve">${no_guia} </w:t>
+        <w:t>${</w:t>
+      </w:r>
+      <w:proofErr w:type="spellStart"/>
+      <w:r>
+        <w:t>no_guia</w:t>
+      </w:r>
+      <w:proofErr w:type="spellEnd"/>
+      <w:r>
+        <w:t xml:space="preserve">} </w:t>
       </w:r>
       <w:r>
         <w:t>“</w:t>
       </w:r>
       <w:r>
-        <w:t>${gu</w:t>
+        <w:t>${</w:t>
+      </w:r>
+      <w:proofErr w:type="spellStart"/>
+      <w:r>
+        <w:t>gu</w:t>
       </w:r>
       <w:r>
         <w:t>i</w:t>
       </w:r>
       <w:r>
-        <w:t>a_name}</w:t>
+        <w:t>a_name</w:t>
+      </w:r>
+      <w:proofErr w:type="spellEnd"/>
+      <w:r>
+        <w:t>}</w:t>
       </w:r>
       <w:r>
         <w:t>”</w:t>
@@ -2540,7 +2712,6 @@
           <w:szCs w:val="24"/>
           <w:lang w:val="es-MX"/>
         </w:rPr>
-        <w:lastRenderedPageBreak/>
         <w:t xml:space="preserve">La </w:t>
       </w:r>
       <w:r>
@@ -2975,8 +3146,22 @@
           <w:szCs w:val="24"/>
           <w:lang w:val="es-MX"/>
         </w:rPr>
-        <w:t xml:space="preserve"> en la plataforma SEDyCO</w:t>
-      </w:r>
+        <w:t xml:space="preserve"> en la plataforma </w:t>
+      </w:r>
+      <w:proofErr w:type="spellStart"/>
+      <w:r>
+        <w:rPr>
+          <w:rFonts w:asciiTheme="minorHAnsi" w:eastAsiaTheme="minorHAnsi" w:hAnsiTheme="minorHAnsi" w:cstheme="minorHAnsi"/>
+          <w:b w:val="0"/>
+          <w:color w:val="auto"/>
+          <w:kern w:val="0"/>
+          <w:sz w:val="24"/>
+          <w:szCs w:val="24"/>
+          <w:lang w:val="es-MX"/>
+        </w:rPr>
+        <w:t>SEDyCO</w:t>
+      </w:r>
+      <w:proofErr w:type="spellEnd"/>
       <w:r>
         <w:rPr>
           <w:rFonts w:asciiTheme="minorHAnsi" w:eastAsiaTheme="minorHAnsi" w:hAnsiTheme="minorHAnsi" w:cstheme="minorHAnsi"/>
@@ -3831,7 +4016,6 @@
           <w:szCs w:val="24"/>
           <w:lang w:val="es-MX"/>
         </w:rPr>
-        <w:lastRenderedPageBreak/>
         <w:t xml:space="preserve">Se comprobó que la cantidad de cuestionarios </w:t>
       </w:r>
       <w:r>
@@ -3953,7 +4137,34 @@
           <w:szCs w:val="24"/>
           <w:lang w:val="es-MX"/>
         </w:rPr>
-        <w:t>Para determinar la muestra representativa, el centro de trabajo contaba con una plantilla de personal activo el ${periodo}, el total de la plantilla fue de ${total_colab}</w:t>
+        <w:lastRenderedPageBreak/>
+        <w:t>Para determinar la muestra representativa, el centro de trabajo contaba con una plantilla de personal activo el ${periodo}, el total de la plantilla fue de ${</w:t>
+      </w:r>
+      <w:proofErr w:type="spellStart"/>
+      <w:r>
+        <w:rPr>
+          <w:rFonts w:asciiTheme="minorHAnsi" w:eastAsiaTheme="minorHAnsi" w:hAnsiTheme="minorHAnsi" w:cstheme="minorHAnsi"/>
+          <w:b w:val="0"/>
+          <w:color w:val="auto"/>
+          <w:kern w:val="0"/>
+          <w:sz w:val="24"/>
+          <w:szCs w:val="24"/>
+          <w:lang w:val="es-MX"/>
+        </w:rPr>
+        <w:t>total_colab</w:t>
+      </w:r>
+      <w:proofErr w:type="spellEnd"/>
+      <w:r>
+        <w:rPr>
+          <w:rFonts w:asciiTheme="minorHAnsi" w:eastAsiaTheme="minorHAnsi" w:hAnsiTheme="minorHAnsi" w:cstheme="minorHAnsi"/>
+          <w:b w:val="0"/>
+          <w:color w:val="auto"/>
+          <w:kern w:val="0"/>
+          <w:sz w:val="24"/>
+          <w:szCs w:val="24"/>
+          <w:lang w:val="es-MX"/>
+        </w:rPr>
+        <w:t>}</w:t>
       </w:r>
       <w:r>
         <w:rPr>
@@ -4507,7 +4718,33 @@
           <w:szCs w:val="24"/>
           <w:lang w:val="es-MX"/>
         </w:rPr>
-        <w:t>${total_colab}</w:t>
+        <w:t>${</w:t>
+      </w:r>
+      <w:proofErr w:type="spellStart"/>
+      <w:r>
+        <w:rPr>
+          <w:rFonts w:asciiTheme="minorHAnsi" w:eastAsiaTheme="minorHAnsi" w:hAnsiTheme="minorHAnsi" w:cstheme="minorHAnsi"/>
+          <w:b w:val="0"/>
+          <w:color w:val="FF0000"/>
+          <w:kern w:val="0"/>
+          <w:sz w:val="24"/>
+          <w:szCs w:val="24"/>
+          <w:lang w:val="es-MX"/>
+        </w:rPr>
+        <w:t>total_colab</w:t>
+      </w:r>
+      <w:proofErr w:type="spellEnd"/>
+      <w:r>
+        <w:rPr>
+          <w:rFonts w:asciiTheme="minorHAnsi" w:eastAsiaTheme="minorHAnsi" w:hAnsiTheme="minorHAnsi" w:cstheme="minorHAnsi"/>
+          <w:b w:val="0"/>
+          <w:color w:val="FF0000"/>
+          <w:kern w:val="0"/>
+          <w:sz w:val="24"/>
+          <w:szCs w:val="24"/>
+          <w:lang w:val="es-MX"/>
+        </w:rPr>
+        <w:t>}</w:t>
       </w:r>
       <w:r>
         <w:rPr>
@@ -4685,7 +4922,25 @@
           <w:sz w:val="24"/>
           <w:szCs w:val="24"/>
         </w:rPr>
-        <w:t xml:space="preserve"> ${guia_numeral} </w:t>
+        <w:t xml:space="preserve"> ${</w:t>
+      </w:r>
+      <w:proofErr w:type="spellStart"/>
+      <w:r>
+        <w:rPr>
+          <w:rFonts w:cstheme="minorHAnsi"/>
+          <w:sz w:val="24"/>
+          <w:szCs w:val="24"/>
+        </w:rPr>
+        <w:t>guia_numeral</w:t>
+      </w:r>
+      <w:proofErr w:type="spellEnd"/>
+      <w:r>
+        <w:rPr>
+          <w:rFonts w:cstheme="minorHAnsi"/>
+          <w:sz w:val="24"/>
+          <w:szCs w:val="24"/>
+        </w:rPr>
+        <w:t xml:space="preserve">} </w:t>
       </w:r>
       <w:r>
         <w:rPr>
@@ -4715,7 +4970,6 @@
           <w:sz w:val="24"/>
           <w:szCs w:val="24"/>
         </w:rPr>
-        <w:lastRenderedPageBreak/>
         <w:t>Para obtener la calificación se consideró la agrupación de los ítems por categoría, dominio y dimensión, de acuerdo con lo siguiente:</w:t>
       </w:r>
     </w:p>
@@ -4738,6 +4992,7 @@
           <w:rFonts w:asciiTheme="minorHAnsi" w:hAnsiTheme="minorHAnsi" w:cstheme="minorHAnsi"/>
           <w:color w:val="auto"/>
         </w:rPr>
+        <w:lastRenderedPageBreak/>
         <w:t xml:space="preserve">Las respuestas a los ítems del cuestionario para la identificación de los factores de riesgo psicosocial </w:t>
       </w:r>
       <w:r>
@@ -5018,7 +5273,27 @@
           <w:sz w:val="22"/>
           <w:szCs w:val="22"/>
         </w:rPr>
-        <w:t xml:space="preserve">n del dominio (Cdom). Se obtiene sumando el puntaje de cada uno de los </w:t>
+        <w:t>n del dominio (</w:t>
+      </w:r>
+      <w:proofErr w:type="spellStart"/>
+      <w:r>
+        <w:rPr>
+          <w:rFonts w:asciiTheme="minorHAnsi" w:hAnsiTheme="minorHAnsi" w:cstheme="minorHAnsi"/>
+          <w:color w:val="auto"/>
+          <w:sz w:val="22"/>
+          <w:szCs w:val="22"/>
+        </w:rPr>
+        <w:t>Cdom</w:t>
+      </w:r>
+      <w:proofErr w:type="spellEnd"/>
+      <w:r>
+        <w:rPr>
+          <w:rFonts w:asciiTheme="minorHAnsi" w:hAnsiTheme="minorHAnsi" w:cstheme="minorHAnsi"/>
+          <w:color w:val="auto"/>
+          <w:sz w:val="22"/>
+          <w:szCs w:val="22"/>
+        </w:rPr>
+        <w:t xml:space="preserve">). Se obtiene sumando el puntaje de cada uno de los </w:t>
       </w:r>
       <w:r>
         <w:rPr>
@@ -5097,7 +5372,27 @@
           <w:sz w:val="22"/>
           <w:szCs w:val="22"/>
         </w:rPr>
-        <w:t xml:space="preserve">a (Ccat). Se obtiene sumando el puntaje de cada uno de los </w:t>
+        <w:t>a (</w:t>
+      </w:r>
+      <w:proofErr w:type="spellStart"/>
+      <w:r>
+        <w:rPr>
+          <w:rFonts w:asciiTheme="minorHAnsi" w:hAnsiTheme="minorHAnsi" w:cstheme="minorHAnsi"/>
+          <w:color w:val="auto"/>
+          <w:sz w:val="22"/>
+          <w:szCs w:val="22"/>
+        </w:rPr>
+        <w:t>Ccat</w:t>
+      </w:r>
+      <w:proofErr w:type="spellEnd"/>
+      <w:r>
+        <w:rPr>
+          <w:rFonts w:asciiTheme="minorHAnsi" w:hAnsiTheme="minorHAnsi" w:cstheme="minorHAnsi"/>
+          <w:color w:val="auto"/>
+          <w:sz w:val="22"/>
+          <w:szCs w:val="22"/>
+        </w:rPr>
+        <w:t xml:space="preserve">). Se obtiene sumando el puntaje de cada uno de los </w:t>
       </w:r>
       <w:r>
         <w:rPr>
@@ -5176,7 +5471,27 @@
           <w:sz w:val="22"/>
           <w:szCs w:val="22"/>
         </w:rPr>
-        <w:t xml:space="preserve">n final del cuestionario (Cfinal). Se obtiene sumando el puntaje de todos y cada uno de los </w:t>
+        <w:t>n final del cuestionario (</w:t>
+      </w:r>
+      <w:proofErr w:type="spellStart"/>
+      <w:r>
+        <w:rPr>
+          <w:rFonts w:asciiTheme="minorHAnsi" w:hAnsiTheme="minorHAnsi" w:cstheme="minorHAnsi"/>
+          <w:color w:val="auto"/>
+          <w:sz w:val="22"/>
+          <w:szCs w:val="22"/>
+        </w:rPr>
+        <w:t>Cfinal</w:t>
+      </w:r>
+      <w:proofErr w:type="spellEnd"/>
+      <w:r>
+        <w:rPr>
+          <w:rFonts w:asciiTheme="minorHAnsi" w:hAnsiTheme="minorHAnsi" w:cstheme="minorHAnsi"/>
+          <w:color w:val="auto"/>
+          <w:sz w:val="22"/>
+          <w:szCs w:val="22"/>
+        </w:rPr>
+        <w:t xml:space="preserve">). Se obtiene sumando el puntaje de todos y cada uno de los </w:t>
       </w:r>
       <w:r>
         <w:rPr>
@@ -5977,7 +6292,25 @@
           <w:sz w:val="18"/>
           <w:szCs w:val="18"/>
         </w:rPr>
-        <w:t>gico (mobbing), entre otros.</w:t>
+        <w:t>gico (</w:t>
+      </w:r>
+      <w:proofErr w:type="spellStart"/>
+      <w:r>
+        <w:rPr>
+          <w:rFonts w:cstheme="minorHAnsi"/>
+          <w:sz w:val="18"/>
+          <w:szCs w:val="18"/>
+        </w:rPr>
+        <w:t>mobbing</w:t>
+      </w:r>
+      <w:proofErr w:type="spellEnd"/>
+      <w:r>
+        <w:rPr>
+          <w:rFonts w:cstheme="minorHAnsi"/>
+          <w:sz w:val="18"/>
+          <w:szCs w:val="18"/>
+        </w:rPr>
+        <w:t>), entre otros.</w:t>
       </w:r>
     </w:p>
     <w:p>
@@ -6103,7 +6436,27 @@
           <w:sz w:val="24"/>
           <w:szCs w:val="24"/>
         </w:rPr>
-        <w:t>${guia_name}</w:t>
+        <w:t>${</w:t>
+      </w:r>
+      <w:proofErr w:type="spellStart"/>
+      <w:r>
+        <w:rPr>
+          <w:rFonts w:asciiTheme="minorHAnsi" w:hAnsiTheme="minorHAnsi" w:cstheme="minorHAnsi"/>
+          <w:color w:val="404040" w:themeColor="text1" w:themeTint="BF"/>
+          <w:sz w:val="24"/>
+          <w:szCs w:val="24"/>
+        </w:rPr>
+        <w:t>guia_name</w:t>
+      </w:r>
+      <w:proofErr w:type="spellEnd"/>
+      <w:r>
+        <w:rPr>
+          <w:rFonts w:asciiTheme="minorHAnsi" w:hAnsiTheme="minorHAnsi" w:cstheme="minorHAnsi"/>
+          <w:color w:val="404040" w:themeColor="text1" w:themeTint="BF"/>
+          <w:sz w:val="24"/>
+          <w:szCs w:val="24"/>
+        </w:rPr>
+        <w:t>}</w:t>
       </w:r>
       <w:r>
         <w:rPr>
@@ -6205,6 +6558,7 @@
         </w:rPr>
         <w:t>${</w:t>
       </w:r>
+      <w:proofErr w:type="spellStart"/>
       <w:r>
         <w:rPr>
           <w:rFonts w:asciiTheme="minorHAnsi" w:eastAsiaTheme="minorHAnsi" w:hAnsiTheme="minorHAnsi" w:cstheme="minorHAnsi"/>
@@ -6245,7 +6599,29 @@
             <w14:round/>
           </w14:textOutline>
         </w:rPr>
-        <w:t>_colab}</w:t>
+        <w:t>_colab</w:t>
+      </w:r>
+      <w:proofErr w:type="spellEnd"/>
+      <w:r>
+        <w:rPr>
+          <w:rFonts w:asciiTheme="minorHAnsi" w:eastAsiaTheme="minorHAnsi" w:hAnsiTheme="minorHAnsi" w:cstheme="minorHAnsi"/>
+          <w:bCs/>
+          <w:kern w:val="0"/>
+          <w:sz w:val="32"/>
+          <w:szCs w:val="32"/>
+          <w:lang w:val="es-MX"/>
+          <w14:shadow w14:blurRad="0" w14:dist="38100" w14:dir="2700000" w14:sx="100000" w14:sy="100000" w14:kx="0" w14:ky="0" w14:algn="bl">
+            <w14:schemeClr w14:val="accent5"/>
+          </w14:shadow>
+          <w14:textOutline w14:w="6731" w14:cap="flat" w14:cmpd="sng" w14:algn="ctr">
+            <w14:solidFill>
+              <w14:schemeClr w14:val="bg1"/>
+            </w14:solidFill>
+            <w14:prstDash w14:val="solid"/>
+            <w14:round/>
+          </w14:textOutline>
+        </w:rPr>
+        <w:t>}</w:t>
       </w:r>
       <w:r>
         <w:rPr>
@@ -6752,6 +7128,7 @@
               </w:rPr>
               <w:t>${</w:t>
             </w:r>
+            <w:proofErr w:type="spellStart"/>
             <w:r>
               <w:rPr>
                 <w:rFonts w:asciiTheme="minorHAnsi" w:eastAsiaTheme="minorHAnsi" w:hAnsiTheme="minorHAnsi" w:cstheme="minorHAnsi"/>
@@ -6778,7 +7155,22 @@
                 <w:szCs w:val="24"/>
                 <w:lang w:val="es-MX"/>
               </w:rPr>
-              <w:t>_colab}</w:t>
+              <w:t>_colab</w:t>
+            </w:r>
+            <w:proofErr w:type="spellEnd"/>
+            <w:r>
+              <w:rPr>
+                <w:rFonts w:asciiTheme="minorHAnsi" w:eastAsiaTheme="minorHAnsi" w:hAnsiTheme="minorHAnsi" w:cstheme="minorHAnsi"/>
+                <w:b/>
+                <w:i/>
+                <w:iCs/>
+                <w:color w:val="auto"/>
+                <w:kern w:val="0"/>
+                <w:sz w:val="24"/>
+                <w:szCs w:val="24"/>
+                <w:lang w:val="es-MX"/>
+              </w:rPr>
+              <w:t>}</w:t>
             </w:r>
           </w:p>
         </w:tc>
@@ -6819,8 +7211,9 @@
                 <w:szCs w:val="24"/>
                 <w:lang w:val="es-MX"/>
               </w:rPr>
-              <w:t>${count</w:t>
+              <w:t>${</w:t>
             </w:r>
+            <w:proofErr w:type="spellStart"/>
             <w:r>
               <w:rPr>
                 <w:rFonts w:asciiTheme="minorHAnsi" w:eastAsiaTheme="minorHAnsi" w:hAnsiTheme="minorHAnsi" w:cstheme="minorHAnsi"/>
@@ -6833,8 +7226,23 @@
                 <w:szCs w:val="24"/>
                 <w:lang w:val="es-MX"/>
               </w:rPr>
+              <w:t>count</w:t>
+            </w:r>
+            <w:r>
+              <w:rPr>
+                <w:rFonts w:asciiTheme="minorHAnsi" w:eastAsiaTheme="minorHAnsi" w:hAnsiTheme="minorHAnsi" w:cstheme="minorHAnsi"/>
+                <w:bCs/>
+                <w:i/>
+                <w:iCs/>
+                <w:color w:val="auto"/>
+                <w:kern w:val="0"/>
+                <w:sz w:val="24"/>
+                <w:szCs w:val="24"/>
+                <w:lang w:val="es-MX"/>
+              </w:rPr>
               <w:t>_eva</w:t>
             </w:r>
+            <w:proofErr w:type="spellEnd"/>
             <w:r>
               <w:rPr>
                 <w:rFonts w:asciiTheme="minorHAnsi" w:eastAsiaTheme="minorHAnsi" w:hAnsiTheme="minorHAnsi" w:cstheme="minorHAnsi"/>
@@ -6929,8 +7337,9 @@
                 <w:szCs w:val="24"/>
                 <w:lang w:val="es-MX"/>
               </w:rPr>
-              <w:t>${count_</w:t>
+              <w:t>${</w:t>
             </w:r>
+            <w:proofErr w:type="spellStart"/>
             <w:r>
               <w:rPr>
                 <w:rFonts w:asciiTheme="minorHAnsi" w:eastAsiaTheme="minorHAnsi" w:hAnsiTheme="minorHAnsi" w:cstheme="minorHAnsi"/>
@@ -6943,8 +7352,23 @@
                 <w:szCs w:val="24"/>
                 <w:lang w:val="es-MX"/>
               </w:rPr>
+              <w:t>count_</w:t>
+            </w:r>
+            <w:r>
+              <w:rPr>
+                <w:rFonts w:asciiTheme="minorHAnsi" w:eastAsiaTheme="minorHAnsi" w:hAnsiTheme="minorHAnsi" w:cstheme="minorHAnsi"/>
+                <w:bCs/>
+                <w:i/>
+                <w:iCs/>
+                <w:color w:val="auto"/>
+                <w:kern w:val="0"/>
+                <w:sz w:val="24"/>
+                <w:szCs w:val="24"/>
+                <w:lang w:val="es-MX"/>
+              </w:rPr>
               <w:t>eva</w:t>
             </w:r>
+            <w:proofErr w:type="spellEnd"/>
             <w:r>
               <w:rPr>
                 <w:rFonts w:asciiTheme="minorHAnsi" w:eastAsiaTheme="minorHAnsi" w:hAnsiTheme="minorHAnsi" w:cstheme="minorHAnsi"/>
@@ -7331,7 +7755,33 @@
                 <w:szCs w:val="24"/>
                 <w:lang w:val="es-MX"/>
               </w:rPr>
-              <w:t>${cali}</w:t>
+              <w:t>${</w:t>
+            </w:r>
+            <w:proofErr w:type="spellStart"/>
+            <w:r>
+              <w:rPr>
+                <w:rFonts w:asciiTheme="minorHAnsi" w:eastAsiaTheme="minorHAnsi" w:hAnsiTheme="minorHAnsi" w:cstheme="minorHAnsi"/>
+                <w:bCs/>
+                <w:color w:val="auto"/>
+                <w:kern w:val="0"/>
+                <w:sz w:val="24"/>
+                <w:szCs w:val="24"/>
+                <w:lang w:val="es-MX"/>
+              </w:rPr>
+              <w:t>cali</w:t>
+            </w:r>
+            <w:proofErr w:type="spellEnd"/>
+            <w:r>
+              <w:rPr>
+                <w:rFonts w:asciiTheme="minorHAnsi" w:eastAsiaTheme="minorHAnsi" w:hAnsiTheme="minorHAnsi" w:cstheme="minorHAnsi"/>
+                <w:bCs/>
+                <w:color w:val="auto"/>
+                <w:kern w:val="0"/>
+                <w:sz w:val="24"/>
+                <w:szCs w:val="24"/>
+                <w:lang w:val="es-MX"/>
+              </w:rPr>
+              <w:t>}</w:t>
             </w:r>
           </w:p>
         </w:tc>
@@ -7507,7 +7957,35 @@
           <w:szCs w:val="24"/>
           <w:lang w:val="es-MX"/>
         </w:rPr>
-        <w:t>${riesgo} (${cali})</w:t>
+        <w:t>${riesgo} (${</w:t>
+      </w:r>
+      <w:proofErr w:type="spellStart"/>
+      <w:r>
+        <w:rPr>
+          <w:rFonts w:asciiTheme="minorHAnsi" w:eastAsiaTheme="minorHAnsi" w:hAnsiTheme="minorHAnsi" w:cstheme="minorHAnsi"/>
+          <w:i/>
+          <w:iCs/>
+          <w:color w:val="auto"/>
+          <w:kern w:val="0"/>
+          <w:sz w:val="24"/>
+          <w:szCs w:val="24"/>
+          <w:lang w:val="es-MX"/>
+        </w:rPr>
+        <w:t>cali</w:t>
+      </w:r>
+      <w:proofErr w:type="spellEnd"/>
+      <w:r>
+        <w:rPr>
+          <w:rFonts w:asciiTheme="minorHAnsi" w:eastAsiaTheme="minorHAnsi" w:hAnsiTheme="minorHAnsi" w:cstheme="minorHAnsi"/>
+          <w:i/>
+          <w:iCs/>
+          <w:color w:val="auto"/>
+          <w:kern w:val="0"/>
+          <w:sz w:val="24"/>
+          <w:szCs w:val="24"/>
+          <w:lang w:val="es-MX"/>
+        </w:rPr>
+        <w:t>})</w:t>
       </w:r>
     </w:p>
     <w:p>
@@ -7683,7 +8161,31 @@
           <w:sz w:val="24"/>
           <w:szCs w:val="24"/>
         </w:rPr>
-        <w:t>${determinacion}</w:t>
+        <w:t>${</w:t>
+      </w:r>
+      <w:proofErr w:type="spellStart"/>
+      <w:r>
+        <w:rPr>
+          <w:rFonts w:cstheme="minorHAnsi"/>
+          <w:bCs/>
+          <w:i/>
+          <w:iCs/>
+          <w:sz w:val="24"/>
+          <w:szCs w:val="24"/>
+        </w:rPr>
+        <w:t>determinacion</w:t>
+      </w:r>
+      <w:proofErr w:type="spellEnd"/>
+      <w:r>
+        <w:rPr>
+          <w:rFonts w:cstheme="minorHAnsi"/>
+          <w:bCs/>
+          <w:i/>
+          <w:iCs/>
+          <w:sz w:val="24"/>
+          <w:szCs w:val="24"/>
+        </w:rPr>
+        <w:t>}</w:t>
       </w:r>
     </w:p>
     <w:p>
@@ -8204,6 +8706,7 @@
               </w:rPr>
               <w:t>${</w:t>
             </w:r>
+            <w:proofErr w:type="spellStart"/>
             <w:r>
               <w:rPr>
                 <w:rFonts w:asciiTheme="minorHAnsi" w:eastAsiaTheme="minorEastAsia" w:hAnsiTheme="minorHAnsi" w:cstheme="minorBidi"/>
@@ -8216,6 +8719,7 @@
               </w:rPr>
               <w:t>total_vh</w:t>
             </w:r>
+            <w:proofErr w:type="spellEnd"/>
             <w:r>
               <w:rPr>
                 <w:rFonts w:asciiTheme="minorHAnsi" w:eastAsiaTheme="minorEastAsia" w:hAnsiTheme="minorHAnsi" w:cstheme="minorBidi"/>
@@ -8263,6 +8767,7 @@
               </w:rPr>
               <w:t>${</w:t>
             </w:r>
+            <w:proofErr w:type="spellStart"/>
             <w:r>
               <w:rPr>
                 <w:rFonts w:asciiTheme="minorHAnsi" w:eastAsiaTheme="minorEastAsia" w:hAnsiTheme="minorHAnsi" w:cstheme="minorBidi"/>
@@ -8275,6 +8780,7 @@
               </w:rPr>
               <w:t>total_h</w:t>
             </w:r>
+            <w:proofErr w:type="spellEnd"/>
             <w:r>
               <w:rPr>
                 <w:rFonts w:asciiTheme="minorHAnsi" w:eastAsiaTheme="minorEastAsia" w:hAnsiTheme="minorHAnsi" w:cstheme="minorBidi"/>
@@ -8322,6 +8828,7 @@
               </w:rPr>
               <w:t>${</w:t>
             </w:r>
+            <w:proofErr w:type="spellStart"/>
             <w:r>
               <w:rPr>
                 <w:rFonts w:asciiTheme="minorHAnsi" w:eastAsiaTheme="minorEastAsia" w:hAnsiTheme="minorHAnsi" w:cstheme="minorBidi"/>
@@ -8334,6 +8841,7 @@
               </w:rPr>
               <w:t>total_m</w:t>
             </w:r>
+            <w:proofErr w:type="spellEnd"/>
             <w:r>
               <w:rPr>
                 <w:rFonts w:asciiTheme="minorHAnsi" w:eastAsiaTheme="minorEastAsia" w:hAnsiTheme="minorHAnsi" w:cstheme="minorBidi"/>
@@ -8381,6 +8889,7 @@
               </w:rPr>
               <w:t>${</w:t>
             </w:r>
+            <w:proofErr w:type="spellStart"/>
             <w:r>
               <w:rPr>
                 <w:rFonts w:asciiTheme="minorHAnsi" w:eastAsiaTheme="minorEastAsia" w:hAnsiTheme="minorHAnsi" w:cstheme="minorBidi"/>
@@ -8393,6 +8902,7 @@
               </w:rPr>
               <w:t>total_b</w:t>
             </w:r>
+            <w:proofErr w:type="spellEnd"/>
             <w:r>
               <w:rPr>
                 <w:rFonts w:asciiTheme="minorHAnsi" w:eastAsiaTheme="minorEastAsia" w:hAnsiTheme="minorHAnsi" w:cstheme="minorBidi"/>
@@ -8440,6 +8950,7 @@
               </w:rPr>
               <w:t>${</w:t>
             </w:r>
+            <w:proofErr w:type="spellStart"/>
             <w:r>
               <w:rPr>
                 <w:rFonts w:asciiTheme="minorHAnsi" w:eastAsiaTheme="minorEastAsia" w:hAnsiTheme="minorHAnsi" w:cstheme="minorBidi"/>
@@ -8452,6 +8963,7 @@
               </w:rPr>
               <w:t>total_n</w:t>
             </w:r>
+            <w:proofErr w:type="spellEnd"/>
             <w:r>
               <w:rPr>
                 <w:rFonts w:asciiTheme="minorHAnsi" w:eastAsiaTheme="minorEastAsia" w:hAnsiTheme="minorHAnsi" w:cstheme="minorBidi"/>
@@ -8547,6 +9059,7 @@
         </w:rPr>
         <w:t>${</w:t>
       </w:r>
+      <w:proofErr w:type="spellStart"/>
       <w:r>
         <w:rPr>
           <w:rFonts w:asciiTheme="minorHAnsi" w:eastAsiaTheme="minorHAnsi" w:hAnsiTheme="minorHAnsi" w:cstheme="minorHAnsi"/>
@@ -8559,6 +9072,7 @@
         </w:rPr>
         <w:t>chart_gen</w:t>
       </w:r>
+      <w:proofErr w:type="spellEnd"/>
       <w:r>
         <w:rPr>
           <w:rFonts w:asciiTheme="minorHAnsi" w:eastAsiaTheme="minorHAnsi" w:hAnsiTheme="minorHAnsi" w:cstheme="minorHAnsi"/>
@@ -9408,7 +9922,33 @@
                 <w:szCs w:val="14"/>
                 <w:lang w:val="es-MX"/>
               </w:rPr>
-              <w:t>${cat_name}</w:t>
+              <w:t>${</w:t>
+            </w:r>
+            <w:proofErr w:type="spellStart"/>
+            <w:r>
+              <w:rPr>
+                <w:rFonts w:asciiTheme="minorHAnsi" w:eastAsiaTheme="minorHAnsi" w:hAnsiTheme="minorHAnsi" w:cstheme="minorHAnsi"/>
+                <w:b w:val="0"/>
+                <w:color w:val="auto"/>
+                <w:kern w:val="0"/>
+                <w:sz w:val="14"/>
+                <w:szCs w:val="14"/>
+                <w:lang w:val="es-MX"/>
+              </w:rPr>
+              <w:t>cat_name</w:t>
+            </w:r>
+            <w:proofErr w:type="spellEnd"/>
+            <w:r>
+              <w:rPr>
+                <w:rFonts w:asciiTheme="minorHAnsi" w:eastAsiaTheme="minorHAnsi" w:hAnsiTheme="minorHAnsi" w:cstheme="minorHAnsi"/>
+                <w:b w:val="0"/>
+                <w:color w:val="auto"/>
+                <w:kern w:val="0"/>
+                <w:sz w:val="14"/>
+                <w:szCs w:val="14"/>
+                <w:lang w:val="es-MX"/>
+              </w:rPr>
+              <w:t>}</w:t>
             </w:r>
           </w:p>
         </w:tc>
@@ -9442,7 +9982,33 @@
                 <w:szCs w:val="14"/>
                 <w:lang w:val="es-MX"/>
               </w:rPr>
-              <w:t>${cat_cal}</w:t>
+              <w:t>${</w:t>
+            </w:r>
+            <w:proofErr w:type="spellStart"/>
+            <w:r>
+              <w:rPr>
+                <w:rFonts w:asciiTheme="minorHAnsi" w:eastAsiaTheme="minorEastAsia" w:hAnsiTheme="minorHAnsi" w:cstheme="minorBidi"/>
+                <w:b w:val="0"/>
+                <w:color w:val="auto"/>
+                <w:kern w:val="0"/>
+                <w:sz w:val="14"/>
+                <w:szCs w:val="14"/>
+                <w:lang w:val="es-MX"/>
+              </w:rPr>
+              <w:t>cat_cal</w:t>
+            </w:r>
+            <w:proofErr w:type="spellEnd"/>
+            <w:r>
+              <w:rPr>
+                <w:rFonts w:asciiTheme="minorHAnsi" w:eastAsiaTheme="minorEastAsia" w:hAnsiTheme="minorHAnsi" w:cstheme="minorBidi"/>
+                <w:b w:val="0"/>
+                <w:color w:val="auto"/>
+                <w:kern w:val="0"/>
+                <w:sz w:val="14"/>
+                <w:szCs w:val="14"/>
+                <w:lang w:val="es-MX"/>
+              </w:rPr>
+              <w:t>}</w:t>
             </w:r>
           </w:p>
         </w:tc>
@@ -9478,6 +10044,7 @@
               </w:rPr>
               <w:t>${</w:t>
             </w:r>
+            <w:proofErr w:type="spellStart"/>
             <w:r>
               <w:rPr>
                 <w:rFonts w:asciiTheme="minorHAnsi" w:eastAsiaTheme="minorHAnsi" w:hAnsiTheme="minorHAnsi" w:cstheme="minorHAnsi"/>
@@ -9490,6 +10057,7 @@
               </w:rPr>
               <w:t>cat_nivel</w:t>
             </w:r>
+            <w:proofErr w:type="spellEnd"/>
             <w:r>
               <w:rPr>
                 <w:rFonts w:asciiTheme="minorHAnsi" w:eastAsiaTheme="minorHAnsi" w:hAnsiTheme="minorHAnsi" w:cstheme="minorHAnsi"/>
@@ -9621,7 +10189,31 @@
           <w:szCs w:val="24"/>
           <w:lang w:val="es-MX"/>
         </w:rPr>
-        <w:t>${det_cat_mas_alta}</w:t>
+        <w:t>${</w:t>
+      </w:r>
+      <w:proofErr w:type="spellStart"/>
+      <w:r>
+        <w:rPr>
+          <w:rFonts w:asciiTheme="minorHAnsi" w:eastAsiaTheme="minorHAnsi" w:hAnsiTheme="minorHAnsi" w:cstheme="minorHAnsi"/>
+          <w:bCs/>
+          <w:kern w:val="0"/>
+          <w:sz w:val="24"/>
+          <w:szCs w:val="24"/>
+          <w:lang w:val="es-MX"/>
+        </w:rPr>
+        <w:t>det_cat_mas_alta</w:t>
+      </w:r>
+      <w:proofErr w:type="spellEnd"/>
+      <w:r>
+        <w:rPr>
+          <w:rFonts w:asciiTheme="minorHAnsi" w:eastAsiaTheme="minorHAnsi" w:hAnsiTheme="minorHAnsi" w:cstheme="minorHAnsi"/>
+          <w:bCs/>
+          <w:kern w:val="0"/>
+          <w:sz w:val="24"/>
+          <w:szCs w:val="24"/>
+          <w:lang w:val="es-MX"/>
+        </w:rPr>
+        <w:t>}</w:t>
       </w:r>
       <w:r>
         <w:rPr>
@@ -9671,7 +10263,33 @@
           <w:szCs w:val="24"/>
           <w:lang w:val="es-MX"/>
         </w:rPr>
-        <w:t>${level_cat_mas_alta}</w:t>
+        <w:t>${</w:t>
+      </w:r>
+      <w:proofErr w:type="spellStart"/>
+      <w:r>
+        <w:rPr>
+          <w:rFonts w:asciiTheme="minorHAnsi" w:eastAsiaTheme="minorHAnsi" w:hAnsiTheme="minorHAnsi" w:cstheme="minorHAnsi"/>
+          <w:b w:val="0"/>
+          <w:color w:val="auto"/>
+          <w:kern w:val="0"/>
+          <w:sz w:val="24"/>
+          <w:szCs w:val="24"/>
+          <w:lang w:val="es-MX"/>
+        </w:rPr>
+        <w:t>level_cat_mas_alta</w:t>
+      </w:r>
+      <w:proofErr w:type="spellEnd"/>
+      <w:r>
+        <w:rPr>
+          <w:rFonts w:asciiTheme="minorHAnsi" w:eastAsiaTheme="minorHAnsi" w:hAnsiTheme="minorHAnsi" w:cstheme="minorHAnsi"/>
+          <w:b w:val="0"/>
+          <w:color w:val="auto"/>
+          <w:kern w:val="0"/>
+          <w:sz w:val="24"/>
+          <w:szCs w:val="24"/>
+          <w:lang w:val="es-MX"/>
+        </w:rPr>
+        <w:t>}</w:t>
       </w:r>
       <w:r>
         <w:rPr>
@@ -9852,7 +10470,33 @@
                 <w:szCs w:val="24"/>
                 <w:lang w:val="es-MX"/>
               </w:rPr>
-              <w:t>${colab_name}</w:t>
+              <w:t>${</w:t>
+            </w:r>
+            <w:proofErr w:type="spellStart"/>
+            <w:r>
+              <w:rPr>
+                <w:rFonts w:asciiTheme="minorHAnsi" w:eastAsiaTheme="minorHAnsi" w:hAnsiTheme="minorHAnsi" w:cstheme="minorHAnsi"/>
+                <w:b w:val="0"/>
+                <w:color w:val="auto"/>
+                <w:kern w:val="0"/>
+                <w:sz w:val="24"/>
+                <w:szCs w:val="24"/>
+                <w:lang w:val="es-MX"/>
+              </w:rPr>
+              <w:t>colab_name</w:t>
+            </w:r>
+            <w:proofErr w:type="spellEnd"/>
+            <w:r>
+              <w:rPr>
+                <w:rFonts w:asciiTheme="minorHAnsi" w:eastAsiaTheme="minorHAnsi" w:hAnsiTheme="minorHAnsi" w:cstheme="minorHAnsi"/>
+                <w:b w:val="0"/>
+                <w:color w:val="auto"/>
+                <w:kern w:val="0"/>
+                <w:sz w:val="24"/>
+                <w:szCs w:val="24"/>
+                <w:lang w:val="es-MX"/>
+              </w:rPr>
+              <w:t>}</w:t>
             </w:r>
           </w:p>
         </w:tc>
@@ -9886,7 +10530,33 @@
                 <w:szCs w:val="24"/>
                 <w:lang w:val="es-MX"/>
               </w:rPr>
-              <w:t>${colab_score}</w:t>
+              <w:t>${</w:t>
+            </w:r>
+            <w:proofErr w:type="spellStart"/>
+            <w:r>
+              <w:rPr>
+                <w:rFonts w:asciiTheme="minorHAnsi" w:eastAsiaTheme="minorHAnsi" w:hAnsiTheme="minorHAnsi" w:cstheme="minorHAnsi"/>
+                <w:b w:val="0"/>
+                <w:color w:val="auto"/>
+                <w:kern w:val="0"/>
+                <w:sz w:val="24"/>
+                <w:szCs w:val="24"/>
+                <w:lang w:val="es-MX"/>
+              </w:rPr>
+              <w:t>colab_score</w:t>
+            </w:r>
+            <w:proofErr w:type="spellEnd"/>
+            <w:r>
+              <w:rPr>
+                <w:rFonts w:asciiTheme="minorHAnsi" w:eastAsiaTheme="minorHAnsi" w:hAnsiTheme="minorHAnsi" w:cstheme="minorHAnsi"/>
+                <w:b w:val="0"/>
+                <w:color w:val="auto"/>
+                <w:kern w:val="0"/>
+                <w:sz w:val="24"/>
+                <w:szCs w:val="24"/>
+                <w:lang w:val="es-MX"/>
+              </w:rPr>
+              <w:t>}</w:t>
             </w:r>
           </w:p>
         </w:tc>
@@ -9920,7 +10590,33 @@
                 <w:szCs w:val="24"/>
                 <w:lang w:val="es-MX"/>
               </w:rPr>
-              <w:t>${colab_level}</w:t>
+              <w:t>${</w:t>
+            </w:r>
+            <w:proofErr w:type="spellStart"/>
+            <w:r>
+              <w:rPr>
+                <w:rFonts w:asciiTheme="minorHAnsi" w:eastAsiaTheme="minorHAnsi" w:hAnsiTheme="minorHAnsi" w:cstheme="minorHAnsi"/>
+                <w:b w:val="0"/>
+                <w:color w:val="auto"/>
+                <w:kern w:val="0"/>
+                <w:sz w:val="24"/>
+                <w:szCs w:val="24"/>
+                <w:lang w:val="es-MX"/>
+              </w:rPr>
+              <w:t>colab_level</w:t>
+            </w:r>
+            <w:proofErr w:type="spellEnd"/>
+            <w:r>
+              <w:rPr>
+                <w:rFonts w:asciiTheme="minorHAnsi" w:eastAsiaTheme="minorHAnsi" w:hAnsiTheme="minorHAnsi" w:cstheme="minorHAnsi"/>
+                <w:b w:val="0"/>
+                <w:color w:val="auto"/>
+                <w:kern w:val="0"/>
+                <w:sz w:val="24"/>
+                <w:szCs w:val="24"/>
+                <w:lang w:val="es-MX"/>
+              </w:rPr>
+              <w:t>}</w:t>
             </w:r>
           </w:p>
         </w:tc>
@@ -10357,6 +11053,7 @@
               </w:rPr>
               <w:t>${</w:t>
             </w:r>
+            <w:proofErr w:type="spellStart"/>
             <w:r>
               <w:rPr>
                 <w:rFonts w:asciiTheme="minorHAnsi" w:eastAsiaTheme="minorHAnsi" w:hAnsiTheme="minorHAnsi" w:cstheme="minorHAnsi"/>
@@ -10381,6 +11078,7 @@
               </w:rPr>
               <w:t>_name</w:t>
             </w:r>
+            <w:proofErr w:type="spellEnd"/>
             <w:r>
               <w:rPr>
                 <w:rFonts w:asciiTheme="minorHAnsi" w:eastAsiaTheme="minorHAnsi" w:hAnsiTheme="minorHAnsi" w:cstheme="minorHAnsi"/>
@@ -10429,6 +11127,7 @@
               </w:rPr>
               <w:t>${</w:t>
             </w:r>
+            <w:proofErr w:type="spellStart"/>
             <w:r>
               <w:rPr>
                 <w:rFonts w:asciiTheme="minorHAnsi" w:hAnsiTheme="minorHAnsi" w:cstheme="minorHAnsi"/>
@@ -10440,6 +11139,7 @@
               </w:rPr>
               <w:t>cat_very_high</w:t>
             </w:r>
+            <w:proofErr w:type="spellEnd"/>
             <w:r>
               <w:rPr>
                 <w:rFonts w:asciiTheme="minorHAnsi" w:eastAsiaTheme="minorHAnsi" w:hAnsiTheme="minorHAnsi" w:cstheme="minorHAnsi"/>
@@ -10493,6 +11193,7 @@
               </w:rPr>
               <w:t>${</w:t>
             </w:r>
+            <w:proofErr w:type="spellStart"/>
             <w:r>
               <w:rPr>
                 <w:rFonts w:asciiTheme="minorHAnsi" w:eastAsiaTheme="minorHAnsi" w:hAnsiTheme="minorHAnsi" w:cstheme="minorHAnsi"/>
@@ -10507,6 +11208,7 @@
               </w:rPr>
               <w:t>cat_high</w:t>
             </w:r>
+            <w:proofErr w:type="spellEnd"/>
             <w:r>
               <w:rPr>
                 <w:rFonts w:asciiTheme="minorHAnsi" w:eastAsiaTheme="minorHAnsi" w:hAnsiTheme="minorHAnsi" w:cstheme="minorHAnsi"/>
@@ -10560,6 +11262,7 @@
               </w:rPr>
               <w:t>${</w:t>
             </w:r>
+            <w:proofErr w:type="spellStart"/>
             <w:r>
               <w:rPr>
                 <w:rFonts w:asciiTheme="minorHAnsi" w:eastAsiaTheme="minorHAnsi" w:hAnsiTheme="minorHAnsi" w:cstheme="minorHAnsi"/>
@@ -10588,6 +11291,7 @@
               </w:rPr>
               <w:t>at_medium</w:t>
             </w:r>
+            <w:proofErr w:type="spellEnd"/>
             <w:r>
               <w:rPr>
                 <w:rFonts w:asciiTheme="minorHAnsi" w:eastAsiaTheme="minorHAnsi" w:hAnsiTheme="minorHAnsi" w:cstheme="minorHAnsi"/>
@@ -10641,6 +11345,7 @@
               </w:rPr>
               <w:t>${</w:t>
             </w:r>
+            <w:proofErr w:type="spellStart"/>
             <w:r>
               <w:rPr>
                 <w:rFonts w:asciiTheme="minorHAnsi" w:eastAsiaTheme="minorHAnsi" w:hAnsiTheme="minorHAnsi" w:cstheme="minorHAnsi"/>
@@ -10669,6 +11374,7 @@
               </w:rPr>
               <w:t>at_low</w:t>
             </w:r>
+            <w:proofErr w:type="spellEnd"/>
             <w:r>
               <w:rPr>
                 <w:rFonts w:asciiTheme="minorHAnsi" w:eastAsiaTheme="minorHAnsi" w:hAnsiTheme="minorHAnsi" w:cstheme="minorHAnsi"/>
@@ -10719,6 +11425,7 @@
               </w:rPr>
               <w:t>${</w:t>
             </w:r>
+            <w:proofErr w:type="spellStart"/>
             <w:r>
               <w:rPr>
                 <w:rFonts w:asciiTheme="minorHAnsi" w:hAnsiTheme="minorHAnsi" w:cstheme="minorHAnsi"/>
@@ -10730,6 +11437,7 @@
               </w:rPr>
               <w:t>cat_null</w:t>
             </w:r>
+            <w:proofErr w:type="spellEnd"/>
             <w:r>
               <w:rPr>
                 <w:rFonts w:asciiTheme="minorHAnsi" w:eastAsiaTheme="minorHAnsi" w:hAnsiTheme="minorHAnsi" w:cstheme="minorHAnsi"/>
@@ -11523,7 +12231,33 @@
                 <w:szCs w:val="14"/>
                 <w:lang w:val="es-MX"/>
               </w:rPr>
-              <w:t>${dom_name}</w:t>
+              <w:t>${</w:t>
+            </w:r>
+            <w:proofErr w:type="spellStart"/>
+            <w:r>
+              <w:rPr>
+                <w:rFonts w:asciiTheme="minorHAnsi" w:eastAsiaTheme="minorHAnsi" w:hAnsiTheme="minorHAnsi" w:cstheme="minorHAnsi"/>
+                <w:b w:val="0"/>
+                <w:color w:val="auto"/>
+                <w:kern w:val="0"/>
+                <w:sz w:val="14"/>
+                <w:szCs w:val="14"/>
+                <w:lang w:val="es-MX"/>
+              </w:rPr>
+              <w:t>dom_name</w:t>
+            </w:r>
+            <w:proofErr w:type="spellEnd"/>
+            <w:r>
+              <w:rPr>
+                <w:rFonts w:asciiTheme="minorHAnsi" w:eastAsiaTheme="minorHAnsi" w:hAnsiTheme="minorHAnsi" w:cstheme="minorHAnsi"/>
+                <w:b w:val="0"/>
+                <w:color w:val="auto"/>
+                <w:kern w:val="0"/>
+                <w:sz w:val="14"/>
+                <w:szCs w:val="14"/>
+                <w:lang w:val="es-MX"/>
+              </w:rPr>
+              <w:t>}</w:t>
             </w:r>
           </w:p>
         </w:tc>
@@ -11559,6 +12293,7 @@
               </w:rPr>
               <w:t>${</w:t>
             </w:r>
+            <w:proofErr w:type="spellStart"/>
             <w:r>
               <w:rPr>
                 <w:rFonts w:asciiTheme="minorHAnsi" w:eastAsiaTheme="minorEastAsia" w:hAnsiTheme="minorHAnsi" w:cstheme="minorBidi"/>
@@ -11571,6 +12306,7 @@
               </w:rPr>
               <w:t>dom_cal</w:t>
             </w:r>
+            <w:proofErr w:type="spellEnd"/>
             <w:r>
               <w:rPr>
                 <w:rFonts w:asciiTheme="minorHAnsi" w:eastAsiaTheme="minorEastAsia" w:hAnsiTheme="minorHAnsi" w:cstheme="minorBidi"/>
@@ -11617,6 +12353,7 @@
               </w:rPr>
               <w:t>${</w:t>
             </w:r>
+            <w:proofErr w:type="spellStart"/>
             <w:r>
               <w:rPr>
                 <w:rFonts w:asciiTheme="minorHAnsi" w:eastAsiaTheme="minorEastAsia" w:hAnsiTheme="minorHAnsi" w:cstheme="minorBidi"/>
@@ -11629,6 +12366,7 @@
               </w:rPr>
               <w:t>dom_nivel</w:t>
             </w:r>
+            <w:proofErr w:type="spellEnd"/>
             <w:r>
               <w:rPr>
                 <w:rFonts w:asciiTheme="minorHAnsi" w:eastAsiaTheme="minorEastAsia" w:hAnsiTheme="minorHAnsi" w:cstheme="minorBidi"/>
@@ -12063,8 +12801,9 @@
                 <w:szCs w:val="16"/>
                 <w:lang w:val="es-MX"/>
               </w:rPr>
-              <w:t>${dom</w:t>
+              <w:t>${</w:t>
             </w:r>
+            <w:proofErr w:type="spellStart"/>
             <w:r>
               <w:rPr>
                 <w:rFonts w:asciiTheme="minorHAnsi" w:eastAsiaTheme="minorHAnsi" w:hAnsiTheme="minorHAnsi" w:cstheme="minorHAnsi"/>
@@ -12075,6 +12814,18 @@
                 <w:szCs w:val="16"/>
                 <w:lang w:val="es-MX"/>
               </w:rPr>
+              <w:t>dom</w:t>
+            </w:r>
+            <w:r>
+              <w:rPr>
+                <w:rFonts w:asciiTheme="minorHAnsi" w:eastAsiaTheme="minorHAnsi" w:hAnsiTheme="minorHAnsi" w:cstheme="minorHAnsi"/>
+                <w:b w:val="0"/>
+                <w:color w:val="auto"/>
+                <w:kern w:val="0"/>
+                <w:sz w:val="16"/>
+                <w:szCs w:val="16"/>
+                <w:lang w:val="es-MX"/>
+              </w:rPr>
               <w:t>_list</w:t>
             </w:r>
             <w:r>
@@ -12087,7 +12838,20 @@
                 <w:szCs w:val="16"/>
                 <w:lang w:val="es-MX"/>
               </w:rPr>
-              <w:t>_name}</w:t>
+              <w:t>_name</w:t>
+            </w:r>
+            <w:proofErr w:type="spellEnd"/>
+            <w:r>
+              <w:rPr>
+                <w:rFonts w:asciiTheme="minorHAnsi" w:eastAsiaTheme="minorHAnsi" w:hAnsiTheme="minorHAnsi" w:cstheme="minorHAnsi"/>
+                <w:b w:val="0"/>
+                <w:color w:val="auto"/>
+                <w:kern w:val="0"/>
+                <w:sz w:val="16"/>
+                <w:szCs w:val="16"/>
+                <w:lang w:val="es-MX"/>
+              </w:rPr>
+              <w:t>}</w:t>
             </w:r>
           </w:p>
         </w:tc>
@@ -12139,8 +12903,24 @@
                 <w:szCs w:val="16"/>
                 <w:lang w:val="es-MX"/>
               </w:rPr>
-              <w:t>{dom_very_high</w:t>
+              <w:t>{</w:t>
             </w:r>
+            <w:proofErr w:type="spellStart"/>
+            <w:r>
+              <w:rPr>
+                <w:rFonts w:asciiTheme="minorHAnsi" w:eastAsiaTheme="minorHAnsi" w:hAnsiTheme="minorHAnsi" w:cstheme="minorHAnsi"/>
+                <w:bCs/>
+                <w:i/>
+                <w:iCs/>
+                <w:color w:val="auto"/>
+                <w:kern w:val="0"/>
+                <w:sz w:val="16"/>
+                <w:szCs w:val="16"/>
+                <w:lang w:val="es-MX"/>
+              </w:rPr>
+              <w:t>dom_very_high</w:t>
+            </w:r>
+            <w:proofErr w:type="spellEnd"/>
             <w:r>
               <w:rPr>
                 <w:rFonts w:asciiTheme="minorHAnsi" w:eastAsiaTheme="minorHAnsi" w:hAnsiTheme="minorHAnsi" w:cstheme="minorHAnsi"/>
@@ -12193,6 +12973,7 @@
               </w:rPr>
               <w:t>${</w:t>
             </w:r>
+            <w:proofErr w:type="spellStart"/>
             <w:r>
               <w:rPr>
                 <w:rFonts w:asciiTheme="minorHAnsi" w:eastAsiaTheme="minorHAnsi" w:hAnsiTheme="minorHAnsi" w:cstheme="minorHAnsi"/>
@@ -12207,6 +12988,7 @@
               </w:rPr>
               <w:t>dom_high</w:t>
             </w:r>
+            <w:proofErr w:type="spellEnd"/>
             <w:r>
               <w:rPr>
                 <w:rFonts w:asciiTheme="minorHAnsi" w:eastAsiaTheme="minorHAnsi" w:hAnsiTheme="minorHAnsi" w:cstheme="minorHAnsi"/>
@@ -12259,6 +13041,7 @@
               </w:rPr>
               <w:t>${</w:t>
             </w:r>
+            <w:proofErr w:type="spellStart"/>
             <w:r>
               <w:rPr>
                 <w:rFonts w:asciiTheme="minorHAnsi" w:eastAsiaTheme="minorHAnsi" w:hAnsiTheme="minorHAnsi" w:cstheme="minorHAnsi"/>
@@ -12329,6 +13112,7 @@
               </w:rPr>
               <w:t>edium</w:t>
             </w:r>
+            <w:proofErr w:type="spellEnd"/>
             <w:r>
               <w:rPr>
                 <w:rFonts w:asciiTheme="minorHAnsi" w:eastAsiaTheme="minorHAnsi" w:hAnsiTheme="minorHAnsi" w:cstheme="minorHAnsi"/>
@@ -12379,8 +13163,9 @@
                 <w:szCs w:val="16"/>
                 <w:lang w:val="es-MX"/>
               </w:rPr>
-              <w:t>${dom</w:t>
+              <w:t>${</w:t>
             </w:r>
+            <w:proofErr w:type="spellStart"/>
             <w:r>
               <w:rPr>
                 <w:rFonts w:asciiTheme="minorHAnsi" w:eastAsiaTheme="minorHAnsi" w:hAnsiTheme="minorHAnsi" w:cstheme="minorHAnsi"/>
@@ -12393,7 +13178,7 @@
                 <w:szCs w:val="16"/>
                 <w:lang w:val="es-MX"/>
               </w:rPr>
-              <w:t>_</w:t>
+              <w:t>dom</w:t>
             </w:r>
             <w:r>
               <w:rPr>
@@ -12407,7 +13192,7 @@
                 <w:szCs w:val="16"/>
                 <w:lang w:val="es-MX"/>
               </w:rPr>
-              <w:t>l</w:t>
+              <w:t>_</w:t>
             </w:r>
             <w:r>
               <w:rPr>
@@ -12421,8 +13206,23 @@
                 <w:szCs w:val="16"/>
                 <w:lang w:val="es-MX"/>
               </w:rPr>
+              <w:t>l</w:t>
+            </w:r>
+            <w:r>
+              <w:rPr>
+                <w:rFonts w:asciiTheme="minorHAnsi" w:eastAsiaTheme="minorHAnsi" w:hAnsiTheme="minorHAnsi" w:cstheme="minorHAnsi"/>
+                <w:bCs/>
+                <w:i/>
+                <w:iCs/>
+                <w:color w:val="auto"/>
+                <w:kern w:val="0"/>
+                <w:sz w:val="16"/>
+                <w:szCs w:val="16"/>
+                <w:lang w:val="es-MX"/>
+              </w:rPr>
               <w:t>ow</w:t>
             </w:r>
+            <w:proofErr w:type="spellEnd"/>
             <w:r>
               <w:rPr>
                 <w:rFonts w:asciiTheme="minorHAnsi" w:eastAsiaTheme="minorHAnsi" w:hAnsiTheme="minorHAnsi" w:cstheme="minorHAnsi"/>
@@ -12475,6 +13275,7 @@
               </w:rPr>
               <w:t>${</w:t>
             </w:r>
+            <w:proofErr w:type="spellStart"/>
             <w:r>
               <w:rPr>
                 <w:rFonts w:asciiTheme="minorHAnsi" w:eastAsiaTheme="minorHAnsi" w:hAnsiTheme="minorHAnsi" w:cstheme="minorHAnsi"/>
@@ -12489,6 +13290,7 @@
               </w:rPr>
               <w:t>dom_null</w:t>
             </w:r>
+            <w:proofErr w:type="spellEnd"/>
             <w:r>
               <w:rPr>
                 <w:rFonts w:asciiTheme="minorHAnsi" w:eastAsiaTheme="minorHAnsi" w:hAnsiTheme="minorHAnsi" w:cstheme="minorHAnsi"/>

</xml_diff>

<commit_message>
Se agrega cambios a la tabla sedes, se añade responsable y cedula
</commit_message>
<xml_diff>
--- a/storage/app/plantillas/informe_guiaIII_template.docx
+++ b/storage/app/plantillas/informe_guiaIII_template.docx
@@ -13855,25 +13855,24 @@
         <w:rPr>
           <w:rFonts w:asciiTheme="minorHAnsi" w:eastAsiaTheme="minorHAnsi" w:hAnsiTheme="minorHAnsi" w:cstheme="minorHAnsi"/>
           <w:b w:val="0"/>
-          <w:color w:val="FF0000"/>
-          <w:kern w:val="0"/>
-          <w:sz w:val="24"/>
-          <w:szCs w:val="24"/>
-          <w:lang w:val="es-MX"/>
-        </w:rPr>
-      </w:pPr>
-      <w:r>
-        <w:rPr>
-          <w:rFonts w:asciiTheme="minorHAnsi" w:eastAsiaTheme="minorHAnsi" w:hAnsiTheme="minorHAnsi" w:cstheme="minorHAnsi"/>
-          <w:b w:val="0"/>
-          <w:color w:val="FF0000"/>
-          <w:kern w:val="0"/>
-          <w:sz w:val="24"/>
-          <w:szCs w:val="24"/>
-          <w:highlight w:val="yellow"/>
-          <w:lang w:val="es-MX"/>
-        </w:rPr>
-        <w:t>Claudia Leticia Esparza Araujo</w:t>
+          <w:color w:val="auto"/>
+          <w:kern w:val="0"/>
+          <w:sz w:val="24"/>
+          <w:szCs w:val="24"/>
+          <w:lang w:val="es-MX"/>
+        </w:rPr>
+      </w:pPr>
+      <w:r>
+        <w:rPr>
+          <w:rFonts w:asciiTheme="minorHAnsi" w:eastAsiaTheme="minorHAnsi" w:hAnsiTheme="minorHAnsi" w:cstheme="minorHAnsi"/>
+          <w:b w:val="0"/>
+          <w:color w:val="auto"/>
+          <w:kern w:val="0"/>
+          <w:sz w:val="24"/>
+          <w:szCs w:val="24"/>
+          <w:lang w:val="es-MX"/>
+        </w:rPr>
+        <w:t>${responsable}</w:t>
       </w:r>
     </w:p>
     <w:p>
@@ -13939,14 +13938,13 @@
         <w:rPr>
           <w:rFonts w:asciiTheme="minorHAnsi" w:eastAsiaTheme="minorHAnsi" w:hAnsiTheme="minorHAnsi" w:cstheme="minorHAnsi"/>
           <w:b w:val="0"/>
-          <w:color w:val="FF0000"/>
-          <w:kern w:val="0"/>
-          <w:sz w:val="24"/>
-          <w:szCs w:val="24"/>
-          <w:highlight w:val="yellow"/>
-          <w:lang w:val="es-MX"/>
-        </w:rPr>
-        <w:t>8128209</w:t>
+          <w:color w:val="auto"/>
+          <w:kern w:val="0"/>
+          <w:sz w:val="24"/>
+          <w:szCs w:val="24"/>
+          <w:lang w:val="es-MX"/>
+        </w:rPr>
+        <w:t>${card_id}</w:t>
       </w:r>
     </w:p>
     <w:p>

</xml_diff>

<commit_message>
Se corrige la plantilla de la G3
</commit_message>
<xml_diff>
--- a/storage/app/plantillas/informe_guiaIII_template.docx
+++ b/storage/app/plantillas/informe_guiaIII_template.docx
@@ -13944,7 +13944,31 @@
           <w:szCs w:val="24"/>
           <w:lang w:val="es-MX"/>
         </w:rPr>
-        <w:t>${card_id}</w:t>
+        <w:t>${c</w:t>
+      </w:r>
+      <w:r>
+        <w:rPr>
+          <w:rFonts w:asciiTheme="minorHAnsi" w:eastAsiaTheme="minorHAnsi" w:hAnsiTheme="minorHAnsi" w:cstheme="minorHAnsi"/>
+          <w:b w:val="0"/>
+          <w:color w:val="auto"/>
+          <w:kern w:val="0"/>
+          <w:sz w:val="24"/>
+          <w:szCs w:val="24"/>
+          <w:lang w:val="es-MX"/>
+        </w:rPr>
+        <w:t>edula</w:t>
+      </w:r>
+      <w:r>
+        <w:rPr>
+          <w:rFonts w:asciiTheme="minorHAnsi" w:eastAsiaTheme="minorHAnsi" w:hAnsiTheme="minorHAnsi" w:cstheme="minorHAnsi"/>
+          <w:b w:val="0"/>
+          <w:color w:val="auto"/>
+          <w:kern w:val="0"/>
+          <w:sz w:val="24"/>
+          <w:szCs w:val="24"/>
+          <w:lang w:val="es-MX"/>
+        </w:rPr>
+        <w:t>}</w:t>
       </w:r>
     </w:p>
     <w:p>

</xml_diff>

<commit_message>
CFormatos norma035, se agrega párrafo guía 3 para los que no hicieron muestra, se quita imagen constancia lety y se agregan los dominios más altos de Muy Alto a Medio
</commit_message>
<xml_diff>
--- a/storage/app/plantillas/informe_guiaIII_template.docx
+++ b/storage/app/plantillas/informe_guiaIII_template.docx
@@ -510,6 +510,7 @@
         </w:rPr>
         <w:t>${</w:t>
       </w:r>
+      <w:proofErr w:type="spellStart"/>
       <w:r>
         <w:rPr>
           <w:rFonts w:ascii="Bahnschrift" w:hAnsi="Bahnschrift"/>
@@ -550,7 +551,29 @@
             <w14:round/>
           </w14:textOutline>
         </w:rPr>
-        <w:t>guia}</w:t>
+        <w:t>guia</w:t>
+      </w:r>
+      <w:proofErr w:type="spellEnd"/>
+      <w:r>
+        <w:rPr>
+          <w:rFonts w:ascii="Bahnschrift" w:hAnsi="Bahnschrift"/>
+          <w:b w:val="0"/>
+          <w:color w:val="404040" w:themeColor="text1" w:themeTint="BF"/>
+          <w:sz w:val="36"/>
+          <w:szCs w:val="36"/>
+          <w:lang w:bidi="es-ES"/>
+          <w14:shadow w14:blurRad="38100" w14:dist="19050" w14:dir="2700000" w14:sx="100000" w14:sy="100000" w14:kx="0" w14:ky="0" w14:algn="tl">
+            <w14:schemeClr w14:val="dk1">
+              <w14:alpha w14:val="60000"/>
+            </w14:schemeClr>
+          </w14:shadow>
+          <w14:textOutline w14:w="0" w14:cap="flat" w14:cmpd="sng" w14:algn="ctr">
+            <w14:noFill/>
+            <w14:prstDash w14:val="solid"/>
+            <w14:round/>
+          </w14:textOutline>
+        </w:rPr>
+        <w:t>}</w:t>
       </w:r>
     </w:p>
     <w:p>
@@ -1697,12 +1720,28 @@
           </w:tcPr>
           <w:p>
             <w:r>
-              <w:t>Nombre: ${company_name}</w:t>
+              <w:t>Nombre: ${</w:t>
+            </w:r>
+            <w:proofErr w:type="spellStart"/>
+            <w:r>
+              <w:t>company_name</w:t>
+            </w:r>
+            <w:proofErr w:type="spellEnd"/>
+            <w:r>
+              <w:t>}</w:t>
             </w:r>
           </w:p>
           <w:p>
             <w:r>
-              <w:t>Domicilio: ${direccion}</w:t>
+              <w:t>Domicilio: ${</w:t>
+            </w:r>
+            <w:proofErr w:type="spellStart"/>
+            <w:r>
+              <w:t>direccion</w:t>
+            </w:r>
+            <w:proofErr w:type="spellEnd"/>
+            <w:r>
+              <w:t>}</w:t>
             </w:r>
           </w:p>
           <w:p>
@@ -2158,19 +2197,35 @@
         <w:t xml:space="preserve"> </w:t>
       </w:r>
       <w:r>
-        <w:t xml:space="preserve">${no_guia} </w:t>
+        <w:t>${</w:t>
+      </w:r>
+      <w:proofErr w:type="spellStart"/>
+      <w:r>
+        <w:t>no_guia</w:t>
+      </w:r>
+      <w:proofErr w:type="spellEnd"/>
+      <w:r>
+        <w:t xml:space="preserve">} </w:t>
       </w:r>
       <w:r>
         <w:t>“</w:t>
       </w:r>
       <w:r>
-        <w:t>${gu</w:t>
+        <w:t>${</w:t>
+      </w:r>
+      <w:proofErr w:type="spellStart"/>
+      <w:r>
+        <w:t>gu</w:t>
       </w:r>
       <w:r>
         <w:t>i</w:t>
       </w:r>
       <w:r>
-        <w:t>a_name}</w:t>
+        <w:t>a_name</w:t>
+      </w:r>
+      <w:proofErr w:type="spellEnd"/>
+      <w:r>
+        <w:t>}</w:t>
       </w:r>
       <w:r>
         <w:t>”</w:t>
@@ -2912,8 +2967,22 @@
           <w:szCs w:val="24"/>
           <w:lang w:val="es-MX"/>
         </w:rPr>
-        <w:t xml:space="preserve"> en la plataforma SEDyCO</w:t>
-      </w:r>
+        <w:t xml:space="preserve"> en la plataforma </w:t>
+      </w:r>
+      <w:proofErr w:type="spellStart"/>
+      <w:r>
+        <w:rPr>
+          <w:rFonts w:asciiTheme="minorHAnsi" w:eastAsiaTheme="minorHAnsi" w:hAnsiTheme="minorHAnsi" w:cstheme="minorHAnsi"/>
+          <w:b w:val="0"/>
+          <w:color w:val="auto"/>
+          <w:kern w:val="0"/>
+          <w:sz w:val="24"/>
+          <w:szCs w:val="24"/>
+          <w:lang w:val="es-MX"/>
+        </w:rPr>
+        <w:t>SEDyCO</w:t>
+      </w:r>
+      <w:proofErr w:type="spellEnd"/>
       <w:r>
         <w:rPr>
           <w:rFonts w:asciiTheme="minorHAnsi" w:eastAsiaTheme="minorHAnsi" w:hAnsiTheme="minorHAnsi" w:cstheme="minorHAnsi"/>
@@ -3890,7 +3959,33 @@
           <w:lang w:val="es-MX"/>
         </w:rPr>
         <w:lastRenderedPageBreak/>
-        <w:t>Para determinar la muestra representativa, el centro de trabajo contaba con una plantilla de personal activo el ${periodo}, el total de la plantilla fue de ${total_colab}</w:t>
+        <w:t>Para determinar la muestra representativa, el centro de trabajo contaba con una plantilla de personal activo el ${periodo}, el total de la plantilla fue de ${</w:t>
+      </w:r>
+      <w:proofErr w:type="spellStart"/>
+      <w:r>
+        <w:rPr>
+          <w:rFonts w:asciiTheme="minorHAnsi" w:eastAsiaTheme="minorHAnsi" w:hAnsiTheme="minorHAnsi" w:cstheme="minorHAnsi"/>
+          <w:b w:val="0"/>
+          <w:color w:val="auto"/>
+          <w:kern w:val="0"/>
+          <w:sz w:val="24"/>
+          <w:szCs w:val="24"/>
+          <w:lang w:val="es-MX"/>
+        </w:rPr>
+        <w:t>total_colab</w:t>
+      </w:r>
+      <w:proofErr w:type="spellEnd"/>
+      <w:r>
+        <w:rPr>
+          <w:rFonts w:asciiTheme="minorHAnsi" w:eastAsiaTheme="minorHAnsi" w:hAnsiTheme="minorHAnsi" w:cstheme="minorHAnsi"/>
+          <w:b w:val="0"/>
+          <w:color w:val="auto"/>
+          <w:kern w:val="0"/>
+          <w:sz w:val="24"/>
+          <w:szCs w:val="24"/>
+          <w:lang w:val="es-MX"/>
+        </w:rPr>
+        <w:t>}</w:t>
       </w:r>
       <w:r>
         <w:rPr>
@@ -4379,149 +4474,53 @@
     </w:p>
     <w:p>
       <w:pPr>
-        <w:pStyle w:val="Ttulo"/>
-        <w:framePr w:hSpace="0" w:wrap="auto" w:vAnchor="margin" w:hAnchor="text" w:yAlign="inline"/>
-        <w:spacing w:before="120" w:after="120"/>
-        <w:jc w:val="both"/>
-        <w:rPr>
-          <w:rFonts w:asciiTheme="minorHAnsi" w:eastAsiaTheme="minorHAnsi" w:hAnsiTheme="minorHAnsi" w:cstheme="minorHAnsi"/>
-          <w:b w:val="0"/>
-          <w:color w:val="auto"/>
-          <w:kern w:val="0"/>
-          <w:sz w:val="24"/>
-          <w:szCs w:val="24"/>
-          <w:lang w:val="es-MX"/>
-        </w:rPr>
-      </w:pPr>
-      <w:r>
-        <w:rPr>
-          <w:rFonts w:asciiTheme="minorHAnsi" w:eastAsiaTheme="minorHAnsi" w:hAnsiTheme="minorHAnsi" w:cstheme="minorHAnsi"/>
-          <w:b w:val="0"/>
-          <w:color w:val="auto"/>
-          <w:kern w:val="0"/>
-          <w:sz w:val="24"/>
-          <w:szCs w:val="24"/>
-          <w:lang w:val="es-MX"/>
-        </w:rPr>
-        <w:t>La muestra se distribuyó entre hombres y mujeres conforme al porcentaje de cada género en el centro de trabajo quedando de la siguiente forma:</w:t>
-      </w:r>
-    </w:p>
-    <w:p>
-      <w:pPr>
-        <w:pStyle w:val="Ttulo"/>
-        <w:framePr w:hSpace="0" w:wrap="auto" w:vAnchor="margin" w:hAnchor="text" w:yAlign="inline"/>
-        <w:spacing w:before="120" w:after="120"/>
-        <w:jc w:val="center"/>
-        <w:rPr>
-          <w:rFonts w:asciiTheme="minorHAnsi" w:eastAsiaTheme="minorHAnsi" w:hAnsiTheme="minorHAnsi" w:cstheme="minorHAnsi"/>
+        <w:jc w:val="both"/>
+        <w:rPr>
+          <w:rFonts w:cstheme="minorHAnsi"/>
+          <w:sz w:val="24"/>
+          <w:szCs w:val="24"/>
+        </w:rPr>
+      </w:pPr>
+      <w:r>
+        <w:rPr>
+          <w:rFonts w:cstheme="minorHAnsi"/>
+          <w:sz w:val="24"/>
+          <w:szCs w:val="24"/>
+        </w:rPr>
+        <w:t xml:space="preserve">Sin embargo, </w:t>
+      </w:r>
+      <w:r>
+        <w:rPr>
+          <w:rFonts w:cstheme="minorHAnsi"/>
+          <w:b/>
           <w:bCs/>
-          <w:color w:val="auto"/>
-          <w:kern w:val="0"/>
-          <w:sz w:val="24"/>
-          <w:szCs w:val="24"/>
-          <w:lang w:val="es-MX"/>
-        </w:rPr>
-      </w:pPr>
-      <w:r>
-        <w:rPr>
-          <w:rFonts w:asciiTheme="minorHAnsi" w:eastAsiaTheme="minorHAnsi" w:hAnsiTheme="minorHAnsi" w:cstheme="minorHAnsi"/>
+          <w:sz w:val="24"/>
+          <w:szCs w:val="24"/>
+        </w:rPr>
+        <w:t>el centro de trabajo tomo la decisión de aplicar al total de la plantilla</w:t>
+      </w:r>
+      <w:r>
+        <w:rPr>
+          <w:rFonts w:cstheme="minorHAnsi"/>
+          <w:sz w:val="24"/>
+          <w:szCs w:val="24"/>
+        </w:rPr>
+        <w:t>, de manera que todos pudieran ser considerados para la aplicación de los cuestionarios, sin importar, su turno, tipo de puesto, área de trabajo, departamento, etc.</w:t>
+      </w:r>
+    </w:p>
+    <w:p>
+      <w:pPr>
+        <w:pStyle w:val="Prrafodelista"/>
+        <w:numPr>
+          <w:ilvl w:val="1"/>
+          <w:numId w:val="22"/>
+        </w:numPr>
+        <w:jc w:val="both"/>
+        <w:rPr>
+          <w:rFonts w:ascii="Bahnschrift" w:hAnsi="Bahnschrift"/>
           <w:bCs/>
-          <w:color w:val="auto"/>
-          <w:kern w:val="0"/>
-          <w:sz w:val="24"/>
-          <w:szCs w:val="24"/>
-          <w:lang w:val="es-MX"/>
-        </w:rPr>
-        <w:t xml:space="preserve">Muestra </w:t>
-      </w:r>
-      <w:r>
-        <w:rPr>
-          <w:rFonts w:asciiTheme="minorHAnsi" w:eastAsiaTheme="minorHAnsi" w:hAnsiTheme="minorHAnsi" w:cstheme="minorHAnsi"/>
-          <w:b w:val="0"/>
-          <w:color w:val="FF0000"/>
-          <w:kern w:val="0"/>
-          <w:sz w:val="24"/>
-          <w:szCs w:val="24"/>
-          <w:lang w:val="es-MX"/>
-        </w:rPr>
-        <w:t>${total_colab}</w:t>
-      </w:r>
-      <w:r>
-        <w:rPr>
-          <w:rFonts w:asciiTheme="minorHAnsi" w:eastAsiaTheme="minorHAnsi" w:hAnsiTheme="minorHAnsi" w:cstheme="minorHAnsi"/>
-          <w:bCs/>
-          <w:color w:val="auto"/>
-          <w:kern w:val="0"/>
-          <w:sz w:val="24"/>
-          <w:szCs w:val="24"/>
-          <w:lang w:val="es-MX"/>
-        </w:rPr>
-        <w:t xml:space="preserve"> colaboradores</w:t>
-      </w:r>
-    </w:p>
-    <w:p>
-      <w:pPr>
-        <w:jc w:val="center"/>
-        <w:rPr>
-          <w:rFonts w:cstheme="minorHAnsi"/>
-          <w:sz w:val="24"/>
-          <w:szCs w:val="24"/>
-        </w:rPr>
-      </w:pPr>
-      <w:r>
-        <w:rPr>
-          <w:rFonts w:cstheme="minorHAnsi"/>
-          <w:sz w:val="24"/>
-          <w:szCs w:val="24"/>
-        </w:rPr>
-        <w:t xml:space="preserve">Total hombres </w:t>
-      </w:r>
-      <w:r>
-        <w:rPr>
-          <w:rFonts w:cstheme="minorHAnsi"/>
-          <w:color w:val="FF0000"/>
-          <w:sz w:val="24"/>
-          <w:szCs w:val="24"/>
-        </w:rPr>
-        <w:t>${hombres}</w:t>
-      </w:r>
-      <w:r>
-        <w:rPr>
-          <w:rFonts w:cstheme="minorHAnsi"/>
-          <w:color w:val="FF0000"/>
-          <w:sz w:val="24"/>
-          <w:szCs w:val="24"/>
-        </w:rPr>
-        <w:tab/>
-      </w:r>
-      <w:r>
-        <w:rPr>
-          <w:rFonts w:cstheme="minorHAnsi"/>
-          <w:sz w:val="24"/>
-          <w:szCs w:val="24"/>
-        </w:rPr>
-        <w:t xml:space="preserve">Total mujeres </w:t>
-      </w:r>
-      <w:r>
-        <w:rPr>
-          <w:rFonts w:cstheme="minorHAnsi"/>
-          <w:color w:val="FF0000"/>
-          <w:sz w:val="24"/>
-          <w:szCs w:val="24"/>
-        </w:rPr>
-        <w:t>${mujeres}</w:t>
-      </w:r>
-    </w:p>
-    <w:p>
-      <w:pPr>
-        <w:pStyle w:val="Prrafodelista"/>
-        <w:ind w:left="1440"/>
-        <w:jc w:val="both"/>
-        <w:rPr>
-          <w:rFonts w:ascii="Bahnschrift" w:hAnsi="Bahnschrift"/>
-          <w:b/>
-          <w:sz w:val="28"/>
-          <w:szCs w:val="28"/>
+          <w:sz w:val="24"/>
+          <w:szCs w:val="24"/>
           <w14:shadow w14:blurRad="38100" w14:dist="19050" w14:dir="2700000" w14:sx="100000" w14:sy="100000" w14:kx="0" w14:ky="0" w14:algn="tl">
             <w14:schemeClr w14:val="dk1">
               <w14:alpha w14:val="60000"/>
@@ -4534,15 +4533,7 @@
           </w14:textOutline>
         </w:rPr>
       </w:pPr>
-    </w:p>
-    <w:p>
-      <w:pPr>
-        <w:pStyle w:val="Prrafodelista"/>
-        <w:numPr>
-          <w:ilvl w:val="1"/>
-          <w:numId w:val="22"/>
-        </w:numPr>
-        <w:jc w:val="both"/>
+      <w:r>
         <w:rPr>
           <w:rFonts w:ascii="Bahnschrift" w:hAnsi="Bahnschrift"/>
           <w:bCs/>
@@ -4559,7 +4550,8 @@
             <w14:round/>
           </w14:textOutline>
         </w:rPr>
-      </w:pPr>
+        <w:t>Medio</w:t>
+      </w:r>
       <w:r>
         <w:rPr>
           <w:rFonts w:ascii="Bahnschrift" w:hAnsi="Bahnschrift"/>
@@ -4577,25 +4569,6 @@
             <w14:round/>
           </w14:textOutline>
         </w:rPr>
-        <w:t>Medio</w:t>
-      </w:r>
-      <w:r>
-        <w:rPr>
-          <w:rFonts w:ascii="Bahnschrift" w:hAnsi="Bahnschrift"/>
-          <w:bCs/>
-          <w:sz w:val="24"/>
-          <w:szCs w:val="24"/>
-          <w14:shadow w14:blurRad="38100" w14:dist="19050" w14:dir="2700000" w14:sx="100000" w14:sy="100000" w14:kx="0" w14:ky="0" w14:algn="tl">
-            <w14:schemeClr w14:val="dk1">
-              <w14:alpha w14:val="60000"/>
-            </w14:schemeClr>
-          </w14:shadow>
-          <w14:textOutline w14:w="0" w14:cap="flat" w14:cmpd="sng" w14:algn="ctr">
-            <w14:noFill/>
-            <w14:prstDash w14:val="solid"/>
-            <w14:round/>
-          </w14:textOutline>
-        </w:rPr>
         <w:t xml:space="preserve"> de Calificación</w:t>
       </w:r>
     </w:p>
@@ -4622,7 +4595,25 @@
           <w:sz w:val="24"/>
           <w:szCs w:val="24"/>
         </w:rPr>
-        <w:t xml:space="preserve"> ${guia_numeral} </w:t>
+        <w:t xml:space="preserve"> ${</w:t>
+      </w:r>
+      <w:proofErr w:type="spellStart"/>
+      <w:r>
+        <w:rPr>
+          <w:rFonts w:cstheme="minorHAnsi"/>
+          <w:sz w:val="24"/>
+          <w:szCs w:val="24"/>
+        </w:rPr>
+        <w:t>guia_numeral</w:t>
+      </w:r>
+      <w:proofErr w:type="spellEnd"/>
+      <w:r>
+        <w:rPr>
+          <w:rFonts w:cstheme="minorHAnsi"/>
+          <w:sz w:val="24"/>
+          <w:szCs w:val="24"/>
+        </w:rPr>
+        <w:t xml:space="preserve">} </w:t>
       </w:r>
       <w:r>
         <w:rPr>
@@ -4674,7 +4665,6 @@
           <w:rFonts w:asciiTheme="minorHAnsi" w:hAnsiTheme="minorHAnsi" w:cstheme="minorHAnsi"/>
           <w:color w:val="auto"/>
         </w:rPr>
-        <w:lastRenderedPageBreak/>
         <w:t xml:space="preserve">Las respuestas a los ítems del cuestionario para la identificación de los factores de riesgo psicosocial </w:t>
       </w:r>
       <w:r>
@@ -4955,7 +4945,27 @@
           <w:sz w:val="22"/>
           <w:szCs w:val="22"/>
         </w:rPr>
-        <w:t xml:space="preserve">n del dominio (Cdom). Se obtiene sumando el puntaje de cada uno de los </w:t>
+        <w:t>n del dominio (</w:t>
+      </w:r>
+      <w:proofErr w:type="spellStart"/>
+      <w:r>
+        <w:rPr>
+          <w:rFonts w:asciiTheme="minorHAnsi" w:hAnsiTheme="minorHAnsi" w:cstheme="minorHAnsi"/>
+          <w:color w:val="auto"/>
+          <w:sz w:val="22"/>
+          <w:szCs w:val="22"/>
+        </w:rPr>
+        <w:t>Cdom</w:t>
+      </w:r>
+      <w:proofErr w:type="spellEnd"/>
+      <w:r>
+        <w:rPr>
+          <w:rFonts w:asciiTheme="minorHAnsi" w:hAnsiTheme="minorHAnsi" w:cstheme="minorHAnsi"/>
+          <w:color w:val="auto"/>
+          <w:sz w:val="22"/>
+          <w:szCs w:val="22"/>
+        </w:rPr>
+        <w:t xml:space="preserve">). Se obtiene sumando el puntaje de cada uno de los </w:t>
       </w:r>
       <w:r>
         <w:rPr>
@@ -5034,7 +5044,27 @@
           <w:sz w:val="22"/>
           <w:szCs w:val="22"/>
         </w:rPr>
-        <w:t xml:space="preserve">a (Ccat). Se obtiene sumando el puntaje de cada uno de los </w:t>
+        <w:t>a (</w:t>
+      </w:r>
+      <w:proofErr w:type="spellStart"/>
+      <w:r>
+        <w:rPr>
+          <w:rFonts w:asciiTheme="minorHAnsi" w:hAnsiTheme="minorHAnsi" w:cstheme="minorHAnsi"/>
+          <w:color w:val="auto"/>
+          <w:sz w:val="22"/>
+          <w:szCs w:val="22"/>
+        </w:rPr>
+        <w:t>Ccat</w:t>
+      </w:r>
+      <w:proofErr w:type="spellEnd"/>
+      <w:r>
+        <w:rPr>
+          <w:rFonts w:asciiTheme="minorHAnsi" w:hAnsiTheme="minorHAnsi" w:cstheme="minorHAnsi"/>
+          <w:color w:val="auto"/>
+          <w:sz w:val="22"/>
+          <w:szCs w:val="22"/>
+        </w:rPr>
+        <w:t xml:space="preserve">). Se obtiene sumando el puntaje de cada uno de los </w:t>
       </w:r>
       <w:r>
         <w:rPr>
@@ -5113,7 +5143,27 @@
           <w:sz w:val="22"/>
           <w:szCs w:val="22"/>
         </w:rPr>
-        <w:t xml:space="preserve">n final del cuestionario (Cfinal). Se obtiene sumando el puntaje de todos y cada uno de los </w:t>
+        <w:t>n final del cuestionario (</w:t>
+      </w:r>
+      <w:proofErr w:type="spellStart"/>
+      <w:r>
+        <w:rPr>
+          <w:rFonts w:asciiTheme="minorHAnsi" w:hAnsiTheme="minorHAnsi" w:cstheme="minorHAnsi"/>
+          <w:color w:val="auto"/>
+          <w:sz w:val="22"/>
+          <w:szCs w:val="22"/>
+        </w:rPr>
+        <w:t>Cfinal</w:t>
+      </w:r>
+      <w:proofErr w:type="spellEnd"/>
+      <w:r>
+        <w:rPr>
+          <w:rFonts w:asciiTheme="minorHAnsi" w:hAnsiTheme="minorHAnsi" w:cstheme="minorHAnsi"/>
+          <w:color w:val="auto"/>
+          <w:sz w:val="22"/>
+          <w:szCs w:val="22"/>
+        </w:rPr>
+        <w:t xml:space="preserve">). Se obtiene sumando el puntaje de todos y cada uno de los </w:t>
       </w:r>
       <w:r>
         <w:rPr>
@@ -5914,7 +5964,25 @@
           <w:sz w:val="18"/>
           <w:szCs w:val="18"/>
         </w:rPr>
-        <w:t>gico (mobbing), entre otros.</w:t>
+        <w:t>gico (</w:t>
+      </w:r>
+      <w:proofErr w:type="spellStart"/>
+      <w:r>
+        <w:rPr>
+          <w:rFonts w:cstheme="minorHAnsi"/>
+          <w:sz w:val="18"/>
+          <w:szCs w:val="18"/>
+        </w:rPr>
+        <w:t>mobbing</w:t>
+      </w:r>
+      <w:proofErr w:type="spellEnd"/>
+      <w:r>
+        <w:rPr>
+          <w:rFonts w:cstheme="minorHAnsi"/>
+          <w:sz w:val="18"/>
+          <w:szCs w:val="18"/>
+        </w:rPr>
+        <w:t>), entre otros.</w:t>
       </w:r>
     </w:p>
     <w:p>
@@ -6040,7 +6108,27 @@
           <w:sz w:val="24"/>
           <w:szCs w:val="24"/>
         </w:rPr>
-        <w:t>${guia_name}</w:t>
+        <w:t>${</w:t>
+      </w:r>
+      <w:proofErr w:type="spellStart"/>
+      <w:r>
+        <w:rPr>
+          <w:rFonts w:asciiTheme="minorHAnsi" w:hAnsiTheme="minorHAnsi" w:cstheme="minorHAnsi"/>
+          <w:color w:val="404040" w:themeColor="text1" w:themeTint="BF"/>
+          <w:sz w:val="24"/>
+          <w:szCs w:val="24"/>
+        </w:rPr>
+        <w:t>guia_name</w:t>
+      </w:r>
+      <w:proofErr w:type="spellEnd"/>
+      <w:r>
+        <w:rPr>
+          <w:rFonts w:asciiTheme="minorHAnsi" w:hAnsiTheme="minorHAnsi" w:cstheme="minorHAnsi"/>
+          <w:color w:val="404040" w:themeColor="text1" w:themeTint="BF"/>
+          <w:sz w:val="24"/>
+          <w:szCs w:val="24"/>
+        </w:rPr>
+        <w:t>}</w:t>
       </w:r>
       <w:r>
         <w:rPr>
@@ -6142,6 +6230,7 @@
         </w:rPr>
         <w:t>${</w:t>
       </w:r>
+      <w:proofErr w:type="spellStart"/>
       <w:r>
         <w:rPr>
           <w:rFonts w:asciiTheme="minorHAnsi" w:eastAsiaTheme="minorHAnsi" w:hAnsiTheme="minorHAnsi" w:cstheme="minorHAnsi"/>
@@ -6182,7 +6271,29 @@
             <w14:round/>
           </w14:textOutline>
         </w:rPr>
-        <w:t>_colab}</w:t>
+        <w:t>_colab</w:t>
+      </w:r>
+      <w:proofErr w:type="spellEnd"/>
+      <w:r>
+        <w:rPr>
+          <w:rFonts w:asciiTheme="minorHAnsi" w:eastAsiaTheme="minorHAnsi" w:hAnsiTheme="minorHAnsi" w:cstheme="minorHAnsi"/>
+          <w:bCs/>
+          <w:kern w:val="0"/>
+          <w:sz w:val="32"/>
+          <w:szCs w:val="32"/>
+          <w:lang w:val="es-MX"/>
+          <w14:shadow w14:blurRad="0" w14:dist="38100" w14:dir="2700000" w14:sx="100000" w14:sy="100000" w14:kx="0" w14:ky="0" w14:algn="bl">
+            <w14:schemeClr w14:val="accent5"/>
+          </w14:shadow>
+          <w14:textOutline w14:w="6731" w14:cap="flat" w14:cmpd="sng" w14:algn="ctr">
+            <w14:solidFill>
+              <w14:schemeClr w14:val="bg1"/>
+            </w14:solidFill>
+            <w14:prstDash w14:val="solid"/>
+            <w14:round/>
+          </w14:textOutline>
+        </w:rPr>
+        <w:t>}</w:t>
       </w:r>
       <w:r>
         <w:rPr>
@@ -6689,6 +6800,7 @@
               </w:rPr>
               <w:t>${</w:t>
             </w:r>
+            <w:proofErr w:type="spellStart"/>
             <w:r>
               <w:rPr>
                 <w:rFonts w:asciiTheme="minorHAnsi" w:eastAsiaTheme="minorHAnsi" w:hAnsiTheme="minorHAnsi" w:cstheme="minorHAnsi"/>
@@ -6715,7 +6827,22 @@
                 <w:szCs w:val="24"/>
                 <w:lang w:val="es-MX"/>
               </w:rPr>
-              <w:t>_colab}</w:t>
+              <w:t>_colab</w:t>
+            </w:r>
+            <w:proofErr w:type="spellEnd"/>
+            <w:r>
+              <w:rPr>
+                <w:rFonts w:asciiTheme="minorHAnsi" w:eastAsiaTheme="minorHAnsi" w:hAnsiTheme="minorHAnsi" w:cstheme="minorHAnsi"/>
+                <w:b/>
+                <w:i/>
+                <w:iCs/>
+                <w:color w:val="auto"/>
+                <w:kern w:val="0"/>
+                <w:sz w:val="24"/>
+                <w:szCs w:val="24"/>
+                <w:lang w:val="es-MX"/>
+              </w:rPr>
+              <w:t>}</w:t>
             </w:r>
           </w:p>
         </w:tc>
@@ -6756,8 +6883,9 @@
                 <w:szCs w:val="24"/>
                 <w:lang w:val="es-MX"/>
               </w:rPr>
-              <w:t>${count</w:t>
+              <w:t>${</w:t>
             </w:r>
+            <w:proofErr w:type="spellStart"/>
             <w:r>
               <w:rPr>
                 <w:rFonts w:asciiTheme="minorHAnsi" w:eastAsiaTheme="minorHAnsi" w:hAnsiTheme="minorHAnsi" w:cstheme="minorHAnsi"/>
@@ -6770,8 +6898,23 @@
                 <w:szCs w:val="24"/>
                 <w:lang w:val="es-MX"/>
               </w:rPr>
+              <w:t>count</w:t>
+            </w:r>
+            <w:r>
+              <w:rPr>
+                <w:rFonts w:asciiTheme="minorHAnsi" w:eastAsiaTheme="minorHAnsi" w:hAnsiTheme="minorHAnsi" w:cstheme="minorHAnsi"/>
+                <w:bCs/>
+                <w:i/>
+                <w:iCs/>
+                <w:color w:val="auto"/>
+                <w:kern w:val="0"/>
+                <w:sz w:val="24"/>
+                <w:szCs w:val="24"/>
+                <w:lang w:val="es-MX"/>
+              </w:rPr>
               <w:t>_eva</w:t>
             </w:r>
+            <w:proofErr w:type="spellEnd"/>
             <w:r>
               <w:rPr>
                 <w:rFonts w:asciiTheme="minorHAnsi" w:eastAsiaTheme="minorHAnsi" w:hAnsiTheme="minorHAnsi" w:cstheme="minorHAnsi"/>
@@ -6866,8 +7009,9 @@
                 <w:szCs w:val="24"/>
                 <w:lang w:val="es-MX"/>
               </w:rPr>
-              <w:t>${count_</w:t>
+              <w:t>${</w:t>
             </w:r>
+            <w:proofErr w:type="spellStart"/>
             <w:r>
               <w:rPr>
                 <w:rFonts w:asciiTheme="minorHAnsi" w:eastAsiaTheme="minorHAnsi" w:hAnsiTheme="minorHAnsi" w:cstheme="minorHAnsi"/>
@@ -6880,8 +7024,23 @@
                 <w:szCs w:val="24"/>
                 <w:lang w:val="es-MX"/>
               </w:rPr>
+              <w:t>count_</w:t>
+            </w:r>
+            <w:r>
+              <w:rPr>
+                <w:rFonts w:asciiTheme="minorHAnsi" w:eastAsiaTheme="minorHAnsi" w:hAnsiTheme="minorHAnsi" w:cstheme="minorHAnsi"/>
+                <w:bCs/>
+                <w:i/>
+                <w:iCs/>
+                <w:color w:val="auto"/>
+                <w:kern w:val="0"/>
+                <w:sz w:val="24"/>
+                <w:szCs w:val="24"/>
+                <w:lang w:val="es-MX"/>
+              </w:rPr>
               <w:t>eva</w:t>
             </w:r>
+            <w:proofErr w:type="spellEnd"/>
             <w:r>
               <w:rPr>
                 <w:rFonts w:asciiTheme="minorHAnsi" w:eastAsiaTheme="minorHAnsi" w:hAnsiTheme="minorHAnsi" w:cstheme="minorHAnsi"/>
@@ -7268,7 +7427,33 @@
                 <w:szCs w:val="24"/>
                 <w:lang w:val="es-MX"/>
               </w:rPr>
-              <w:t>${cali}</w:t>
+              <w:t>${</w:t>
+            </w:r>
+            <w:proofErr w:type="spellStart"/>
+            <w:r>
+              <w:rPr>
+                <w:rFonts w:asciiTheme="minorHAnsi" w:eastAsiaTheme="minorHAnsi" w:hAnsiTheme="minorHAnsi" w:cstheme="minorHAnsi"/>
+                <w:bCs/>
+                <w:color w:val="auto"/>
+                <w:kern w:val="0"/>
+                <w:sz w:val="24"/>
+                <w:szCs w:val="24"/>
+                <w:lang w:val="es-MX"/>
+              </w:rPr>
+              <w:t>cali</w:t>
+            </w:r>
+            <w:proofErr w:type="spellEnd"/>
+            <w:r>
+              <w:rPr>
+                <w:rFonts w:asciiTheme="minorHAnsi" w:eastAsiaTheme="minorHAnsi" w:hAnsiTheme="minorHAnsi" w:cstheme="minorHAnsi"/>
+                <w:bCs/>
+                <w:color w:val="auto"/>
+                <w:kern w:val="0"/>
+                <w:sz w:val="24"/>
+                <w:szCs w:val="24"/>
+                <w:lang w:val="es-MX"/>
+              </w:rPr>
+              <w:t>}</w:t>
             </w:r>
           </w:p>
         </w:tc>
@@ -7444,7 +7629,35 @@
           <w:szCs w:val="24"/>
           <w:lang w:val="es-MX"/>
         </w:rPr>
-        <w:t>${riesgo} (${cali})</w:t>
+        <w:t>${riesgo} (${</w:t>
+      </w:r>
+      <w:proofErr w:type="spellStart"/>
+      <w:r>
+        <w:rPr>
+          <w:rFonts w:asciiTheme="minorHAnsi" w:eastAsiaTheme="minorHAnsi" w:hAnsiTheme="minorHAnsi" w:cstheme="minorHAnsi"/>
+          <w:i/>
+          <w:iCs/>
+          <w:color w:val="auto"/>
+          <w:kern w:val="0"/>
+          <w:sz w:val="24"/>
+          <w:szCs w:val="24"/>
+          <w:lang w:val="es-MX"/>
+        </w:rPr>
+        <w:t>cali</w:t>
+      </w:r>
+      <w:proofErr w:type="spellEnd"/>
+      <w:r>
+        <w:rPr>
+          <w:rFonts w:asciiTheme="minorHAnsi" w:eastAsiaTheme="minorHAnsi" w:hAnsiTheme="minorHAnsi" w:cstheme="minorHAnsi"/>
+          <w:i/>
+          <w:iCs/>
+          <w:color w:val="auto"/>
+          <w:kern w:val="0"/>
+          <w:sz w:val="24"/>
+          <w:szCs w:val="24"/>
+          <w:lang w:val="es-MX"/>
+        </w:rPr>
+        <w:t>})</w:t>
       </w:r>
     </w:p>
     <w:p>
@@ -7620,7 +7833,31 @@
           <w:sz w:val="24"/>
           <w:szCs w:val="24"/>
         </w:rPr>
-        <w:t>${determinacion}</w:t>
+        <w:t>${</w:t>
+      </w:r>
+      <w:proofErr w:type="spellStart"/>
+      <w:r>
+        <w:rPr>
+          <w:rFonts w:cstheme="minorHAnsi"/>
+          <w:bCs/>
+          <w:i/>
+          <w:iCs/>
+          <w:sz w:val="24"/>
+          <w:szCs w:val="24"/>
+        </w:rPr>
+        <w:t>determinacion</w:t>
+      </w:r>
+      <w:proofErr w:type="spellEnd"/>
+      <w:r>
+        <w:rPr>
+          <w:rFonts w:cstheme="minorHAnsi"/>
+          <w:bCs/>
+          <w:i/>
+          <w:iCs/>
+          <w:sz w:val="24"/>
+          <w:szCs w:val="24"/>
+        </w:rPr>
+        <w:t>}</w:t>
       </w:r>
     </w:p>
     <w:p>
@@ -8141,6 +8378,7 @@
               </w:rPr>
               <w:t>${</w:t>
             </w:r>
+            <w:proofErr w:type="spellStart"/>
             <w:r>
               <w:rPr>
                 <w:rFonts w:asciiTheme="minorHAnsi" w:eastAsiaTheme="minorEastAsia" w:hAnsiTheme="minorHAnsi" w:cstheme="minorBidi"/>
@@ -8153,6 +8391,7 @@
               </w:rPr>
               <w:t>total_vh</w:t>
             </w:r>
+            <w:proofErr w:type="spellEnd"/>
             <w:r>
               <w:rPr>
                 <w:rFonts w:asciiTheme="minorHAnsi" w:eastAsiaTheme="minorEastAsia" w:hAnsiTheme="minorHAnsi" w:cstheme="minorBidi"/>
@@ -8200,6 +8439,7 @@
               </w:rPr>
               <w:t>${</w:t>
             </w:r>
+            <w:proofErr w:type="spellStart"/>
             <w:r>
               <w:rPr>
                 <w:rFonts w:asciiTheme="minorHAnsi" w:eastAsiaTheme="minorEastAsia" w:hAnsiTheme="minorHAnsi" w:cstheme="minorBidi"/>
@@ -8212,6 +8452,7 @@
               </w:rPr>
               <w:t>total_h</w:t>
             </w:r>
+            <w:proofErr w:type="spellEnd"/>
             <w:r>
               <w:rPr>
                 <w:rFonts w:asciiTheme="minorHAnsi" w:eastAsiaTheme="minorEastAsia" w:hAnsiTheme="minorHAnsi" w:cstheme="minorBidi"/>
@@ -8259,6 +8500,7 @@
               </w:rPr>
               <w:t>${</w:t>
             </w:r>
+            <w:proofErr w:type="spellStart"/>
             <w:r>
               <w:rPr>
                 <w:rFonts w:asciiTheme="minorHAnsi" w:eastAsiaTheme="minorEastAsia" w:hAnsiTheme="minorHAnsi" w:cstheme="minorBidi"/>
@@ -8271,6 +8513,7 @@
               </w:rPr>
               <w:t>total_m</w:t>
             </w:r>
+            <w:proofErr w:type="spellEnd"/>
             <w:r>
               <w:rPr>
                 <w:rFonts w:asciiTheme="minorHAnsi" w:eastAsiaTheme="minorEastAsia" w:hAnsiTheme="minorHAnsi" w:cstheme="minorBidi"/>
@@ -8318,6 +8561,7 @@
               </w:rPr>
               <w:t>${</w:t>
             </w:r>
+            <w:proofErr w:type="spellStart"/>
             <w:r>
               <w:rPr>
                 <w:rFonts w:asciiTheme="minorHAnsi" w:eastAsiaTheme="minorEastAsia" w:hAnsiTheme="minorHAnsi" w:cstheme="minorBidi"/>
@@ -8330,6 +8574,7 @@
               </w:rPr>
               <w:t>total_b</w:t>
             </w:r>
+            <w:proofErr w:type="spellEnd"/>
             <w:r>
               <w:rPr>
                 <w:rFonts w:asciiTheme="minorHAnsi" w:eastAsiaTheme="minorEastAsia" w:hAnsiTheme="minorHAnsi" w:cstheme="minorBidi"/>
@@ -8377,6 +8622,7 @@
               </w:rPr>
               <w:t>${</w:t>
             </w:r>
+            <w:proofErr w:type="spellStart"/>
             <w:r>
               <w:rPr>
                 <w:rFonts w:asciiTheme="minorHAnsi" w:eastAsiaTheme="minorEastAsia" w:hAnsiTheme="minorHAnsi" w:cstheme="minorBidi"/>
@@ -8389,6 +8635,7 @@
               </w:rPr>
               <w:t>total_n</w:t>
             </w:r>
+            <w:proofErr w:type="spellEnd"/>
             <w:r>
               <w:rPr>
                 <w:rFonts w:asciiTheme="minorHAnsi" w:eastAsiaTheme="minorEastAsia" w:hAnsiTheme="minorHAnsi" w:cstheme="minorBidi"/>
@@ -8484,6 +8731,7 @@
         </w:rPr>
         <w:t>${</w:t>
       </w:r>
+      <w:proofErr w:type="spellStart"/>
       <w:r>
         <w:rPr>
           <w:rFonts w:asciiTheme="minorHAnsi" w:eastAsiaTheme="minorHAnsi" w:hAnsiTheme="minorHAnsi" w:cstheme="minorHAnsi"/>
@@ -8496,6 +8744,7 @@
         </w:rPr>
         <w:t>chart_gen</w:t>
       </w:r>
+      <w:proofErr w:type="spellEnd"/>
       <w:r>
         <w:rPr>
           <w:rFonts w:asciiTheme="minorHAnsi" w:eastAsiaTheme="minorHAnsi" w:hAnsiTheme="minorHAnsi" w:cstheme="minorHAnsi"/>
@@ -8813,9 +9062,11 @@
                             <w:r>
                               <w:t>${</w:t>
                             </w:r>
+                            <w:proofErr w:type="spellStart"/>
                             <w:r>
                               <w:t>grafica_categorias</w:t>
                             </w:r>
+                            <w:proofErr w:type="spellEnd"/>
                             <w:r>
                               <w:t>}</w:t>
                             </w:r>
@@ -8851,9 +9102,11 @@
                       <w:r>
                         <w:t>${</w:t>
                       </w:r>
+                      <w:proofErr w:type="spellStart"/>
                       <w:r>
                         <w:t>grafica_categorias</w:t>
                       </w:r>
+                      <w:proofErr w:type="spellEnd"/>
                       <w:r>
                         <w:t>}</w:t>
                       </w:r>
@@ -9348,7 +9601,33 @@
                 <w:szCs w:val="22"/>
                 <w:lang w:val="es-MX"/>
               </w:rPr>
-              <w:t>${cat_name}</w:t>
+              <w:t>${</w:t>
+            </w:r>
+            <w:proofErr w:type="spellStart"/>
+            <w:r>
+              <w:rPr>
+                <w:rFonts w:asciiTheme="minorHAnsi" w:eastAsiaTheme="minorHAnsi" w:hAnsiTheme="minorHAnsi" w:cstheme="minorHAnsi"/>
+                <w:b w:val="0"/>
+                <w:color w:val="auto"/>
+                <w:kern w:val="0"/>
+                <w:sz w:val="22"/>
+                <w:szCs w:val="22"/>
+                <w:lang w:val="es-MX"/>
+              </w:rPr>
+              <w:t>cat_name</w:t>
+            </w:r>
+            <w:proofErr w:type="spellEnd"/>
+            <w:r>
+              <w:rPr>
+                <w:rFonts w:asciiTheme="minorHAnsi" w:eastAsiaTheme="minorHAnsi" w:hAnsiTheme="minorHAnsi" w:cstheme="minorHAnsi"/>
+                <w:b w:val="0"/>
+                <w:color w:val="auto"/>
+                <w:kern w:val="0"/>
+                <w:sz w:val="22"/>
+                <w:szCs w:val="22"/>
+                <w:lang w:val="es-MX"/>
+              </w:rPr>
+              <w:t>}</w:t>
             </w:r>
           </w:p>
         </w:tc>
@@ -9382,7 +9661,33 @@
                 <w:szCs w:val="22"/>
                 <w:lang w:val="es-MX"/>
               </w:rPr>
-              <w:t>${cat_cal}</w:t>
+              <w:t>${</w:t>
+            </w:r>
+            <w:proofErr w:type="spellStart"/>
+            <w:r>
+              <w:rPr>
+                <w:rFonts w:asciiTheme="minorHAnsi" w:eastAsiaTheme="minorEastAsia" w:hAnsiTheme="minorHAnsi" w:cstheme="minorBidi"/>
+                <w:b w:val="0"/>
+                <w:color w:val="auto"/>
+                <w:kern w:val="0"/>
+                <w:sz w:val="22"/>
+                <w:szCs w:val="22"/>
+                <w:lang w:val="es-MX"/>
+              </w:rPr>
+              <w:t>cat_cal</w:t>
+            </w:r>
+            <w:proofErr w:type="spellEnd"/>
+            <w:r>
+              <w:rPr>
+                <w:rFonts w:asciiTheme="minorHAnsi" w:eastAsiaTheme="minorEastAsia" w:hAnsiTheme="minorHAnsi" w:cstheme="minorBidi"/>
+                <w:b w:val="0"/>
+                <w:color w:val="auto"/>
+                <w:kern w:val="0"/>
+                <w:sz w:val="22"/>
+                <w:szCs w:val="22"/>
+                <w:lang w:val="es-MX"/>
+              </w:rPr>
+              <w:t>}</w:t>
             </w:r>
           </w:p>
         </w:tc>
@@ -9416,7 +9721,33 @@
                 <w:szCs w:val="22"/>
                 <w:lang w:val="es-MX"/>
               </w:rPr>
-              <w:t>${cat_nivel}</w:t>
+              <w:t>${</w:t>
+            </w:r>
+            <w:proofErr w:type="spellStart"/>
+            <w:r>
+              <w:rPr>
+                <w:rFonts w:asciiTheme="minorHAnsi" w:eastAsiaTheme="minorHAnsi" w:hAnsiTheme="minorHAnsi" w:cstheme="minorHAnsi"/>
+                <w:b w:val="0"/>
+                <w:color w:val="auto"/>
+                <w:kern w:val="0"/>
+                <w:sz w:val="22"/>
+                <w:szCs w:val="22"/>
+                <w:lang w:val="es-MX"/>
+              </w:rPr>
+              <w:t>cat_nivel</w:t>
+            </w:r>
+            <w:proofErr w:type="spellEnd"/>
+            <w:r>
+              <w:rPr>
+                <w:rFonts w:asciiTheme="minorHAnsi" w:eastAsiaTheme="minorHAnsi" w:hAnsiTheme="minorHAnsi" w:cstheme="minorHAnsi"/>
+                <w:b w:val="0"/>
+                <w:color w:val="auto"/>
+                <w:kern w:val="0"/>
+                <w:sz w:val="22"/>
+                <w:szCs w:val="22"/>
+                <w:lang w:val="es-MX"/>
+              </w:rPr>
+              <w:t>}</w:t>
             </w:r>
           </w:p>
         </w:tc>
@@ -9506,7 +9837,31 @@
           <w:szCs w:val="24"/>
           <w:lang w:val="es-MX"/>
         </w:rPr>
-        <w:t>${det_cat_mas_alta}</w:t>
+        <w:t>${</w:t>
+      </w:r>
+      <w:proofErr w:type="spellStart"/>
+      <w:r>
+        <w:rPr>
+          <w:rFonts w:asciiTheme="minorHAnsi" w:eastAsiaTheme="minorHAnsi" w:hAnsiTheme="minorHAnsi" w:cstheme="minorHAnsi"/>
+          <w:bCs/>
+          <w:kern w:val="0"/>
+          <w:sz w:val="24"/>
+          <w:szCs w:val="24"/>
+          <w:lang w:val="es-MX"/>
+        </w:rPr>
+        <w:t>det_cat_mas_alta</w:t>
+      </w:r>
+      <w:proofErr w:type="spellEnd"/>
+      <w:r>
+        <w:rPr>
+          <w:rFonts w:asciiTheme="minorHAnsi" w:eastAsiaTheme="minorHAnsi" w:hAnsiTheme="minorHAnsi" w:cstheme="minorHAnsi"/>
+          <w:bCs/>
+          <w:kern w:val="0"/>
+          <w:sz w:val="24"/>
+          <w:szCs w:val="24"/>
+          <w:lang w:val="es-MX"/>
+        </w:rPr>
+        <w:t>}</w:t>
       </w:r>
       <w:r>
         <w:rPr>
@@ -9556,7 +9911,33 @@
           <w:szCs w:val="24"/>
           <w:lang w:val="es-MX"/>
         </w:rPr>
-        <w:t>${level_cat_mas_alta}</w:t>
+        <w:t>${</w:t>
+      </w:r>
+      <w:proofErr w:type="spellStart"/>
+      <w:r>
+        <w:rPr>
+          <w:rFonts w:asciiTheme="minorHAnsi" w:eastAsiaTheme="minorHAnsi" w:hAnsiTheme="minorHAnsi" w:cstheme="minorHAnsi"/>
+          <w:b w:val="0"/>
+          <w:color w:val="auto"/>
+          <w:kern w:val="0"/>
+          <w:sz w:val="24"/>
+          <w:szCs w:val="24"/>
+          <w:lang w:val="es-MX"/>
+        </w:rPr>
+        <w:t>level_cat_mas_alta</w:t>
+      </w:r>
+      <w:proofErr w:type="spellEnd"/>
+      <w:r>
+        <w:rPr>
+          <w:rFonts w:asciiTheme="minorHAnsi" w:eastAsiaTheme="minorHAnsi" w:hAnsiTheme="minorHAnsi" w:cstheme="minorHAnsi"/>
+          <w:b w:val="0"/>
+          <w:color w:val="auto"/>
+          <w:kern w:val="0"/>
+          <w:sz w:val="24"/>
+          <w:szCs w:val="24"/>
+          <w:lang w:val="es-MX"/>
+        </w:rPr>
+        <w:t>}</w:t>
       </w:r>
       <w:r>
         <w:rPr>
@@ -9737,7 +10118,33 @@
                 <w:szCs w:val="24"/>
                 <w:lang w:val="es-MX"/>
               </w:rPr>
-              <w:t>${colab_name}</w:t>
+              <w:t>${</w:t>
+            </w:r>
+            <w:proofErr w:type="spellStart"/>
+            <w:r>
+              <w:rPr>
+                <w:rFonts w:asciiTheme="minorHAnsi" w:eastAsiaTheme="minorHAnsi" w:hAnsiTheme="minorHAnsi" w:cstheme="minorHAnsi"/>
+                <w:b w:val="0"/>
+                <w:color w:val="auto"/>
+                <w:kern w:val="0"/>
+                <w:sz w:val="24"/>
+                <w:szCs w:val="24"/>
+                <w:lang w:val="es-MX"/>
+              </w:rPr>
+              <w:t>colab_name</w:t>
+            </w:r>
+            <w:proofErr w:type="spellEnd"/>
+            <w:r>
+              <w:rPr>
+                <w:rFonts w:asciiTheme="minorHAnsi" w:eastAsiaTheme="minorHAnsi" w:hAnsiTheme="minorHAnsi" w:cstheme="minorHAnsi"/>
+                <w:b w:val="0"/>
+                <w:color w:val="auto"/>
+                <w:kern w:val="0"/>
+                <w:sz w:val="24"/>
+                <w:szCs w:val="24"/>
+                <w:lang w:val="es-MX"/>
+              </w:rPr>
+              <w:t>}</w:t>
             </w:r>
           </w:p>
         </w:tc>
@@ -9771,7 +10178,33 @@
                 <w:szCs w:val="24"/>
                 <w:lang w:val="es-MX"/>
               </w:rPr>
-              <w:t>${colab_score}</w:t>
+              <w:t>${</w:t>
+            </w:r>
+            <w:proofErr w:type="spellStart"/>
+            <w:r>
+              <w:rPr>
+                <w:rFonts w:asciiTheme="minorHAnsi" w:eastAsiaTheme="minorHAnsi" w:hAnsiTheme="minorHAnsi" w:cstheme="minorHAnsi"/>
+                <w:b w:val="0"/>
+                <w:color w:val="auto"/>
+                <w:kern w:val="0"/>
+                <w:sz w:val="24"/>
+                <w:szCs w:val="24"/>
+                <w:lang w:val="es-MX"/>
+              </w:rPr>
+              <w:t>colab_score</w:t>
+            </w:r>
+            <w:proofErr w:type="spellEnd"/>
+            <w:r>
+              <w:rPr>
+                <w:rFonts w:asciiTheme="minorHAnsi" w:eastAsiaTheme="minorHAnsi" w:hAnsiTheme="minorHAnsi" w:cstheme="minorHAnsi"/>
+                <w:b w:val="0"/>
+                <w:color w:val="auto"/>
+                <w:kern w:val="0"/>
+                <w:sz w:val="24"/>
+                <w:szCs w:val="24"/>
+                <w:lang w:val="es-MX"/>
+              </w:rPr>
+              <w:t>}</w:t>
             </w:r>
           </w:p>
         </w:tc>
@@ -9805,7 +10238,33 @@
                 <w:szCs w:val="24"/>
                 <w:lang w:val="es-MX"/>
               </w:rPr>
-              <w:t>${colab_level}</w:t>
+              <w:t>${</w:t>
+            </w:r>
+            <w:proofErr w:type="spellStart"/>
+            <w:r>
+              <w:rPr>
+                <w:rFonts w:asciiTheme="minorHAnsi" w:eastAsiaTheme="minorHAnsi" w:hAnsiTheme="minorHAnsi" w:cstheme="minorHAnsi"/>
+                <w:b w:val="0"/>
+                <w:color w:val="auto"/>
+                <w:kern w:val="0"/>
+                <w:sz w:val="24"/>
+                <w:szCs w:val="24"/>
+                <w:lang w:val="es-MX"/>
+              </w:rPr>
+              <w:t>colab_level</w:t>
+            </w:r>
+            <w:proofErr w:type="spellEnd"/>
+            <w:r>
+              <w:rPr>
+                <w:rFonts w:asciiTheme="minorHAnsi" w:eastAsiaTheme="minorHAnsi" w:hAnsiTheme="minorHAnsi" w:cstheme="minorHAnsi"/>
+                <w:b w:val="0"/>
+                <w:color w:val="auto"/>
+                <w:kern w:val="0"/>
+                <w:sz w:val="24"/>
+                <w:szCs w:val="24"/>
+                <w:lang w:val="es-MX"/>
+              </w:rPr>
+              <w:t>}</w:t>
             </w:r>
           </w:p>
         </w:tc>
@@ -10242,6 +10701,7 @@
               </w:rPr>
               <w:t>${</w:t>
             </w:r>
+            <w:proofErr w:type="spellStart"/>
             <w:r>
               <w:rPr>
                 <w:rFonts w:asciiTheme="minorHAnsi" w:eastAsiaTheme="minorHAnsi" w:hAnsiTheme="minorHAnsi" w:cstheme="minorHAnsi"/>
@@ -10266,6 +10726,7 @@
               </w:rPr>
               <w:t>_name</w:t>
             </w:r>
+            <w:proofErr w:type="spellEnd"/>
             <w:r>
               <w:rPr>
                 <w:rFonts w:asciiTheme="minorHAnsi" w:eastAsiaTheme="minorHAnsi" w:hAnsiTheme="minorHAnsi" w:cstheme="minorHAnsi"/>
@@ -10314,6 +10775,7 @@
               </w:rPr>
               <w:t>${</w:t>
             </w:r>
+            <w:proofErr w:type="spellStart"/>
             <w:r>
               <w:rPr>
                 <w:rFonts w:asciiTheme="minorHAnsi" w:hAnsiTheme="minorHAnsi" w:cstheme="minorHAnsi"/>
@@ -10325,6 +10787,7 @@
               </w:rPr>
               <w:t>cat_very_high</w:t>
             </w:r>
+            <w:proofErr w:type="spellEnd"/>
             <w:r>
               <w:rPr>
                 <w:rFonts w:asciiTheme="minorHAnsi" w:eastAsiaTheme="minorHAnsi" w:hAnsiTheme="minorHAnsi" w:cstheme="minorHAnsi"/>
@@ -10378,6 +10841,7 @@
               </w:rPr>
               <w:t>${</w:t>
             </w:r>
+            <w:proofErr w:type="spellStart"/>
             <w:r>
               <w:rPr>
                 <w:rFonts w:asciiTheme="minorHAnsi" w:eastAsiaTheme="minorHAnsi" w:hAnsiTheme="minorHAnsi" w:cstheme="minorHAnsi"/>
@@ -10392,6 +10856,7 @@
               </w:rPr>
               <w:t>cat_high</w:t>
             </w:r>
+            <w:proofErr w:type="spellEnd"/>
             <w:r>
               <w:rPr>
                 <w:rFonts w:asciiTheme="minorHAnsi" w:eastAsiaTheme="minorHAnsi" w:hAnsiTheme="minorHAnsi" w:cstheme="minorHAnsi"/>
@@ -10445,6 +10910,7 @@
               </w:rPr>
               <w:t>${</w:t>
             </w:r>
+            <w:proofErr w:type="spellStart"/>
             <w:r>
               <w:rPr>
                 <w:rFonts w:asciiTheme="minorHAnsi" w:eastAsiaTheme="minorHAnsi" w:hAnsiTheme="minorHAnsi" w:cstheme="minorHAnsi"/>
@@ -10473,6 +10939,7 @@
               </w:rPr>
               <w:t>at_medium</w:t>
             </w:r>
+            <w:proofErr w:type="spellEnd"/>
             <w:r>
               <w:rPr>
                 <w:rFonts w:asciiTheme="minorHAnsi" w:eastAsiaTheme="minorHAnsi" w:hAnsiTheme="minorHAnsi" w:cstheme="minorHAnsi"/>
@@ -10526,6 +10993,7 @@
               </w:rPr>
               <w:t>${</w:t>
             </w:r>
+            <w:proofErr w:type="spellStart"/>
             <w:r>
               <w:rPr>
                 <w:rFonts w:asciiTheme="minorHAnsi" w:eastAsiaTheme="minorHAnsi" w:hAnsiTheme="minorHAnsi" w:cstheme="minorHAnsi"/>
@@ -10554,6 +11022,7 @@
               </w:rPr>
               <w:t>at_low</w:t>
             </w:r>
+            <w:proofErr w:type="spellEnd"/>
             <w:r>
               <w:rPr>
                 <w:rFonts w:asciiTheme="minorHAnsi" w:eastAsiaTheme="minorHAnsi" w:hAnsiTheme="minorHAnsi" w:cstheme="minorHAnsi"/>
@@ -10604,6 +11073,7 @@
               </w:rPr>
               <w:t>${</w:t>
             </w:r>
+            <w:proofErr w:type="spellStart"/>
             <w:r>
               <w:rPr>
                 <w:rFonts w:asciiTheme="minorHAnsi" w:hAnsiTheme="minorHAnsi" w:cstheme="minorHAnsi"/>
@@ -10615,6 +11085,7 @@
               </w:rPr>
               <w:t>cat_null</w:t>
             </w:r>
+            <w:proofErr w:type="spellEnd"/>
             <w:r>
               <w:rPr>
                 <w:rFonts w:asciiTheme="minorHAnsi" w:eastAsiaTheme="minorHAnsi" w:hAnsiTheme="minorHAnsi" w:cstheme="minorHAnsi"/>
@@ -10847,9 +11318,11 @@
                             <w:r>
                               <w:t>${</w:t>
                             </w:r>
+                            <w:proofErr w:type="spellStart"/>
                             <w:r>
                               <w:t>grafica_dominios</w:t>
                             </w:r>
+                            <w:proofErr w:type="spellEnd"/>
                             <w:r>
                               <w:t>}</w:t>
                             </w:r>
@@ -10881,9 +11354,11 @@
                       <w:r>
                         <w:t>${</w:t>
                       </w:r>
+                      <w:proofErr w:type="spellStart"/>
                       <w:r>
                         <w:t>grafica_dominios</w:t>
                       </w:r>
+                      <w:proofErr w:type="spellEnd"/>
                       <w:r>
                         <w:t>}</w:t>
                       </w:r>
@@ -11410,7 +11885,33 @@
                 <w:szCs w:val="22"/>
                 <w:lang w:val="es-MX"/>
               </w:rPr>
-              <w:t>${dom_name}</w:t>
+              <w:t>${</w:t>
+            </w:r>
+            <w:proofErr w:type="spellStart"/>
+            <w:r>
+              <w:rPr>
+                <w:rFonts w:asciiTheme="minorHAnsi" w:eastAsiaTheme="minorHAnsi" w:hAnsiTheme="minorHAnsi" w:cstheme="minorHAnsi"/>
+                <w:b w:val="0"/>
+                <w:color w:val="auto"/>
+                <w:kern w:val="0"/>
+                <w:sz w:val="22"/>
+                <w:szCs w:val="22"/>
+                <w:lang w:val="es-MX"/>
+              </w:rPr>
+              <w:t>dom_name</w:t>
+            </w:r>
+            <w:proofErr w:type="spellEnd"/>
+            <w:r>
+              <w:rPr>
+                <w:rFonts w:asciiTheme="minorHAnsi" w:eastAsiaTheme="minorHAnsi" w:hAnsiTheme="minorHAnsi" w:cstheme="minorHAnsi"/>
+                <w:b w:val="0"/>
+                <w:color w:val="auto"/>
+                <w:kern w:val="0"/>
+                <w:sz w:val="22"/>
+                <w:szCs w:val="22"/>
+                <w:lang w:val="es-MX"/>
+              </w:rPr>
+              <w:t>}</w:t>
             </w:r>
           </w:p>
         </w:tc>
@@ -11444,7 +11945,33 @@
                 <w:szCs w:val="22"/>
                 <w:lang w:val="es-MX"/>
               </w:rPr>
-              <w:t>${dom_cal}</w:t>
+              <w:t>${</w:t>
+            </w:r>
+            <w:proofErr w:type="spellStart"/>
+            <w:r>
+              <w:rPr>
+                <w:rFonts w:asciiTheme="minorHAnsi" w:eastAsiaTheme="minorEastAsia" w:hAnsiTheme="minorHAnsi" w:cstheme="minorBidi"/>
+                <w:b w:val="0"/>
+                <w:color w:val="auto"/>
+                <w:kern w:val="0"/>
+                <w:sz w:val="22"/>
+                <w:szCs w:val="22"/>
+                <w:lang w:val="es-MX"/>
+              </w:rPr>
+              <w:t>dom_cal</w:t>
+            </w:r>
+            <w:proofErr w:type="spellEnd"/>
+            <w:r>
+              <w:rPr>
+                <w:rFonts w:asciiTheme="minorHAnsi" w:eastAsiaTheme="minorEastAsia" w:hAnsiTheme="minorHAnsi" w:cstheme="minorBidi"/>
+                <w:b w:val="0"/>
+                <w:color w:val="auto"/>
+                <w:kern w:val="0"/>
+                <w:sz w:val="22"/>
+                <w:szCs w:val="22"/>
+                <w:lang w:val="es-MX"/>
+              </w:rPr>
+              <w:t>}</w:t>
             </w:r>
           </w:p>
         </w:tc>
@@ -11478,7 +12005,33 @@
                 <w:szCs w:val="22"/>
                 <w:lang w:val="es-MX"/>
               </w:rPr>
-              <w:t>${dom_nivel}</w:t>
+              <w:t>${</w:t>
+            </w:r>
+            <w:proofErr w:type="spellStart"/>
+            <w:r>
+              <w:rPr>
+                <w:rFonts w:asciiTheme="minorHAnsi" w:eastAsiaTheme="minorEastAsia" w:hAnsiTheme="minorHAnsi" w:cstheme="minorBidi"/>
+                <w:b w:val="0"/>
+                <w:color w:val="auto"/>
+                <w:kern w:val="0"/>
+                <w:sz w:val="22"/>
+                <w:szCs w:val="22"/>
+                <w:lang w:val="es-MX"/>
+              </w:rPr>
+              <w:t>dom_nivel</w:t>
+            </w:r>
+            <w:proofErr w:type="spellEnd"/>
+            <w:r>
+              <w:rPr>
+                <w:rFonts w:asciiTheme="minorHAnsi" w:eastAsiaTheme="minorEastAsia" w:hAnsiTheme="minorHAnsi" w:cstheme="minorBidi"/>
+                <w:b w:val="0"/>
+                <w:color w:val="auto"/>
+                <w:kern w:val="0"/>
+                <w:sz w:val="22"/>
+                <w:szCs w:val="22"/>
+                <w:lang w:val="es-MX"/>
+              </w:rPr>
+              <w:t>}</w:t>
             </w:r>
           </w:p>
         </w:tc>
@@ -11902,7 +12455,20 @@
                 <w:szCs w:val="16"/>
                 <w:lang w:val="es-MX"/>
               </w:rPr>
-              <w:t>${dom</w:t>
+              <w:t>${</w:t>
+            </w:r>
+            <w:proofErr w:type="spellStart"/>
+            <w:r>
+              <w:rPr>
+                <w:rFonts w:asciiTheme="minorHAnsi" w:eastAsiaTheme="minorHAnsi" w:hAnsiTheme="minorHAnsi" w:cstheme="minorHAnsi"/>
+                <w:b w:val="0"/>
+                <w:color w:val="auto"/>
+                <w:kern w:val="0"/>
+                <w:sz w:val="16"/>
+                <w:szCs w:val="16"/>
+                <w:lang w:val="es-MX"/>
+              </w:rPr>
+              <w:t>dom</w:t>
             </w:r>
             <w:r>
               <w:rPr>
@@ -11926,7 +12492,20 @@
                 <w:szCs w:val="16"/>
                 <w:lang w:val="es-MX"/>
               </w:rPr>
-              <w:t>_name}</w:t>
+              <w:t>_name</w:t>
+            </w:r>
+            <w:proofErr w:type="spellEnd"/>
+            <w:r>
+              <w:rPr>
+                <w:rFonts w:asciiTheme="minorHAnsi" w:eastAsiaTheme="minorHAnsi" w:hAnsiTheme="minorHAnsi" w:cstheme="minorHAnsi"/>
+                <w:b w:val="0"/>
+                <w:color w:val="auto"/>
+                <w:kern w:val="0"/>
+                <w:sz w:val="16"/>
+                <w:szCs w:val="16"/>
+                <w:lang w:val="es-MX"/>
+              </w:rPr>
+              <w:t>}</w:t>
             </w:r>
           </w:p>
         </w:tc>
@@ -11978,8 +12557,24 @@
                 <w:szCs w:val="16"/>
                 <w:lang w:val="es-MX"/>
               </w:rPr>
-              <w:t>{dom_very_high</w:t>
+              <w:t>{</w:t>
             </w:r>
+            <w:proofErr w:type="spellStart"/>
+            <w:r>
+              <w:rPr>
+                <w:rFonts w:asciiTheme="minorHAnsi" w:eastAsiaTheme="minorHAnsi" w:hAnsiTheme="minorHAnsi" w:cstheme="minorHAnsi"/>
+                <w:bCs/>
+                <w:i/>
+                <w:iCs/>
+                <w:color w:val="auto"/>
+                <w:kern w:val="0"/>
+                <w:sz w:val="16"/>
+                <w:szCs w:val="16"/>
+                <w:lang w:val="es-MX"/>
+              </w:rPr>
+              <w:t>dom_very_high</w:t>
+            </w:r>
+            <w:proofErr w:type="spellEnd"/>
             <w:r>
               <w:rPr>
                 <w:rFonts w:asciiTheme="minorHAnsi" w:eastAsiaTheme="minorHAnsi" w:hAnsiTheme="minorHAnsi" w:cstheme="minorHAnsi"/>
@@ -12032,6 +12627,7 @@
               </w:rPr>
               <w:t>${</w:t>
             </w:r>
+            <w:proofErr w:type="spellStart"/>
             <w:r>
               <w:rPr>
                 <w:rFonts w:asciiTheme="minorHAnsi" w:eastAsiaTheme="minorHAnsi" w:hAnsiTheme="minorHAnsi" w:cstheme="minorHAnsi"/>
@@ -12046,6 +12642,7 @@
               </w:rPr>
               <w:t>dom_high</w:t>
             </w:r>
+            <w:proofErr w:type="spellEnd"/>
             <w:r>
               <w:rPr>
                 <w:rFonts w:asciiTheme="minorHAnsi" w:eastAsiaTheme="minorHAnsi" w:hAnsiTheme="minorHAnsi" w:cstheme="minorHAnsi"/>
@@ -12098,6 +12695,7 @@
               </w:rPr>
               <w:t>${</w:t>
             </w:r>
+            <w:proofErr w:type="spellStart"/>
             <w:r>
               <w:rPr>
                 <w:rFonts w:asciiTheme="minorHAnsi" w:eastAsiaTheme="minorHAnsi" w:hAnsiTheme="minorHAnsi" w:cstheme="minorHAnsi"/>
@@ -12168,6 +12766,7 @@
               </w:rPr>
               <w:t>edium</w:t>
             </w:r>
+            <w:proofErr w:type="spellEnd"/>
             <w:r>
               <w:rPr>
                 <w:rFonts w:asciiTheme="minorHAnsi" w:eastAsiaTheme="minorHAnsi" w:hAnsiTheme="minorHAnsi" w:cstheme="minorHAnsi"/>
@@ -12218,8 +12817,9 @@
                 <w:szCs w:val="16"/>
                 <w:lang w:val="es-MX"/>
               </w:rPr>
-              <w:t>${dom</w:t>
+              <w:t>${</w:t>
             </w:r>
+            <w:proofErr w:type="spellStart"/>
             <w:r>
               <w:rPr>
                 <w:rFonts w:asciiTheme="minorHAnsi" w:eastAsiaTheme="minorHAnsi" w:hAnsiTheme="minorHAnsi" w:cstheme="minorHAnsi"/>
@@ -12232,6 +12832,20 @@
                 <w:szCs w:val="16"/>
                 <w:lang w:val="es-MX"/>
               </w:rPr>
+              <w:t>dom</w:t>
+            </w:r>
+            <w:r>
+              <w:rPr>
+                <w:rFonts w:asciiTheme="minorHAnsi" w:eastAsiaTheme="minorHAnsi" w:hAnsiTheme="minorHAnsi" w:cstheme="minorHAnsi"/>
+                <w:bCs/>
+                <w:i/>
+                <w:iCs/>
+                <w:color w:val="auto"/>
+                <w:kern w:val="0"/>
+                <w:sz w:val="16"/>
+                <w:szCs w:val="16"/>
+                <w:lang w:val="es-MX"/>
+              </w:rPr>
               <w:t>_</w:t>
             </w:r>
             <w:r>
@@ -12262,6 +12876,7 @@
               </w:rPr>
               <w:t>ow</w:t>
             </w:r>
+            <w:proofErr w:type="spellEnd"/>
             <w:r>
               <w:rPr>
                 <w:rFonts w:asciiTheme="minorHAnsi" w:eastAsiaTheme="minorHAnsi" w:hAnsiTheme="minorHAnsi" w:cstheme="minorHAnsi"/>
@@ -12314,6 +12929,7 @@
               </w:rPr>
               <w:t>${</w:t>
             </w:r>
+            <w:proofErr w:type="spellStart"/>
             <w:r>
               <w:rPr>
                 <w:rFonts w:asciiTheme="minorHAnsi" w:eastAsiaTheme="minorHAnsi" w:hAnsiTheme="minorHAnsi" w:cstheme="minorHAnsi"/>
@@ -12328,6 +12944,7 @@
               </w:rPr>
               <w:t>dom_null</w:t>
             </w:r>
+            <w:proofErr w:type="spellEnd"/>
             <w:r>
               <w:rPr>
                 <w:rFonts w:asciiTheme="minorHAnsi" w:eastAsiaTheme="minorHAnsi" w:hAnsiTheme="minorHAnsi" w:cstheme="minorHAnsi"/>
@@ -12459,416 +13076,334 @@
         </w:rPr>
       </w:pPr>
     </w:p>
-    <w:p>
-      <w:pPr>
-        <w:pStyle w:val="Ttulo"/>
-        <w:framePr w:hSpace="0" w:wrap="auto" w:vAnchor="margin" w:hAnchor="text" w:yAlign="inline"/>
-        <w:numPr>
-          <w:ilvl w:val="1"/>
-          <w:numId w:val="2"/>
-        </w:numPr>
-        <w:ind w:left="567"/>
-        <w:rPr>
-          <w:rFonts w:asciiTheme="minorHAnsi" w:eastAsiaTheme="minorHAnsi" w:hAnsiTheme="minorHAnsi" w:cstheme="minorHAnsi"/>
-          <w:b w:val="0"/>
-          <w:color w:val="auto"/>
-          <w:kern w:val="0"/>
-          <w:sz w:val="24"/>
-          <w:szCs w:val="24"/>
-          <w:lang w:val="es-MX"/>
-        </w:rPr>
-      </w:pPr>
-      <w:r>
-        <w:rPr>
-          <w:rFonts w:asciiTheme="minorHAnsi" w:eastAsiaTheme="minorHAnsi" w:hAnsiTheme="minorHAnsi" w:cstheme="minorHAnsi"/>
-          <w:b w:val="0"/>
-          <w:color w:val="auto"/>
-          <w:kern w:val="0"/>
-          <w:sz w:val="24"/>
-          <w:szCs w:val="24"/>
-          <w:lang w:val="es-MX"/>
-        </w:rPr>
-        <w:t>${domain1_name}</w:t>
-      </w:r>
-      <w:r>
-        <w:rPr>
-          <w:rFonts w:asciiTheme="minorHAnsi" w:eastAsiaTheme="minorHAnsi" w:hAnsiTheme="minorHAnsi" w:cstheme="minorHAnsi"/>
-          <w:b w:val="0"/>
-          <w:color w:val="auto"/>
-          <w:kern w:val="0"/>
-          <w:sz w:val="24"/>
-          <w:szCs w:val="24"/>
-          <w:lang w:val="es-MX"/>
-        </w:rPr>
-        <w:t xml:space="preserve"> </w:t>
-      </w:r>
-      <w:r>
-        <w:rPr>
-          <w:rFonts w:asciiTheme="minorHAnsi" w:eastAsiaTheme="minorHAnsi" w:hAnsiTheme="minorHAnsi" w:cstheme="minorHAnsi"/>
-          <w:b w:val="0"/>
-          <w:color w:val="auto"/>
-          <w:kern w:val="0"/>
-          <w:sz w:val="24"/>
-          <w:szCs w:val="24"/>
-          <w:lang w:val="es-MX"/>
-        </w:rPr>
-        <w:tab/>
-      </w:r>
-      <w:r>
-        <w:rPr>
-          <w:rFonts w:asciiTheme="minorHAnsi" w:eastAsiaTheme="minorHAnsi" w:hAnsiTheme="minorHAnsi" w:cstheme="minorHAnsi"/>
-          <w:b w:val="0"/>
-          <w:color w:val="auto"/>
-          <w:kern w:val="0"/>
-          <w:sz w:val="24"/>
-          <w:szCs w:val="24"/>
-          <w:lang w:val="es-MX"/>
-        </w:rPr>
-        <w:tab/>
-      </w:r>
-      <w:r>
-        <w:rPr>
-          <w:rFonts w:asciiTheme="minorHAnsi" w:eastAsiaTheme="minorHAnsi" w:hAnsiTheme="minorHAnsi" w:cstheme="minorHAnsi"/>
-          <w:b w:val="0"/>
-          <w:color w:val="auto"/>
-          <w:kern w:val="0"/>
-          <w:sz w:val="24"/>
-          <w:szCs w:val="24"/>
-          <w:lang w:val="es-MX"/>
-        </w:rPr>
-        <w:tab/>
-      </w:r>
-      <w:r>
-        <w:rPr>
-          <w:rFonts w:asciiTheme="minorHAnsi" w:eastAsiaTheme="minorHAnsi" w:hAnsiTheme="minorHAnsi" w:cstheme="minorHAnsi"/>
-          <w:b w:val="0"/>
-          <w:color w:val="auto"/>
-          <w:kern w:val="0"/>
-          <w:sz w:val="24"/>
-          <w:szCs w:val="24"/>
-          <w:lang w:val="es-MX"/>
-        </w:rPr>
-        <w:tab/>
-      </w:r>
-      <w:r>
-        <w:rPr>
-          <w:rFonts w:asciiTheme="minorHAnsi" w:eastAsiaTheme="minorHAnsi" w:hAnsiTheme="minorHAnsi" w:cstheme="minorHAnsi"/>
-          <w:b w:val="0"/>
-          <w:color w:val="auto"/>
-          <w:kern w:val="0"/>
-          <w:sz w:val="24"/>
-          <w:szCs w:val="24"/>
-          <w:lang w:val="es-MX"/>
-        </w:rPr>
-        <w:t>${domain1_level}</w:t>
-      </w:r>
-    </w:p>
-    <w:p>
-      <w:pPr>
-        <w:pStyle w:val="Ttulo"/>
-        <w:framePr w:hSpace="0" w:wrap="auto" w:vAnchor="margin" w:hAnchor="text" w:yAlign="inline"/>
-        <w:ind w:left="567"/>
-        <w:jc w:val="both"/>
-        <w:rPr>
-          <w:rFonts w:asciiTheme="minorHAnsi" w:eastAsiaTheme="minorHAnsi" w:hAnsiTheme="minorHAnsi" w:cstheme="minorHAnsi"/>
-          <w:b w:val="0"/>
-          <w:i/>
-          <w:iCs/>
-          <w:color w:val="auto"/>
-          <w:kern w:val="0"/>
-          <w:sz w:val="24"/>
-          <w:szCs w:val="24"/>
-          <w:lang w:val="es-MX"/>
-        </w:rPr>
-      </w:pPr>
-      <w:r>
-        <w:rPr>
-          <w:rFonts w:asciiTheme="minorHAnsi" w:eastAsiaTheme="minorHAnsi" w:hAnsiTheme="minorHAnsi" w:cstheme="minorHAnsi"/>
-          <w:b w:val="0"/>
-          <w:i/>
-          <w:iCs/>
-          <w:color w:val="auto"/>
-          <w:kern w:val="0"/>
-          <w:sz w:val="24"/>
-          <w:szCs w:val="24"/>
-          <w:lang w:val="es-MX"/>
-        </w:rPr>
-        <w:t>${domain1_description}</w:t>
-      </w:r>
-      <w:r>
-        <w:rPr>
-          <w:rFonts w:asciiTheme="minorHAnsi" w:eastAsiaTheme="minorHAnsi" w:hAnsiTheme="minorHAnsi" w:cstheme="minorHAnsi"/>
-          <w:b w:val="0"/>
-          <w:i/>
-          <w:iCs/>
-          <w:color w:val="auto"/>
-          <w:kern w:val="0"/>
-          <w:sz w:val="24"/>
-          <w:szCs w:val="24"/>
-          <w:lang w:val="es-MX"/>
-        </w:rPr>
-        <w:t>;</w:t>
-      </w:r>
-    </w:p>
-    <w:p>
-      <w:pPr>
-        <w:pStyle w:val="Ttulo"/>
-        <w:framePr w:hSpace="0" w:wrap="auto" w:vAnchor="margin" w:hAnchor="text" w:yAlign="inline"/>
-        <w:ind w:left="567"/>
-        <w:rPr>
-          <w:rFonts w:asciiTheme="minorHAnsi" w:eastAsiaTheme="minorHAnsi" w:hAnsiTheme="minorHAnsi" w:cstheme="minorHAnsi"/>
-          <w:b w:val="0"/>
-          <w:color w:val="auto"/>
-          <w:kern w:val="0"/>
-          <w:sz w:val="24"/>
-          <w:szCs w:val="24"/>
-          <w:lang w:val="es-MX"/>
-        </w:rPr>
-      </w:pPr>
-    </w:p>
-    <w:p>
-      <w:pPr>
-        <w:pStyle w:val="Ttulo"/>
-        <w:framePr w:hSpace="0" w:wrap="auto" w:vAnchor="margin" w:hAnchor="text" w:yAlign="inline"/>
-        <w:numPr>
-          <w:ilvl w:val="1"/>
-          <w:numId w:val="2"/>
-        </w:numPr>
-        <w:ind w:left="567"/>
-        <w:rPr>
-          <w:rFonts w:asciiTheme="minorHAnsi" w:eastAsiaTheme="minorHAnsi" w:hAnsiTheme="minorHAnsi" w:cstheme="minorHAnsi"/>
-          <w:b w:val="0"/>
-          <w:color w:val="auto"/>
-          <w:kern w:val="0"/>
-          <w:sz w:val="24"/>
-          <w:szCs w:val="24"/>
-          <w:lang w:val="es-MX"/>
-        </w:rPr>
-      </w:pPr>
-      <w:r>
-        <w:rPr>
-          <w:rFonts w:asciiTheme="minorHAnsi" w:eastAsiaTheme="minorHAnsi" w:hAnsiTheme="minorHAnsi" w:cstheme="minorHAnsi"/>
-          <w:b w:val="0"/>
-          <w:color w:val="auto"/>
-          <w:kern w:val="0"/>
-          <w:sz w:val="24"/>
-          <w:szCs w:val="24"/>
-          <w:lang w:val="es-MX"/>
-        </w:rPr>
-        <w:t xml:space="preserve">${domain2_name} </w:t>
-      </w:r>
-      <w:r>
-        <w:rPr>
-          <w:rFonts w:asciiTheme="minorHAnsi" w:eastAsiaTheme="minorHAnsi" w:hAnsiTheme="minorHAnsi" w:cstheme="minorHAnsi"/>
-          <w:b w:val="0"/>
-          <w:color w:val="auto"/>
-          <w:kern w:val="0"/>
-          <w:sz w:val="24"/>
-          <w:szCs w:val="24"/>
-          <w:lang w:val="es-MX"/>
-        </w:rPr>
-        <w:tab/>
-      </w:r>
-      <w:r>
-        <w:rPr>
-          <w:rFonts w:asciiTheme="minorHAnsi" w:eastAsiaTheme="minorHAnsi" w:hAnsiTheme="minorHAnsi" w:cstheme="minorHAnsi"/>
-          <w:b w:val="0"/>
-          <w:color w:val="auto"/>
-          <w:kern w:val="0"/>
-          <w:sz w:val="24"/>
-          <w:szCs w:val="24"/>
-          <w:lang w:val="es-MX"/>
-        </w:rPr>
-        <w:tab/>
-      </w:r>
-      <w:r>
-        <w:rPr>
-          <w:rFonts w:asciiTheme="minorHAnsi" w:eastAsiaTheme="minorHAnsi" w:hAnsiTheme="minorHAnsi" w:cstheme="minorHAnsi"/>
-          <w:b w:val="0"/>
-          <w:color w:val="auto"/>
-          <w:kern w:val="0"/>
-          <w:sz w:val="24"/>
-          <w:szCs w:val="24"/>
-          <w:lang w:val="es-MX"/>
-        </w:rPr>
-        <w:tab/>
-      </w:r>
-      <w:r>
-        <w:rPr>
-          <w:rFonts w:asciiTheme="minorHAnsi" w:eastAsiaTheme="minorHAnsi" w:hAnsiTheme="minorHAnsi" w:cstheme="minorHAnsi"/>
-          <w:b w:val="0"/>
-          <w:color w:val="auto"/>
-          <w:kern w:val="0"/>
-          <w:sz w:val="24"/>
-          <w:szCs w:val="24"/>
-          <w:lang w:val="es-MX"/>
-        </w:rPr>
-        <w:tab/>
-        <w:t>${domain2_level}</w:t>
-      </w:r>
-    </w:p>
-    <w:p>
-      <w:pPr>
-        <w:pStyle w:val="Ttulo"/>
-        <w:framePr w:hSpace="0" w:wrap="auto" w:vAnchor="margin" w:hAnchor="text" w:yAlign="inline"/>
-        <w:ind w:left="567"/>
-        <w:jc w:val="both"/>
-        <w:rPr>
-          <w:rFonts w:asciiTheme="minorHAnsi" w:eastAsiaTheme="minorHAnsi" w:hAnsiTheme="minorHAnsi" w:cstheme="minorHAnsi"/>
-          <w:b w:val="0"/>
-          <w:i/>
-          <w:iCs/>
-          <w:color w:val="auto"/>
-          <w:kern w:val="0"/>
-          <w:sz w:val="24"/>
-          <w:szCs w:val="24"/>
-          <w:lang w:val="es-MX"/>
-        </w:rPr>
-      </w:pPr>
-      <w:r>
-        <w:rPr>
-          <w:rFonts w:asciiTheme="minorHAnsi" w:eastAsiaTheme="minorHAnsi" w:hAnsiTheme="minorHAnsi" w:cstheme="minorHAnsi"/>
-          <w:b w:val="0"/>
-          <w:i/>
-          <w:iCs/>
-          <w:color w:val="auto"/>
-          <w:kern w:val="0"/>
-          <w:sz w:val="24"/>
-          <w:szCs w:val="24"/>
-          <w:lang w:val="es-MX"/>
-        </w:rPr>
-        <w:t>${domain2_description};</w:t>
-      </w:r>
-    </w:p>
-    <w:p>
-      <w:pPr>
-        <w:pStyle w:val="Ttulo"/>
-        <w:framePr w:hSpace="0" w:wrap="auto" w:vAnchor="margin" w:hAnchor="text" w:yAlign="inline"/>
-        <w:ind w:left="567"/>
-        <w:rPr>
-          <w:rFonts w:asciiTheme="minorHAnsi" w:eastAsiaTheme="minorHAnsi" w:hAnsiTheme="minorHAnsi" w:cstheme="minorHAnsi"/>
-          <w:b w:val="0"/>
-          <w:color w:val="auto"/>
-          <w:kern w:val="0"/>
-          <w:sz w:val="24"/>
-          <w:szCs w:val="24"/>
-          <w:lang w:val="es-MX"/>
-        </w:rPr>
-      </w:pPr>
-    </w:p>
-    <w:p>
-      <w:pPr>
-        <w:pStyle w:val="Ttulo"/>
-        <w:framePr w:hSpace="0" w:wrap="auto" w:vAnchor="margin" w:hAnchor="text" w:yAlign="inline"/>
-        <w:numPr>
-          <w:ilvl w:val="1"/>
-          <w:numId w:val="2"/>
-        </w:numPr>
-        <w:ind w:left="567"/>
-        <w:rPr>
-          <w:rFonts w:asciiTheme="minorHAnsi" w:eastAsiaTheme="minorHAnsi" w:hAnsiTheme="minorHAnsi" w:cstheme="minorHAnsi"/>
-          <w:b w:val="0"/>
-          <w:color w:val="auto"/>
-          <w:kern w:val="0"/>
-          <w:sz w:val="24"/>
-          <w:szCs w:val="24"/>
-          <w:lang w:val="es-MX"/>
-        </w:rPr>
-      </w:pPr>
-      <w:r>
-        <w:rPr>
-          <w:rFonts w:asciiTheme="minorHAnsi" w:eastAsiaTheme="minorHAnsi" w:hAnsiTheme="minorHAnsi" w:cstheme="minorHAnsi"/>
-          <w:b w:val="0"/>
-          <w:color w:val="auto"/>
-          <w:kern w:val="0"/>
-          <w:sz w:val="24"/>
-          <w:szCs w:val="24"/>
-          <w:lang w:val="es-MX"/>
-        </w:rPr>
-        <w:t xml:space="preserve">${domain3_name} </w:t>
-      </w:r>
-      <w:r>
-        <w:rPr>
-          <w:rFonts w:asciiTheme="minorHAnsi" w:eastAsiaTheme="minorHAnsi" w:hAnsiTheme="minorHAnsi" w:cstheme="minorHAnsi"/>
-          <w:b w:val="0"/>
-          <w:color w:val="auto"/>
-          <w:kern w:val="0"/>
-          <w:sz w:val="24"/>
-          <w:szCs w:val="24"/>
-          <w:lang w:val="es-MX"/>
-        </w:rPr>
-        <w:tab/>
-      </w:r>
-      <w:r>
-        <w:rPr>
-          <w:rFonts w:asciiTheme="minorHAnsi" w:eastAsiaTheme="minorHAnsi" w:hAnsiTheme="minorHAnsi" w:cstheme="minorHAnsi"/>
-          <w:b w:val="0"/>
-          <w:color w:val="auto"/>
-          <w:kern w:val="0"/>
-          <w:sz w:val="24"/>
-          <w:szCs w:val="24"/>
-          <w:lang w:val="es-MX"/>
-        </w:rPr>
-        <w:tab/>
-      </w:r>
-      <w:r>
-        <w:rPr>
-          <w:rFonts w:asciiTheme="minorHAnsi" w:eastAsiaTheme="minorHAnsi" w:hAnsiTheme="minorHAnsi" w:cstheme="minorHAnsi"/>
-          <w:b w:val="0"/>
-          <w:color w:val="auto"/>
-          <w:kern w:val="0"/>
-          <w:sz w:val="24"/>
-          <w:szCs w:val="24"/>
-          <w:lang w:val="es-MX"/>
-        </w:rPr>
-        <w:tab/>
-      </w:r>
-      <w:r>
-        <w:rPr>
-          <w:rFonts w:asciiTheme="minorHAnsi" w:eastAsiaTheme="minorHAnsi" w:hAnsiTheme="minorHAnsi" w:cstheme="minorHAnsi"/>
-          <w:b w:val="0"/>
-          <w:color w:val="auto"/>
-          <w:kern w:val="0"/>
-          <w:sz w:val="24"/>
-          <w:szCs w:val="24"/>
-          <w:lang w:val="es-MX"/>
-        </w:rPr>
-        <w:tab/>
-        <w:t>${domain3_level}</w:t>
-      </w:r>
-    </w:p>
-    <w:p>
-      <w:pPr>
-        <w:pStyle w:val="Ttulo"/>
-        <w:framePr w:hSpace="0" w:wrap="auto" w:vAnchor="margin" w:hAnchor="text" w:yAlign="inline"/>
-        <w:ind w:left="567"/>
-        <w:jc w:val="both"/>
-        <w:rPr>
-          <w:rFonts w:asciiTheme="minorHAnsi" w:eastAsiaTheme="minorHAnsi" w:hAnsiTheme="minorHAnsi" w:cstheme="minorHAnsi"/>
-          <w:b w:val="0"/>
-          <w:i/>
-          <w:iCs/>
-          <w:color w:val="auto"/>
-          <w:kern w:val="0"/>
-          <w:sz w:val="24"/>
-          <w:szCs w:val="24"/>
-          <w:lang w:val="es-MX"/>
-        </w:rPr>
-      </w:pPr>
-      <w:r>
-        <w:rPr>
-          <w:rFonts w:asciiTheme="minorHAnsi" w:eastAsiaTheme="minorHAnsi" w:hAnsiTheme="minorHAnsi" w:cstheme="minorHAnsi"/>
-          <w:b w:val="0"/>
-          <w:i/>
-          <w:iCs/>
-          <w:color w:val="auto"/>
-          <w:kern w:val="0"/>
-          <w:sz w:val="24"/>
-          <w:szCs w:val="24"/>
-          <w:lang w:val="es-MX"/>
-        </w:rPr>
-        <w:t>${domain3_description};</w:t>
-      </w:r>
+    <w:tbl>
+      <w:tblPr>
+        <w:tblStyle w:val="Tablaconcuadrcula"/>
+        <w:tblW w:w="0" w:type="auto"/>
+        <w:tblBorders>
+          <w:top w:val="none" w:sz="0" w:space="0" w:color="auto"/>
+          <w:left w:val="none" w:sz="0" w:space="0" w:color="auto"/>
+          <w:bottom w:val="none" w:sz="0" w:space="0" w:color="auto"/>
+          <w:right w:val="none" w:sz="0" w:space="0" w:color="auto"/>
+          <w:insideH w:val="none" w:sz="0" w:space="0" w:color="auto"/>
+          <w:insideV w:val="none" w:sz="0" w:space="0" w:color="auto"/>
+        </w:tblBorders>
+        <w:tblLook w:val="04A0" w:firstRow="1" w:lastRow="0" w:firstColumn="1" w:lastColumn="0" w:noHBand="0" w:noVBand="1"/>
+      </w:tblPr>
+      <w:tblGrid>
+        <w:gridCol w:w="8828"/>
+      </w:tblGrid>
+      <w:tr>
+        <w:tc>
+          <w:tcPr>
+            <w:tcW w:w="8828" w:type="dxa"/>
+          </w:tcPr>
+          <w:p>
+            <w:pPr>
+              <w:pStyle w:val="Ttulo"/>
+              <w:framePr w:hSpace="0" w:wrap="auto" w:vAnchor="margin" w:hAnchor="text" w:yAlign="inline"/>
+              <w:numPr>
+                <w:ilvl w:val="1"/>
+                <w:numId w:val="2"/>
+              </w:numPr>
+              <w:ind w:left="567"/>
+              <w:rPr>
+                <w:rFonts w:asciiTheme="minorHAnsi" w:eastAsiaTheme="minorHAnsi" w:hAnsiTheme="minorHAnsi" w:cstheme="minorHAnsi"/>
+                <w:b w:val="0"/>
+                <w:color w:val="auto"/>
+                <w:kern w:val="0"/>
+                <w:sz w:val="24"/>
+                <w:szCs w:val="24"/>
+                <w:lang w:val="es-MX"/>
+              </w:rPr>
+            </w:pPr>
+            <w:r>
+              <w:rPr>
+                <w:rFonts w:asciiTheme="minorHAnsi" w:eastAsiaTheme="minorHAnsi" w:hAnsiTheme="minorHAnsi" w:cstheme="minorHAnsi"/>
+                <w:b w:val="0"/>
+                <w:color w:val="auto"/>
+                <w:kern w:val="0"/>
+                <w:sz w:val="24"/>
+                <w:szCs w:val="24"/>
+                <w:lang w:val="es-MX"/>
+              </w:rPr>
+              <w:t>${</w:t>
+            </w:r>
+            <w:proofErr w:type="spellStart"/>
+            <w:r>
+              <w:rPr>
+                <w:rFonts w:asciiTheme="minorHAnsi" w:eastAsiaTheme="minorHAnsi" w:hAnsiTheme="minorHAnsi" w:cstheme="minorHAnsi"/>
+                <w:b w:val="0"/>
+                <w:color w:val="auto"/>
+                <w:kern w:val="0"/>
+                <w:sz w:val="24"/>
+                <w:szCs w:val="24"/>
+                <w:lang w:val="es-MX"/>
+              </w:rPr>
+              <w:t>dom</w:t>
+            </w:r>
+            <w:r>
+              <w:rPr>
+                <w:rFonts w:asciiTheme="minorHAnsi" w:eastAsiaTheme="minorHAnsi" w:hAnsiTheme="minorHAnsi" w:cstheme="minorHAnsi"/>
+                <w:b w:val="0"/>
+                <w:color w:val="auto"/>
+                <w:kern w:val="0"/>
+                <w:sz w:val="24"/>
+                <w:szCs w:val="24"/>
+                <w:lang w:val="es-MX"/>
+              </w:rPr>
+              <w:t>_top</w:t>
+            </w:r>
+            <w:r>
+              <w:rPr>
+                <w:rFonts w:asciiTheme="minorHAnsi" w:eastAsiaTheme="minorHAnsi" w:hAnsiTheme="minorHAnsi" w:cstheme="minorHAnsi"/>
+                <w:b w:val="0"/>
+                <w:color w:val="auto"/>
+                <w:kern w:val="0"/>
+                <w:sz w:val="24"/>
+                <w:szCs w:val="24"/>
+                <w:lang w:val="es-MX"/>
+              </w:rPr>
+              <w:t>_name</w:t>
+            </w:r>
+            <w:proofErr w:type="spellEnd"/>
+            <w:r>
+              <w:rPr>
+                <w:rFonts w:asciiTheme="minorHAnsi" w:eastAsiaTheme="minorHAnsi" w:hAnsiTheme="minorHAnsi" w:cstheme="minorHAnsi"/>
+                <w:b w:val="0"/>
+                <w:color w:val="auto"/>
+                <w:kern w:val="0"/>
+                <w:sz w:val="24"/>
+                <w:szCs w:val="24"/>
+                <w:lang w:val="es-MX"/>
+              </w:rPr>
+              <w:t xml:space="preserve">} </w:t>
+            </w:r>
+            <w:r>
+              <w:rPr>
+                <w:rFonts w:asciiTheme="minorHAnsi" w:eastAsiaTheme="minorHAnsi" w:hAnsiTheme="minorHAnsi" w:cstheme="minorHAnsi"/>
+                <w:b w:val="0"/>
+                <w:color w:val="auto"/>
+                <w:kern w:val="0"/>
+                <w:sz w:val="24"/>
+                <w:szCs w:val="24"/>
+                <w:lang w:val="es-MX"/>
+              </w:rPr>
+              <w:tab/>
+            </w:r>
+            <w:r>
+              <w:rPr>
+                <w:rFonts w:asciiTheme="minorHAnsi" w:eastAsiaTheme="minorHAnsi" w:hAnsiTheme="minorHAnsi" w:cstheme="minorHAnsi"/>
+                <w:b w:val="0"/>
+                <w:color w:val="auto"/>
+                <w:kern w:val="0"/>
+                <w:sz w:val="24"/>
+                <w:szCs w:val="24"/>
+                <w:lang w:val="es-MX"/>
+              </w:rPr>
+              <w:tab/>
+            </w:r>
+            <w:r>
+              <w:rPr>
+                <w:rFonts w:asciiTheme="minorHAnsi" w:eastAsiaTheme="minorHAnsi" w:hAnsiTheme="minorHAnsi" w:cstheme="minorHAnsi"/>
+                <w:b w:val="0"/>
+                <w:color w:val="auto"/>
+                <w:kern w:val="0"/>
+                <w:sz w:val="24"/>
+                <w:szCs w:val="24"/>
+                <w:lang w:val="es-MX"/>
+              </w:rPr>
+              <w:tab/>
+              <w:t>${</w:t>
+            </w:r>
+            <w:proofErr w:type="spellStart"/>
+            <w:r>
+              <w:rPr>
+                <w:rFonts w:asciiTheme="minorHAnsi" w:eastAsiaTheme="minorHAnsi" w:hAnsiTheme="minorHAnsi" w:cstheme="minorHAnsi"/>
+                <w:b w:val="0"/>
+                <w:color w:val="auto"/>
+                <w:kern w:val="0"/>
+                <w:sz w:val="24"/>
+                <w:szCs w:val="24"/>
+                <w:lang w:val="es-MX"/>
+              </w:rPr>
+              <w:t>dom</w:t>
+            </w:r>
+            <w:r>
+              <w:rPr>
+                <w:rFonts w:asciiTheme="minorHAnsi" w:eastAsiaTheme="minorHAnsi" w:hAnsiTheme="minorHAnsi" w:cstheme="minorHAnsi"/>
+                <w:b w:val="0"/>
+                <w:color w:val="auto"/>
+                <w:kern w:val="0"/>
+                <w:sz w:val="24"/>
+                <w:szCs w:val="24"/>
+                <w:lang w:val="es-MX"/>
+              </w:rPr>
+              <w:t>_top</w:t>
+            </w:r>
+            <w:r>
+              <w:rPr>
+                <w:rFonts w:asciiTheme="minorHAnsi" w:eastAsiaTheme="minorHAnsi" w:hAnsiTheme="minorHAnsi" w:cstheme="minorHAnsi"/>
+                <w:b w:val="0"/>
+                <w:color w:val="auto"/>
+                <w:kern w:val="0"/>
+                <w:sz w:val="24"/>
+                <w:szCs w:val="24"/>
+                <w:lang w:val="es-MX"/>
+              </w:rPr>
+              <w:t>_level</w:t>
+            </w:r>
+            <w:proofErr w:type="spellEnd"/>
+            <w:r>
+              <w:rPr>
+                <w:rFonts w:asciiTheme="minorHAnsi" w:eastAsiaTheme="minorHAnsi" w:hAnsiTheme="minorHAnsi" w:cstheme="minorHAnsi"/>
+                <w:b w:val="0"/>
+                <w:color w:val="auto"/>
+                <w:kern w:val="0"/>
+                <w:sz w:val="24"/>
+                <w:szCs w:val="24"/>
+                <w:lang w:val="es-MX"/>
+              </w:rPr>
+              <w:t>}</w:t>
+            </w:r>
+          </w:p>
+          <w:p>
+            <w:pPr>
+              <w:pStyle w:val="Ttulo"/>
+              <w:framePr w:hSpace="0" w:wrap="auto" w:vAnchor="margin" w:hAnchor="text" w:yAlign="inline"/>
+              <w:ind w:left="567"/>
+              <w:rPr>
+                <w:rFonts w:asciiTheme="minorHAnsi" w:eastAsiaTheme="minorHAnsi" w:hAnsiTheme="minorHAnsi" w:cstheme="minorHAnsi"/>
+                <w:b w:val="0"/>
+                <w:i/>
+                <w:iCs/>
+                <w:color w:val="auto"/>
+                <w:kern w:val="0"/>
+                <w:sz w:val="24"/>
+                <w:szCs w:val="24"/>
+                <w:lang w:val="es-MX"/>
+              </w:rPr>
+            </w:pPr>
+            <w:r>
+              <w:rPr>
+                <w:rFonts w:asciiTheme="minorHAnsi" w:eastAsiaTheme="minorHAnsi" w:hAnsiTheme="minorHAnsi" w:cstheme="minorHAnsi"/>
+                <w:b w:val="0"/>
+                <w:i/>
+                <w:iCs/>
+                <w:color w:val="auto"/>
+                <w:kern w:val="0"/>
+                <w:sz w:val="24"/>
+                <w:szCs w:val="24"/>
+                <w:lang w:val="es-MX"/>
+              </w:rPr>
+              <w:t>${</w:t>
+            </w:r>
+            <w:proofErr w:type="spellStart"/>
+            <w:r>
+              <w:rPr>
+                <w:rFonts w:asciiTheme="minorHAnsi" w:eastAsiaTheme="minorHAnsi" w:hAnsiTheme="minorHAnsi" w:cstheme="minorHAnsi"/>
+                <w:b w:val="0"/>
+                <w:i/>
+                <w:iCs/>
+                <w:color w:val="auto"/>
+                <w:kern w:val="0"/>
+                <w:sz w:val="24"/>
+                <w:szCs w:val="24"/>
+                <w:lang w:val="es-MX"/>
+              </w:rPr>
+              <w:t>dom</w:t>
+            </w:r>
+            <w:r>
+              <w:rPr>
+                <w:rFonts w:asciiTheme="minorHAnsi" w:eastAsiaTheme="minorHAnsi" w:hAnsiTheme="minorHAnsi" w:cstheme="minorHAnsi"/>
+                <w:b w:val="0"/>
+                <w:i/>
+                <w:iCs/>
+                <w:color w:val="auto"/>
+                <w:kern w:val="0"/>
+                <w:sz w:val="24"/>
+                <w:szCs w:val="24"/>
+                <w:lang w:val="es-MX"/>
+              </w:rPr>
+              <w:t>_top</w:t>
+            </w:r>
+            <w:r>
+              <w:rPr>
+                <w:rFonts w:asciiTheme="minorHAnsi" w:eastAsiaTheme="minorHAnsi" w:hAnsiTheme="minorHAnsi" w:cstheme="minorHAnsi"/>
+                <w:b w:val="0"/>
+                <w:i/>
+                <w:iCs/>
+                <w:color w:val="auto"/>
+                <w:kern w:val="0"/>
+                <w:sz w:val="24"/>
+                <w:szCs w:val="24"/>
+                <w:lang w:val="es-MX"/>
+              </w:rPr>
+              <w:t>_desc</w:t>
+            </w:r>
+            <w:proofErr w:type="spellEnd"/>
+            <w:r>
+              <w:rPr>
+                <w:rFonts w:asciiTheme="minorHAnsi" w:eastAsiaTheme="minorHAnsi" w:hAnsiTheme="minorHAnsi" w:cstheme="minorHAnsi"/>
+                <w:b w:val="0"/>
+                <w:i/>
+                <w:iCs/>
+                <w:color w:val="auto"/>
+                <w:kern w:val="0"/>
+                <w:sz w:val="24"/>
+                <w:szCs w:val="24"/>
+                <w:lang w:val="es-MX"/>
+              </w:rPr>
+              <w:t>};</w:t>
+            </w:r>
+          </w:p>
+          <w:p>
+            <w:pPr>
+              <w:pStyle w:val="Ttulo"/>
+              <w:framePr w:hSpace="0" w:wrap="auto" w:vAnchor="margin" w:hAnchor="text" w:yAlign="inline"/>
+              <w:rPr>
+                <w:rFonts w:asciiTheme="minorHAnsi" w:eastAsiaTheme="minorHAnsi" w:hAnsiTheme="minorHAnsi" w:cstheme="minorHAnsi"/>
+                <w:b w:val="0"/>
+                <w:color w:val="auto"/>
+                <w:kern w:val="0"/>
+                <w:sz w:val="24"/>
+                <w:szCs w:val="24"/>
+                <w:lang w:val="es-MX"/>
+              </w:rPr>
+            </w:pPr>
+          </w:p>
+        </w:tc>
+      </w:tr>
+    </w:tbl>
+    <w:p>
+      <w:pPr>
+        <w:pStyle w:val="Ttulo"/>
+        <w:framePr w:hSpace="0" w:wrap="auto" w:vAnchor="margin" w:hAnchor="text" w:yAlign="inline"/>
+        <w:rPr>
+          <w:rFonts w:asciiTheme="minorHAnsi" w:eastAsiaTheme="minorHAnsi" w:hAnsiTheme="minorHAnsi" w:cstheme="minorHAnsi"/>
+          <w:b w:val="0"/>
+          <w:color w:val="auto"/>
+          <w:kern w:val="0"/>
+          <w:sz w:val="24"/>
+          <w:szCs w:val="24"/>
+          <w:lang w:val="es-MX"/>
+        </w:rPr>
+      </w:pPr>
+    </w:p>
+    <w:p>
+      <w:pPr>
+        <w:pStyle w:val="Ttulo"/>
+        <w:framePr w:hSpace="0" w:wrap="auto" w:vAnchor="margin" w:hAnchor="text" w:yAlign="inline"/>
+        <w:rPr>
+          <w:rFonts w:asciiTheme="minorHAnsi" w:eastAsiaTheme="minorHAnsi" w:hAnsiTheme="minorHAnsi" w:cstheme="minorHAnsi"/>
+          <w:b w:val="0"/>
+          <w:color w:val="auto"/>
+          <w:kern w:val="0"/>
+          <w:sz w:val="24"/>
+          <w:szCs w:val="24"/>
+          <w:lang w:val="es-MX"/>
+        </w:rPr>
+      </w:pPr>
     </w:p>
     <w:p>
       <w:pPr>
@@ -13320,6 +13855,7 @@
           <w:sz w:val="24"/>
           <w:szCs w:val="24"/>
         </w:rPr>
+        <w:lastRenderedPageBreak/>
         <w:t>Primer Nivel - organizacional</w:t>
       </w:r>
     </w:p>
@@ -13715,93 +14251,6 @@
           <w:lang w:val="es-MX"/>
         </w:rPr>
       </w:pPr>
-      <w:r>
-        <w:rPr>
-          <w:noProof/>
-        </w:rPr>
-        <w:drawing>
-          <wp:anchor distT="0" distB="0" distL="114300" distR="114300" simplePos="0" relativeHeight="251658242" behindDoc="0" locked="0" layoutInCell="1" allowOverlap="1" wp14:anchorId="44DEAFAC" wp14:editId="19029476">
-            <wp:simplePos x="0" y="0"/>
-            <wp:positionH relativeFrom="margin">
-              <wp:posOffset>278765</wp:posOffset>
-            </wp:positionH>
-            <wp:positionV relativeFrom="paragraph">
-              <wp:posOffset>156210</wp:posOffset>
-            </wp:positionV>
-            <wp:extent cx="1181100" cy="1509395"/>
-            <wp:effectExtent l="152400" t="152400" r="361950" b="357505"/>
-            <wp:wrapThrough wrapText="bothSides">
-              <wp:wrapPolygon edited="0">
-                <wp:start x="1394" y="-2181"/>
-                <wp:lineTo x="-2787" y="-1636"/>
-                <wp:lineTo x="-2787" y="22627"/>
-                <wp:lineTo x="-1045" y="24535"/>
-                <wp:lineTo x="3135" y="25898"/>
-                <wp:lineTo x="3484" y="26443"/>
-                <wp:lineTo x="21600" y="26443"/>
-                <wp:lineTo x="21948" y="25898"/>
-                <wp:lineTo x="26129" y="24535"/>
-                <wp:lineTo x="27871" y="20446"/>
-                <wp:lineTo x="27871" y="2726"/>
-                <wp:lineTo x="23690" y="-1363"/>
-                <wp:lineTo x="23342" y="-2181"/>
-                <wp:lineTo x="1394" y="-2181"/>
-              </wp:wrapPolygon>
-            </wp:wrapThrough>
-            <wp:docPr id="71" name="Imagen 71" descr="Imagen que contiene Texto&#10;&#10;Descripción generada automáticamente"/>
-            <wp:cNvGraphicFramePr>
-              <a:graphicFrameLocks xmlns:a="http://schemas.openxmlformats.org/drawingml/2006/main" noChangeAspect="1"/>
-            </wp:cNvGraphicFramePr>
-            <a:graphic xmlns:a="http://schemas.openxmlformats.org/drawingml/2006/main">
-              <a:graphicData uri="http://schemas.openxmlformats.org/drawingml/2006/picture">
-                <pic:pic xmlns:pic="http://schemas.openxmlformats.org/drawingml/2006/picture">
-                  <pic:nvPicPr>
-                    <pic:cNvPr id="71" name="Imagen 71" descr="Imagen que contiene Texto&#10;&#10;Descripción generada automáticamente"/>
-                    <pic:cNvPicPr/>
-                  </pic:nvPicPr>
-                  <pic:blipFill>
-                    <a:blip r:embed="rId19" cstate="print">
-                      <a:extLst>
-                        <a:ext uri="{28A0092B-C50C-407E-A947-70E740481C1C}">
-                          <a14:useLocalDpi xmlns:a14="http://schemas.microsoft.com/office/drawing/2010/main" val="0"/>
-                        </a:ext>
-                      </a:extLst>
-                    </a:blip>
-                    <a:stretch>
-                      <a:fillRect/>
-                    </a:stretch>
-                  </pic:blipFill>
-                  <pic:spPr>
-                    <a:xfrm>
-                      <a:off x="0" y="0"/>
-                      <a:ext cx="1181100" cy="1509395"/>
-                    </a:xfrm>
-                    <a:prstGeom prst="rect">
-                      <a:avLst/>
-                    </a:prstGeom>
-                    <a:ln>
-                      <a:noFill/>
-                    </a:ln>
-                    <a:effectLst>
-                      <a:outerShdw blurRad="292100" dist="139700" dir="2700000" algn="tl" rotWithShape="0">
-                        <a:srgbClr val="333333">
-                          <a:alpha val="65000"/>
-                        </a:srgbClr>
-                      </a:outerShdw>
-                    </a:effectLst>
-                  </pic:spPr>
-                </pic:pic>
-              </a:graphicData>
-            </a:graphic>
-            <wp14:sizeRelH relativeFrom="page">
-              <wp14:pctWidth>0</wp14:pctWidth>
-            </wp14:sizeRelH>
-            <wp14:sizeRelV relativeFrom="page">
-              <wp14:pctHeight>0</wp14:pctHeight>
-            </wp14:sizeRelV>
-          </wp:anchor>
-        </w:drawing>
-      </w:r>
     </w:p>
     <w:p>
       <w:pPr>
@@ -14104,8 +14553,8 @@
       </w:r>
     </w:p>
     <w:sectPr>
-      <w:headerReference w:type="default" r:id="rId20"/>
-      <w:headerReference w:type="first" r:id="rId21"/>
+      <w:headerReference w:type="default" r:id="rId19"/>
+      <w:headerReference w:type="first" r:id="rId20"/>
       <w:pgSz w:w="12240" w:h="15840"/>
       <w:pgMar w:top="1417" w:right="1701" w:bottom="1417" w:left="1701" w:header="708" w:footer="708" w:gutter="0"/>
       <w:cols w:space="708"/>

</xml_diff>

<commit_message>
La nom035 y sus reportes. Se agrega periodo de acuerdo a las fechas de campaña.
</commit_message>
<xml_diff>
--- a/storage/app/plantillas/informe_guiaIII_template.docx
+++ b/storage/app/plantillas/informe_guiaIII_template.docx
@@ -2068,6 +2068,13 @@
           <w:sz w:val="24"/>
           <w:szCs w:val="24"/>
         </w:rPr>
+        <w:t>I</w:t>
+      </w:r>
+      <w:r>
+        <w:rPr>
+          <w:sz w:val="24"/>
+          <w:szCs w:val="24"/>
+        </w:rPr>
         <w:t xml:space="preserve"> </w:t>
       </w:r>
       <w:r>
@@ -2179,22 +2186,7 @@
         <w:t>Guía</w:t>
       </w:r>
       <w:r>
-        <w:rPr>
-          <w:rFonts w:ascii="Bahnschrift" w:hAnsi="Bahnschrift"/>
-          <w:sz w:val="24"/>
-          <w:szCs w:val="24"/>
-          <w14:shadow w14:blurRad="38100" w14:dist="19050" w14:dir="2700000" w14:sx="100000" w14:sy="100000" w14:kx="0" w14:ky="0" w14:algn="tl">
-            <w14:schemeClr w14:val="dk1">
-              <w14:alpha w14:val="60000"/>
-            </w14:schemeClr>
-          </w14:shadow>
-          <w14:textOutline w14:w="0" w14:cap="flat" w14:cmpd="sng" w14:algn="ctr">
-            <w14:noFill/>
-            <w14:prstDash w14:val="solid"/>
-            <w14:round/>
-          </w14:textOutline>
-        </w:rPr>
-        <w:t xml:space="preserve"> </w:t>
+        <w:t xml:space="preserve"> de Referencia </w:t>
       </w:r>
       <w:r>
         <w:t>${</w:t>
@@ -2209,6 +2201,18 @@
       </w:r>
       <w:r>
         <w:t>“</w:t>
+      </w:r>
+      <w:r>
+        <w:t>Cue</w:t>
+      </w:r>
+      <w:r>
+        <w:t>s</w:t>
+      </w:r>
+      <w:r>
+        <w:t xml:space="preserve">tionario para </w:t>
+      </w:r>
+      <w:r>
+        <w:t xml:space="preserve">la </w:t>
       </w:r>
       <w:r>
         <w:t>${</w:t>
@@ -2616,6 +2620,7 @@
           <w:szCs w:val="24"/>
           <w:lang w:val="es-MX"/>
         </w:rPr>
+        <w:lastRenderedPageBreak/>
         <w:t>El sentido de pertenencia de los trabajadores a la empresa;</w:t>
       </w:r>
     </w:p>
@@ -2648,7 +2653,6 @@
           <w:szCs w:val="24"/>
           <w:lang w:val="es-MX"/>
         </w:rPr>
-        <w:lastRenderedPageBreak/>
         <w:t>La formación para la adecuada realización de las tareas encomendadas;</w:t>
       </w:r>
     </w:p>
@@ -3972,7 +3976,19 @@
           <w:szCs w:val="24"/>
           <w:lang w:val="es-MX"/>
         </w:rPr>
-        <w:t>total_colab</w:t>
+        <w:t>count_</w:t>
+      </w:r>
+      <w:r>
+        <w:rPr>
+          <w:rFonts w:asciiTheme="minorHAnsi" w:eastAsiaTheme="minorHAnsi" w:hAnsiTheme="minorHAnsi" w:cstheme="minorHAnsi"/>
+          <w:b w:val="0"/>
+          <w:color w:val="auto"/>
+          <w:kern w:val="0"/>
+          <w:sz w:val="24"/>
+          <w:szCs w:val="24"/>
+          <w:lang w:val="es-MX"/>
+        </w:rPr>
+        <w:t>colab</w:t>
       </w:r>
       <w:proofErr w:type="spellEnd"/>
       <w:r>
@@ -4595,6 +4611,14 @@
           <w:sz w:val="24"/>
           <w:szCs w:val="24"/>
         </w:rPr>
+        <w:t xml:space="preserve"> numeral</w:t>
+      </w:r>
+      <w:r>
+        <w:rPr>
+          <w:rFonts w:cstheme="minorHAnsi"/>
+          <w:sz w:val="24"/>
+          <w:szCs w:val="24"/>
+        </w:rPr>
         <w:t xml:space="preserve"> ${</w:t>
       </w:r>
       <w:proofErr w:type="spellStart"/>
@@ -6250,7 +6274,7 @@
             <w14:round/>
           </w14:textOutline>
         </w:rPr>
-        <w:t>total</w:t>
+        <w:t>count</w:t>
       </w:r>
       <w:r>
         <w:rPr>
@@ -6271,7 +6295,28 @@
             <w14:round/>
           </w14:textOutline>
         </w:rPr>
-        <w:t>_colab</w:t>
+        <w:t>_</w:t>
+      </w:r>
+      <w:r>
+        <w:rPr>
+          <w:rFonts w:asciiTheme="minorHAnsi" w:eastAsiaTheme="minorHAnsi" w:hAnsiTheme="minorHAnsi" w:cstheme="minorHAnsi"/>
+          <w:bCs/>
+          <w:kern w:val="0"/>
+          <w:sz w:val="32"/>
+          <w:szCs w:val="32"/>
+          <w:lang w:val="es-MX"/>
+          <w14:shadow w14:blurRad="0" w14:dist="38100" w14:dir="2700000" w14:sx="100000" w14:sy="100000" w14:kx="0" w14:ky="0" w14:algn="bl">
+            <w14:schemeClr w14:val="accent5"/>
+          </w14:shadow>
+          <w14:textOutline w14:w="6731" w14:cap="flat" w14:cmpd="sng" w14:algn="ctr">
+            <w14:solidFill>
+              <w14:schemeClr w14:val="bg1"/>
+            </w14:solidFill>
+            <w14:prstDash w14:val="solid"/>
+            <w14:round/>
+          </w14:textOutline>
+        </w:rPr>
+        <w:t>colab</w:t>
       </w:r>
       <w:proofErr w:type="spellEnd"/>
       <w:r>
@@ -6813,7 +6858,7 @@
                 <w:szCs w:val="24"/>
                 <w:lang w:val="es-MX"/>
               </w:rPr>
-              <w:t>total</w:t>
+              <w:t>count_</w:t>
             </w:r>
             <w:r>
               <w:rPr>
@@ -6827,7 +6872,7 @@
                 <w:szCs w:val="24"/>
                 <w:lang w:val="es-MX"/>
               </w:rPr>
-              <w:t>_colab</w:t>
+              <w:t>colab</w:t>
             </w:r>
             <w:proofErr w:type="spellEnd"/>
             <w:r>
@@ -9062,11 +9107,9 @@
                             <w:r>
                               <w:t>${</w:t>
                             </w:r>
-                            <w:proofErr w:type="spellStart"/>
                             <w:r>
                               <w:t>grafica_categorias</w:t>
                             </w:r>
-                            <w:proofErr w:type="spellEnd"/>
                             <w:r>
                               <w:t>}</w:t>
                             </w:r>
@@ -11318,11 +11361,9 @@
                             <w:r>
                               <w:t>${</w:t>
                             </w:r>
-                            <w:proofErr w:type="spellStart"/>
                             <w:r>
                               <w:t>grafica_dominios</w:t>
                             </w:r>
-                            <w:proofErr w:type="spellEnd"/>
                             <w:r>
                               <w:t>}</w:t>
                             </w:r>

</xml_diff>

<commit_message>
Cambios word a reportes Guía III,
</commit_message>
<xml_diff>
--- a/storage/app/plantillas/informe_guiaIII_template.docx
+++ b/storage/app/plantillas/informe_guiaIII_template.docx
@@ -510,7 +510,6 @@
         </w:rPr>
         <w:t>${</w:t>
       </w:r>
-      <w:proofErr w:type="spellStart"/>
       <w:r>
         <w:rPr>
           <w:rFonts w:ascii="Bahnschrift" w:hAnsi="Bahnschrift"/>
@@ -551,29 +550,7 @@
             <w14:round/>
           </w14:textOutline>
         </w:rPr>
-        <w:t>guia</w:t>
-      </w:r>
-      <w:proofErr w:type="spellEnd"/>
-      <w:r>
-        <w:rPr>
-          <w:rFonts w:ascii="Bahnschrift" w:hAnsi="Bahnschrift"/>
-          <w:b w:val="0"/>
-          <w:color w:val="404040" w:themeColor="text1" w:themeTint="BF"/>
-          <w:sz w:val="36"/>
-          <w:szCs w:val="36"/>
-          <w:lang w:bidi="es-ES"/>
-          <w14:shadow w14:blurRad="38100" w14:dist="19050" w14:dir="2700000" w14:sx="100000" w14:sy="100000" w14:kx="0" w14:ky="0" w14:algn="tl">
-            <w14:schemeClr w14:val="dk1">
-              <w14:alpha w14:val="60000"/>
-            </w14:schemeClr>
-          </w14:shadow>
-          <w14:textOutline w14:w="0" w14:cap="flat" w14:cmpd="sng" w14:algn="ctr">
-            <w14:noFill/>
-            <w14:prstDash w14:val="solid"/>
-            <w14:round/>
-          </w14:textOutline>
-        </w:rPr>
-        <w:t>}</w:t>
+        <w:t>guia}</w:t>
       </w:r>
     </w:p>
     <w:p>
@@ -1720,28 +1697,12 @@
           </w:tcPr>
           <w:p>
             <w:r>
-              <w:t>Nombre: ${</w:t>
-            </w:r>
-            <w:proofErr w:type="spellStart"/>
-            <w:r>
-              <w:t>company_name</w:t>
-            </w:r>
-            <w:proofErr w:type="spellEnd"/>
-            <w:r>
-              <w:t>}</w:t>
+              <w:t>Nombre: ${company_name}</w:t>
             </w:r>
           </w:p>
           <w:p>
             <w:r>
-              <w:t>Domicilio: ${</w:t>
-            </w:r>
-            <w:proofErr w:type="spellStart"/>
-            <w:r>
-              <w:t>direccion</w:t>
-            </w:r>
-            <w:proofErr w:type="spellEnd"/>
-            <w:r>
-              <w:t>}</w:t>
+              <w:t>Domicilio: ${direccion}</w:t>
             </w:r>
           </w:p>
           <w:p>
@@ -2189,15 +2150,7 @@
         <w:t xml:space="preserve"> de Referencia </w:t>
       </w:r>
       <w:r>
-        <w:t>${</w:t>
-      </w:r>
-      <w:proofErr w:type="spellStart"/>
-      <w:r>
-        <w:t>no_guia</w:t>
-      </w:r>
-      <w:proofErr w:type="spellEnd"/>
-      <w:r>
-        <w:t xml:space="preserve">} </w:t>
+        <w:t xml:space="preserve">${no_guia} </w:t>
       </w:r>
       <w:r>
         <w:t>“</w:t>
@@ -2215,21 +2168,13 @@
         <w:t xml:space="preserve">la </w:t>
       </w:r>
       <w:r>
-        <w:t>${</w:t>
-      </w:r>
-      <w:proofErr w:type="spellStart"/>
-      <w:r>
-        <w:t>gu</w:t>
+        <w:t>${gu</w:t>
       </w:r>
       <w:r>
         <w:t>i</w:t>
       </w:r>
       <w:r>
-        <w:t>a_name</w:t>
-      </w:r>
-      <w:proofErr w:type="spellEnd"/>
-      <w:r>
-        <w:t>}</w:t>
+        <w:t>a_name}</w:t>
       </w:r>
       <w:r>
         <w:t>”</w:t>
@@ -2971,22 +2916,8 @@
           <w:szCs w:val="24"/>
           <w:lang w:val="es-MX"/>
         </w:rPr>
-        <w:t xml:space="preserve"> en la plataforma </w:t>
-      </w:r>
-      <w:proofErr w:type="spellStart"/>
-      <w:r>
-        <w:rPr>
-          <w:rFonts w:asciiTheme="minorHAnsi" w:eastAsiaTheme="minorHAnsi" w:hAnsiTheme="minorHAnsi" w:cstheme="minorHAnsi"/>
-          <w:b w:val="0"/>
-          <w:color w:val="auto"/>
-          <w:kern w:val="0"/>
-          <w:sz w:val="24"/>
-          <w:szCs w:val="24"/>
-          <w:lang w:val="es-MX"/>
-        </w:rPr>
-        <w:t>SEDyCO</w:t>
-      </w:r>
-      <w:proofErr w:type="spellEnd"/>
+        <w:t xml:space="preserve"> en la plataforma SEDyCO</w:t>
+      </w:r>
       <w:r>
         <w:rPr>
           <w:rFonts w:asciiTheme="minorHAnsi" w:eastAsiaTheme="minorHAnsi" w:hAnsiTheme="minorHAnsi" w:cstheme="minorHAnsi"/>
@@ -3965,7 +3896,6 @@
         <w:lastRenderedPageBreak/>
         <w:t>Para determinar la muestra representativa, el centro de trabajo contaba con una plantilla de personal activo el ${periodo}, el total de la plantilla fue de ${</w:t>
       </w:r>
-      <w:proofErr w:type="spellStart"/>
       <w:r>
         <w:rPr>
           <w:rFonts w:asciiTheme="minorHAnsi" w:eastAsiaTheme="minorHAnsi" w:hAnsiTheme="minorHAnsi" w:cstheme="minorHAnsi"/>
@@ -3990,7 +3920,6 @@
         </w:rPr>
         <w:t>colab</w:t>
       </w:r>
-      <w:proofErr w:type="spellEnd"/>
       <w:r>
         <w:rPr>
           <w:rFonts w:asciiTheme="minorHAnsi" w:eastAsiaTheme="minorHAnsi" w:hAnsiTheme="minorHAnsi" w:cstheme="minorHAnsi"/>
@@ -4619,25 +4548,7 @@
           <w:sz w:val="24"/>
           <w:szCs w:val="24"/>
         </w:rPr>
-        <w:t xml:space="preserve"> ${</w:t>
-      </w:r>
-      <w:proofErr w:type="spellStart"/>
-      <w:r>
-        <w:rPr>
-          <w:rFonts w:cstheme="minorHAnsi"/>
-          <w:sz w:val="24"/>
-          <w:szCs w:val="24"/>
-        </w:rPr>
-        <w:t>guia_numeral</w:t>
-      </w:r>
-      <w:proofErr w:type="spellEnd"/>
-      <w:r>
-        <w:rPr>
-          <w:rFonts w:cstheme="minorHAnsi"/>
-          <w:sz w:val="24"/>
-          <w:szCs w:val="24"/>
-        </w:rPr>
-        <w:t xml:space="preserve">} </w:t>
+        <w:t xml:space="preserve"> ${guia_numeral} </w:t>
       </w:r>
       <w:r>
         <w:rPr>
@@ -4856,14 +4767,14 @@
           <w:rFonts w:asciiTheme="minorHAnsi" w:hAnsiTheme="minorHAnsi" w:cstheme="minorHAnsi"/>
           <w:color w:val="auto"/>
         </w:rPr>
-        <w:t xml:space="preserve">la Tabla </w:t>
+        <w:t xml:space="preserve">la </w:t>
       </w:r>
       <w:r>
         <w:rPr>
           <w:rFonts w:asciiTheme="minorHAnsi" w:hAnsiTheme="minorHAnsi" w:cstheme="minorHAnsi"/>
           <w:color w:val="auto"/>
         </w:rPr>
-        <w:t>3</w:t>
+        <w:t>siguiente tabla</w:t>
       </w:r>
       <w:r>
         <w:rPr>
@@ -4969,27 +4880,7 @@
           <w:sz w:val="22"/>
           <w:szCs w:val="22"/>
         </w:rPr>
-        <w:t>n del dominio (</w:t>
-      </w:r>
-      <w:proofErr w:type="spellStart"/>
-      <w:r>
-        <w:rPr>
-          <w:rFonts w:asciiTheme="minorHAnsi" w:hAnsiTheme="minorHAnsi" w:cstheme="minorHAnsi"/>
-          <w:color w:val="auto"/>
-          <w:sz w:val="22"/>
-          <w:szCs w:val="22"/>
-        </w:rPr>
-        <w:t>Cdom</w:t>
-      </w:r>
-      <w:proofErr w:type="spellEnd"/>
-      <w:r>
-        <w:rPr>
-          <w:rFonts w:asciiTheme="minorHAnsi" w:hAnsiTheme="minorHAnsi" w:cstheme="minorHAnsi"/>
-          <w:color w:val="auto"/>
-          <w:sz w:val="22"/>
-          <w:szCs w:val="22"/>
-        </w:rPr>
-        <w:t xml:space="preserve">). Se obtiene sumando el puntaje de cada uno de los </w:t>
+        <w:t xml:space="preserve">n del dominio (Cdom). Se obtiene sumando el puntaje de cada uno de los </w:t>
       </w:r>
       <w:r>
         <w:rPr>
@@ -5068,27 +4959,7 @@
           <w:sz w:val="22"/>
           <w:szCs w:val="22"/>
         </w:rPr>
-        <w:t>a (</w:t>
-      </w:r>
-      <w:proofErr w:type="spellStart"/>
-      <w:r>
-        <w:rPr>
-          <w:rFonts w:asciiTheme="minorHAnsi" w:hAnsiTheme="minorHAnsi" w:cstheme="minorHAnsi"/>
-          <w:color w:val="auto"/>
-          <w:sz w:val="22"/>
-          <w:szCs w:val="22"/>
-        </w:rPr>
-        <w:t>Ccat</w:t>
-      </w:r>
-      <w:proofErr w:type="spellEnd"/>
-      <w:r>
-        <w:rPr>
-          <w:rFonts w:asciiTheme="minorHAnsi" w:hAnsiTheme="minorHAnsi" w:cstheme="minorHAnsi"/>
-          <w:color w:val="auto"/>
-          <w:sz w:val="22"/>
-          <w:szCs w:val="22"/>
-        </w:rPr>
-        <w:t xml:space="preserve">). Se obtiene sumando el puntaje de cada uno de los </w:t>
+        <w:t xml:space="preserve">a (Ccat). Se obtiene sumando el puntaje de cada uno de los </w:t>
       </w:r>
       <w:r>
         <w:rPr>
@@ -5167,27 +5038,7 @@
           <w:sz w:val="22"/>
           <w:szCs w:val="22"/>
         </w:rPr>
-        <w:t>n final del cuestionario (</w:t>
-      </w:r>
-      <w:proofErr w:type="spellStart"/>
-      <w:r>
-        <w:rPr>
-          <w:rFonts w:asciiTheme="minorHAnsi" w:hAnsiTheme="minorHAnsi" w:cstheme="minorHAnsi"/>
-          <w:color w:val="auto"/>
-          <w:sz w:val="22"/>
-          <w:szCs w:val="22"/>
-        </w:rPr>
-        <w:t>Cfinal</w:t>
-      </w:r>
-      <w:proofErr w:type="spellEnd"/>
-      <w:r>
-        <w:rPr>
-          <w:rFonts w:asciiTheme="minorHAnsi" w:hAnsiTheme="minorHAnsi" w:cstheme="minorHAnsi"/>
-          <w:color w:val="auto"/>
-          <w:sz w:val="22"/>
-          <w:szCs w:val="22"/>
-        </w:rPr>
-        <w:t xml:space="preserve">). Se obtiene sumando el puntaje de todos y cada uno de los </w:t>
+        <w:t xml:space="preserve">n final del cuestionario (Cfinal). Se obtiene sumando el puntaje de todos y cada uno de los </w:t>
       </w:r>
       <w:r>
         <w:rPr>
@@ -5679,19 +5530,31 @@
         <w:rPr>
           <w:rFonts w:cstheme="minorHAnsi"/>
         </w:rPr>
-        <w:t xml:space="preserve">n para los niveles medio, alto y muy alto, con base en la Tabla </w:t>
+        <w:t>n para los niveles medio, alto y muy alto, con base en la</w:t>
       </w:r>
       <w:r>
         <w:rPr>
           <w:rFonts w:cstheme="minorHAnsi"/>
         </w:rPr>
-        <w:t>4</w:t>
+        <w:t xml:space="preserve"> </w:t>
       </w:r>
       <w:r>
         <w:rPr>
           <w:rFonts w:cstheme="minorHAnsi"/>
         </w:rPr>
-        <w:t xml:space="preserve"> siguiente:</w:t>
+        <w:t>siguiente</w:t>
+      </w:r>
+      <w:r>
+        <w:rPr>
+          <w:rFonts w:cstheme="minorHAnsi"/>
+        </w:rPr>
+        <w:t xml:space="preserve"> tabla</w:t>
+      </w:r>
+      <w:r>
+        <w:rPr>
+          <w:rFonts w:cstheme="minorHAnsi"/>
+        </w:rPr>
+        <w:t>:</w:t>
       </w:r>
     </w:p>
     <w:p>
@@ -5988,25 +5851,7 @@
           <w:sz w:val="18"/>
           <w:szCs w:val="18"/>
         </w:rPr>
-        <w:t>gico (</w:t>
-      </w:r>
-      <w:proofErr w:type="spellStart"/>
-      <w:r>
-        <w:rPr>
-          <w:rFonts w:cstheme="minorHAnsi"/>
-          <w:sz w:val="18"/>
-          <w:szCs w:val="18"/>
-        </w:rPr>
-        <w:t>mobbing</w:t>
-      </w:r>
-      <w:proofErr w:type="spellEnd"/>
-      <w:r>
-        <w:rPr>
-          <w:rFonts w:cstheme="minorHAnsi"/>
-          <w:sz w:val="18"/>
-          <w:szCs w:val="18"/>
-        </w:rPr>
-        <w:t>), entre otros.</w:t>
+        <w:t>gico (mobbing), entre otros.</w:t>
       </w:r>
     </w:p>
     <w:p>
@@ -6132,27 +5977,7 @@
           <w:sz w:val="24"/>
           <w:szCs w:val="24"/>
         </w:rPr>
-        <w:t>${</w:t>
-      </w:r>
-      <w:proofErr w:type="spellStart"/>
-      <w:r>
-        <w:rPr>
-          <w:rFonts w:asciiTheme="minorHAnsi" w:hAnsiTheme="minorHAnsi" w:cstheme="minorHAnsi"/>
-          <w:color w:val="404040" w:themeColor="text1" w:themeTint="BF"/>
-          <w:sz w:val="24"/>
-          <w:szCs w:val="24"/>
-        </w:rPr>
-        <w:t>guia_name</w:t>
-      </w:r>
-      <w:proofErr w:type="spellEnd"/>
-      <w:r>
-        <w:rPr>
-          <w:rFonts w:asciiTheme="minorHAnsi" w:hAnsiTheme="minorHAnsi" w:cstheme="minorHAnsi"/>
-          <w:color w:val="404040" w:themeColor="text1" w:themeTint="BF"/>
-          <w:sz w:val="24"/>
-          <w:szCs w:val="24"/>
-        </w:rPr>
-        <w:t>}</w:t>
+        <w:t>${guia_name}</w:t>
       </w:r>
       <w:r>
         <w:rPr>
@@ -6254,7 +6079,6 @@
         </w:rPr>
         <w:t>${</w:t>
       </w:r>
-      <w:proofErr w:type="spellStart"/>
       <w:r>
         <w:rPr>
           <w:rFonts w:asciiTheme="minorHAnsi" w:eastAsiaTheme="minorHAnsi" w:hAnsiTheme="minorHAnsi" w:cstheme="minorHAnsi"/>
@@ -6318,7 +6142,6 @@
         </w:rPr>
         <w:t>colab</w:t>
       </w:r>
-      <w:proofErr w:type="spellEnd"/>
       <w:r>
         <w:rPr>
           <w:rFonts w:asciiTheme="minorHAnsi" w:eastAsiaTheme="minorHAnsi" w:hAnsiTheme="minorHAnsi" w:cstheme="minorHAnsi"/>
@@ -6845,7 +6668,6 @@
               </w:rPr>
               <w:t>${</w:t>
             </w:r>
-            <w:proofErr w:type="spellStart"/>
             <w:r>
               <w:rPr>
                 <w:rFonts w:asciiTheme="minorHAnsi" w:eastAsiaTheme="minorHAnsi" w:hAnsiTheme="minorHAnsi" w:cstheme="minorHAnsi"/>
@@ -6874,7 +6696,6 @@
               </w:rPr>
               <w:t>colab</w:t>
             </w:r>
-            <w:proofErr w:type="spellEnd"/>
             <w:r>
               <w:rPr>
                 <w:rFonts w:asciiTheme="minorHAnsi" w:eastAsiaTheme="minorHAnsi" w:hAnsiTheme="minorHAnsi" w:cstheme="minorHAnsi"/>
@@ -6928,9 +6749,8 @@
                 <w:szCs w:val="24"/>
                 <w:lang w:val="es-MX"/>
               </w:rPr>
-              <w:t>${</w:t>
+              <w:t>${count</w:t>
             </w:r>
-            <w:proofErr w:type="spellStart"/>
             <w:r>
               <w:rPr>
                 <w:rFonts w:asciiTheme="minorHAnsi" w:eastAsiaTheme="minorHAnsi" w:hAnsiTheme="minorHAnsi" w:cstheme="minorHAnsi"/>
@@ -6943,23 +6763,8 @@
                 <w:szCs w:val="24"/>
                 <w:lang w:val="es-MX"/>
               </w:rPr>
-              <w:t>count</w:t>
-            </w:r>
-            <w:r>
-              <w:rPr>
-                <w:rFonts w:asciiTheme="minorHAnsi" w:eastAsiaTheme="minorHAnsi" w:hAnsiTheme="minorHAnsi" w:cstheme="minorHAnsi"/>
-                <w:bCs/>
-                <w:i/>
-                <w:iCs/>
-                <w:color w:val="auto"/>
-                <w:kern w:val="0"/>
-                <w:sz w:val="24"/>
-                <w:szCs w:val="24"/>
-                <w:lang w:val="es-MX"/>
-              </w:rPr>
               <w:t>_eva</w:t>
             </w:r>
-            <w:proofErr w:type="spellEnd"/>
             <w:r>
               <w:rPr>
                 <w:rFonts w:asciiTheme="minorHAnsi" w:eastAsiaTheme="minorHAnsi" w:hAnsiTheme="minorHAnsi" w:cstheme="minorHAnsi"/>
@@ -7054,9 +6859,8 @@
                 <w:szCs w:val="24"/>
                 <w:lang w:val="es-MX"/>
               </w:rPr>
-              <w:t>${</w:t>
+              <w:t>${count_</w:t>
             </w:r>
-            <w:proofErr w:type="spellStart"/>
             <w:r>
               <w:rPr>
                 <w:rFonts w:asciiTheme="minorHAnsi" w:eastAsiaTheme="minorHAnsi" w:hAnsiTheme="minorHAnsi" w:cstheme="minorHAnsi"/>
@@ -7069,23 +6873,8 @@
                 <w:szCs w:val="24"/>
                 <w:lang w:val="es-MX"/>
               </w:rPr>
-              <w:t>count_</w:t>
-            </w:r>
-            <w:r>
-              <w:rPr>
-                <w:rFonts w:asciiTheme="minorHAnsi" w:eastAsiaTheme="minorHAnsi" w:hAnsiTheme="minorHAnsi" w:cstheme="minorHAnsi"/>
-                <w:bCs/>
-                <w:i/>
-                <w:iCs/>
-                <w:color w:val="auto"/>
-                <w:kern w:val="0"/>
-                <w:sz w:val="24"/>
-                <w:szCs w:val="24"/>
-                <w:lang w:val="es-MX"/>
-              </w:rPr>
               <w:t>eva</w:t>
             </w:r>
-            <w:proofErr w:type="spellEnd"/>
             <w:r>
               <w:rPr>
                 <w:rFonts w:asciiTheme="minorHAnsi" w:eastAsiaTheme="minorHAnsi" w:hAnsiTheme="minorHAnsi" w:cstheme="minorHAnsi"/>
@@ -7472,33 +7261,7 @@
                 <w:szCs w:val="24"/>
                 <w:lang w:val="es-MX"/>
               </w:rPr>
-              <w:t>${</w:t>
-            </w:r>
-            <w:proofErr w:type="spellStart"/>
-            <w:r>
-              <w:rPr>
-                <w:rFonts w:asciiTheme="minorHAnsi" w:eastAsiaTheme="minorHAnsi" w:hAnsiTheme="minorHAnsi" w:cstheme="minorHAnsi"/>
-                <w:bCs/>
-                <w:color w:val="auto"/>
-                <w:kern w:val="0"/>
-                <w:sz w:val="24"/>
-                <w:szCs w:val="24"/>
-                <w:lang w:val="es-MX"/>
-              </w:rPr>
-              <w:t>cali</w:t>
-            </w:r>
-            <w:proofErr w:type="spellEnd"/>
-            <w:r>
-              <w:rPr>
-                <w:rFonts w:asciiTheme="minorHAnsi" w:eastAsiaTheme="minorHAnsi" w:hAnsiTheme="minorHAnsi" w:cstheme="minorHAnsi"/>
-                <w:bCs/>
-                <w:color w:val="auto"/>
-                <w:kern w:val="0"/>
-                <w:sz w:val="24"/>
-                <w:szCs w:val="24"/>
-                <w:lang w:val="es-MX"/>
-              </w:rPr>
-              <w:t>}</w:t>
+              <w:t>${cali}</w:t>
             </w:r>
           </w:p>
         </w:tc>
@@ -7674,35 +7437,7 @@
           <w:szCs w:val="24"/>
           <w:lang w:val="es-MX"/>
         </w:rPr>
-        <w:t>${riesgo} (${</w:t>
-      </w:r>
-      <w:proofErr w:type="spellStart"/>
-      <w:r>
-        <w:rPr>
-          <w:rFonts w:asciiTheme="minorHAnsi" w:eastAsiaTheme="minorHAnsi" w:hAnsiTheme="minorHAnsi" w:cstheme="minorHAnsi"/>
-          <w:i/>
-          <w:iCs/>
-          <w:color w:val="auto"/>
-          <w:kern w:val="0"/>
-          <w:sz w:val="24"/>
-          <w:szCs w:val="24"/>
-          <w:lang w:val="es-MX"/>
-        </w:rPr>
-        <w:t>cali</w:t>
-      </w:r>
-      <w:proofErr w:type="spellEnd"/>
-      <w:r>
-        <w:rPr>
-          <w:rFonts w:asciiTheme="minorHAnsi" w:eastAsiaTheme="minorHAnsi" w:hAnsiTheme="minorHAnsi" w:cstheme="minorHAnsi"/>
-          <w:i/>
-          <w:iCs/>
-          <w:color w:val="auto"/>
-          <w:kern w:val="0"/>
-          <w:sz w:val="24"/>
-          <w:szCs w:val="24"/>
-          <w:lang w:val="es-MX"/>
-        </w:rPr>
-        <w:t>})</w:t>
+        <w:t>${riesgo} (${cali})</w:t>
       </w:r>
     </w:p>
     <w:p>
@@ -7878,31 +7613,7 @@
           <w:sz w:val="24"/>
           <w:szCs w:val="24"/>
         </w:rPr>
-        <w:t>${</w:t>
-      </w:r>
-      <w:proofErr w:type="spellStart"/>
-      <w:r>
-        <w:rPr>
-          <w:rFonts w:cstheme="minorHAnsi"/>
-          <w:bCs/>
-          <w:i/>
-          <w:iCs/>
-          <w:sz w:val="24"/>
-          <w:szCs w:val="24"/>
-        </w:rPr>
-        <w:t>determinacion</w:t>
-      </w:r>
-      <w:proofErr w:type="spellEnd"/>
-      <w:r>
-        <w:rPr>
-          <w:rFonts w:cstheme="minorHAnsi"/>
-          <w:bCs/>
-          <w:i/>
-          <w:iCs/>
-          <w:sz w:val="24"/>
-          <w:szCs w:val="24"/>
-        </w:rPr>
-        <w:t>}</w:t>
+        <w:t>${determinacion}</w:t>
       </w:r>
     </w:p>
     <w:p>
@@ -8423,7 +8134,6 @@
               </w:rPr>
               <w:t>${</w:t>
             </w:r>
-            <w:proofErr w:type="spellStart"/>
             <w:r>
               <w:rPr>
                 <w:rFonts w:asciiTheme="minorHAnsi" w:eastAsiaTheme="minorEastAsia" w:hAnsiTheme="minorHAnsi" w:cstheme="minorBidi"/>
@@ -8436,7 +8146,6 @@
               </w:rPr>
               <w:t>total_vh</w:t>
             </w:r>
-            <w:proofErr w:type="spellEnd"/>
             <w:r>
               <w:rPr>
                 <w:rFonts w:asciiTheme="minorHAnsi" w:eastAsiaTheme="minorEastAsia" w:hAnsiTheme="minorHAnsi" w:cstheme="minorBidi"/>
@@ -8484,7 +8193,6 @@
               </w:rPr>
               <w:t>${</w:t>
             </w:r>
-            <w:proofErr w:type="spellStart"/>
             <w:r>
               <w:rPr>
                 <w:rFonts w:asciiTheme="minorHAnsi" w:eastAsiaTheme="minorEastAsia" w:hAnsiTheme="minorHAnsi" w:cstheme="minorBidi"/>
@@ -8497,7 +8205,6 @@
               </w:rPr>
               <w:t>total_h</w:t>
             </w:r>
-            <w:proofErr w:type="spellEnd"/>
             <w:r>
               <w:rPr>
                 <w:rFonts w:asciiTheme="minorHAnsi" w:eastAsiaTheme="minorEastAsia" w:hAnsiTheme="minorHAnsi" w:cstheme="minorBidi"/>
@@ -8545,7 +8252,6 @@
               </w:rPr>
               <w:t>${</w:t>
             </w:r>
-            <w:proofErr w:type="spellStart"/>
             <w:r>
               <w:rPr>
                 <w:rFonts w:asciiTheme="minorHAnsi" w:eastAsiaTheme="minorEastAsia" w:hAnsiTheme="minorHAnsi" w:cstheme="minorBidi"/>
@@ -8558,7 +8264,6 @@
               </w:rPr>
               <w:t>total_m</w:t>
             </w:r>
-            <w:proofErr w:type="spellEnd"/>
             <w:r>
               <w:rPr>
                 <w:rFonts w:asciiTheme="minorHAnsi" w:eastAsiaTheme="minorEastAsia" w:hAnsiTheme="minorHAnsi" w:cstheme="minorBidi"/>
@@ -8606,7 +8311,6 @@
               </w:rPr>
               <w:t>${</w:t>
             </w:r>
-            <w:proofErr w:type="spellStart"/>
             <w:r>
               <w:rPr>
                 <w:rFonts w:asciiTheme="minorHAnsi" w:eastAsiaTheme="minorEastAsia" w:hAnsiTheme="minorHAnsi" w:cstheme="minorBidi"/>
@@ -8619,7 +8323,6 @@
               </w:rPr>
               <w:t>total_b</w:t>
             </w:r>
-            <w:proofErr w:type="spellEnd"/>
             <w:r>
               <w:rPr>
                 <w:rFonts w:asciiTheme="minorHAnsi" w:eastAsiaTheme="minorEastAsia" w:hAnsiTheme="minorHAnsi" w:cstheme="minorBidi"/>
@@ -8667,7 +8370,6 @@
               </w:rPr>
               <w:t>${</w:t>
             </w:r>
-            <w:proofErr w:type="spellStart"/>
             <w:r>
               <w:rPr>
                 <w:rFonts w:asciiTheme="minorHAnsi" w:eastAsiaTheme="minorEastAsia" w:hAnsiTheme="minorHAnsi" w:cstheme="minorBidi"/>
@@ -8680,7 +8382,6 @@
               </w:rPr>
               <w:t>total_n</w:t>
             </w:r>
-            <w:proofErr w:type="spellEnd"/>
             <w:r>
               <w:rPr>
                 <w:rFonts w:asciiTheme="minorHAnsi" w:eastAsiaTheme="minorEastAsia" w:hAnsiTheme="minorHAnsi" w:cstheme="minorBidi"/>
@@ -8776,7 +8477,6 @@
         </w:rPr>
         <w:t>${</w:t>
       </w:r>
-      <w:proofErr w:type="spellStart"/>
       <w:r>
         <w:rPr>
           <w:rFonts w:asciiTheme="minorHAnsi" w:eastAsiaTheme="minorHAnsi" w:hAnsiTheme="minorHAnsi" w:cstheme="minorHAnsi"/>
@@ -8789,7 +8489,6 @@
         </w:rPr>
         <w:t>chart_gen</w:t>
       </w:r>
-      <w:proofErr w:type="spellEnd"/>
       <w:r>
         <w:rPr>
           <w:rFonts w:asciiTheme="minorHAnsi" w:eastAsiaTheme="minorHAnsi" w:hAnsiTheme="minorHAnsi" w:cstheme="minorHAnsi"/>
@@ -9644,33 +9343,7 @@
                 <w:szCs w:val="22"/>
                 <w:lang w:val="es-MX"/>
               </w:rPr>
-              <w:t>${</w:t>
-            </w:r>
-            <w:proofErr w:type="spellStart"/>
-            <w:r>
-              <w:rPr>
-                <w:rFonts w:asciiTheme="minorHAnsi" w:eastAsiaTheme="minorHAnsi" w:hAnsiTheme="minorHAnsi" w:cstheme="minorHAnsi"/>
-                <w:b w:val="0"/>
-                <w:color w:val="auto"/>
-                <w:kern w:val="0"/>
-                <w:sz w:val="22"/>
-                <w:szCs w:val="22"/>
-                <w:lang w:val="es-MX"/>
-              </w:rPr>
-              <w:t>cat_name</w:t>
-            </w:r>
-            <w:proofErr w:type="spellEnd"/>
-            <w:r>
-              <w:rPr>
-                <w:rFonts w:asciiTheme="minorHAnsi" w:eastAsiaTheme="minorHAnsi" w:hAnsiTheme="minorHAnsi" w:cstheme="minorHAnsi"/>
-                <w:b w:val="0"/>
-                <w:color w:val="auto"/>
-                <w:kern w:val="0"/>
-                <w:sz w:val="22"/>
-                <w:szCs w:val="22"/>
-                <w:lang w:val="es-MX"/>
-              </w:rPr>
-              <w:t>}</w:t>
+              <w:t>${cat_name}</w:t>
             </w:r>
           </w:p>
         </w:tc>
@@ -9704,33 +9377,7 @@
                 <w:szCs w:val="22"/>
                 <w:lang w:val="es-MX"/>
               </w:rPr>
-              <w:t>${</w:t>
-            </w:r>
-            <w:proofErr w:type="spellStart"/>
-            <w:r>
-              <w:rPr>
-                <w:rFonts w:asciiTheme="minorHAnsi" w:eastAsiaTheme="minorEastAsia" w:hAnsiTheme="minorHAnsi" w:cstheme="minorBidi"/>
-                <w:b w:val="0"/>
-                <w:color w:val="auto"/>
-                <w:kern w:val="0"/>
-                <w:sz w:val="22"/>
-                <w:szCs w:val="22"/>
-                <w:lang w:val="es-MX"/>
-              </w:rPr>
-              <w:t>cat_cal</w:t>
-            </w:r>
-            <w:proofErr w:type="spellEnd"/>
-            <w:r>
-              <w:rPr>
-                <w:rFonts w:asciiTheme="minorHAnsi" w:eastAsiaTheme="minorEastAsia" w:hAnsiTheme="minorHAnsi" w:cstheme="minorBidi"/>
-                <w:b w:val="0"/>
-                <w:color w:val="auto"/>
-                <w:kern w:val="0"/>
-                <w:sz w:val="22"/>
-                <w:szCs w:val="22"/>
-                <w:lang w:val="es-MX"/>
-              </w:rPr>
-              <w:t>}</w:t>
+              <w:t>${cat_cal}</w:t>
             </w:r>
           </w:p>
         </w:tc>
@@ -9764,33 +9411,7 @@
                 <w:szCs w:val="22"/>
                 <w:lang w:val="es-MX"/>
               </w:rPr>
-              <w:t>${</w:t>
-            </w:r>
-            <w:proofErr w:type="spellStart"/>
-            <w:r>
-              <w:rPr>
-                <w:rFonts w:asciiTheme="minorHAnsi" w:eastAsiaTheme="minorHAnsi" w:hAnsiTheme="minorHAnsi" w:cstheme="minorHAnsi"/>
-                <w:b w:val="0"/>
-                <w:color w:val="auto"/>
-                <w:kern w:val="0"/>
-                <w:sz w:val="22"/>
-                <w:szCs w:val="22"/>
-                <w:lang w:val="es-MX"/>
-              </w:rPr>
-              <w:t>cat_nivel</w:t>
-            </w:r>
-            <w:proofErr w:type="spellEnd"/>
-            <w:r>
-              <w:rPr>
-                <w:rFonts w:asciiTheme="minorHAnsi" w:eastAsiaTheme="minorHAnsi" w:hAnsiTheme="minorHAnsi" w:cstheme="minorHAnsi"/>
-                <w:b w:val="0"/>
-                <w:color w:val="auto"/>
-                <w:kern w:val="0"/>
-                <w:sz w:val="22"/>
-                <w:szCs w:val="22"/>
-                <w:lang w:val="es-MX"/>
-              </w:rPr>
-              <w:t>}</w:t>
+              <w:t>${cat_nivel}</w:t>
             </w:r>
           </w:p>
         </w:tc>
@@ -9880,31 +9501,7 @@
           <w:szCs w:val="24"/>
           <w:lang w:val="es-MX"/>
         </w:rPr>
-        <w:t>${</w:t>
-      </w:r>
-      <w:proofErr w:type="spellStart"/>
-      <w:r>
-        <w:rPr>
-          <w:rFonts w:asciiTheme="minorHAnsi" w:eastAsiaTheme="minorHAnsi" w:hAnsiTheme="minorHAnsi" w:cstheme="minorHAnsi"/>
-          <w:bCs/>
-          <w:kern w:val="0"/>
-          <w:sz w:val="24"/>
-          <w:szCs w:val="24"/>
-          <w:lang w:val="es-MX"/>
-        </w:rPr>
-        <w:t>det_cat_mas_alta</w:t>
-      </w:r>
-      <w:proofErr w:type="spellEnd"/>
-      <w:r>
-        <w:rPr>
-          <w:rFonts w:asciiTheme="minorHAnsi" w:eastAsiaTheme="minorHAnsi" w:hAnsiTheme="minorHAnsi" w:cstheme="minorHAnsi"/>
-          <w:bCs/>
-          <w:kern w:val="0"/>
-          <w:sz w:val="24"/>
-          <w:szCs w:val="24"/>
-          <w:lang w:val="es-MX"/>
-        </w:rPr>
-        <w:t>}</w:t>
+        <w:t>${det_cat_mas_alta}</w:t>
       </w:r>
       <w:r>
         <w:rPr>
@@ -9954,33 +9551,7 @@
           <w:szCs w:val="24"/>
           <w:lang w:val="es-MX"/>
         </w:rPr>
-        <w:t>${</w:t>
-      </w:r>
-      <w:proofErr w:type="spellStart"/>
-      <w:r>
-        <w:rPr>
-          <w:rFonts w:asciiTheme="minorHAnsi" w:eastAsiaTheme="minorHAnsi" w:hAnsiTheme="minorHAnsi" w:cstheme="minorHAnsi"/>
-          <w:b w:val="0"/>
-          <w:color w:val="auto"/>
-          <w:kern w:val="0"/>
-          <w:sz w:val="24"/>
-          <w:szCs w:val="24"/>
-          <w:lang w:val="es-MX"/>
-        </w:rPr>
-        <w:t>level_cat_mas_alta</w:t>
-      </w:r>
-      <w:proofErr w:type="spellEnd"/>
-      <w:r>
-        <w:rPr>
-          <w:rFonts w:asciiTheme="minorHAnsi" w:eastAsiaTheme="minorHAnsi" w:hAnsiTheme="minorHAnsi" w:cstheme="minorHAnsi"/>
-          <w:b w:val="0"/>
-          <w:color w:val="auto"/>
-          <w:kern w:val="0"/>
-          <w:sz w:val="24"/>
-          <w:szCs w:val="24"/>
-          <w:lang w:val="es-MX"/>
-        </w:rPr>
-        <w:t>}</w:t>
+        <w:t>${level_cat_mas_alta}</w:t>
       </w:r>
       <w:r>
         <w:rPr>
@@ -10161,33 +9732,7 @@
                 <w:szCs w:val="24"/>
                 <w:lang w:val="es-MX"/>
               </w:rPr>
-              <w:t>${</w:t>
-            </w:r>
-            <w:proofErr w:type="spellStart"/>
-            <w:r>
-              <w:rPr>
-                <w:rFonts w:asciiTheme="minorHAnsi" w:eastAsiaTheme="minorHAnsi" w:hAnsiTheme="minorHAnsi" w:cstheme="minorHAnsi"/>
-                <w:b w:val="0"/>
-                <w:color w:val="auto"/>
-                <w:kern w:val="0"/>
-                <w:sz w:val="24"/>
-                <w:szCs w:val="24"/>
-                <w:lang w:val="es-MX"/>
-              </w:rPr>
-              <w:t>colab_name</w:t>
-            </w:r>
-            <w:proofErr w:type="spellEnd"/>
-            <w:r>
-              <w:rPr>
-                <w:rFonts w:asciiTheme="minorHAnsi" w:eastAsiaTheme="minorHAnsi" w:hAnsiTheme="minorHAnsi" w:cstheme="minorHAnsi"/>
-                <w:b w:val="0"/>
-                <w:color w:val="auto"/>
-                <w:kern w:val="0"/>
-                <w:sz w:val="24"/>
-                <w:szCs w:val="24"/>
-                <w:lang w:val="es-MX"/>
-              </w:rPr>
-              <w:t>}</w:t>
+              <w:t>${colab_name}</w:t>
             </w:r>
           </w:p>
         </w:tc>
@@ -10221,33 +9766,7 @@
                 <w:szCs w:val="24"/>
                 <w:lang w:val="es-MX"/>
               </w:rPr>
-              <w:t>${</w:t>
-            </w:r>
-            <w:proofErr w:type="spellStart"/>
-            <w:r>
-              <w:rPr>
-                <w:rFonts w:asciiTheme="minorHAnsi" w:eastAsiaTheme="minorHAnsi" w:hAnsiTheme="minorHAnsi" w:cstheme="minorHAnsi"/>
-                <w:b w:val="0"/>
-                <w:color w:val="auto"/>
-                <w:kern w:val="0"/>
-                <w:sz w:val="24"/>
-                <w:szCs w:val="24"/>
-                <w:lang w:val="es-MX"/>
-              </w:rPr>
-              <w:t>colab_score</w:t>
-            </w:r>
-            <w:proofErr w:type="spellEnd"/>
-            <w:r>
-              <w:rPr>
-                <w:rFonts w:asciiTheme="minorHAnsi" w:eastAsiaTheme="minorHAnsi" w:hAnsiTheme="minorHAnsi" w:cstheme="minorHAnsi"/>
-                <w:b w:val="0"/>
-                <w:color w:val="auto"/>
-                <w:kern w:val="0"/>
-                <w:sz w:val="24"/>
-                <w:szCs w:val="24"/>
-                <w:lang w:val="es-MX"/>
-              </w:rPr>
-              <w:t>}</w:t>
+              <w:t>${colab_score}</w:t>
             </w:r>
           </w:p>
         </w:tc>
@@ -10281,33 +9800,7 @@
                 <w:szCs w:val="24"/>
                 <w:lang w:val="es-MX"/>
               </w:rPr>
-              <w:t>${</w:t>
-            </w:r>
-            <w:proofErr w:type="spellStart"/>
-            <w:r>
-              <w:rPr>
-                <w:rFonts w:asciiTheme="minorHAnsi" w:eastAsiaTheme="minorHAnsi" w:hAnsiTheme="minorHAnsi" w:cstheme="minorHAnsi"/>
-                <w:b w:val="0"/>
-                <w:color w:val="auto"/>
-                <w:kern w:val="0"/>
-                <w:sz w:val="24"/>
-                <w:szCs w:val="24"/>
-                <w:lang w:val="es-MX"/>
-              </w:rPr>
-              <w:t>colab_level</w:t>
-            </w:r>
-            <w:proofErr w:type="spellEnd"/>
-            <w:r>
-              <w:rPr>
-                <w:rFonts w:asciiTheme="minorHAnsi" w:eastAsiaTheme="minorHAnsi" w:hAnsiTheme="minorHAnsi" w:cstheme="minorHAnsi"/>
-                <w:b w:val="0"/>
-                <w:color w:val="auto"/>
-                <w:kern w:val="0"/>
-                <w:sz w:val="24"/>
-                <w:szCs w:val="24"/>
-                <w:lang w:val="es-MX"/>
-              </w:rPr>
-              <w:t>}</w:t>
+              <w:t>${colab_level}</w:t>
             </w:r>
           </w:p>
         </w:tc>
@@ -10744,7 +10237,6 @@
               </w:rPr>
               <w:t>${</w:t>
             </w:r>
-            <w:proofErr w:type="spellStart"/>
             <w:r>
               <w:rPr>
                 <w:rFonts w:asciiTheme="minorHAnsi" w:eastAsiaTheme="minorHAnsi" w:hAnsiTheme="minorHAnsi" w:cstheme="minorHAnsi"/>
@@ -10769,7 +10261,6 @@
               </w:rPr>
               <w:t>_name</w:t>
             </w:r>
-            <w:proofErr w:type="spellEnd"/>
             <w:r>
               <w:rPr>
                 <w:rFonts w:asciiTheme="minorHAnsi" w:eastAsiaTheme="minorHAnsi" w:hAnsiTheme="minorHAnsi" w:cstheme="minorHAnsi"/>
@@ -10818,7 +10309,6 @@
               </w:rPr>
               <w:t>${</w:t>
             </w:r>
-            <w:proofErr w:type="spellStart"/>
             <w:r>
               <w:rPr>
                 <w:rFonts w:asciiTheme="minorHAnsi" w:hAnsiTheme="minorHAnsi" w:cstheme="minorHAnsi"/>
@@ -10830,7 +10320,6 @@
               </w:rPr>
               <w:t>cat_very_high</w:t>
             </w:r>
-            <w:proofErr w:type="spellEnd"/>
             <w:r>
               <w:rPr>
                 <w:rFonts w:asciiTheme="minorHAnsi" w:eastAsiaTheme="minorHAnsi" w:hAnsiTheme="minorHAnsi" w:cstheme="minorHAnsi"/>
@@ -10884,7 +10373,6 @@
               </w:rPr>
               <w:t>${</w:t>
             </w:r>
-            <w:proofErr w:type="spellStart"/>
             <w:r>
               <w:rPr>
                 <w:rFonts w:asciiTheme="minorHAnsi" w:eastAsiaTheme="minorHAnsi" w:hAnsiTheme="minorHAnsi" w:cstheme="minorHAnsi"/>
@@ -10899,7 +10387,6 @@
               </w:rPr>
               <w:t>cat_high</w:t>
             </w:r>
-            <w:proofErr w:type="spellEnd"/>
             <w:r>
               <w:rPr>
                 <w:rFonts w:asciiTheme="minorHAnsi" w:eastAsiaTheme="minorHAnsi" w:hAnsiTheme="minorHAnsi" w:cstheme="minorHAnsi"/>
@@ -10953,7 +10440,6 @@
               </w:rPr>
               <w:t>${</w:t>
             </w:r>
-            <w:proofErr w:type="spellStart"/>
             <w:r>
               <w:rPr>
                 <w:rFonts w:asciiTheme="minorHAnsi" w:eastAsiaTheme="minorHAnsi" w:hAnsiTheme="minorHAnsi" w:cstheme="minorHAnsi"/>
@@ -10982,7 +10468,6 @@
               </w:rPr>
               <w:t>at_medium</w:t>
             </w:r>
-            <w:proofErr w:type="spellEnd"/>
             <w:r>
               <w:rPr>
                 <w:rFonts w:asciiTheme="minorHAnsi" w:eastAsiaTheme="minorHAnsi" w:hAnsiTheme="minorHAnsi" w:cstheme="minorHAnsi"/>
@@ -11036,7 +10521,6 @@
               </w:rPr>
               <w:t>${</w:t>
             </w:r>
-            <w:proofErr w:type="spellStart"/>
             <w:r>
               <w:rPr>
                 <w:rFonts w:asciiTheme="minorHAnsi" w:eastAsiaTheme="minorHAnsi" w:hAnsiTheme="minorHAnsi" w:cstheme="minorHAnsi"/>
@@ -11065,7 +10549,6 @@
               </w:rPr>
               <w:t>at_low</w:t>
             </w:r>
-            <w:proofErr w:type="spellEnd"/>
             <w:r>
               <w:rPr>
                 <w:rFonts w:asciiTheme="minorHAnsi" w:eastAsiaTheme="minorHAnsi" w:hAnsiTheme="minorHAnsi" w:cstheme="minorHAnsi"/>
@@ -11116,7 +10599,6 @@
               </w:rPr>
               <w:t>${</w:t>
             </w:r>
-            <w:proofErr w:type="spellStart"/>
             <w:r>
               <w:rPr>
                 <w:rFonts w:asciiTheme="minorHAnsi" w:hAnsiTheme="minorHAnsi" w:cstheme="minorHAnsi"/>
@@ -11128,7 +10610,6 @@
               </w:rPr>
               <w:t>cat_null</w:t>
             </w:r>
-            <w:proofErr w:type="spellEnd"/>
             <w:r>
               <w:rPr>
                 <w:rFonts w:asciiTheme="minorHAnsi" w:eastAsiaTheme="minorHAnsi" w:hAnsiTheme="minorHAnsi" w:cstheme="minorHAnsi"/>
@@ -11926,33 +11407,7 @@
                 <w:szCs w:val="22"/>
                 <w:lang w:val="es-MX"/>
               </w:rPr>
-              <w:t>${</w:t>
-            </w:r>
-            <w:proofErr w:type="spellStart"/>
-            <w:r>
-              <w:rPr>
-                <w:rFonts w:asciiTheme="minorHAnsi" w:eastAsiaTheme="minorHAnsi" w:hAnsiTheme="minorHAnsi" w:cstheme="minorHAnsi"/>
-                <w:b w:val="0"/>
-                <w:color w:val="auto"/>
-                <w:kern w:val="0"/>
-                <w:sz w:val="22"/>
-                <w:szCs w:val="22"/>
-                <w:lang w:val="es-MX"/>
-              </w:rPr>
-              <w:t>dom_name</w:t>
-            </w:r>
-            <w:proofErr w:type="spellEnd"/>
-            <w:r>
-              <w:rPr>
-                <w:rFonts w:asciiTheme="minorHAnsi" w:eastAsiaTheme="minorHAnsi" w:hAnsiTheme="minorHAnsi" w:cstheme="minorHAnsi"/>
-                <w:b w:val="0"/>
-                <w:color w:val="auto"/>
-                <w:kern w:val="0"/>
-                <w:sz w:val="22"/>
-                <w:szCs w:val="22"/>
-                <w:lang w:val="es-MX"/>
-              </w:rPr>
-              <w:t>}</w:t>
+              <w:t>${dom_name}</w:t>
             </w:r>
           </w:p>
         </w:tc>
@@ -11986,33 +11441,7 @@
                 <w:szCs w:val="22"/>
                 <w:lang w:val="es-MX"/>
               </w:rPr>
-              <w:t>${</w:t>
-            </w:r>
-            <w:proofErr w:type="spellStart"/>
-            <w:r>
-              <w:rPr>
-                <w:rFonts w:asciiTheme="minorHAnsi" w:eastAsiaTheme="minorEastAsia" w:hAnsiTheme="minorHAnsi" w:cstheme="minorBidi"/>
-                <w:b w:val="0"/>
-                <w:color w:val="auto"/>
-                <w:kern w:val="0"/>
-                <w:sz w:val="22"/>
-                <w:szCs w:val="22"/>
-                <w:lang w:val="es-MX"/>
-              </w:rPr>
-              <w:t>dom_cal</w:t>
-            </w:r>
-            <w:proofErr w:type="spellEnd"/>
-            <w:r>
-              <w:rPr>
-                <w:rFonts w:asciiTheme="minorHAnsi" w:eastAsiaTheme="minorEastAsia" w:hAnsiTheme="minorHAnsi" w:cstheme="minorBidi"/>
-                <w:b w:val="0"/>
-                <w:color w:val="auto"/>
-                <w:kern w:val="0"/>
-                <w:sz w:val="22"/>
-                <w:szCs w:val="22"/>
-                <w:lang w:val="es-MX"/>
-              </w:rPr>
-              <w:t>}</w:t>
+              <w:t>${dom_cal}</w:t>
             </w:r>
           </w:p>
         </w:tc>
@@ -12046,33 +11475,7 @@
                 <w:szCs w:val="22"/>
                 <w:lang w:val="es-MX"/>
               </w:rPr>
-              <w:t>${</w:t>
-            </w:r>
-            <w:proofErr w:type="spellStart"/>
-            <w:r>
-              <w:rPr>
-                <w:rFonts w:asciiTheme="minorHAnsi" w:eastAsiaTheme="minorEastAsia" w:hAnsiTheme="minorHAnsi" w:cstheme="minorBidi"/>
-                <w:b w:val="0"/>
-                <w:color w:val="auto"/>
-                <w:kern w:val="0"/>
-                <w:sz w:val="22"/>
-                <w:szCs w:val="22"/>
-                <w:lang w:val="es-MX"/>
-              </w:rPr>
-              <w:t>dom_nivel</w:t>
-            </w:r>
-            <w:proofErr w:type="spellEnd"/>
-            <w:r>
-              <w:rPr>
-                <w:rFonts w:asciiTheme="minorHAnsi" w:eastAsiaTheme="minorEastAsia" w:hAnsiTheme="minorHAnsi" w:cstheme="minorBidi"/>
-                <w:b w:val="0"/>
-                <w:color w:val="auto"/>
-                <w:kern w:val="0"/>
-                <w:sz w:val="22"/>
-                <w:szCs w:val="22"/>
-                <w:lang w:val="es-MX"/>
-              </w:rPr>
-              <w:t>}</w:t>
+              <w:t>${dom_nivel}</w:t>
             </w:r>
           </w:p>
         </w:tc>
@@ -12496,9 +11899,8 @@
                 <w:szCs w:val="16"/>
                 <w:lang w:val="es-MX"/>
               </w:rPr>
-              <w:t>${</w:t>
+              <w:t>${dom</w:t>
             </w:r>
-            <w:proofErr w:type="spellStart"/>
             <w:r>
               <w:rPr>
                 <w:rFonts w:asciiTheme="minorHAnsi" w:eastAsiaTheme="minorHAnsi" w:hAnsiTheme="minorHAnsi" w:cstheme="minorHAnsi"/>
@@ -12509,7 +11911,7 @@
                 <w:szCs w:val="16"/>
                 <w:lang w:val="es-MX"/>
               </w:rPr>
-              <w:t>dom</w:t>
+              <w:t>_list</w:t>
             </w:r>
             <w:r>
               <w:rPr>
@@ -12521,32 +11923,7 @@
                 <w:szCs w:val="16"/>
                 <w:lang w:val="es-MX"/>
               </w:rPr>
-              <w:t>_list</w:t>
-            </w:r>
-            <w:r>
-              <w:rPr>
-                <w:rFonts w:asciiTheme="minorHAnsi" w:eastAsiaTheme="minorHAnsi" w:hAnsiTheme="minorHAnsi" w:cstheme="minorHAnsi"/>
-                <w:b w:val="0"/>
-                <w:color w:val="auto"/>
-                <w:kern w:val="0"/>
-                <w:sz w:val="16"/>
-                <w:szCs w:val="16"/>
-                <w:lang w:val="es-MX"/>
-              </w:rPr>
-              <w:t>_name</w:t>
-            </w:r>
-            <w:proofErr w:type="spellEnd"/>
-            <w:r>
-              <w:rPr>
-                <w:rFonts w:asciiTheme="minorHAnsi" w:eastAsiaTheme="minorHAnsi" w:hAnsiTheme="minorHAnsi" w:cstheme="minorHAnsi"/>
-                <w:b w:val="0"/>
-                <w:color w:val="auto"/>
-                <w:kern w:val="0"/>
-                <w:sz w:val="16"/>
-                <w:szCs w:val="16"/>
-                <w:lang w:val="es-MX"/>
-              </w:rPr>
-              <w:t>}</w:t>
+              <w:t>_name}</w:t>
             </w:r>
           </w:p>
         </w:tc>
@@ -12598,24 +11975,8 @@
                 <w:szCs w:val="16"/>
                 <w:lang w:val="es-MX"/>
               </w:rPr>
-              <w:t>{</w:t>
+              <w:t>{dom_very_high</w:t>
             </w:r>
-            <w:proofErr w:type="spellStart"/>
-            <w:r>
-              <w:rPr>
-                <w:rFonts w:asciiTheme="minorHAnsi" w:eastAsiaTheme="minorHAnsi" w:hAnsiTheme="minorHAnsi" w:cstheme="minorHAnsi"/>
-                <w:bCs/>
-                <w:i/>
-                <w:iCs/>
-                <w:color w:val="auto"/>
-                <w:kern w:val="0"/>
-                <w:sz w:val="16"/>
-                <w:szCs w:val="16"/>
-                <w:lang w:val="es-MX"/>
-              </w:rPr>
-              <w:t>dom_very_high</w:t>
-            </w:r>
-            <w:proofErr w:type="spellEnd"/>
             <w:r>
               <w:rPr>
                 <w:rFonts w:asciiTheme="minorHAnsi" w:eastAsiaTheme="minorHAnsi" w:hAnsiTheme="minorHAnsi" w:cstheme="minorHAnsi"/>
@@ -12668,7 +12029,6 @@
               </w:rPr>
               <w:t>${</w:t>
             </w:r>
-            <w:proofErr w:type="spellStart"/>
             <w:r>
               <w:rPr>
                 <w:rFonts w:asciiTheme="minorHAnsi" w:eastAsiaTheme="minorHAnsi" w:hAnsiTheme="minorHAnsi" w:cstheme="minorHAnsi"/>
@@ -12683,7 +12043,6 @@
               </w:rPr>
               <w:t>dom_high</w:t>
             </w:r>
-            <w:proofErr w:type="spellEnd"/>
             <w:r>
               <w:rPr>
                 <w:rFonts w:asciiTheme="minorHAnsi" w:eastAsiaTheme="minorHAnsi" w:hAnsiTheme="minorHAnsi" w:cstheme="minorHAnsi"/>
@@ -12736,7 +12095,6 @@
               </w:rPr>
               <w:t>${</w:t>
             </w:r>
-            <w:proofErr w:type="spellStart"/>
             <w:r>
               <w:rPr>
                 <w:rFonts w:asciiTheme="minorHAnsi" w:eastAsiaTheme="minorHAnsi" w:hAnsiTheme="minorHAnsi" w:cstheme="minorHAnsi"/>
@@ -12807,7 +12165,6 @@
               </w:rPr>
               <w:t>edium</w:t>
             </w:r>
-            <w:proofErr w:type="spellEnd"/>
             <w:r>
               <w:rPr>
                 <w:rFonts w:asciiTheme="minorHAnsi" w:eastAsiaTheme="minorHAnsi" w:hAnsiTheme="minorHAnsi" w:cstheme="minorHAnsi"/>
@@ -12858,9 +12215,8 @@
                 <w:szCs w:val="16"/>
                 <w:lang w:val="es-MX"/>
               </w:rPr>
-              <w:t>${</w:t>
+              <w:t>${dom</w:t>
             </w:r>
-            <w:proofErr w:type="spellStart"/>
             <w:r>
               <w:rPr>
                 <w:rFonts w:asciiTheme="minorHAnsi" w:eastAsiaTheme="minorHAnsi" w:hAnsiTheme="minorHAnsi" w:cstheme="minorHAnsi"/>
@@ -12873,7 +12229,7 @@
                 <w:szCs w:val="16"/>
                 <w:lang w:val="es-MX"/>
               </w:rPr>
-              <w:t>dom</w:t>
+              <w:t>_</w:t>
             </w:r>
             <w:r>
               <w:rPr>
@@ -12887,7 +12243,7 @@
                 <w:szCs w:val="16"/>
                 <w:lang w:val="es-MX"/>
               </w:rPr>
-              <w:t>_</w:t>
+              <w:t>l</w:t>
             </w:r>
             <w:r>
               <w:rPr>
@@ -12901,23 +12257,8 @@
                 <w:szCs w:val="16"/>
                 <w:lang w:val="es-MX"/>
               </w:rPr>
-              <w:t>l</w:t>
-            </w:r>
-            <w:r>
-              <w:rPr>
-                <w:rFonts w:asciiTheme="minorHAnsi" w:eastAsiaTheme="minorHAnsi" w:hAnsiTheme="minorHAnsi" w:cstheme="minorHAnsi"/>
-                <w:bCs/>
-                <w:i/>
-                <w:iCs/>
-                <w:color w:val="auto"/>
-                <w:kern w:val="0"/>
-                <w:sz w:val="16"/>
-                <w:szCs w:val="16"/>
-                <w:lang w:val="es-MX"/>
-              </w:rPr>
               <w:t>ow</w:t>
             </w:r>
-            <w:proofErr w:type="spellEnd"/>
             <w:r>
               <w:rPr>
                 <w:rFonts w:asciiTheme="minorHAnsi" w:eastAsiaTheme="minorHAnsi" w:hAnsiTheme="minorHAnsi" w:cstheme="minorHAnsi"/>
@@ -12970,7 +12311,6 @@
               </w:rPr>
               <w:t>${</w:t>
             </w:r>
-            <w:proofErr w:type="spellStart"/>
             <w:r>
               <w:rPr>
                 <w:rFonts w:asciiTheme="minorHAnsi" w:eastAsiaTheme="minorHAnsi" w:hAnsiTheme="minorHAnsi" w:cstheme="minorHAnsi"/>
@@ -12985,7 +12325,6 @@
               </w:rPr>
               <w:t>dom_null</w:t>
             </w:r>
-            <w:proofErr w:type="spellEnd"/>
             <w:r>
               <w:rPr>
                 <w:rFonts w:asciiTheme="minorHAnsi" w:eastAsiaTheme="minorHAnsi" w:hAnsiTheme="minorHAnsi" w:cstheme="minorHAnsi"/>
@@ -13168,9 +12507,8 @@
                 <w:szCs w:val="24"/>
                 <w:lang w:val="es-MX"/>
               </w:rPr>
-              <w:t>${</w:t>
+              <w:t>${dom</w:t>
             </w:r>
-            <w:proofErr w:type="spellStart"/>
             <w:r>
               <w:rPr>
                 <w:rFonts w:asciiTheme="minorHAnsi" w:eastAsiaTheme="minorHAnsi" w:hAnsiTheme="minorHAnsi" w:cstheme="minorHAnsi"/>
@@ -13181,7 +12519,7 @@
                 <w:szCs w:val="24"/>
                 <w:lang w:val="es-MX"/>
               </w:rPr>
-              <w:t>dom</w:t>
+              <w:t>_top</w:t>
             </w:r>
             <w:r>
               <w:rPr>
@@ -13193,6 +12531,55 @@
                 <w:szCs w:val="24"/>
                 <w:lang w:val="es-MX"/>
               </w:rPr>
+              <w:t xml:space="preserve">_name} </w:t>
+            </w:r>
+            <w:r>
+              <w:rPr>
+                <w:rFonts w:asciiTheme="minorHAnsi" w:eastAsiaTheme="minorHAnsi" w:hAnsiTheme="minorHAnsi" w:cstheme="minorHAnsi"/>
+                <w:b w:val="0"/>
+                <w:color w:val="auto"/>
+                <w:kern w:val="0"/>
+                <w:sz w:val="24"/>
+                <w:szCs w:val="24"/>
+                <w:lang w:val="es-MX"/>
+              </w:rPr>
+              <w:tab/>
+            </w:r>
+            <w:r>
+              <w:rPr>
+                <w:rFonts w:asciiTheme="minorHAnsi" w:eastAsiaTheme="minorHAnsi" w:hAnsiTheme="minorHAnsi" w:cstheme="minorHAnsi"/>
+                <w:b w:val="0"/>
+                <w:color w:val="auto"/>
+                <w:kern w:val="0"/>
+                <w:sz w:val="24"/>
+                <w:szCs w:val="24"/>
+                <w:lang w:val="es-MX"/>
+              </w:rPr>
+              <w:tab/>
+            </w:r>
+            <w:r>
+              <w:rPr>
+                <w:rFonts w:asciiTheme="minorHAnsi" w:eastAsiaTheme="minorHAnsi" w:hAnsiTheme="minorHAnsi" w:cstheme="minorHAnsi"/>
+                <w:b w:val="0"/>
+                <w:color w:val="auto"/>
+                <w:kern w:val="0"/>
+                <w:sz w:val="24"/>
+                <w:szCs w:val="24"/>
+                <w:lang w:val="es-MX"/>
+              </w:rPr>
+              <w:tab/>
+              <w:t>${dom</w:t>
+            </w:r>
+            <w:r>
+              <w:rPr>
+                <w:rFonts w:asciiTheme="minorHAnsi" w:eastAsiaTheme="minorHAnsi" w:hAnsiTheme="minorHAnsi" w:cstheme="minorHAnsi"/>
+                <w:b w:val="0"/>
+                <w:color w:val="auto"/>
+                <w:kern w:val="0"/>
+                <w:sz w:val="24"/>
+                <w:szCs w:val="24"/>
+                <w:lang w:val="es-MX"/>
+              </w:rPr>
               <w:t>_top</w:t>
             </w:r>
             <w:r>
@@ -13205,107 +12592,7 @@
                 <w:szCs w:val="24"/>
                 <w:lang w:val="es-MX"/>
               </w:rPr>
-              <w:t>_name</w:t>
-            </w:r>
-            <w:proofErr w:type="spellEnd"/>
-            <w:r>
-              <w:rPr>
-                <w:rFonts w:asciiTheme="minorHAnsi" w:eastAsiaTheme="minorHAnsi" w:hAnsiTheme="minorHAnsi" w:cstheme="minorHAnsi"/>
-                <w:b w:val="0"/>
-                <w:color w:val="auto"/>
-                <w:kern w:val="0"/>
-                <w:sz w:val="24"/>
-                <w:szCs w:val="24"/>
-                <w:lang w:val="es-MX"/>
-              </w:rPr>
-              <w:t xml:space="preserve">} </w:t>
-            </w:r>
-            <w:r>
-              <w:rPr>
-                <w:rFonts w:asciiTheme="minorHAnsi" w:eastAsiaTheme="minorHAnsi" w:hAnsiTheme="minorHAnsi" w:cstheme="minorHAnsi"/>
-                <w:b w:val="0"/>
-                <w:color w:val="auto"/>
-                <w:kern w:val="0"/>
-                <w:sz w:val="24"/>
-                <w:szCs w:val="24"/>
-                <w:lang w:val="es-MX"/>
-              </w:rPr>
-              <w:tab/>
-            </w:r>
-            <w:r>
-              <w:rPr>
-                <w:rFonts w:asciiTheme="minorHAnsi" w:eastAsiaTheme="minorHAnsi" w:hAnsiTheme="minorHAnsi" w:cstheme="minorHAnsi"/>
-                <w:b w:val="0"/>
-                <w:color w:val="auto"/>
-                <w:kern w:val="0"/>
-                <w:sz w:val="24"/>
-                <w:szCs w:val="24"/>
-                <w:lang w:val="es-MX"/>
-              </w:rPr>
-              <w:tab/>
-            </w:r>
-            <w:r>
-              <w:rPr>
-                <w:rFonts w:asciiTheme="minorHAnsi" w:eastAsiaTheme="minorHAnsi" w:hAnsiTheme="minorHAnsi" w:cstheme="minorHAnsi"/>
-                <w:b w:val="0"/>
-                <w:color w:val="auto"/>
-                <w:kern w:val="0"/>
-                <w:sz w:val="24"/>
-                <w:szCs w:val="24"/>
-                <w:lang w:val="es-MX"/>
-              </w:rPr>
-              <w:tab/>
-              <w:t>${</w:t>
-            </w:r>
-            <w:proofErr w:type="spellStart"/>
-            <w:r>
-              <w:rPr>
-                <w:rFonts w:asciiTheme="minorHAnsi" w:eastAsiaTheme="minorHAnsi" w:hAnsiTheme="minorHAnsi" w:cstheme="minorHAnsi"/>
-                <w:b w:val="0"/>
-                <w:color w:val="auto"/>
-                <w:kern w:val="0"/>
-                <w:sz w:val="24"/>
-                <w:szCs w:val="24"/>
-                <w:lang w:val="es-MX"/>
-              </w:rPr>
-              <w:t>dom</w:t>
-            </w:r>
-            <w:r>
-              <w:rPr>
-                <w:rFonts w:asciiTheme="minorHAnsi" w:eastAsiaTheme="minorHAnsi" w:hAnsiTheme="minorHAnsi" w:cstheme="minorHAnsi"/>
-                <w:b w:val="0"/>
-                <w:color w:val="auto"/>
-                <w:kern w:val="0"/>
-                <w:sz w:val="24"/>
-                <w:szCs w:val="24"/>
-                <w:lang w:val="es-MX"/>
-              </w:rPr>
-              <w:t>_top</w:t>
-            </w:r>
-            <w:r>
-              <w:rPr>
-                <w:rFonts w:asciiTheme="minorHAnsi" w:eastAsiaTheme="minorHAnsi" w:hAnsiTheme="minorHAnsi" w:cstheme="minorHAnsi"/>
-                <w:b w:val="0"/>
-                <w:color w:val="auto"/>
-                <w:kern w:val="0"/>
-                <w:sz w:val="24"/>
-                <w:szCs w:val="24"/>
-                <w:lang w:val="es-MX"/>
-              </w:rPr>
-              <w:t>_level</w:t>
-            </w:r>
-            <w:proofErr w:type="spellEnd"/>
-            <w:r>
-              <w:rPr>
-                <w:rFonts w:asciiTheme="minorHAnsi" w:eastAsiaTheme="minorHAnsi" w:hAnsiTheme="minorHAnsi" w:cstheme="minorHAnsi"/>
-                <w:b w:val="0"/>
-                <w:color w:val="auto"/>
-                <w:kern w:val="0"/>
-                <w:sz w:val="24"/>
-                <w:szCs w:val="24"/>
-                <w:lang w:val="es-MX"/>
-              </w:rPr>
-              <w:t>}</w:t>
+              <w:t>_level}</w:t>
             </w:r>
           </w:p>
           <w:p>
@@ -13337,9 +12624,8 @@
                 <w:szCs w:val="24"/>
                 <w:lang w:val="es-MX"/>
               </w:rPr>
-              <w:t>${</w:t>
+              <w:t>${dom</w:t>
             </w:r>
-            <w:proofErr w:type="spellStart"/>
             <w:r>
               <w:rPr>
                 <w:rFonts w:asciiTheme="minorHAnsi" w:eastAsiaTheme="minorHAnsi" w:hAnsiTheme="minorHAnsi" w:cstheme="minorHAnsi"/>
@@ -13352,7 +12638,7 @@
                 <w:szCs w:val="24"/>
                 <w:lang w:val="es-MX"/>
               </w:rPr>
-              <w:t>dom</w:t>
+              <w:t>_top</w:t>
             </w:r>
             <w:r>
               <w:rPr>
@@ -13366,36 +12652,7 @@
                 <w:szCs w:val="24"/>
                 <w:lang w:val="es-MX"/>
               </w:rPr>
-              <w:t>_top</w:t>
-            </w:r>
-            <w:r>
-              <w:rPr>
-                <w:rFonts w:asciiTheme="minorHAnsi" w:eastAsiaTheme="minorHAnsi" w:hAnsiTheme="minorHAnsi" w:cstheme="minorHAnsi"/>
-                <w:b w:val="0"/>
-                <w:i/>
-                <w:iCs/>
-                <w:color w:val="auto"/>
-                <w:kern w:val="0"/>
-                <w:sz w:val="24"/>
-                <w:szCs w:val="24"/>
-                <w:lang w:val="es-MX"/>
-              </w:rPr>
-              <w:t>_desc</w:t>
-            </w:r>
-            <w:proofErr w:type="spellEnd"/>
-            <w:r>
-              <w:rPr>
-                <w:rFonts w:asciiTheme="minorHAnsi" w:eastAsiaTheme="minorHAnsi" w:hAnsiTheme="minorHAnsi" w:cstheme="minorHAnsi"/>
-                <w:b w:val="0"/>
-                <w:i/>
-                <w:iCs/>
-                <w:color w:val="auto"/>
-                <w:kern w:val="0"/>
-                <w:sz w:val="24"/>
-                <w:szCs w:val="24"/>
-                <w:lang w:val="es-MX"/>
-              </w:rPr>
-              <w:t>};</w:t>
+              <w:t>_desc};</w:t>
             </w:r>
           </w:p>
           <w:p>

</xml_diff>